<commit_message>
Piece 3: Proof reading of Front Matter + small tiny alignment edits in score
</commit_message>
<xml_diff>
--- a/Front Matter/Template/3_Front-Matter.docx
+++ b/Front Matter/Template/3_Front-Matter.docx
@@ -2852,25 +2852,23 @@
           <w:sz w:val="24"/>
           <w:szCs w:val="24"/>
         </w:rPr>
-        <w:t xml:space="preserve">Born in Dec.1989, </w:t>
-      </w:r>
-      <w:proofErr w:type="spellStart"/>
-      <w:r>
-        <w:rPr>
-          <w:rFonts w:ascii="Noto Serif SC" w:eastAsia="Noto Serif SC" w:hAnsi="Noto Serif SC" w:cs="Noto Serif"/>
-          <w:sz w:val="24"/>
-          <w:szCs w:val="24"/>
-        </w:rPr>
-        <w:t>Yiqing</w:t>
-      </w:r>
-      <w:proofErr w:type="spellEnd"/>
-      <w:r>
-        <w:rPr>
-          <w:rFonts w:ascii="Noto Serif SC" w:eastAsia="Noto Serif SC" w:hAnsi="Noto Serif SC" w:cs="Noto Serif"/>
-          <w:sz w:val="24"/>
-          <w:szCs w:val="24"/>
-        </w:rPr>
-        <w:t xml:space="preserve"> Zhu is a Chinese composer. He began composing in 2008 at Shanghai Conservatory of Music under the guidance of Prof. Huang </w:t>
+        <w:t>Born in Dec.</w:t>
+      </w:r>
+      <w:r>
+        <w:rPr>
+          <w:rFonts w:ascii="Noto Serif SC" w:eastAsia="Noto Serif SC" w:hAnsi="Noto Serif SC" w:cs="Noto Serif"/>
+          <w:sz w:val="24"/>
+          <w:szCs w:val="24"/>
+        </w:rPr>
+        <w:t xml:space="preserve"> </w:t>
+      </w:r>
+      <w:r>
+        <w:rPr>
+          <w:rFonts w:ascii="Noto Serif SC" w:eastAsia="Noto Serif SC" w:hAnsi="Noto Serif SC" w:cs="Noto Serif"/>
+          <w:sz w:val="24"/>
+          <w:szCs w:val="24"/>
+        </w:rPr>
+        <w:t xml:space="preserve">1989, Yiqing Zhu is a Chinese composer. He began composing in 2008 at Shanghai Conservatory of Music under the guidance of Prof. Huang </w:t>
       </w:r>
       <w:proofErr w:type="spellStart"/>
       <w:r>
@@ -3905,27 +3903,311 @@
           <w:szCs w:val="24"/>
           <w:lang w:val="en-GB"/>
         </w:rPr>
+        <w:t xml:space="preserve"> (Diyin Sheng)</w:t>
+      </w:r>
+    </w:p>
+    <w:p>
+      <w:pPr>
+        <w:jc w:val="right"/>
+        <w:rPr>
+          <w:rFonts w:ascii="Noto Serif SC" w:eastAsia="Noto Serif SC" w:hAnsi="Noto Serif SC" w:cs="Noto Serif"/>
+          <w:sz w:val="24"/>
+          <w:szCs w:val="24"/>
+          <w:lang w:val="en-US"/>
+        </w:rPr>
+      </w:pPr>
+    </w:p>
+    <w:p>
+      <w:pPr>
+        <w:jc w:val="right"/>
+        <w:rPr>
+          <w:rFonts w:ascii="Noto Serif SC" w:eastAsia="Noto Serif SC" w:hAnsi="Noto Serif SC" w:cs="Noto Serif"/>
+          <w:sz w:val="24"/>
+          <w:szCs w:val="24"/>
+          <w:lang w:val="en-GB"/>
+        </w:rPr>
+      </w:pPr>
+      <w:r>
+        <w:rPr>
+          <w:rFonts w:ascii="Noto Serif SC" w:eastAsia="Noto Serif SC" w:hAnsi="Noto Serif SC" w:cs="Noto Serif" w:hint="eastAsia"/>
+          <w:sz w:val="24"/>
+          <w:szCs w:val="24"/>
+          <w:lang w:val="en-GB"/>
+        </w:rPr>
+        <w:t>高音唢呐</w:t>
+      </w:r>
+      <w:r>
+        <w:rPr>
+          <w:rFonts w:ascii="Noto Serif SC" w:eastAsia="Noto Serif SC" w:hAnsi="Noto Serif SC" w:cs="Noto Serif"/>
+          <w:sz w:val="24"/>
+          <w:szCs w:val="24"/>
+          <w:lang w:val="en-GB"/>
+        </w:rPr>
+        <w:t xml:space="preserve">  I*, II (</w:t>
+      </w:r>
+      <w:proofErr w:type="spellStart"/>
+      <w:r>
+        <w:rPr>
+          <w:rFonts w:ascii="Noto Serif SC" w:eastAsia="Noto Serif SC" w:hAnsi="Noto Serif SC" w:cs="Noto Serif"/>
+          <w:sz w:val="24"/>
+          <w:szCs w:val="24"/>
+          <w:lang w:val="en-GB"/>
+        </w:rPr>
+        <w:t>Gaoyin</w:t>
+      </w:r>
+      <w:proofErr w:type="spellEnd"/>
+      <w:r>
+        <w:rPr>
+          <w:rFonts w:ascii="Noto Serif SC" w:eastAsia="Noto Serif SC" w:hAnsi="Noto Serif SC" w:cs="Noto Serif"/>
+          <w:sz w:val="24"/>
+          <w:szCs w:val="24"/>
+          <w:lang w:val="en-GB"/>
+        </w:rPr>
+        <w:t xml:space="preserve"> </w:t>
+      </w:r>
+      <w:proofErr w:type="spellStart"/>
+      <w:r>
+        <w:rPr>
+          <w:rFonts w:ascii="Noto Serif SC" w:eastAsia="Noto Serif SC" w:hAnsi="Noto Serif SC" w:cs="Noto Serif"/>
+          <w:sz w:val="24"/>
+          <w:szCs w:val="24"/>
+          <w:lang w:val="en-GB"/>
+        </w:rPr>
+        <w:t>Suona</w:t>
+      </w:r>
+      <w:proofErr w:type="spellEnd"/>
+      <w:r>
+        <w:rPr>
+          <w:rFonts w:ascii="Noto Serif SC" w:eastAsia="Noto Serif SC" w:hAnsi="Noto Serif SC" w:cs="Noto Serif"/>
+          <w:sz w:val="24"/>
+          <w:szCs w:val="24"/>
+          <w:lang w:val="en-GB"/>
+        </w:rPr>
+        <w:t xml:space="preserve"> I*, II)</w:t>
+      </w:r>
+    </w:p>
+    <w:p>
+      <w:pPr>
+        <w:jc w:val="right"/>
+        <w:rPr>
+          <w:rFonts w:ascii="Noto Serif SC" w:eastAsia="Noto Serif SC" w:hAnsi="Noto Serif SC" w:cs="Noto Serif"/>
+          <w:sz w:val="24"/>
+          <w:szCs w:val="24"/>
+          <w:lang w:val="en-US"/>
+        </w:rPr>
+      </w:pPr>
+      <w:r>
+        <w:rPr>
+          <w:rFonts w:ascii="Noto Serif SC" w:eastAsia="Noto Serif SC" w:hAnsi="Noto Serif SC" w:cs="Noto Serif"/>
+          <w:sz w:val="20"/>
+          <w:szCs w:val="20"/>
+          <w:lang w:val="en-GB"/>
+        </w:rPr>
+        <w:t xml:space="preserve"> I* </w:t>
+      </w:r>
+      <w:r>
+        <w:rPr>
+          <w:rFonts w:ascii="Noto Serif SC" w:eastAsia="Noto Serif SC" w:hAnsi="Noto Serif SC" w:cs="Noto Serif" w:hint="eastAsia"/>
+          <w:sz w:val="20"/>
+          <w:szCs w:val="20"/>
+          <w:lang w:val="en-GB"/>
+        </w:rPr>
+        <w:t>兼奏高音管</w:t>
+      </w:r>
+      <w:r>
+        <w:rPr>
+          <w:rFonts w:ascii="Noto Serif SC" w:eastAsia="Noto Serif SC" w:hAnsi="Noto Serif SC" w:cs="Noto Serif"/>
+          <w:sz w:val="20"/>
+          <w:szCs w:val="20"/>
+          <w:lang w:val="en-GB"/>
+        </w:rPr>
+        <w:t xml:space="preserve"> (I* </w:t>
+      </w:r>
+      <w:proofErr w:type="spellStart"/>
+      <w:r>
+        <w:rPr>
+          <w:rFonts w:ascii="Noto Serif SC" w:eastAsia="Noto Serif SC" w:hAnsi="Noto Serif SC" w:cs="Noto Serif"/>
+          <w:sz w:val="20"/>
+          <w:szCs w:val="20"/>
+          <w:lang w:val="en-GB"/>
+        </w:rPr>
+        <w:t>doub</w:t>
+      </w:r>
+      <w:proofErr w:type="spellEnd"/>
+      <w:r>
+        <w:rPr>
+          <w:rFonts w:ascii="Noto Serif SC" w:eastAsia="Noto Serif SC" w:hAnsi="Noto Serif SC" w:cs="Noto Serif"/>
+          <w:sz w:val="20"/>
+          <w:szCs w:val="20"/>
+          <w:lang w:val="en-GB"/>
+        </w:rPr>
+        <w:t xml:space="preserve">. </w:t>
+      </w:r>
+      <w:proofErr w:type="spellStart"/>
+      <w:r>
+        <w:rPr>
+          <w:rFonts w:ascii="Noto Serif SC" w:eastAsia="Noto Serif SC" w:hAnsi="Noto Serif SC" w:cs="Noto Serif"/>
+          <w:sz w:val="20"/>
+          <w:szCs w:val="20"/>
+          <w:lang w:val="en-GB"/>
+        </w:rPr>
+        <w:t>Gaoyin</w:t>
+      </w:r>
+      <w:proofErr w:type="spellEnd"/>
+      <w:r>
+        <w:rPr>
+          <w:rFonts w:ascii="Noto Serif SC" w:eastAsia="Noto Serif SC" w:hAnsi="Noto Serif SC" w:cs="Noto Serif"/>
+          <w:sz w:val="20"/>
+          <w:szCs w:val="20"/>
+          <w:lang w:val="en-GB"/>
+        </w:rPr>
+        <w:t xml:space="preserve"> Guan)</w:t>
+      </w:r>
+    </w:p>
+    <w:p>
+      <w:pPr>
+        <w:jc w:val="right"/>
+        <w:rPr>
+          <w:rFonts w:ascii="Noto Serif SC" w:eastAsia="Noto Serif SC" w:hAnsi="Noto Serif SC" w:cs="Noto Serif"/>
+          <w:sz w:val="24"/>
+          <w:szCs w:val="24"/>
+          <w:lang w:val="en-US"/>
+        </w:rPr>
+      </w:pPr>
+      <w:r>
+        <w:rPr>
+          <w:rFonts w:ascii="Noto Serif SC" w:eastAsia="Noto Serif SC" w:hAnsi="Noto Serif SC" w:cs="Noto Serif" w:hint="eastAsia"/>
+          <w:sz w:val="24"/>
+          <w:szCs w:val="24"/>
+          <w:lang w:val="en-US"/>
+        </w:rPr>
+        <w:t>加键中音唢呐</w:t>
+      </w:r>
+      <w:r>
+        <w:rPr>
+          <w:rFonts w:ascii="Noto Serif SC" w:eastAsia="Noto Serif SC" w:hAnsi="Noto Serif SC" w:cs="Noto Serif"/>
+          <w:sz w:val="24"/>
+          <w:szCs w:val="24"/>
+          <w:lang w:val="en-US"/>
+        </w:rPr>
+        <w:t>** (</w:t>
+      </w:r>
+      <w:proofErr w:type="spellStart"/>
+      <w:r>
+        <w:rPr>
+          <w:rFonts w:ascii="Noto Serif SC" w:eastAsia="Noto Serif SC" w:hAnsi="Noto Serif SC" w:cs="Noto Serif"/>
+          <w:sz w:val="24"/>
+          <w:szCs w:val="24"/>
+          <w:lang w:val="en-US"/>
+        </w:rPr>
+        <w:t>Jiajian</w:t>
+      </w:r>
+      <w:proofErr w:type="spellEnd"/>
+      <w:r>
+        <w:rPr>
+          <w:rFonts w:ascii="Noto Serif SC" w:eastAsia="Noto Serif SC" w:hAnsi="Noto Serif SC" w:cs="Noto Serif"/>
+          <w:sz w:val="24"/>
+          <w:szCs w:val="24"/>
+          <w:lang w:val="en-US"/>
+        </w:rPr>
+        <w:t xml:space="preserve"> </w:t>
+      </w:r>
+      <w:proofErr w:type="spellStart"/>
+      <w:r>
+        <w:rPr>
+          <w:rFonts w:ascii="Noto Serif SC" w:eastAsia="Noto Serif SC" w:hAnsi="Noto Serif SC" w:cs="Noto Serif"/>
+          <w:sz w:val="24"/>
+          <w:szCs w:val="24"/>
+          <w:lang w:val="en-US"/>
+        </w:rPr>
+        <w:t>Zhongyin</w:t>
+      </w:r>
+      <w:proofErr w:type="spellEnd"/>
+      <w:r>
+        <w:rPr>
+          <w:rFonts w:ascii="Noto Serif SC" w:eastAsia="Noto Serif SC" w:hAnsi="Noto Serif SC" w:cs="Noto Serif"/>
+          <w:sz w:val="24"/>
+          <w:szCs w:val="24"/>
+          <w:lang w:val="en-US"/>
+        </w:rPr>
+        <w:t xml:space="preserve"> </w:t>
+      </w:r>
+      <w:proofErr w:type="spellStart"/>
+      <w:r>
+        <w:rPr>
+          <w:rFonts w:ascii="Noto Serif SC" w:eastAsia="Noto Serif SC" w:hAnsi="Noto Serif SC" w:cs="Noto Serif"/>
+          <w:sz w:val="24"/>
+          <w:szCs w:val="24"/>
+          <w:lang w:val="en-US"/>
+        </w:rPr>
+        <w:t>Suona</w:t>
+      </w:r>
+      <w:proofErr w:type="spellEnd"/>
+      <w:r>
+        <w:rPr>
+          <w:rFonts w:ascii="Noto Serif SC" w:eastAsia="Noto Serif SC" w:hAnsi="Noto Serif SC" w:cs="Noto Serif"/>
+          <w:sz w:val="24"/>
+          <w:szCs w:val="24"/>
+          <w:lang w:val="en-US"/>
+        </w:rPr>
+        <w:t>**)</w:t>
+      </w:r>
+    </w:p>
+    <w:p>
+      <w:pPr>
+        <w:jc w:val="right"/>
+        <w:rPr>
+          <w:rFonts w:ascii="Noto Serif SC" w:eastAsia="Noto Serif SC" w:hAnsi="Noto Serif SC" w:cs="Noto Serif"/>
+          <w:sz w:val="24"/>
+          <w:szCs w:val="24"/>
+          <w:lang w:val="en-US"/>
+        </w:rPr>
+      </w:pPr>
+      <w:r>
+        <w:rPr>
+          <w:rFonts w:ascii="Noto Serif SC" w:eastAsia="Noto Serif SC" w:hAnsi="Noto Serif SC" w:cs="Noto Serif"/>
+          <w:sz w:val="20"/>
+          <w:szCs w:val="20"/>
+          <w:lang w:val="en-US"/>
+        </w:rPr>
+        <w:t>**</w:t>
+      </w:r>
+      <w:r>
+        <w:rPr>
+          <w:rFonts w:ascii="Noto Serif SC" w:eastAsia="Noto Serif SC" w:hAnsi="Noto Serif SC" w:cs="Noto Serif" w:hint="eastAsia"/>
+          <w:sz w:val="20"/>
+          <w:szCs w:val="20"/>
+        </w:rPr>
+        <w:t>兼奏低音管</w:t>
+      </w:r>
+      <w:r>
+        <w:rPr>
+          <w:rFonts w:ascii="Noto Serif SC" w:eastAsia="Noto Serif SC" w:hAnsi="Noto Serif SC" w:cs="Noto Serif"/>
+          <w:sz w:val="20"/>
+          <w:szCs w:val="20"/>
+          <w:lang w:val="en-GB"/>
+        </w:rPr>
         <w:t xml:space="preserve"> (</w:t>
       </w:r>
       <w:proofErr w:type="spellStart"/>
       <w:r>
         <w:rPr>
           <w:rFonts w:ascii="Noto Serif SC" w:eastAsia="Noto Serif SC" w:hAnsi="Noto Serif SC" w:cs="Noto Serif"/>
-          <w:sz w:val="24"/>
-          <w:szCs w:val="24"/>
+          <w:sz w:val="20"/>
+          <w:szCs w:val="20"/>
           <w:lang w:val="en-GB"/>
         </w:rPr>
-        <w:t>Diyin</w:t>
+        <w:t>doub</w:t>
       </w:r>
       <w:proofErr w:type="spellEnd"/>
       <w:r>
         <w:rPr>
           <w:rFonts w:ascii="Noto Serif SC" w:eastAsia="Noto Serif SC" w:hAnsi="Noto Serif SC" w:cs="Noto Serif"/>
-          <w:sz w:val="24"/>
-          <w:szCs w:val="24"/>
+          <w:sz w:val="20"/>
+          <w:szCs w:val="20"/>
           <w:lang w:val="en-GB"/>
         </w:rPr>
-        <w:t xml:space="preserve"> Sheng)</w:t>
+        <w:t>. on Diyin Guan)</w:t>
       </w:r>
     </w:p>
     <w:p>
@@ -3938,6 +4220,90 @@
           <w:lang w:val="en-US"/>
         </w:rPr>
       </w:pPr>
+      <w:r>
+        <w:rPr>
+          <w:rFonts w:ascii="Noto Serif SC" w:eastAsia="Noto Serif SC" w:hAnsi="Noto Serif SC" w:cs="Noto Serif" w:hint="eastAsia"/>
+          <w:sz w:val="24"/>
+          <w:szCs w:val="24"/>
+          <w:lang w:val="en-US"/>
+        </w:rPr>
+        <w:t>管</w:t>
+      </w:r>
+      <w:r>
+        <w:rPr>
+          <w:rFonts w:ascii="Noto Serif SC" w:eastAsia="Noto Serif SC" w:hAnsi="Noto Serif SC" w:cs="Noto Serif"/>
+          <w:sz w:val="24"/>
+          <w:szCs w:val="24"/>
+          <w:lang w:val="en-US"/>
+        </w:rPr>
+        <w:t xml:space="preserve"> </w:t>
+      </w:r>
+      <w:r>
+        <w:rPr>
+          <w:rFonts w:ascii="Noto Serif SC" w:eastAsia="Noto Serif SC" w:hAnsi="Noto Serif SC" w:cs="Noto Serif"/>
+          <w:sz w:val="24"/>
+          <w:szCs w:val="24"/>
+        </w:rPr>
+        <w:t>(</w:t>
+      </w:r>
+      <w:r>
+        <w:rPr>
+          <w:rFonts w:ascii="Noto Serif SC" w:eastAsia="Noto Serif SC" w:hAnsi="Noto Serif SC" w:cs="Noto Serif" w:hint="eastAsia"/>
+          <w:sz w:val="24"/>
+          <w:szCs w:val="24"/>
+        </w:rPr>
+        <w:t>兼</w:t>
+      </w:r>
+      <w:r>
+        <w:rPr>
+          <w:rFonts w:ascii="Noto Serif SC" w:eastAsia="Noto Serif SC" w:hAnsi="Noto Serif SC" w:cs="Noto Serif"/>
+          <w:sz w:val="24"/>
+          <w:szCs w:val="24"/>
+        </w:rPr>
+        <w:t xml:space="preserve">: </w:t>
+      </w:r>
+      <w:r>
+        <w:rPr>
+          <w:rFonts w:ascii="Noto Serif SC" w:eastAsia="Noto Serif SC" w:hAnsi="Noto Serif SC" w:cs="Noto Serif" w:hint="eastAsia"/>
+          <w:sz w:val="24"/>
+          <w:szCs w:val="24"/>
+        </w:rPr>
+        <w:t>高音，中音，低音</w:t>
+      </w:r>
+      <w:r>
+        <w:rPr>
+          <w:rFonts w:ascii="Noto Serif SC" w:eastAsia="Noto Serif SC" w:hAnsi="Noto Serif SC" w:cs="Noto Serif"/>
+          <w:sz w:val="24"/>
+          <w:szCs w:val="24"/>
+        </w:rPr>
+        <w:t>)</w:t>
+      </w:r>
+      <w:r>
+        <w:rPr>
+          <w:rFonts w:ascii="Noto Serif SC" w:eastAsia="Noto Serif SC" w:hAnsi="Noto Serif SC" w:cs="Noto Serif"/>
+          <w:sz w:val="24"/>
+          <w:szCs w:val="24"/>
+          <w:lang w:val="en-US"/>
+        </w:rPr>
+        <w:t xml:space="preserve"> (Guan – </w:t>
+      </w:r>
+      <w:r>
+        <w:rPr>
+          <w:rFonts w:ascii="Noto Serif SC" w:eastAsia="Noto Serif SC" w:hAnsi="Noto Serif SC" w:cs="Noto Serif"/>
+          <w:sz w:val="24"/>
+          <w:szCs w:val="24"/>
+        </w:rPr>
+        <w:t>High, Middle, Low</w:t>
+      </w:r>
+      <w:r>
+        <w:rPr>
+          <w:rFonts w:ascii="Noto Serif SC" w:eastAsia="Noto Serif SC" w:hAnsi="Noto Serif SC" w:cs="Noto Serif"/>
+          <w:sz w:val="24"/>
+          <w:szCs w:val="24"/>
+          <w:lang w:val="en-US"/>
+        </w:rPr>
+        <w:t>)</w:t>
+      </w:r>
     </w:p>
     <w:p>
       <w:pPr>
@@ -3946,66 +4312,940 @@
           <w:rFonts w:ascii="Noto Serif SC" w:eastAsia="Noto Serif SC" w:hAnsi="Noto Serif SC" w:cs="Noto Serif"/>
           <w:sz w:val="24"/>
           <w:szCs w:val="24"/>
+          <w:lang w:val="en-US"/>
+        </w:rPr>
+      </w:pPr>
+    </w:p>
+    <w:p>
+      <w:pPr>
+        <w:jc w:val="right"/>
+        <w:rPr>
+          <w:rFonts w:ascii="Noto Serif SC" w:eastAsia="Noto Serif SC" w:hAnsi="Noto Serif SC" w:cs="Noto Serif"/>
+          <w:sz w:val="24"/>
+          <w:szCs w:val="24"/>
+          <w:lang w:val="en-US"/>
+        </w:rPr>
+      </w:pPr>
+      <w:r>
+        <w:rPr>
+          <w:rFonts w:ascii="Noto Serif SC" w:eastAsia="Noto Serif SC" w:hAnsi="Noto Serif SC" w:cs="Noto Serif" w:hint="eastAsia"/>
+          <w:sz w:val="24"/>
+          <w:szCs w:val="24"/>
+          <w:lang w:val="en-US"/>
+        </w:rPr>
+        <w:t>扬琴</w:t>
+      </w:r>
+      <w:r>
+        <w:rPr>
+          <w:rFonts w:ascii="Noto Serif SC" w:eastAsia="Noto Serif SC" w:hAnsi="Noto Serif SC" w:cs="Noto Serif"/>
+          <w:sz w:val="24"/>
+          <w:szCs w:val="24"/>
+          <w:lang w:val="en-US"/>
+        </w:rPr>
+        <w:t xml:space="preserve"> (Yangqin)</w:t>
+      </w:r>
+    </w:p>
+    <w:p>
+      <w:pPr>
+        <w:jc w:val="right"/>
+        <w:rPr>
+          <w:rFonts w:ascii="Noto Serif SC" w:eastAsia="Noto Serif SC" w:hAnsi="Noto Serif SC" w:cs="Noto Serif"/>
+          <w:sz w:val="24"/>
+          <w:szCs w:val="24"/>
+          <w:lang w:val="en-US"/>
+        </w:rPr>
+      </w:pPr>
+      <w:r>
+        <w:rPr>
+          <w:rFonts w:ascii="Noto Serif SC" w:eastAsia="Noto Serif SC" w:hAnsi="Noto Serif SC" w:cs="Noto Serif" w:hint="eastAsia"/>
+          <w:sz w:val="24"/>
+          <w:szCs w:val="24"/>
+          <w:lang w:val="en-US"/>
+        </w:rPr>
+        <w:t>柳琴</w:t>
+      </w:r>
+      <w:r>
+        <w:rPr>
+          <w:rFonts w:ascii="Noto Serif SC" w:eastAsia="Noto Serif SC" w:hAnsi="Noto Serif SC" w:cs="Noto Serif"/>
+          <w:sz w:val="24"/>
+          <w:szCs w:val="24"/>
+          <w:lang w:val="en-US"/>
+        </w:rPr>
+        <w:t xml:space="preserve"> I, II (</w:t>
+      </w:r>
+      <w:proofErr w:type="spellStart"/>
+      <w:r>
+        <w:rPr>
+          <w:rFonts w:ascii="Noto Serif SC" w:eastAsia="Noto Serif SC" w:hAnsi="Noto Serif SC" w:cs="Noto Serif"/>
+          <w:sz w:val="24"/>
+          <w:szCs w:val="24"/>
+          <w:lang w:val="en-US"/>
+        </w:rPr>
+        <w:t>Liuqin</w:t>
+      </w:r>
+      <w:proofErr w:type="spellEnd"/>
+      <w:r>
+        <w:rPr>
+          <w:rFonts w:ascii="Noto Serif SC" w:eastAsia="Noto Serif SC" w:hAnsi="Noto Serif SC" w:cs="Noto Serif"/>
+          <w:sz w:val="24"/>
+          <w:szCs w:val="24"/>
+          <w:lang w:val="en-US"/>
+        </w:rPr>
+        <w:t xml:space="preserve"> I, II)</w:t>
+      </w:r>
+    </w:p>
+    <w:p>
+      <w:pPr>
+        <w:jc w:val="right"/>
+        <w:rPr>
+          <w:rFonts w:ascii="Noto Serif SC" w:eastAsia="Noto Serif SC" w:hAnsi="Noto Serif SC" w:cs="Noto Serif"/>
+          <w:sz w:val="24"/>
+          <w:szCs w:val="24"/>
+          <w:lang w:val="en-US"/>
+        </w:rPr>
+      </w:pPr>
+      <w:r>
+        <w:rPr>
+          <w:rFonts w:ascii="Noto Serif SC" w:eastAsia="Noto Serif SC" w:hAnsi="Noto Serif SC" w:cs="Noto Serif" w:hint="eastAsia"/>
+          <w:sz w:val="24"/>
+          <w:szCs w:val="24"/>
+          <w:lang w:val="en-US"/>
+        </w:rPr>
+        <w:t>琵琶</w:t>
+      </w:r>
+      <w:r>
+        <w:rPr>
+          <w:rFonts w:ascii="Noto Serif SC" w:eastAsia="Noto Serif SC" w:hAnsi="Noto Serif SC" w:cs="Noto Serif"/>
+          <w:sz w:val="24"/>
+          <w:szCs w:val="24"/>
+          <w:lang w:val="en-US"/>
+        </w:rPr>
+        <w:t xml:space="preserve"> I-IV (Pipa I-IV)</w:t>
+      </w:r>
+    </w:p>
+    <w:p>
+      <w:pPr>
+        <w:jc w:val="right"/>
+        <w:rPr>
+          <w:rFonts w:ascii="Noto Serif SC" w:eastAsia="Noto Serif SC" w:hAnsi="Noto Serif SC" w:cs="Noto Serif"/>
+          <w:sz w:val="24"/>
+          <w:szCs w:val="24"/>
+          <w:lang w:val="en-US"/>
+        </w:rPr>
+      </w:pPr>
+      <w:r>
+        <w:rPr>
+          <w:rFonts w:ascii="Noto Serif SC" w:eastAsia="Noto Serif SC" w:hAnsi="Noto Serif SC" w:cs="Noto Serif" w:hint="eastAsia"/>
+          <w:sz w:val="24"/>
+          <w:szCs w:val="24"/>
+          <w:lang w:val="en-US"/>
+        </w:rPr>
+        <w:t>中阮</w:t>
+      </w:r>
+      <w:r>
+        <w:rPr>
+          <w:rFonts w:ascii="Noto Serif SC" w:eastAsia="Noto Serif SC" w:hAnsi="Noto Serif SC" w:cs="Noto Serif"/>
+          <w:sz w:val="24"/>
+          <w:szCs w:val="24"/>
+          <w:lang w:val="en-US"/>
+        </w:rPr>
+        <w:t xml:space="preserve"> I-IV (Zhongruan I-IV)</w:t>
+      </w:r>
+    </w:p>
+    <w:p>
+      <w:pPr>
+        <w:jc w:val="right"/>
+        <w:rPr>
+          <w:rFonts w:ascii="Noto Serif SC" w:eastAsia="Noto Serif SC" w:hAnsi="Noto Serif SC" w:cs="Noto Serif"/>
+          <w:sz w:val="24"/>
+          <w:szCs w:val="24"/>
+          <w:lang w:val="en-US"/>
+        </w:rPr>
+      </w:pPr>
+      <w:r>
+        <w:rPr>
+          <w:rFonts w:ascii="Noto Serif SC" w:eastAsia="Noto Serif SC" w:hAnsi="Noto Serif SC" w:cs="Noto Serif" w:hint="eastAsia"/>
+          <w:sz w:val="24"/>
+          <w:szCs w:val="24"/>
+        </w:rPr>
+        <w:t>三弦</w:t>
+      </w:r>
+      <w:r>
+        <w:rPr>
+          <w:rFonts w:ascii="Noto Serif SC" w:eastAsia="Noto Serif SC" w:hAnsi="Noto Serif SC" w:cs="Noto Serif"/>
+          <w:sz w:val="24"/>
+          <w:szCs w:val="24"/>
+          <w:lang w:val="en-US"/>
+        </w:rPr>
+        <w:t xml:space="preserve"> Sanxian</w:t>
+      </w:r>
+    </w:p>
+    <w:p>
+      <w:pPr>
+        <w:jc w:val="right"/>
+        <w:rPr>
+          <w:rFonts w:ascii="Noto Serif SC" w:eastAsia="Noto Serif SC" w:hAnsi="Noto Serif SC" w:cs="Noto Serif"/>
+          <w:sz w:val="24"/>
+          <w:szCs w:val="24"/>
+          <w:lang w:val="en-US"/>
+        </w:rPr>
+      </w:pPr>
+      <w:r>
+        <w:rPr>
+          <w:rFonts w:ascii="Noto Serif SC" w:eastAsia="Noto Serif SC" w:hAnsi="Noto Serif SC" w:cs="Noto Serif" w:hint="eastAsia"/>
+          <w:sz w:val="24"/>
+          <w:szCs w:val="24"/>
+          <w:lang w:val="en-US"/>
+        </w:rPr>
+        <w:t>大阮</w:t>
+      </w:r>
+      <w:r>
+        <w:rPr>
+          <w:rFonts w:ascii="Noto Serif SC" w:eastAsia="Noto Serif SC" w:hAnsi="Noto Serif SC" w:cs="Noto Serif"/>
+          <w:sz w:val="24"/>
+          <w:szCs w:val="24"/>
+          <w:lang w:val="en-US"/>
+        </w:rPr>
+        <w:t xml:space="preserve"> I, II (Daruan I, II)</w:t>
+      </w:r>
+    </w:p>
+    <w:p>
+      <w:pPr>
+        <w:jc w:val="right"/>
+        <w:rPr>
+          <w:rFonts w:ascii="Noto Serif SC" w:eastAsia="Noto Serif SC" w:hAnsi="Noto Serif SC" w:cs="Noto Serif"/>
+          <w:sz w:val="24"/>
+          <w:szCs w:val="24"/>
+          <w:lang w:val="en-US"/>
+        </w:rPr>
+      </w:pPr>
+      <w:r>
+        <w:rPr>
+          <w:rFonts w:ascii="Noto Serif SC" w:eastAsia="Noto Serif SC" w:hAnsi="Noto Serif SC" w:cs="Noto Serif" w:hint="eastAsia"/>
+          <w:sz w:val="24"/>
+          <w:szCs w:val="24"/>
+        </w:rPr>
+        <w:t>古筝</w:t>
+      </w:r>
+      <w:r>
+        <w:rPr>
+          <w:rFonts w:ascii="Noto Serif SC" w:eastAsia="Noto Serif SC" w:hAnsi="Noto Serif SC" w:cs="Noto Serif"/>
+          <w:sz w:val="24"/>
+          <w:szCs w:val="24"/>
+          <w:lang w:val="en-US"/>
+        </w:rPr>
+        <w:t xml:space="preserve"> (Guzheng)</w:t>
+      </w:r>
+    </w:p>
+    <w:p>
+      <w:pPr>
+        <w:jc w:val="right"/>
+        <w:rPr>
+          <w:rFonts w:ascii="Noto Serif SC" w:eastAsia="Noto Serif SC" w:hAnsi="Noto Serif SC" w:cs="Noto Serif"/>
+          <w:sz w:val="24"/>
+          <w:szCs w:val="24"/>
+          <w:lang w:val="en-US"/>
+        </w:rPr>
+      </w:pPr>
+      <w:r>
+        <w:rPr>
+          <w:rFonts w:ascii="Noto Serif SC" w:eastAsia="Noto Serif SC" w:hAnsi="Noto Serif SC" w:cs="Noto Serif" w:hint="eastAsia"/>
+          <w:sz w:val="24"/>
+          <w:szCs w:val="24"/>
+          <w:lang w:val="en-US"/>
+        </w:rPr>
+        <w:t>竖琴</w:t>
+      </w:r>
+      <w:r>
+        <w:rPr>
+          <w:rFonts w:ascii="Noto Serif SC" w:eastAsia="Noto Serif SC" w:hAnsi="Noto Serif SC" w:cs="Noto Serif"/>
+          <w:sz w:val="24"/>
+          <w:szCs w:val="24"/>
+          <w:lang w:val="en-US"/>
+        </w:rPr>
+        <w:t xml:space="preserve"> (Harp)</w:t>
+      </w:r>
+    </w:p>
+    <w:p>
+      <w:pPr>
+        <w:jc w:val="right"/>
+        <w:rPr>
+          <w:rFonts w:ascii="Noto Serif SC" w:eastAsia="Noto Serif SC" w:hAnsi="Noto Serif SC" w:cs="Noto Serif"/>
+          <w:sz w:val="24"/>
+          <w:szCs w:val="24"/>
+          <w:lang w:val="en-US"/>
+        </w:rPr>
+      </w:pPr>
+    </w:p>
+    <w:p>
+      <w:pPr>
+        <w:jc w:val="right"/>
+        <w:rPr>
+          <w:rFonts w:ascii="Noto Serif SC" w:eastAsia="Noto Serif SC" w:hAnsi="Noto Serif SC" w:cs="Noto Serif"/>
+          <w:sz w:val="24"/>
+          <w:szCs w:val="24"/>
+          <w:lang w:val="en-US"/>
+        </w:rPr>
+      </w:pPr>
+      <w:r>
+        <w:rPr>
+          <w:rFonts w:ascii="Noto Serif SC" w:eastAsia="Noto Serif SC" w:hAnsi="Noto Serif SC" w:cs="Noto Serif" w:hint="eastAsia"/>
+          <w:sz w:val="24"/>
+          <w:szCs w:val="24"/>
+          <w:lang w:val="en-US"/>
+        </w:rPr>
+        <w:t>打击乐</w:t>
+      </w:r>
+      <w:r>
+        <w:rPr>
+          <w:rFonts w:ascii="Noto Serif SC" w:eastAsia="Noto Serif SC" w:hAnsi="Noto Serif SC" w:cs="Noto Serif"/>
+          <w:sz w:val="24"/>
+          <w:szCs w:val="24"/>
+          <w:lang w:val="en-US"/>
+        </w:rPr>
+        <w:t xml:space="preserve"> I (Percussion I)</w:t>
+      </w:r>
+    </w:p>
+    <w:p>
+      <w:pPr>
+        <w:jc w:val="right"/>
+        <w:rPr>
+          <w:rFonts w:ascii="Noto Serif SC" w:eastAsia="Noto Serif SC" w:hAnsi="Noto Serif SC" w:cs="Noto Serif"/>
+          <w:sz w:val="20"/>
+          <w:szCs w:val="20"/>
           <w:lang w:val="en-GB"/>
         </w:rPr>
       </w:pPr>
       <w:r>
         <w:rPr>
-          <w:rFonts w:ascii="Noto Serif SC" w:eastAsia="Noto Serif SC" w:hAnsi="Noto Serif SC" w:cs="Noto Serif" w:hint="eastAsia"/>
-          <w:sz w:val="24"/>
-          <w:szCs w:val="24"/>
+          <w:rFonts w:ascii="Noto Serif SC" w:eastAsia="Noto Serif SC" w:hAnsi="Noto Serif SC" w:cs="Noto Serif"/>
+          <w:sz w:val="20"/>
+          <w:szCs w:val="20"/>
+        </w:rPr>
+        <w:t>(</w:t>
+      </w:r>
+      <w:r>
+        <w:rPr>
+          <w:rFonts w:ascii="Noto Serif SC" w:eastAsia="Noto Serif SC" w:hAnsi="Noto Serif SC" w:cs="Noto Serif" w:hint="eastAsia"/>
+          <w:sz w:val="20"/>
+          <w:szCs w:val="20"/>
+        </w:rPr>
+        <w:t>西方</w:t>
+      </w:r>
+      <w:r>
+        <w:rPr>
+          <w:rFonts w:ascii="Noto Serif SC" w:eastAsia="Noto Serif SC" w:hAnsi="Noto Serif SC" w:cs="Noto Serif"/>
+          <w:sz w:val="20"/>
+          <w:szCs w:val="20"/>
+        </w:rPr>
+        <w:t xml:space="preserve">) </w:t>
+      </w:r>
+      <w:r>
+        <w:rPr>
+          <w:rFonts w:ascii="Noto Serif SC" w:eastAsia="Noto Serif SC" w:hAnsi="Noto Serif SC" w:cs="Noto Serif" w:hint="eastAsia"/>
+          <w:sz w:val="20"/>
+          <w:szCs w:val="20"/>
+        </w:rPr>
+        <w:t>木鱼</w:t>
+      </w:r>
+      <w:r>
+        <w:rPr>
+          <w:rFonts w:ascii="Noto Serif SC" w:eastAsia="Noto Serif SC" w:hAnsi="Noto Serif SC" w:cs="Noto Serif"/>
+          <w:sz w:val="20"/>
+          <w:szCs w:val="20"/>
+        </w:rPr>
+        <w:t xml:space="preserve"> </w:t>
+      </w:r>
+      <w:r>
+        <w:rPr>
+          <w:rFonts w:ascii="Noto Serif SC" w:eastAsia="Noto Serif SC" w:hAnsi="Noto Serif SC" w:cs="Noto Serif" w:hint="eastAsia"/>
+          <w:sz w:val="20"/>
+          <w:szCs w:val="20"/>
+        </w:rPr>
+        <w:t>(</w:t>
+      </w:r>
+      <w:r>
+        <w:rPr>
+          <w:rFonts w:ascii="Noto Serif SC" w:eastAsia="Noto Serif SC" w:hAnsi="Noto Serif SC" w:cs="Noto Serif"/>
+          <w:sz w:val="20"/>
+          <w:szCs w:val="20"/>
+        </w:rPr>
+        <w:t>Woodblocks</w:t>
+      </w:r>
+      <w:r>
+        <w:rPr>
+          <w:rFonts w:ascii="Noto Serif SC" w:eastAsia="Noto Serif SC" w:hAnsi="Noto Serif SC" w:cs="Noto Serif" w:hint="eastAsia"/>
+          <w:sz w:val="20"/>
+          <w:szCs w:val="20"/>
+        </w:rPr>
+        <w:t>)</w:t>
+      </w:r>
+      <w:r>
+        <w:rPr>
+          <w:rFonts w:ascii="Noto Serif SC" w:eastAsia="Noto Serif SC" w:hAnsi="Noto Serif SC" w:cs="Noto Serif"/>
+          <w:sz w:val="20"/>
+          <w:szCs w:val="20"/>
+        </w:rPr>
+        <w:t xml:space="preserve">, </w:t>
+      </w:r>
+      <w:r>
+        <w:rPr>
+          <w:rFonts w:ascii="Noto Serif SC" w:eastAsia="Noto Serif SC" w:hAnsi="Noto Serif SC" w:cs="Noto Serif" w:hint="eastAsia"/>
+          <w:sz w:val="20"/>
+          <w:szCs w:val="20"/>
+        </w:rPr>
+        <w:t>钟琴</w:t>
+      </w:r>
+      <w:r>
+        <w:rPr>
+          <w:rFonts w:ascii="Noto Serif SC" w:eastAsia="Noto Serif SC" w:hAnsi="Noto Serif SC" w:cs="Noto Serif"/>
+          <w:sz w:val="20"/>
+          <w:szCs w:val="20"/>
+        </w:rPr>
+        <w:t xml:space="preserve"> </w:t>
+      </w:r>
+      <w:r>
+        <w:rPr>
+          <w:rFonts w:ascii="Noto Serif SC" w:eastAsia="Noto Serif SC" w:hAnsi="Noto Serif SC" w:cs="Noto Serif" w:hint="eastAsia"/>
+          <w:sz w:val="20"/>
+          <w:szCs w:val="20"/>
+        </w:rPr>
+        <w:t>(</w:t>
+      </w:r>
+      <w:r>
+        <w:rPr>
+          <w:rFonts w:ascii="Noto Serif SC" w:eastAsia="Noto Serif SC" w:hAnsi="Noto Serif SC" w:cs="Noto Serif"/>
+          <w:sz w:val="20"/>
+          <w:szCs w:val="20"/>
+        </w:rPr>
+        <w:t>Glockenspiel</w:t>
+      </w:r>
+      <w:r>
+        <w:rPr>
+          <w:rFonts w:ascii="Noto Serif SC" w:eastAsia="Noto Serif SC" w:hAnsi="Noto Serif SC" w:cs="Noto Serif" w:hint="eastAsia"/>
+          <w:sz w:val="20"/>
+          <w:szCs w:val="20"/>
+        </w:rPr>
+        <w:t>)</w:t>
+      </w:r>
+      <w:r>
+        <w:rPr>
+          <w:rFonts w:ascii="Noto Serif SC" w:eastAsia="Noto Serif SC" w:hAnsi="Noto Serif SC" w:cs="Noto Serif"/>
+          <w:sz w:val="20"/>
+          <w:szCs w:val="20"/>
+        </w:rPr>
+        <w:t xml:space="preserve">, </w:t>
+      </w:r>
+      <w:r>
+        <w:rPr>
+          <w:rFonts w:ascii="Noto Serif SC" w:eastAsia="Noto Serif SC" w:hAnsi="Noto Serif SC" w:cs="Noto Serif" w:hint="eastAsia"/>
+          <w:sz w:val="20"/>
+          <w:szCs w:val="20"/>
+        </w:rPr>
+        <w:t>云锣</w:t>
+      </w:r>
+      <w:r>
+        <w:rPr>
+          <w:rFonts w:ascii="Noto Serif SC" w:eastAsia="Noto Serif SC" w:hAnsi="Noto Serif SC" w:cs="Noto Serif"/>
+          <w:sz w:val="20"/>
+          <w:szCs w:val="20"/>
+        </w:rPr>
+        <w:t xml:space="preserve"> </w:t>
+      </w:r>
+      <w:r>
+        <w:rPr>
+          <w:rFonts w:ascii="Noto Serif SC" w:eastAsia="Noto Serif SC" w:hAnsi="Noto Serif SC" w:cs="Noto Serif" w:hint="eastAsia"/>
+          <w:sz w:val="20"/>
+          <w:szCs w:val="20"/>
+        </w:rPr>
+        <w:t>(</w:t>
+      </w:r>
+      <w:r>
+        <w:rPr>
+          <w:rFonts w:ascii="Noto Serif SC" w:eastAsia="Noto Serif SC" w:hAnsi="Noto Serif SC" w:cs="Noto Serif"/>
+          <w:sz w:val="20"/>
+          <w:szCs w:val="20"/>
+        </w:rPr>
+        <w:t>Yunluo</w:t>
+      </w:r>
+      <w:r>
+        <w:rPr>
+          <w:rFonts w:ascii="Noto Serif SC" w:eastAsia="Noto Serif SC" w:hAnsi="Noto Serif SC" w:cs="Noto Serif" w:hint="eastAsia"/>
+          <w:sz w:val="20"/>
+          <w:szCs w:val="20"/>
+        </w:rPr>
+        <w:t>)</w:t>
+      </w:r>
+      <w:r>
+        <w:rPr>
+          <w:rFonts w:ascii="Noto Serif SC" w:eastAsia="Noto Serif SC" w:hAnsi="Noto Serif SC" w:cs="Noto Serif"/>
+          <w:sz w:val="20"/>
+          <w:szCs w:val="20"/>
+        </w:rPr>
+        <w:t xml:space="preserve">, </w:t>
+      </w:r>
+      <w:r>
+        <w:rPr>
+          <w:rFonts w:ascii="Noto Serif SC" w:eastAsia="Noto Serif SC" w:hAnsi="Noto Serif SC" w:cs="Noto Serif" w:hint="eastAsia"/>
+          <w:sz w:val="20"/>
+          <w:szCs w:val="20"/>
+        </w:rPr>
+        <w:t>小堂鼓</w:t>
+      </w:r>
+      <w:r>
+        <w:rPr>
+          <w:rFonts w:ascii="Noto Serif SC" w:eastAsia="Noto Serif SC" w:hAnsi="Noto Serif SC" w:cs="Noto Serif"/>
+          <w:sz w:val="20"/>
+          <w:szCs w:val="20"/>
+        </w:rPr>
+        <w:t xml:space="preserve"> </w:t>
+      </w:r>
+      <w:r>
+        <w:rPr>
+          <w:rFonts w:ascii="Noto Serif SC" w:eastAsia="Noto Serif SC" w:hAnsi="Noto Serif SC" w:cs="Noto Serif" w:hint="eastAsia"/>
+          <w:sz w:val="20"/>
+          <w:szCs w:val="20"/>
+        </w:rPr>
+        <w:t>(</w:t>
+      </w:r>
+      <w:proofErr w:type="spellStart"/>
+      <w:r>
+        <w:rPr>
+          <w:rFonts w:ascii="Noto Serif SC" w:eastAsia="Noto Serif SC" w:hAnsi="Noto Serif SC" w:cs="Noto Serif"/>
+          <w:sz w:val="20"/>
+          <w:szCs w:val="20"/>
+        </w:rPr>
+        <w:t>Xiaotanggu</w:t>
+      </w:r>
+      <w:proofErr w:type="spellEnd"/>
+      <w:r>
+        <w:rPr>
+          <w:rFonts w:ascii="Noto Serif SC" w:eastAsia="Noto Serif SC" w:hAnsi="Noto Serif SC" w:cs="Noto Serif" w:hint="eastAsia"/>
+          <w:sz w:val="20"/>
+          <w:szCs w:val="20"/>
+        </w:rPr>
+        <w:t>)</w:t>
+      </w:r>
+      <w:r>
+        <w:rPr>
+          <w:rFonts w:ascii="Noto Serif SC" w:eastAsia="Noto Serif SC" w:hAnsi="Noto Serif SC" w:cs="Noto Serif"/>
+          <w:sz w:val="20"/>
+          <w:szCs w:val="20"/>
+        </w:rPr>
+        <w:t xml:space="preserve">, </w:t>
+      </w:r>
+      <w:r>
+        <w:rPr>
+          <w:rFonts w:ascii="Noto Serif SC" w:eastAsia="Noto Serif SC" w:hAnsi="Noto Serif SC" w:cs="Noto Serif" w:hint="eastAsia"/>
+          <w:sz w:val="20"/>
+          <w:szCs w:val="20"/>
+        </w:rPr>
+        <w:t>排鼓</w:t>
+      </w:r>
+      <w:r>
+        <w:rPr>
+          <w:rFonts w:ascii="Noto Serif SC" w:eastAsia="Noto Serif SC" w:hAnsi="Noto Serif SC" w:cs="Noto Serif"/>
+          <w:sz w:val="20"/>
+          <w:szCs w:val="20"/>
+        </w:rPr>
+        <w:t xml:space="preserve"> </w:t>
+      </w:r>
+      <w:r>
+        <w:rPr>
+          <w:rFonts w:ascii="Noto Serif SC" w:eastAsia="Noto Serif SC" w:hAnsi="Noto Serif SC" w:cs="Noto Serif"/>
+          <w:sz w:val="20"/>
+          <w:szCs w:val="20"/>
           <w:lang w:val="en-GB"/>
         </w:rPr>
-        <w:t>高音唢呐</w:t>
-      </w:r>
-      <w:r>
-        <w:rPr>
-          <w:rFonts w:ascii="Noto Serif SC" w:eastAsia="Noto Serif SC" w:hAnsi="Noto Serif SC" w:cs="Noto Serif"/>
-          <w:sz w:val="24"/>
-          <w:szCs w:val="24"/>
-          <w:lang w:val="en-GB"/>
-        </w:rPr>
-        <w:t xml:space="preserve">  I*, II (</w:t>
+        <w:t>(</w:t>
       </w:r>
       <w:proofErr w:type="spellStart"/>
       <w:r>
         <w:rPr>
           <w:rFonts w:ascii="Noto Serif SC" w:eastAsia="Noto Serif SC" w:hAnsi="Noto Serif SC" w:cs="Noto Serif"/>
-          <w:sz w:val="24"/>
-          <w:szCs w:val="24"/>
-          <w:lang w:val="en-GB"/>
-        </w:rPr>
-        <w:t>Gaoyin</w:t>
+          <w:sz w:val="20"/>
+          <w:szCs w:val="20"/>
+        </w:rPr>
+        <w:t>Paigu</w:t>
       </w:r>
       <w:proofErr w:type="spellEnd"/>
       <w:r>
         <w:rPr>
           <w:rFonts w:ascii="Noto Serif SC" w:eastAsia="Noto Serif SC" w:hAnsi="Noto Serif SC" w:cs="Noto Serif"/>
-          <w:sz w:val="24"/>
-          <w:szCs w:val="24"/>
-          <w:lang w:val="en-GB"/>
+          <w:sz w:val="20"/>
+          <w:szCs w:val="20"/>
+        </w:rPr>
+        <w:t>)</w:t>
+      </w:r>
+      <w:r>
+        <w:rPr>
+          <w:rFonts w:ascii="Noto Serif SC" w:eastAsia="Noto Serif SC" w:hAnsi="Noto Serif SC" w:cs="Noto Serif"/>
+          <w:sz w:val="20"/>
+          <w:szCs w:val="20"/>
+        </w:rPr>
+        <w:t xml:space="preserve">, </w:t>
+      </w:r>
+      <w:r>
+        <w:rPr>
+          <w:rFonts w:ascii="Noto Serif SC" w:eastAsia="Noto Serif SC" w:hAnsi="Noto Serif SC" w:cs="Noto Serif" w:hint="eastAsia"/>
+          <w:sz w:val="20"/>
+          <w:szCs w:val="20"/>
+        </w:rPr>
+        <w:t>木鱼</w:t>
+      </w:r>
+      <w:r>
+        <w:rPr>
+          <w:rFonts w:ascii="Noto Serif SC" w:eastAsia="Noto Serif SC" w:hAnsi="Noto Serif SC" w:cs="Noto Serif"/>
+          <w:sz w:val="20"/>
+          <w:szCs w:val="20"/>
         </w:rPr>
         <w:t xml:space="preserve"> </w:t>
       </w:r>
+      <w:r>
+        <w:rPr>
+          <w:rFonts w:ascii="Noto Serif SC" w:eastAsia="Noto Serif SC" w:hAnsi="Noto Serif SC" w:cs="Noto Serif"/>
+          <w:sz w:val="20"/>
+          <w:szCs w:val="20"/>
+        </w:rPr>
+        <w:t>(</w:t>
+      </w:r>
+      <w:r>
+        <w:rPr>
+          <w:rFonts w:ascii="Noto Serif SC" w:eastAsia="Noto Serif SC" w:hAnsi="Noto Serif SC" w:cs="Noto Serif"/>
+          <w:sz w:val="20"/>
+          <w:szCs w:val="20"/>
+        </w:rPr>
+        <w:t>Chinese Woodblock</w:t>
+      </w:r>
+      <w:r>
+        <w:rPr>
+          <w:rFonts w:ascii="Noto Serif SC" w:eastAsia="Noto Serif SC" w:hAnsi="Noto Serif SC" w:cs="Noto Serif"/>
+          <w:sz w:val="20"/>
+          <w:szCs w:val="20"/>
+        </w:rPr>
+        <w:t>)</w:t>
+      </w:r>
+    </w:p>
+    <w:p>
+      <w:pPr>
+        <w:jc w:val="right"/>
+        <w:rPr>
+          <w:rFonts w:ascii="Noto Serif SC" w:eastAsia="Noto Serif SC" w:hAnsi="Noto Serif SC" w:cs="Noto Serif"/>
+          <w:sz w:val="24"/>
+          <w:szCs w:val="24"/>
+          <w:lang w:val="en-US"/>
+        </w:rPr>
+      </w:pPr>
+      <w:r>
+        <w:rPr>
+          <w:rFonts w:ascii="Noto Serif SC" w:eastAsia="Noto Serif SC" w:hAnsi="Noto Serif SC" w:cs="Noto Serif" w:hint="eastAsia"/>
+          <w:sz w:val="24"/>
+          <w:szCs w:val="24"/>
+          <w:lang w:val="en-US"/>
+        </w:rPr>
+        <w:t>打击乐</w:t>
+      </w:r>
+      <w:r>
+        <w:rPr>
+          <w:rFonts w:ascii="Noto Serif SC" w:eastAsia="Noto Serif SC" w:hAnsi="Noto Serif SC" w:cs="Noto Serif"/>
+          <w:sz w:val="24"/>
+          <w:szCs w:val="24"/>
+          <w:lang w:val="en-US"/>
+        </w:rPr>
+        <w:t xml:space="preserve"> II (Percussion II)</w:t>
+      </w:r>
+    </w:p>
+    <w:p>
+      <w:pPr>
+        <w:jc w:val="right"/>
+        <w:rPr>
+          <w:rFonts w:ascii="Noto Serif SC" w:eastAsia="Noto Serif SC" w:hAnsi="Noto Serif SC" w:cs="Noto Serif"/>
+          <w:sz w:val="20"/>
+          <w:szCs w:val="20"/>
+          <w:lang w:val="en-US"/>
+        </w:rPr>
+      </w:pPr>
+      <w:r>
+        <w:rPr>
+          <w:rFonts w:ascii="Noto Serif SC" w:eastAsia="Noto Serif SC" w:hAnsi="Noto Serif SC" w:cs="Noto Serif" w:hint="eastAsia"/>
+          <w:sz w:val="20"/>
+          <w:szCs w:val="20"/>
+        </w:rPr>
+        <w:t>中国木鱼</w:t>
+      </w:r>
+      <w:r>
+        <w:rPr>
+          <w:rFonts w:ascii="Noto Serif SC" w:eastAsia="Noto Serif SC" w:hAnsi="Noto Serif SC" w:cs="Noto Serif"/>
+          <w:sz w:val="20"/>
+          <w:szCs w:val="20"/>
+        </w:rPr>
+        <w:t xml:space="preserve"> </w:t>
+      </w:r>
+      <w:r>
+        <w:rPr>
+          <w:rFonts w:ascii="Noto Serif SC" w:eastAsia="Noto Serif SC" w:hAnsi="Noto Serif SC" w:cs="Noto Serif"/>
+          <w:sz w:val="20"/>
+          <w:szCs w:val="20"/>
+        </w:rPr>
+        <w:t>(</w:t>
+      </w:r>
+      <w:r>
+        <w:rPr>
+          <w:rFonts w:ascii="Noto Serif SC" w:eastAsia="Noto Serif SC" w:hAnsi="Noto Serif SC" w:cs="Noto Serif"/>
+          <w:sz w:val="20"/>
+          <w:szCs w:val="20"/>
+        </w:rPr>
+        <w:t>Chinese Woodblock</w:t>
+      </w:r>
+      <w:r>
+        <w:rPr>
+          <w:rFonts w:ascii="Noto Serif SC" w:eastAsia="Noto Serif SC" w:hAnsi="Noto Serif SC" w:cs="Noto Serif"/>
+          <w:sz w:val="20"/>
+          <w:szCs w:val="20"/>
+        </w:rPr>
+        <w:t>)</w:t>
+      </w:r>
+      <w:r>
+        <w:rPr>
+          <w:rFonts w:ascii="Noto Serif SC" w:eastAsia="Noto Serif SC" w:hAnsi="Noto Serif SC" w:cs="Noto Serif"/>
+          <w:sz w:val="20"/>
+          <w:szCs w:val="20"/>
+        </w:rPr>
+        <w:t xml:space="preserve">, </w:t>
+      </w:r>
+      <w:r>
+        <w:rPr>
+          <w:rFonts w:ascii="Noto Serif SC" w:eastAsia="Noto Serif SC" w:hAnsi="Noto Serif SC" w:cs="Noto Serif" w:hint="eastAsia"/>
+          <w:sz w:val="20"/>
+          <w:szCs w:val="20"/>
+        </w:rPr>
+        <w:t>颤音琴</w:t>
+      </w:r>
+      <w:r>
+        <w:rPr>
+          <w:rFonts w:ascii="Noto Serif SC" w:eastAsia="Noto Serif SC" w:hAnsi="Noto Serif SC" w:cs="Noto Serif"/>
+          <w:sz w:val="20"/>
+          <w:szCs w:val="20"/>
+        </w:rPr>
+        <w:t xml:space="preserve"> </w:t>
+      </w:r>
+      <w:r>
+        <w:rPr>
+          <w:rFonts w:ascii="Noto Serif SC" w:eastAsia="Noto Serif SC" w:hAnsi="Noto Serif SC" w:cs="Noto Serif"/>
+          <w:sz w:val="20"/>
+          <w:szCs w:val="20"/>
+        </w:rPr>
+        <w:t>(</w:t>
+      </w:r>
+      <w:r>
+        <w:rPr>
+          <w:rFonts w:ascii="Noto Serif SC" w:eastAsia="Noto Serif SC" w:hAnsi="Noto Serif SC" w:cs="Noto Serif"/>
+          <w:sz w:val="20"/>
+          <w:szCs w:val="20"/>
+        </w:rPr>
+        <w:t>Vibraphone</w:t>
+      </w:r>
+      <w:r>
+        <w:rPr>
+          <w:rFonts w:ascii="Noto Serif SC" w:eastAsia="Noto Serif SC" w:hAnsi="Noto Serif SC" w:cs="Noto Serif"/>
+          <w:sz w:val="20"/>
+          <w:szCs w:val="20"/>
+        </w:rPr>
+        <w:t>)</w:t>
+      </w:r>
+      <w:r>
+        <w:rPr>
+          <w:rFonts w:ascii="Noto Serif SC" w:eastAsia="Noto Serif SC" w:hAnsi="Noto Serif SC" w:cs="Noto Serif"/>
+          <w:sz w:val="20"/>
+          <w:szCs w:val="20"/>
+        </w:rPr>
+        <w:t xml:space="preserve">, </w:t>
+      </w:r>
+      <w:r>
+        <w:rPr>
+          <w:rFonts w:ascii="Noto Serif SC" w:eastAsia="Noto Serif SC" w:hAnsi="Noto Serif SC" w:cs="Noto Serif" w:hint="eastAsia"/>
+          <w:sz w:val="20"/>
+          <w:szCs w:val="20"/>
+        </w:rPr>
+        <w:t>大钹</w:t>
+      </w:r>
+      <w:r>
+        <w:rPr>
+          <w:rFonts w:ascii="Noto Serif SC" w:eastAsia="Noto Serif SC" w:hAnsi="Noto Serif SC" w:cs="Noto Serif"/>
+          <w:sz w:val="20"/>
+          <w:szCs w:val="20"/>
+        </w:rPr>
+        <w:t xml:space="preserve"> </w:t>
+      </w:r>
+      <w:r>
+        <w:rPr>
+          <w:rFonts w:ascii="Noto Serif SC" w:eastAsia="Noto Serif SC" w:hAnsi="Noto Serif SC" w:cs="Noto Serif"/>
+          <w:sz w:val="20"/>
+          <w:szCs w:val="20"/>
+        </w:rPr>
+        <w:t>(</w:t>
+      </w:r>
+      <w:r>
+        <w:rPr>
+          <w:rFonts w:ascii="Noto Serif SC" w:eastAsia="Noto Serif SC" w:hAnsi="Noto Serif SC" w:cs="Noto Serif"/>
+          <w:sz w:val="20"/>
+          <w:szCs w:val="20"/>
+        </w:rPr>
+        <w:t>Dabo</w:t>
+      </w:r>
+      <w:r>
+        <w:rPr>
+          <w:rFonts w:ascii="Noto Serif SC" w:eastAsia="Noto Serif SC" w:hAnsi="Noto Serif SC" w:cs="Noto Serif"/>
+          <w:sz w:val="20"/>
+          <w:szCs w:val="20"/>
+        </w:rPr>
+        <w:t>)</w:t>
+      </w:r>
+      <w:r>
+        <w:rPr>
+          <w:rFonts w:ascii="Noto Serif SC" w:eastAsia="Noto Serif SC" w:hAnsi="Noto Serif SC" w:cs="Noto Serif"/>
+          <w:sz w:val="20"/>
+          <w:szCs w:val="20"/>
+        </w:rPr>
+        <w:t xml:space="preserve">, </w:t>
+      </w:r>
+      <w:r>
+        <w:rPr>
+          <w:rFonts w:ascii="Noto Serif SC" w:eastAsia="Noto Serif SC" w:hAnsi="Noto Serif SC" w:cs="Noto Serif" w:hint="eastAsia"/>
+          <w:sz w:val="20"/>
+          <w:szCs w:val="20"/>
+        </w:rPr>
+        <w:t>排鼓</w:t>
+      </w:r>
+      <w:r>
+        <w:rPr>
+          <w:rFonts w:ascii="Noto Serif SC" w:eastAsia="Noto Serif SC" w:hAnsi="Noto Serif SC" w:cs="Noto Serif"/>
+          <w:sz w:val="20"/>
+          <w:szCs w:val="20"/>
+        </w:rPr>
+        <w:t xml:space="preserve"> </w:t>
+      </w:r>
+      <w:r>
+        <w:rPr>
+          <w:rFonts w:ascii="Noto Serif SC" w:eastAsia="Noto Serif SC" w:hAnsi="Noto Serif SC" w:cs="Noto Serif"/>
+          <w:sz w:val="20"/>
+          <w:szCs w:val="20"/>
+        </w:rPr>
+        <w:t>(</w:t>
+      </w:r>
       <w:proofErr w:type="spellStart"/>
       <w:r>
         <w:rPr>
           <w:rFonts w:ascii="Noto Serif SC" w:eastAsia="Noto Serif SC" w:hAnsi="Noto Serif SC" w:cs="Noto Serif"/>
-          <w:sz w:val="24"/>
-          <w:szCs w:val="24"/>
-          <w:lang w:val="en-GB"/>
-        </w:rPr>
-        <w:t>Suona</w:t>
+          <w:sz w:val="20"/>
+          <w:szCs w:val="20"/>
+        </w:rPr>
+        <w:t>Paigu</w:t>
       </w:r>
       <w:proofErr w:type="spellEnd"/>
       <w:r>
         <w:rPr>
           <w:rFonts w:ascii="Noto Serif SC" w:eastAsia="Noto Serif SC" w:hAnsi="Noto Serif SC" w:cs="Noto Serif"/>
-          <w:sz w:val="24"/>
-          <w:szCs w:val="24"/>
-          <w:lang w:val="en-GB"/>
-        </w:rPr>
-        <w:t xml:space="preserve"> I*, II)</w:t>
+          <w:sz w:val="20"/>
+          <w:szCs w:val="20"/>
+        </w:rPr>
+        <w:t>)</w:t>
+      </w:r>
+      <w:r>
+        <w:rPr>
+          <w:rFonts w:ascii="Noto Serif SC" w:eastAsia="Noto Serif SC" w:hAnsi="Noto Serif SC" w:cs="Noto Serif"/>
+          <w:sz w:val="20"/>
+          <w:szCs w:val="20"/>
+        </w:rPr>
+        <w:t xml:space="preserve">, </w:t>
+      </w:r>
+      <w:r>
+        <w:rPr>
+          <w:rFonts w:ascii="Noto Serif SC" w:eastAsia="Noto Serif SC" w:hAnsi="Noto Serif SC" w:cs="Noto Serif" w:hint="eastAsia"/>
+          <w:sz w:val="20"/>
+          <w:szCs w:val="20"/>
+        </w:rPr>
+        <w:t>军镲</w:t>
+      </w:r>
+      <w:r>
+        <w:rPr>
+          <w:rFonts w:ascii="Noto Serif SC" w:eastAsia="Noto Serif SC" w:hAnsi="Noto Serif SC" w:cs="Noto Serif"/>
+          <w:sz w:val="20"/>
+          <w:szCs w:val="20"/>
+        </w:rPr>
+        <w:t xml:space="preserve"> </w:t>
+      </w:r>
+      <w:r>
+        <w:rPr>
+          <w:rFonts w:ascii="Noto Serif SC" w:eastAsia="Noto Serif SC" w:hAnsi="Noto Serif SC" w:cs="Noto Serif"/>
+          <w:sz w:val="20"/>
+          <w:szCs w:val="20"/>
+        </w:rPr>
+        <w:t>(</w:t>
+      </w:r>
+      <w:r>
+        <w:rPr>
+          <w:rFonts w:ascii="Noto Serif SC" w:eastAsia="Noto Serif SC" w:hAnsi="Noto Serif SC" w:cs="Noto Serif"/>
+          <w:sz w:val="20"/>
+          <w:szCs w:val="20"/>
+        </w:rPr>
+        <w:t>Cymbals</w:t>
+      </w:r>
+      <w:r>
+        <w:rPr>
+          <w:rFonts w:ascii="Noto Serif SC" w:eastAsia="Noto Serif SC" w:hAnsi="Noto Serif SC" w:cs="Noto Serif"/>
+          <w:sz w:val="20"/>
+          <w:szCs w:val="20"/>
+        </w:rPr>
+        <w:t>)</w:t>
+      </w:r>
+      <w:r>
+        <w:rPr>
+          <w:rFonts w:ascii="Noto Serif SC" w:eastAsia="Noto Serif SC" w:hAnsi="Noto Serif SC" w:cs="Noto Serif"/>
+          <w:sz w:val="20"/>
+          <w:szCs w:val="20"/>
+        </w:rPr>
+        <w:t xml:space="preserve">, </w:t>
+      </w:r>
+      <w:r>
+        <w:rPr>
+          <w:rFonts w:ascii="Noto Serif SC" w:eastAsia="Noto Serif SC" w:hAnsi="Noto Serif SC" w:cs="Noto Serif" w:hint="eastAsia"/>
+          <w:sz w:val="20"/>
+          <w:szCs w:val="20"/>
+        </w:rPr>
+        <w:t>通通鼓</w:t>
+      </w:r>
+      <w:r>
+        <w:rPr>
+          <w:rFonts w:ascii="Noto Serif SC" w:eastAsia="Noto Serif SC" w:hAnsi="Noto Serif SC" w:cs="Noto Serif"/>
+          <w:sz w:val="20"/>
+          <w:szCs w:val="20"/>
+        </w:rPr>
+        <w:t xml:space="preserve"> </w:t>
+      </w:r>
+      <w:r>
+        <w:rPr>
+          <w:rFonts w:ascii="Noto Serif SC" w:eastAsia="Noto Serif SC" w:hAnsi="Noto Serif SC" w:cs="Noto Serif"/>
+          <w:sz w:val="20"/>
+          <w:szCs w:val="20"/>
+        </w:rPr>
+        <w:t>(</w:t>
+      </w:r>
+      <w:r>
+        <w:rPr>
+          <w:rFonts w:ascii="Noto Serif SC" w:eastAsia="Noto Serif SC" w:hAnsi="Noto Serif SC" w:cs="Noto Serif"/>
+          <w:sz w:val="20"/>
+          <w:szCs w:val="20"/>
+        </w:rPr>
+        <w:t>Tom-toms</w:t>
+      </w:r>
+      <w:r>
+        <w:rPr>
+          <w:rFonts w:ascii="Noto Serif SC" w:eastAsia="Noto Serif SC" w:hAnsi="Noto Serif SC" w:cs="Noto Serif"/>
+          <w:sz w:val="20"/>
+          <w:szCs w:val="20"/>
+        </w:rPr>
+        <w:t>)</w:t>
       </w:r>
     </w:p>
     <w:p>
@@ -4020,30 +5260,278 @@
       </w:pPr>
       <w:r>
         <w:rPr>
-          <w:rFonts w:ascii="Noto Serif SC" w:eastAsia="Noto Serif SC" w:hAnsi="Noto Serif SC" w:cs="Noto Serif"/>
-          <w:sz w:val="20"/>
-          <w:szCs w:val="20"/>
-          <w:lang w:val="en-GB"/>
-        </w:rPr>
-        <w:t xml:space="preserve"> I* </w:t>
-      </w:r>
-      <w:r>
-        <w:rPr>
-          <w:rFonts w:ascii="Noto Serif SC" w:eastAsia="Noto Serif SC" w:hAnsi="Noto Serif SC" w:cs="Noto Serif" w:hint="eastAsia"/>
-          <w:sz w:val="20"/>
-          <w:szCs w:val="20"/>
-          <w:lang w:val="en-GB"/>
-        </w:rPr>
-        <w:t>兼奏高音管</w:t>
-      </w:r>
-      <w:r>
-        <w:rPr>
-          <w:rFonts w:ascii="Noto Serif SC" w:eastAsia="Noto Serif SC" w:hAnsi="Noto Serif SC" w:cs="Noto Serif"/>
-          <w:sz w:val="20"/>
-          <w:szCs w:val="20"/>
-          <w:lang w:val="en-GB"/>
-        </w:rPr>
-        <w:t xml:space="preserve"> (I* </w:t>
+          <w:rFonts w:ascii="Noto Serif SC" w:eastAsia="Noto Serif SC" w:hAnsi="Noto Serif SC" w:cs="Noto Serif" w:hint="eastAsia"/>
+          <w:sz w:val="24"/>
+          <w:szCs w:val="24"/>
+          <w:lang w:val="en-US"/>
+        </w:rPr>
+        <w:t>打击乐</w:t>
+      </w:r>
+      <w:r>
+        <w:rPr>
+          <w:rFonts w:ascii="Noto Serif SC" w:eastAsia="Noto Serif SC" w:hAnsi="Noto Serif SC" w:cs="Noto Serif"/>
+          <w:sz w:val="24"/>
+          <w:szCs w:val="24"/>
+          <w:lang w:val="en-US"/>
+        </w:rPr>
+        <w:t xml:space="preserve"> III (Percussion III)</w:t>
+      </w:r>
+    </w:p>
+    <w:p>
+      <w:pPr>
+        <w:jc w:val="right"/>
+        <w:rPr>
+          <w:rFonts w:ascii="Noto Serif SC" w:eastAsia="Noto Serif SC" w:hAnsi="Noto Serif SC" w:cs="Noto Serif"/>
+          <w:sz w:val="20"/>
+          <w:szCs w:val="20"/>
+        </w:rPr>
+      </w:pPr>
+      <w:r>
+        <w:rPr>
+          <w:rFonts w:ascii="Noto Serif SC" w:eastAsia="Noto Serif SC" w:hAnsi="Noto Serif SC" w:cs="Noto Serif" w:hint="eastAsia"/>
+          <w:sz w:val="20"/>
+          <w:szCs w:val="20"/>
+        </w:rPr>
+        <w:t>木琴</w:t>
+      </w:r>
+      <w:r>
+        <w:rPr>
+          <w:rFonts w:ascii="Noto Serif SC" w:eastAsia="Noto Serif SC" w:hAnsi="Noto Serif SC" w:cs="Noto Serif"/>
+          <w:sz w:val="20"/>
+          <w:szCs w:val="20"/>
+        </w:rPr>
+        <w:t xml:space="preserve"> </w:t>
+      </w:r>
+      <w:r>
+        <w:rPr>
+          <w:rFonts w:ascii="Noto Serif SC" w:eastAsia="Noto Serif SC" w:hAnsi="Noto Serif SC" w:cs="Noto Serif"/>
+          <w:sz w:val="20"/>
+          <w:szCs w:val="20"/>
+        </w:rPr>
+        <w:t>(</w:t>
+      </w:r>
+      <w:r>
+        <w:rPr>
+          <w:rFonts w:ascii="Noto Serif SC" w:eastAsia="Noto Serif SC" w:hAnsi="Noto Serif SC" w:cs="Noto Serif"/>
+          <w:sz w:val="20"/>
+          <w:szCs w:val="20"/>
+        </w:rPr>
+        <w:t>Xylophone</w:t>
+      </w:r>
+      <w:r>
+        <w:rPr>
+          <w:rFonts w:ascii="Noto Serif SC" w:eastAsia="Noto Serif SC" w:hAnsi="Noto Serif SC" w:cs="Noto Serif"/>
+          <w:sz w:val="20"/>
+          <w:szCs w:val="20"/>
+        </w:rPr>
+        <w:t>)</w:t>
+      </w:r>
+      <w:r>
+        <w:rPr>
+          <w:rFonts w:ascii="Noto Serif SC" w:eastAsia="Noto Serif SC" w:hAnsi="Noto Serif SC" w:cs="Noto Serif"/>
+          <w:sz w:val="20"/>
+          <w:szCs w:val="20"/>
+        </w:rPr>
+        <w:t xml:space="preserve">, </w:t>
+      </w:r>
+      <w:r>
+        <w:rPr>
+          <w:rFonts w:ascii="Noto Serif SC" w:eastAsia="Noto Serif SC" w:hAnsi="Noto Serif SC" w:cs="Noto Serif" w:hint="eastAsia"/>
+          <w:sz w:val="20"/>
+          <w:szCs w:val="20"/>
+        </w:rPr>
+        <w:t>通通鼓</w:t>
+      </w:r>
+      <w:r>
+        <w:rPr>
+          <w:rFonts w:ascii="Noto Serif SC" w:eastAsia="Noto Serif SC" w:hAnsi="Noto Serif SC" w:cs="Noto Serif"/>
+          <w:sz w:val="20"/>
+          <w:szCs w:val="20"/>
+        </w:rPr>
+        <w:t xml:space="preserve"> </w:t>
+      </w:r>
+      <w:r>
+        <w:rPr>
+          <w:rFonts w:ascii="Noto Serif SC" w:eastAsia="Noto Serif SC" w:hAnsi="Noto Serif SC" w:cs="Noto Serif"/>
+          <w:sz w:val="20"/>
+          <w:szCs w:val="20"/>
+        </w:rPr>
+        <w:t>(</w:t>
+      </w:r>
+      <w:r>
+        <w:rPr>
+          <w:rFonts w:ascii="Noto Serif SC" w:eastAsia="Noto Serif SC" w:hAnsi="Noto Serif SC" w:cs="Noto Serif"/>
+          <w:sz w:val="20"/>
+          <w:szCs w:val="20"/>
+        </w:rPr>
+        <w:t>Tom-toms</w:t>
+      </w:r>
+      <w:r>
+        <w:rPr>
+          <w:rFonts w:ascii="Noto Serif SC" w:eastAsia="Noto Serif SC" w:hAnsi="Noto Serif SC" w:cs="Noto Serif"/>
+          <w:sz w:val="20"/>
+          <w:szCs w:val="20"/>
+        </w:rPr>
+        <w:t>)</w:t>
+      </w:r>
+      <w:r>
+        <w:rPr>
+          <w:rFonts w:ascii="Noto Serif SC" w:eastAsia="Noto Serif SC" w:hAnsi="Noto Serif SC" w:cs="Noto Serif"/>
+          <w:sz w:val="20"/>
+          <w:szCs w:val="20"/>
+        </w:rPr>
+        <w:t xml:space="preserve">, </w:t>
+      </w:r>
+      <w:r>
+        <w:rPr>
+          <w:rFonts w:ascii="Noto Serif SC" w:eastAsia="Noto Serif SC" w:hAnsi="Noto Serif SC" w:cs="Noto Serif" w:hint="eastAsia"/>
+          <w:sz w:val="20"/>
+          <w:szCs w:val="20"/>
+        </w:rPr>
+        <w:t>乐鞭</w:t>
+      </w:r>
+      <w:r>
+        <w:rPr>
+          <w:rFonts w:ascii="Noto Serif SC" w:eastAsia="Noto Serif SC" w:hAnsi="Noto Serif SC" w:cs="Noto Serif"/>
+          <w:sz w:val="20"/>
+          <w:szCs w:val="20"/>
+        </w:rPr>
+        <w:t xml:space="preserve"> </w:t>
+      </w:r>
+      <w:r>
+        <w:rPr>
+          <w:rFonts w:ascii="Noto Serif SC" w:eastAsia="Noto Serif SC" w:hAnsi="Noto Serif SC" w:cs="Noto Serif"/>
+          <w:sz w:val="20"/>
+          <w:szCs w:val="20"/>
+        </w:rPr>
+        <w:t>(</w:t>
+      </w:r>
+      <w:r>
+        <w:rPr>
+          <w:rFonts w:ascii="Noto Serif SC" w:eastAsia="Noto Serif SC" w:hAnsi="Noto Serif SC" w:cs="Noto Serif"/>
+          <w:sz w:val="20"/>
+          <w:szCs w:val="20"/>
+        </w:rPr>
+        <w:t>Whip</w:t>
+      </w:r>
+      <w:r>
+        <w:rPr>
+          <w:rFonts w:ascii="Noto Serif SC" w:eastAsia="Noto Serif SC" w:hAnsi="Noto Serif SC" w:cs="Noto Serif"/>
+          <w:sz w:val="20"/>
+          <w:szCs w:val="20"/>
+        </w:rPr>
+        <w:t>)</w:t>
+      </w:r>
+      <w:r>
+        <w:rPr>
+          <w:rFonts w:ascii="Noto Serif SC" w:eastAsia="Noto Serif SC" w:hAnsi="Noto Serif SC" w:cs="Noto Serif"/>
+          <w:sz w:val="20"/>
+          <w:szCs w:val="20"/>
+        </w:rPr>
+        <w:t xml:space="preserve">, </w:t>
+      </w:r>
+      <w:r>
+        <w:rPr>
+          <w:rFonts w:ascii="Noto Serif SC" w:eastAsia="Noto Serif SC" w:hAnsi="Noto Serif SC" w:cs="Noto Serif" w:hint="eastAsia"/>
+          <w:sz w:val="20"/>
+          <w:szCs w:val="20"/>
+        </w:rPr>
+        <w:t>康嘎鼓</w:t>
+      </w:r>
+      <w:r>
+        <w:rPr>
+          <w:rFonts w:ascii="Noto Serif SC" w:eastAsia="Noto Serif SC" w:hAnsi="Noto Serif SC" w:cs="Noto Serif"/>
+          <w:sz w:val="20"/>
+          <w:szCs w:val="20"/>
+        </w:rPr>
+        <w:t xml:space="preserve"> </w:t>
+      </w:r>
+      <w:r>
+        <w:rPr>
+          <w:rFonts w:ascii="Noto Serif SC" w:eastAsia="Noto Serif SC" w:hAnsi="Noto Serif SC" w:cs="Noto Serif"/>
+          <w:sz w:val="20"/>
+          <w:szCs w:val="20"/>
+        </w:rPr>
+        <w:t>(</w:t>
+      </w:r>
+      <w:r>
+        <w:rPr>
+          <w:rFonts w:ascii="Noto Serif SC" w:eastAsia="Noto Serif SC" w:hAnsi="Noto Serif SC" w:cs="Noto Serif"/>
+          <w:sz w:val="20"/>
+          <w:szCs w:val="20"/>
+        </w:rPr>
+        <w:t>Congas</w:t>
+      </w:r>
+      <w:r>
+        <w:rPr>
+          <w:rFonts w:ascii="Noto Serif SC" w:eastAsia="Noto Serif SC" w:hAnsi="Noto Serif SC" w:cs="Noto Serif"/>
+          <w:sz w:val="20"/>
+          <w:szCs w:val="20"/>
+        </w:rPr>
+        <w:t>)</w:t>
+      </w:r>
+    </w:p>
+    <w:p>
+      <w:pPr>
+        <w:jc w:val="right"/>
+        <w:rPr>
+          <w:rFonts w:ascii="Noto Serif SC" w:eastAsia="Noto Serif SC" w:hAnsi="Noto Serif SC" w:cs="Noto Serif"/>
+          <w:sz w:val="24"/>
+          <w:szCs w:val="24"/>
+          <w:lang w:val="en-US"/>
+        </w:rPr>
+      </w:pPr>
+      <w:r>
+        <w:rPr>
+          <w:rFonts w:ascii="Noto Serif SC" w:eastAsia="Noto Serif SC" w:hAnsi="Noto Serif SC" w:cs="Noto Serif" w:hint="eastAsia"/>
+          <w:sz w:val="24"/>
+          <w:szCs w:val="24"/>
+          <w:lang w:val="en-US"/>
+        </w:rPr>
+        <w:t>打击乐</w:t>
+      </w:r>
+      <w:r>
+        <w:rPr>
+          <w:rFonts w:ascii="Noto Serif SC" w:eastAsia="Noto Serif SC" w:hAnsi="Noto Serif SC" w:cs="Noto Serif"/>
+          <w:sz w:val="24"/>
+          <w:szCs w:val="24"/>
+          <w:lang w:val="en-US"/>
+        </w:rPr>
+        <w:t xml:space="preserve"> IV (Percussion IV)</w:t>
+      </w:r>
+    </w:p>
+    <w:p>
+      <w:pPr>
+        <w:jc w:val="right"/>
+        <w:rPr>
+          <w:rFonts w:ascii="Noto Serif SC" w:eastAsia="Noto Serif SC" w:hAnsi="Noto Serif SC" w:cs="Noto Serif"/>
+          <w:sz w:val="20"/>
+          <w:szCs w:val="20"/>
+        </w:rPr>
+      </w:pPr>
+      <w:r>
+        <w:rPr>
+          <w:rFonts w:ascii="Noto Serif SC" w:eastAsia="Noto Serif SC" w:hAnsi="Noto Serif SC" w:cs="Noto Serif" w:hint="eastAsia"/>
+          <w:sz w:val="20"/>
+          <w:szCs w:val="20"/>
+        </w:rPr>
+        <w:t>编钟</w:t>
+      </w:r>
+      <w:r>
+        <w:rPr>
+          <w:rFonts w:ascii="Noto Serif SC" w:eastAsia="Noto Serif SC" w:hAnsi="Noto Serif SC" w:cs="Noto Serif"/>
+          <w:sz w:val="20"/>
+          <w:szCs w:val="20"/>
+        </w:rPr>
+        <w:t xml:space="preserve"> </w:t>
+      </w:r>
+      <w:r>
+        <w:rPr>
+          <w:rFonts w:ascii="Noto Serif SC" w:eastAsia="Noto Serif SC" w:hAnsi="Noto Serif SC" w:cs="Noto Serif"/>
+          <w:sz w:val="20"/>
+          <w:szCs w:val="20"/>
+        </w:rPr>
+        <w:t>(</w:t>
       </w:r>
       <w:proofErr w:type="spellStart"/>
       <w:r>
@@ -4051,9 +5539,8 @@
           <w:rFonts w:ascii="Noto Serif SC" w:eastAsia="Noto Serif SC" w:hAnsi="Noto Serif SC" w:cs="Noto Serif"/>
           <w:sz w:val="20"/>
           <w:szCs w:val="20"/>
-          <w:lang w:val="en-GB"/>
-        </w:rPr>
-        <w:t>doub</w:t>
+        </w:rPr>
+        <w:t>Bianzhong</w:t>
       </w:r>
       <w:proofErr w:type="spellEnd"/>
       <w:r>
@@ -4061,9 +5548,215 @@
           <w:rFonts w:ascii="Noto Serif SC" w:eastAsia="Noto Serif SC" w:hAnsi="Noto Serif SC" w:cs="Noto Serif"/>
           <w:sz w:val="20"/>
           <w:szCs w:val="20"/>
-          <w:lang w:val="en-GB"/>
-        </w:rPr>
-        <w:t xml:space="preserve">. </w:t>
+        </w:rPr>
+        <w:t>)</w:t>
+      </w:r>
+      <w:r>
+        <w:rPr>
+          <w:rFonts w:ascii="Noto Serif SC" w:eastAsia="Noto Serif SC" w:hAnsi="Noto Serif SC" w:cs="Noto Serif"/>
+          <w:sz w:val="20"/>
+          <w:szCs w:val="20"/>
+        </w:rPr>
+        <w:t xml:space="preserve">, </w:t>
+      </w:r>
+      <w:r>
+        <w:rPr>
+          <w:rFonts w:ascii="Noto Serif SC" w:eastAsia="Noto Serif SC" w:hAnsi="Noto Serif SC" w:cs="Noto Serif" w:hint="eastAsia"/>
+          <w:sz w:val="20"/>
+          <w:szCs w:val="20"/>
+        </w:rPr>
+        <w:t>通通鼓</w:t>
+      </w:r>
+      <w:r>
+        <w:rPr>
+          <w:rFonts w:ascii="Noto Serif SC" w:eastAsia="Noto Serif SC" w:hAnsi="Noto Serif SC" w:cs="Noto Serif"/>
+          <w:sz w:val="20"/>
+          <w:szCs w:val="20"/>
+        </w:rPr>
+        <w:t xml:space="preserve"> </w:t>
+      </w:r>
+      <w:r>
+        <w:rPr>
+          <w:rFonts w:ascii="Noto Serif SC" w:eastAsia="Noto Serif SC" w:hAnsi="Noto Serif SC" w:cs="Noto Serif"/>
+          <w:sz w:val="20"/>
+          <w:szCs w:val="20"/>
+        </w:rPr>
+        <w:t>(</w:t>
+      </w:r>
+      <w:r>
+        <w:rPr>
+          <w:rFonts w:ascii="Noto Serif SC" w:eastAsia="Noto Serif SC" w:hAnsi="Noto Serif SC" w:cs="Noto Serif"/>
+          <w:sz w:val="20"/>
+          <w:szCs w:val="20"/>
+        </w:rPr>
+        <w:t>Tom-toms</w:t>
+      </w:r>
+      <w:r>
+        <w:rPr>
+          <w:rFonts w:ascii="Noto Serif SC" w:eastAsia="Noto Serif SC" w:hAnsi="Noto Serif SC" w:cs="Noto Serif"/>
+          <w:sz w:val="20"/>
+          <w:szCs w:val="20"/>
+        </w:rPr>
+        <w:t>)</w:t>
+      </w:r>
+      <w:r>
+        <w:rPr>
+          <w:rFonts w:ascii="Noto Serif SC" w:eastAsia="Noto Serif SC" w:hAnsi="Noto Serif SC" w:cs="Noto Serif"/>
+          <w:sz w:val="20"/>
+          <w:szCs w:val="20"/>
+        </w:rPr>
+        <w:t xml:space="preserve">, </w:t>
+      </w:r>
+      <w:r>
+        <w:rPr>
+          <w:rFonts w:ascii="Noto Serif SC" w:eastAsia="Noto Serif SC" w:hAnsi="Noto Serif SC" w:cs="Noto Serif" w:hint="eastAsia"/>
+          <w:sz w:val="20"/>
+          <w:szCs w:val="20"/>
+        </w:rPr>
+        <w:t>马林巴</w:t>
+      </w:r>
+      <w:r>
+        <w:rPr>
+          <w:rFonts w:ascii="Noto Serif SC" w:eastAsia="Noto Serif SC" w:hAnsi="Noto Serif SC" w:cs="Noto Serif"/>
+          <w:sz w:val="20"/>
+          <w:szCs w:val="20"/>
+        </w:rPr>
+        <w:t xml:space="preserve"> </w:t>
+      </w:r>
+      <w:r>
+        <w:rPr>
+          <w:rFonts w:ascii="Noto Serif SC" w:eastAsia="Noto Serif SC" w:hAnsi="Noto Serif SC" w:cs="Noto Serif"/>
+          <w:sz w:val="20"/>
+          <w:szCs w:val="20"/>
+        </w:rPr>
+        <w:t>(</w:t>
+      </w:r>
+      <w:r>
+        <w:rPr>
+          <w:rFonts w:ascii="Noto Serif SC" w:eastAsia="Noto Serif SC" w:hAnsi="Noto Serif SC" w:cs="Noto Serif"/>
+          <w:sz w:val="20"/>
+          <w:szCs w:val="20"/>
+        </w:rPr>
+        <w:t>Marimba</w:t>
+      </w:r>
+      <w:r>
+        <w:rPr>
+          <w:rFonts w:ascii="Noto Serif SC" w:eastAsia="Noto Serif SC" w:hAnsi="Noto Serif SC" w:cs="Noto Serif"/>
+          <w:sz w:val="20"/>
+          <w:szCs w:val="20"/>
+        </w:rPr>
+        <w:t>)</w:t>
+      </w:r>
+      <w:r>
+        <w:rPr>
+          <w:rFonts w:ascii="Noto Serif SC" w:eastAsia="Noto Serif SC" w:hAnsi="Noto Serif SC" w:cs="Noto Serif"/>
+          <w:sz w:val="20"/>
+          <w:szCs w:val="20"/>
+        </w:rPr>
+        <w:t xml:space="preserve">, </w:t>
+      </w:r>
+      <w:r>
+        <w:rPr>
+          <w:rFonts w:ascii="Noto Serif SC" w:eastAsia="Noto Serif SC" w:hAnsi="Noto Serif SC" w:cs="Noto Serif" w:hint="eastAsia"/>
+          <w:sz w:val="20"/>
+          <w:szCs w:val="20"/>
+        </w:rPr>
+        <w:t>军镲</w:t>
+      </w:r>
+      <w:r>
+        <w:rPr>
+          <w:rFonts w:ascii="Noto Serif SC" w:eastAsia="Noto Serif SC" w:hAnsi="Noto Serif SC" w:cs="Noto Serif"/>
+          <w:sz w:val="20"/>
+          <w:szCs w:val="20"/>
+        </w:rPr>
+        <w:t xml:space="preserve"> </w:t>
+      </w:r>
+      <w:r>
+        <w:rPr>
+          <w:rFonts w:ascii="Noto Serif SC" w:eastAsia="Noto Serif SC" w:hAnsi="Noto Serif SC" w:cs="Noto Serif"/>
+          <w:sz w:val="20"/>
+          <w:szCs w:val="20"/>
+        </w:rPr>
+        <w:t>(</w:t>
+      </w:r>
+      <w:r>
+        <w:rPr>
+          <w:rFonts w:ascii="Noto Serif SC" w:eastAsia="Noto Serif SC" w:hAnsi="Noto Serif SC" w:cs="Noto Serif"/>
+          <w:sz w:val="20"/>
+          <w:szCs w:val="20"/>
+        </w:rPr>
+        <w:t>Cymbals</w:t>
+      </w:r>
+      <w:r>
+        <w:rPr>
+          <w:rFonts w:ascii="Noto Serif SC" w:eastAsia="Noto Serif SC" w:hAnsi="Noto Serif SC" w:cs="Noto Serif"/>
+          <w:sz w:val="20"/>
+          <w:szCs w:val="20"/>
+        </w:rPr>
+        <w:t>)</w:t>
+      </w:r>
+    </w:p>
+    <w:p>
+      <w:pPr>
+        <w:jc w:val="right"/>
+        <w:rPr>
+          <w:rFonts w:ascii="Noto Serif SC" w:eastAsia="Noto Serif SC" w:hAnsi="Noto Serif SC" w:cs="Noto Serif"/>
+          <w:sz w:val="24"/>
+          <w:szCs w:val="24"/>
+          <w:lang w:val="en-US"/>
+        </w:rPr>
+      </w:pPr>
+      <w:r>
+        <w:rPr>
+          <w:rFonts w:ascii="Noto Serif SC" w:eastAsia="Noto Serif SC" w:hAnsi="Noto Serif SC" w:cs="Noto Serif" w:hint="eastAsia"/>
+          <w:sz w:val="24"/>
+          <w:szCs w:val="24"/>
+          <w:lang w:val="en-US"/>
+        </w:rPr>
+        <w:t>打击乐</w:t>
+      </w:r>
+      <w:r>
+        <w:rPr>
+          <w:rFonts w:ascii="Noto Serif SC" w:eastAsia="Noto Serif SC" w:hAnsi="Noto Serif SC" w:cs="Noto Serif"/>
+          <w:sz w:val="24"/>
+          <w:szCs w:val="24"/>
+          <w:lang w:val="en-US"/>
+        </w:rPr>
+        <w:t xml:space="preserve"> V (Percussion V)</w:t>
+      </w:r>
+    </w:p>
+    <w:p>
+      <w:pPr>
+        <w:jc w:val="right"/>
+        <w:rPr>
+          <w:rFonts w:ascii="Noto Serif SC" w:eastAsia="Noto Serif SC" w:hAnsi="Noto Serif SC" w:cs="Noto Serif"/>
+          <w:sz w:val="20"/>
+          <w:szCs w:val="20"/>
+        </w:rPr>
+      </w:pPr>
+      <w:r>
+        <w:rPr>
+          <w:rFonts w:ascii="Noto Serif SC" w:eastAsia="Noto Serif SC" w:hAnsi="Noto Serif SC" w:cs="Noto Serif" w:hint="eastAsia"/>
+          <w:sz w:val="20"/>
+          <w:szCs w:val="20"/>
+        </w:rPr>
+        <w:t>铓锣</w:t>
+      </w:r>
+      <w:r>
+        <w:rPr>
+          <w:rFonts w:ascii="Noto Serif SC" w:eastAsia="Noto Serif SC" w:hAnsi="Noto Serif SC" w:cs="Noto Serif"/>
+          <w:sz w:val="20"/>
+          <w:szCs w:val="20"/>
+        </w:rPr>
+        <w:t xml:space="preserve"> </w:t>
+      </w:r>
+      <w:r>
+        <w:rPr>
+          <w:rFonts w:ascii="Noto Serif SC" w:eastAsia="Noto Serif SC" w:hAnsi="Noto Serif SC" w:cs="Noto Serif"/>
+          <w:sz w:val="20"/>
+          <w:szCs w:val="20"/>
+        </w:rPr>
+        <w:t>(</w:t>
       </w:r>
       <w:proofErr w:type="spellStart"/>
       <w:r>
@@ -4071,9 +5764,8 @@
           <w:rFonts w:ascii="Noto Serif SC" w:eastAsia="Noto Serif SC" w:hAnsi="Noto Serif SC" w:cs="Noto Serif"/>
           <w:sz w:val="20"/>
           <w:szCs w:val="20"/>
-          <w:lang w:val="en-GB"/>
-        </w:rPr>
-        <w:t>Gaoyin</w:t>
+        </w:rPr>
+        <w:t>Mangluo</w:t>
       </w:r>
       <w:proofErr w:type="spellEnd"/>
       <w:r>
@@ -4081,9 +5773,204 @@
           <w:rFonts w:ascii="Noto Serif SC" w:eastAsia="Noto Serif SC" w:hAnsi="Noto Serif SC" w:cs="Noto Serif"/>
           <w:sz w:val="20"/>
           <w:szCs w:val="20"/>
-          <w:lang w:val="en-GB"/>
-        </w:rPr>
-        <w:t xml:space="preserve"> Guan)</w:t>
+        </w:rPr>
+        <w:t>)</w:t>
+      </w:r>
+      <w:r>
+        <w:rPr>
+          <w:rFonts w:ascii="Noto Serif SC" w:eastAsia="Noto Serif SC" w:hAnsi="Noto Serif SC" w:cs="Noto Serif"/>
+          <w:sz w:val="20"/>
+          <w:szCs w:val="20"/>
+        </w:rPr>
+        <w:t xml:space="preserve">, </w:t>
+      </w:r>
+      <w:r>
+        <w:rPr>
+          <w:rFonts w:ascii="Noto Serif SC" w:eastAsia="Noto Serif SC" w:hAnsi="Noto Serif SC" w:cs="Noto Serif" w:hint="eastAsia"/>
+          <w:sz w:val="20"/>
+          <w:szCs w:val="20"/>
+        </w:rPr>
+        <w:t>颤音琴</w:t>
+      </w:r>
+      <w:r>
+        <w:rPr>
+          <w:rFonts w:ascii="Noto Serif SC" w:eastAsia="Noto Serif SC" w:hAnsi="Noto Serif SC" w:cs="Noto Serif"/>
+          <w:sz w:val="20"/>
+          <w:szCs w:val="20"/>
+        </w:rPr>
+        <w:t xml:space="preserve"> </w:t>
+      </w:r>
+      <w:r>
+        <w:rPr>
+          <w:rFonts w:ascii="Noto Serif SC" w:eastAsia="Noto Serif SC" w:hAnsi="Noto Serif SC" w:cs="Noto Serif"/>
+          <w:sz w:val="20"/>
+          <w:szCs w:val="20"/>
+        </w:rPr>
+        <w:t>(</w:t>
+      </w:r>
+      <w:r>
+        <w:rPr>
+          <w:rFonts w:ascii="Noto Serif SC" w:eastAsia="Noto Serif SC" w:hAnsi="Noto Serif SC" w:cs="Noto Serif"/>
+          <w:sz w:val="20"/>
+          <w:szCs w:val="20"/>
+        </w:rPr>
+        <w:t>Vibraphone</w:t>
+      </w:r>
+      <w:r>
+        <w:rPr>
+          <w:rFonts w:ascii="Noto Serif SC" w:eastAsia="Noto Serif SC" w:hAnsi="Noto Serif SC" w:cs="Noto Serif"/>
+          <w:sz w:val="20"/>
+          <w:szCs w:val="20"/>
+        </w:rPr>
+        <w:t>)</w:t>
+      </w:r>
+      <w:r>
+        <w:rPr>
+          <w:rFonts w:ascii="Noto Serif SC" w:eastAsia="Noto Serif SC" w:hAnsi="Noto Serif SC" w:cs="Noto Serif"/>
+          <w:sz w:val="20"/>
+          <w:szCs w:val="20"/>
+        </w:rPr>
+        <w:t xml:space="preserve">, </w:t>
+      </w:r>
+      <w:r>
+        <w:rPr>
+          <w:rFonts w:ascii="Noto Serif SC" w:eastAsia="Noto Serif SC" w:hAnsi="Noto Serif SC" w:cs="Noto Serif" w:hint="eastAsia"/>
+          <w:sz w:val="20"/>
+          <w:szCs w:val="20"/>
+        </w:rPr>
+        <w:t>编钟</w:t>
+      </w:r>
+      <w:r>
+        <w:rPr>
+          <w:rFonts w:ascii="Noto Serif SC" w:eastAsia="Noto Serif SC" w:hAnsi="Noto Serif SC" w:cs="Noto Serif"/>
+          <w:sz w:val="20"/>
+          <w:szCs w:val="20"/>
+        </w:rPr>
+        <w:t xml:space="preserve"> </w:t>
+      </w:r>
+      <w:r>
+        <w:rPr>
+          <w:rFonts w:ascii="Noto Serif SC" w:eastAsia="Noto Serif SC" w:hAnsi="Noto Serif SC" w:cs="Noto Serif"/>
+          <w:sz w:val="20"/>
+          <w:szCs w:val="20"/>
+        </w:rPr>
+        <w:t>(</w:t>
+      </w:r>
+      <w:proofErr w:type="spellStart"/>
+      <w:r>
+        <w:rPr>
+          <w:rFonts w:ascii="Noto Serif SC" w:eastAsia="Noto Serif SC" w:hAnsi="Noto Serif SC" w:cs="Noto Serif"/>
+          <w:sz w:val="20"/>
+          <w:szCs w:val="20"/>
+        </w:rPr>
+        <w:t>Bianzhong</w:t>
+      </w:r>
+      <w:proofErr w:type="spellEnd"/>
+      <w:r>
+        <w:rPr>
+          <w:rFonts w:ascii="Noto Serif SC" w:eastAsia="Noto Serif SC" w:hAnsi="Noto Serif SC" w:cs="Noto Serif"/>
+          <w:sz w:val="20"/>
+          <w:szCs w:val="20"/>
+        </w:rPr>
+        <w:t>)</w:t>
+      </w:r>
+      <w:r>
+        <w:rPr>
+          <w:rFonts w:ascii="Noto Serif SC" w:eastAsia="Noto Serif SC" w:hAnsi="Noto Serif SC" w:cs="Noto Serif"/>
+          <w:sz w:val="20"/>
+          <w:szCs w:val="20"/>
+        </w:rPr>
+        <w:t xml:space="preserve">, </w:t>
+      </w:r>
+      <w:r>
+        <w:rPr>
+          <w:rFonts w:ascii="Noto Serif SC" w:eastAsia="Noto Serif SC" w:hAnsi="Noto Serif SC" w:cs="Noto Serif" w:hint="eastAsia"/>
+          <w:sz w:val="20"/>
+          <w:szCs w:val="20"/>
+        </w:rPr>
+        <w:t>大军鼓</w:t>
+      </w:r>
+      <w:r>
+        <w:rPr>
+          <w:rFonts w:ascii="Noto Serif SC" w:eastAsia="Noto Serif SC" w:hAnsi="Noto Serif SC" w:cs="Noto Serif"/>
+          <w:sz w:val="20"/>
+          <w:szCs w:val="20"/>
+        </w:rPr>
+        <w:t xml:space="preserve"> </w:t>
+      </w:r>
+      <w:r>
+        <w:rPr>
+          <w:rFonts w:ascii="Noto Serif SC" w:eastAsia="Noto Serif SC" w:hAnsi="Noto Serif SC" w:cs="Noto Serif"/>
+          <w:sz w:val="20"/>
+          <w:szCs w:val="20"/>
+        </w:rPr>
+        <w:t>(</w:t>
+      </w:r>
+      <w:r>
+        <w:rPr>
+          <w:rFonts w:ascii="Noto Serif SC" w:eastAsia="Noto Serif SC" w:hAnsi="Noto Serif SC" w:cs="Noto Serif"/>
+          <w:sz w:val="20"/>
+          <w:szCs w:val="20"/>
+        </w:rPr>
+        <w:t>Bass drum</w:t>
+      </w:r>
+      <w:r>
+        <w:rPr>
+          <w:rFonts w:ascii="Noto Serif SC" w:eastAsia="Noto Serif SC" w:hAnsi="Noto Serif SC" w:cs="Noto Serif"/>
+          <w:sz w:val="20"/>
+          <w:szCs w:val="20"/>
+        </w:rPr>
+        <w:t>)</w:t>
+      </w:r>
+      <w:r>
+        <w:rPr>
+          <w:rFonts w:ascii="Noto Serif SC" w:eastAsia="Noto Serif SC" w:hAnsi="Noto Serif SC" w:cs="Noto Serif"/>
+          <w:sz w:val="20"/>
+          <w:szCs w:val="20"/>
+        </w:rPr>
+        <w:t xml:space="preserve">, </w:t>
+      </w:r>
+      <w:r>
+        <w:rPr>
+          <w:rFonts w:ascii="Noto Serif SC" w:eastAsia="Noto Serif SC" w:hAnsi="Noto Serif SC" w:cs="Noto Serif" w:hint="eastAsia"/>
+          <w:sz w:val="20"/>
+          <w:szCs w:val="20"/>
+        </w:rPr>
+        <w:t>大锣</w:t>
+      </w:r>
+      <w:r>
+        <w:rPr>
+          <w:rFonts w:ascii="Noto Serif SC" w:eastAsia="Noto Serif SC" w:hAnsi="Noto Serif SC" w:cs="Noto Serif"/>
+          <w:sz w:val="20"/>
+          <w:szCs w:val="20"/>
+        </w:rPr>
+        <w:t xml:space="preserve"> </w:t>
+      </w:r>
+      <w:r>
+        <w:rPr>
+          <w:rFonts w:ascii="Noto Serif SC" w:eastAsia="Noto Serif SC" w:hAnsi="Noto Serif SC" w:cs="Noto Serif"/>
+          <w:sz w:val="20"/>
+          <w:szCs w:val="20"/>
+        </w:rPr>
+        <w:t>(</w:t>
+      </w:r>
+      <w:proofErr w:type="spellStart"/>
+      <w:r>
+        <w:rPr>
+          <w:rFonts w:ascii="Noto Serif SC" w:eastAsia="Noto Serif SC" w:hAnsi="Noto Serif SC" w:cs="Noto Serif"/>
+          <w:sz w:val="20"/>
+          <w:szCs w:val="20"/>
+        </w:rPr>
+        <w:t>Daluo</w:t>
+      </w:r>
+      <w:proofErr w:type="spellEnd"/>
+      <w:r>
+        <w:rPr>
+          <w:rFonts w:ascii="Noto Serif SC" w:eastAsia="Noto Serif SC" w:hAnsi="Noto Serif SC" w:cs="Noto Serif"/>
+          <w:sz w:val="20"/>
+          <w:szCs w:val="20"/>
+        </w:rPr>
+        <w:t>)</w:t>
       </w:r>
     </w:p>
     <w:p>
@@ -4103,2147 +5990,214 @@
           <w:szCs w:val="24"/>
           <w:lang w:val="en-US"/>
         </w:rPr>
-        <w:t>加键中音唢呐</w:t>
-      </w:r>
-      <w:r>
-        <w:rPr>
-          <w:rFonts w:ascii="Noto Serif SC" w:eastAsia="Noto Serif SC" w:hAnsi="Noto Serif SC" w:cs="Noto Serif"/>
-          <w:sz w:val="24"/>
-          <w:szCs w:val="24"/>
-          <w:lang w:val="en-US"/>
-        </w:rPr>
-        <w:t>** (</w:t>
+        <w:t>打击乐</w:t>
+      </w:r>
+      <w:r>
+        <w:rPr>
+          <w:rFonts w:ascii="Noto Serif SC" w:eastAsia="Noto Serif SC" w:hAnsi="Noto Serif SC" w:cs="Noto Serif"/>
+          <w:sz w:val="24"/>
+          <w:szCs w:val="24"/>
+          <w:lang w:val="en-US"/>
+        </w:rPr>
+        <w:t xml:space="preserve"> VI (Percussion VI)</w:t>
+      </w:r>
+    </w:p>
+    <w:p>
+      <w:pPr>
+        <w:jc w:val="right"/>
+        <w:rPr>
+          <w:rFonts w:ascii="Noto Serif SC" w:eastAsia="Noto Serif SC" w:hAnsi="Noto Serif SC" w:cs="Noto Serif"/>
+          <w:sz w:val="20"/>
+          <w:szCs w:val="20"/>
+          <w:lang w:val="en-US"/>
+        </w:rPr>
+      </w:pPr>
+      <w:r>
+        <w:rPr>
+          <w:rFonts w:ascii="Noto Serif SC" w:eastAsia="Noto Serif SC" w:hAnsi="Noto Serif SC" w:cs="Noto Serif"/>
+          <w:sz w:val="20"/>
+          <w:szCs w:val="20"/>
+        </w:rPr>
+        <w:t>(</w:t>
+      </w:r>
+      <w:r>
+        <w:rPr>
+          <w:rFonts w:ascii="Noto Serif SC" w:eastAsia="Noto Serif SC" w:hAnsi="Noto Serif SC" w:cs="Noto Serif" w:hint="eastAsia"/>
+          <w:sz w:val="20"/>
+          <w:szCs w:val="20"/>
+        </w:rPr>
+        <w:t>中国</w:t>
+      </w:r>
+      <w:r>
+        <w:rPr>
+          <w:rFonts w:ascii="Noto Serif SC" w:eastAsia="Noto Serif SC" w:hAnsi="Noto Serif SC" w:cs="Noto Serif"/>
+          <w:sz w:val="20"/>
+          <w:szCs w:val="20"/>
+        </w:rPr>
+        <w:t>)</w:t>
+      </w:r>
+      <w:r>
+        <w:rPr>
+          <w:rFonts w:ascii="Noto Serif SC" w:eastAsia="Noto Serif SC" w:hAnsi="Noto Serif SC" w:cs="Noto Serif" w:hint="eastAsia"/>
+          <w:sz w:val="20"/>
+          <w:szCs w:val="20"/>
+        </w:rPr>
+        <w:t>大鼓</w:t>
+      </w:r>
+      <w:r>
+        <w:rPr>
+          <w:rFonts w:ascii="Noto Serif SC" w:eastAsia="Noto Serif SC" w:hAnsi="Noto Serif SC" w:cs="Noto Serif"/>
+          <w:sz w:val="20"/>
+          <w:szCs w:val="20"/>
+        </w:rPr>
+        <w:t xml:space="preserve"> </w:t>
+      </w:r>
+      <w:r>
+        <w:rPr>
+          <w:rFonts w:ascii="Noto Serif SC" w:eastAsia="Noto Serif SC" w:hAnsi="Noto Serif SC" w:cs="Noto Serif"/>
+          <w:sz w:val="20"/>
+          <w:szCs w:val="20"/>
+        </w:rPr>
+        <w:t>(</w:t>
+      </w:r>
+      <w:r>
+        <w:rPr>
+          <w:rFonts w:ascii="Noto Serif SC" w:eastAsia="Noto Serif SC" w:hAnsi="Noto Serif SC" w:cs="Noto Serif"/>
+          <w:sz w:val="20"/>
+          <w:szCs w:val="20"/>
+        </w:rPr>
+        <w:t>Dagu</w:t>
+      </w:r>
+      <w:r>
+        <w:rPr>
+          <w:rFonts w:ascii="Noto Serif SC" w:eastAsia="Noto Serif SC" w:hAnsi="Noto Serif SC" w:cs="Noto Serif"/>
+          <w:sz w:val="20"/>
+          <w:szCs w:val="20"/>
+        </w:rPr>
+        <w:t>)</w:t>
+      </w:r>
+      <w:r>
+        <w:rPr>
+          <w:rFonts w:ascii="Noto Serif SC" w:eastAsia="Noto Serif SC" w:hAnsi="Noto Serif SC" w:cs="Noto Serif"/>
+          <w:sz w:val="20"/>
+          <w:szCs w:val="20"/>
+        </w:rPr>
+        <w:t xml:space="preserve">, </w:t>
       </w:r>
       <w:proofErr w:type="spellStart"/>
       <w:r>
         <w:rPr>
           <w:rFonts w:ascii="Noto Serif SC" w:eastAsia="Noto Serif SC" w:hAnsi="Noto Serif SC" w:cs="Noto Serif"/>
-          <w:sz w:val="24"/>
-          <w:szCs w:val="24"/>
-          <w:lang w:val="en-US"/>
-        </w:rPr>
-        <w:t>Jiajian</w:t>
+          <w:sz w:val="20"/>
+          <w:szCs w:val="20"/>
+        </w:rPr>
+        <w:t>Tubaphone</w:t>
       </w:r>
       <w:proofErr w:type="spellEnd"/>
       <w:r>
         <w:rPr>
           <w:rFonts w:ascii="Noto Serif SC" w:eastAsia="Noto Serif SC" w:hAnsi="Noto Serif SC" w:cs="Noto Serif"/>
-          <w:sz w:val="24"/>
-          <w:szCs w:val="24"/>
-          <w:lang w:val="en-US"/>
+          <w:sz w:val="20"/>
+          <w:szCs w:val="20"/>
+        </w:rPr>
+        <w:t xml:space="preserve">, </w:t>
+      </w:r>
+      <w:r>
+        <w:rPr>
+          <w:rFonts w:ascii="Noto Serif SC" w:eastAsia="Noto Serif SC" w:hAnsi="Noto Serif SC" w:cs="Noto Serif" w:hint="eastAsia"/>
+          <w:sz w:val="20"/>
+          <w:szCs w:val="20"/>
+        </w:rPr>
+        <w:t>小军鼓</w:t>
+      </w:r>
+      <w:r>
+        <w:rPr>
+          <w:rFonts w:ascii="Noto Serif SC" w:eastAsia="Noto Serif SC" w:hAnsi="Noto Serif SC" w:cs="Noto Serif"/>
+          <w:sz w:val="20"/>
+          <w:szCs w:val="20"/>
         </w:rPr>
         <w:t xml:space="preserve"> </w:t>
       </w:r>
-      <w:proofErr w:type="spellStart"/>
-      <w:r>
-        <w:rPr>
-          <w:rFonts w:ascii="Noto Serif SC" w:eastAsia="Noto Serif SC" w:hAnsi="Noto Serif SC" w:cs="Noto Serif"/>
-          <w:sz w:val="24"/>
-          <w:szCs w:val="24"/>
-          <w:lang w:val="en-US"/>
-        </w:rPr>
-        <w:t>Zhongyin</w:t>
-      </w:r>
-      <w:proofErr w:type="spellEnd"/>
-      <w:r>
-        <w:rPr>
-          <w:rFonts w:ascii="Noto Serif SC" w:eastAsia="Noto Serif SC" w:hAnsi="Noto Serif SC" w:cs="Noto Serif"/>
-          <w:sz w:val="24"/>
-          <w:szCs w:val="24"/>
-          <w:lang w:val="en-US"/>
+      <w:r>
+        <w:rPr>
+          <w:rFonts w:ascii="Noto Serif SC" w:eastAsia="Noto Serif SC" w:hAnsi="Noto Serif SC" w:cs="Noto Serif"/>
+          <w:sz w:val="20"/>
+          <w:szCs w:val="20"/>
+        </w:rPr>
+        <w:t>(</w:t>
+      </w:r>
+      <w:r>
+        <w:rPr>
+          <w:rFonts w:ascii="Noto Serif SC" w:eastAsia="Noto Serif SC" w:hAnsi="Noto Serif SC" w:cs="Noto Serif"/>
+          <w:sz w:val="20"/>
+          <w:szCs w:val="20"/>
+        </w:rPr>
+        <w:t>Snare Drum</w:t>
+      </w:r>
+      <w:r>
+        <w:rPr>
+          <w:rFonts w:ascii="Noto Serif SC" w:eastAsia="Noto Serif SC" w:hAnsi="Noto Serif SC" w:cs="Noto Serif"/>
+          <w:sz w:val="20"/>
+          <w:szCs w:val="20"/>
+        </w:rPr>
+        <w:t>)</w:t>
+      </w:r>
+      <w:r>
+        <w:rPr>
+          <w:rFonts w:ascii="Noto Serif SC" w:eastAsia="Noto Serif SC" w:hAnsi="Noto Serif SC" w:cs="Noto Serif"/>
+          <w:sz w:val="20"/>
+          <w:szCs w:val="20"/>
+        </w:rPr>
+        <w:t>, (</w:t>
+      </w:r>
+      <w:r>
+        <w:rPr>
+          <w:rFonts w:ascii="Noto Serif SC" w:eastAsia="Noto Serif SC" w:hAnsi="Noto Serif SC" w:cs="Noto Serif" w:hint="eastAsia"/>
+          <w:sz w:val="20"/>
+          <w:szCs w:val="20"/>
+        </w:rPr>
+        <w:t>中国</w:t>
+      </w:r>
+      <w:r>
+        <w:rPr>
+          <w:rFonts w:ascii="Noto Serif SC" w:eastAsia="Noto Serif SC" w:hAnsi="Noto Serif SC" w:cs="Noto Serif"/>
+          <w:sz w:val="20"/>
+          <w:szCs w:val="20"/>
+        </w:rPr>
+        <w:t>)</w:t>
+      </w:r>
+      <w:r>
+        <w:rPr>
+          <w:rFonts w:ascii="Noto Serif SC" w:eastAsia="Noto Serif SC" w:hAnsi="Noto Serif SC" w:cs="Noto Serif" w:hint="eastAsia"/>
+          <w:sz w:val="20"/>
+          <w:szCs w:val="20"/>
+        </w:rPr>
+        <w:t>大鼓</w:t>
+      </w:r>
+      <w:r>
+        <w:rPr>
+          <w:rFonts w:ascii="Noto Serif SC" w:eastAsia="Noto Serif SC" w:hAnsi="Noto Serif SC" w:cs="Noto Serif"/>
+          <w:sz w:val="20"/>
+          <w:szCs w:val="20"/>
         </w:rPr>
         <w:t xml:space="preserve"> </w:t>
       </w:r>
-      <w:proofErr w:type="spellStart"/>
-      <w:r>
-        <w:rPr>
-          <w:rFonts w:ascii="Noto Serif SC" w:eastAsia="Noto Serif SC" w:hAnsi="Noto Serif SC" w:cs="Noto Serif"/>
-          <w:sz w:val="24"/>
-          <w:szCs w:val="24"/>
-          <w:lang w:val="en-US"/>
-        </w:rPr>
-        <w:t>Suona</w:t>
-      </w:r>
-      <w:proofErr w:type="spellEnd"/>
-      <w:r>
-        <w:rPr>
-          <w:rFonts w:ascii="Noto Serif SC" w:eastAsia="Noto Serif SC" w:hAnsi="Noto Serif SC" w:cs="Noto Serif"/>
-          <w:sz w:val="24"/>
-          <w:szCs w:val="24"/>
-          <w:lang w:val="en-US"/>
-        </w:rPr>
-        <w:t>**)</w:t>
-      </w:r>
-    </w:p>
-    <w:p>
-      <w:pPr>
-        <w:jc w:val="right"/>
-        <w:rPr>
-          <w:rFonts w:ascii="Noto Serif SC" w:eastAsia="Noto Serif SC" w:hAnsi="Noto Serif SC" w:cs="Noto Serif"/>
-          <w:sz w:val="24"/>
-          <w:szCs w:val="24"/>
-          <w:lang w:val="en-US"/>
-        </w:rPr>
-      </w:pPr>
-      <w:r>
-        <w:rPr>
-          <w:rFonts w:ascii="Noto Serif SC" w:eastAsia="Noto Serif SC" w:hAnsi="Noto Serif SC" w:cs="Noto Serif"/>
-          <w:sz w:val="20"/>
-          <w:szCs w:val="20"/>
-          <w:lang w:val="en-US"/>
-        </w:rPr>
-        <w:t>**</w:t>
-      </w:r>
-      <w:r>
-        <w:rPr>
-          <w:rFonts w:ascii="Noto Serif SC" w:eastAsia="Noto Serif SC" w:hAnsi="Noto Serif SC" w:cs="Noto Serif" w:hint="eastAsia"/>
-          <w:sz w:val="20"/>
-          <w:szCs w:val="20"/>
-        </w:rPr>
-        <w:t>兼奏低音管</w:t>
-      </w:r>
-      <w:r>
-        <w:rPr>
-          <w:rFonts w:ascii="Noto Serif SC" w:eastAsia="Noto Serif SC" w:hAnsi="Noto Serif SC" w:cs="Noto Serif"/>
-          <w:sz w:val="20"/>
-          <w:szCs w:val="20"/>
-          <w:lang w:val="en-GB"/>
-        </w:rPr>
-        <w:t xml:space="preserve"> (</w:t>
-      </w:r>
-      <w:proofErr w:type="spellStart"/>
-      <w:r>
-        <w:rPr>
-          <w:rFonts w:ascii="Noto Serif SC" w:eastAsia="Noto Serif SC" w:hAnsi="Noto Serif SC" w:cs="Noto Serif"/>
-          <w:sz w:val="20"/>
-          <w:szCs w:val="20"/>
-          <w:lang w:val="en-GB"/>
-        </w:rPr>
-        <w:t>doub</w:t>
-      </w:r>
-      <w:proofErr w:type="spellEnd"/>
-      <w:r>
-        <w:rPr>
-          <w:rFonts w:ascii="Noto Serif SC" w:eastAsia="Noto Serif SC" w:hAnsi="Noto Serif SC" w:cs="Noto Serif"/>
-          <w:sz w:val="20"/>
-          <w:szCs w:val="20"/>
-          <w:lang w:val="en-GB"/>
-        </w:rPr>
-        <w:t xml:space="preserve">. on </w:t>
-      </w:r>
-      <w:proofErr w:type="spellStart"/>
-      <w:r>
-        <w:rPr>
-          <w:rFonts w:ascii="Noto Serif SC" w:eastAsia="Noto Serif SC" w:hAnsi="Noto Serif SC" w:cs="Noto Serif"/>
-          <w:sz w:val="20"/>
-          <w:szCs w:val="20"/>
-          <w:lang w:val="en-GB"/>
-        </w:rPr>
-        <w:t>Diyin</w:t>
-      </w:r>
-      <w:proofErr w:type="spellEnd"/>
-      <w:r>
-        <w:rPr>
-          <w:rFonts w:ascii="Noto Serif SC" w:eastAsia="Noto Serif SC" w:hAnsi="Noto Serif SC" w:cs="Noto Serif"/>
-          <w:sz w:val="20"/>
-          <w:szCs w:val="20"/>
-          <w:lang w:val="en-GB"/>
-        </w:rPr>
-        <w:t xml:space="preserve"> Guan)</w:t>
-      </w:r>
-    </w:p>
-    <w:p>
-      <w:pPr>
-        <w:jc w:val="right"/>
-        <w:rPr>
-          <w:rFonts w:ascii="Noto Serif SC" w:eastAsia="Noto Serif SC" w:hAnsi="Noto Serif SC" w:cs="Noto Serif"/>
-          <w:sz w:val="24"/>
-          <w:szCs w:val="24"/>
-          <w:lang w:val="en-US"/>
-        </w:rPr>
-      </w:pPr>
-      <w:r>
-        <w:rPr>
-          <w:rFonts w:ascii="Noto Serif SC" w:eastAsia="Noto Serif SC" w:hAnsi="Noto Serif SC" w:cs="Noto Serif" w:hint="eastAsia"/>
-          <w:sz w:val="24"/>
-          <w:szCs w:val="24"/>
-          <w:lang w:val="en-US"/>
-        </w:rPr>
-        <w:t>管</w:t>
-      </w:r>
-      <w:r>
-        <w:rPr>
-          <w:rFonts w:ascii="Noto Serif SC" w:eastAsia="Noto Serif SC" w:hAnsi="Noto Serif SC" w:cs="Noto Serif"/>
-          <w:sz w:val="24"/>
-          <w:szCs w:val="24"/>
-          <w:lang w:val="en-US"/>
-        </w:rPr>
-        <w:t xml:space="preserve"> </w:t>
-      </w:r>
-      <w:r>
-        <w:rPr>
-          <w:rFonts w:ascii="Noto Serif SC" w:eastAsia="Noto Serif SC" w:hAnsi="Noto Serif SC" w:cs="Noto Serif"/>
-          <w:sz w:val="24"/>
-          <w:szCs w:val="24"/>
+      <w:r>
+        <w:rPr>
+          <w:rFonts w:ascii="Noto Serif SC" w:eastAsia="Noto Serif SC" w:hAnsi="Noto Serif SC" w:cs="Noto Serif"/>
+          <w:sz w:val="20"/>
+          <w:szCs w:val="20"/>
         </w:rPr>
         <w:t>(</w:t>
       </w:r>
       <w:r>
         <w:rPr>
-          <w:rFonts w:ascii="Noto Serif SC" w:eastAsia="Noto Serif SC" w:hAnsi="Noto Serif SC" w:cs="Noto Serif" w:hint="eastAsia"/>
-          <w:sz w:val="24"/>
-          <w:szCs w:val="24"/>
-        </w:rPr>
-        <w:t>兼</w:t>
-      </w:r>
-      <w:r>
-        <w:rPr>
-          <w:rFonts w:ascii="Noto Serif SC" w:eastAsia="Noto Serif SC" w:hAnsi="Noto Serif SC" w:cs="Noto Serif"/>
-          <w:sz w:val="24"/>
-          <w:szCs w:val="24"/>
-        </w:rPr>
-        <w:t xml:space="preserve">: </w:t>
-      </w:r>
-      <w:r>
-        <w:rPr>
-          <w:rFonts w:ascii="Noto Serif SC" w:eastAsia="Noto Serif SC" w:hAnsi="Noto Serif SC" w:cs="Noto Serif" w:hint="eastAsia"/>
-          <w:sz w:val="24"/>
-          <w:szCs w:val="24"/>
-        </w:rPr>
-        <w:t>高音，中音，低音</w:t>
-      </w:r>
-      <w:r>
-        <w:rPr>
-          <w:rFonts w:ascii="Noto Serif SC" w:eastAsia="Noto Serif SC" w:hAnsi="Noto Serif SC" w:cs="Noto Serif"/>
-          <w:sz w:val="24"/>
-          <w:szCs w:val="24"/>
-        </w:rPr>
-        <w:t>)</w:t>
-      </w:r>
-      <w:r>
-        <w:rPr>
-          <w:rFonts w:ascii="Noto Serif SC" w:eastAsia="Noto Serif SC" w:hAnsi="Noto Serif SC" w:cs="Noto Serif"/>
-          <w:sz w:val="24"/>
-          <w:szCs w:val="24"/>
-          <w:lang w:val="en-US"/>
-        </w:rPr>
-        <w:t xml:space="preserve"> (Guan – </w:t>
-      </w:r>
-      <w:r>
-        <w:rPr>
-          <w:rFonts w:ascii="Noto Serif SC" w:eastAsia="Noto Serif SC" w:hAnsi="Noto Serif SC" w:cs="Noto Serif"/>
-          <w:sz w:val="24"/>
-          <w:szCs w:val="24"/>
-        </w:rPr>
-        <w:t>High, Middle, Low</w:t>
-      </w:r>
-      <w:r>
-        <w:rPr>
-          <w:rFonts w:ascii="Noto Serif SC" w:eastAsia="Noto Serif SC" w:hAnsi="Noto Serif SC" w:cs="Noto Serif"/>
-          <w:sz w:val="24"/>
-          <w:szCs w:val="24"/>
-          <w:lang w:val="en-US"/>
-        </w:rPr>
-        <w:t>)</w:t>
-      </w:r>
-    </w:p>
-    <w:p>
-      <w:pPr>
-        <w:jc w:val="right"/>
-        <w:rPr>
-          <w:rFonts w:ascii="Noto Serif SC" w:eastAsia="Noto Serif SC" w:hAnsi="Noto Serif SC" w:cs="Noto Serif"/>
-          <w:sz w:val="24"/>
-          <w:szCs w:val="24"/>
-          <w:lang w:val="en-US"/>
-        </w:rPr>
-      </w:pPr>
-    </w:p>
-    <w:p>
-      <w:pPr>
-        <w:jc w:val="right"/>
-        <w:rPr>
-          <w:rFonts w:ascii="Noto Serif SC" w:eastAsia="Noto Serif SC" w:hAnsi="Noto Serif SC" w:cs="Noto Serif"/>
-          <w:sz w:val="24"/>
-          <w:szCs w:val="24"/>
-          <w:lang w:val="en-US"/>
-        </w:rPr>
-      </w:pPr>
-      <w:r>
-        <w:rPr>
-          <w:rFonts w:ascii="Noto Serif SC" w:eastAsia="Noto Serif SC" w:hAnsi="Noto Serif SC" w:cs="Noto Serif" w:hint="eastAsia"/>
-          <w:sz w:val="24"/>
-          <w:szCs w:val="24"/>
-          <w:lang w:val="en-US"/>
-        </w:rPr>
-        <w:t>扬琴</w:t>
-      </w:r>
-      <w:r>
-        <w:rPr>
-          <w:rFonts w:ascii="Noto Serif SC" w:eastAsia="Noto Serif SC" w:hAnsi="Noto Serif SC" w:cs="Noto Serif"/>
-          <w:sz w:val="24"/>
-          <w:szCs w:val="24"/>
-          <w:lang w:val="en-US"/>
-        </w:rPr>
-        <w:t xml:space="preserve"> (Yangqin)</w:t>
-      </w:r>
-    </w:p>
-    <w:p>
-      <w:pPr>
-        <w:jc w:val="right"/>
-        <w:rPr>
-          <w:rFonts w:ascii="Noto Serif SC" w:eastAsia="Noto Serif SC" w:hAnsi="Noto Serif SC" w:cs="Noto Serif"/>
-          <w:sz w:val="24"/>
-          <w:szCs w:val="24"/>
-          <w:lang w:val="en-US"/>
-        </w:rPr>
-      </w:pPr>
-      <w:r>
-        <w:rPr>
-          <w:rFonts w:ascii="Noto Serif SC" w:eastAsia="Noto Serif SC" w:hAnsi="Noto Serif SC" w:cs="Noto Serif" w:hint="eastAsia"/>
-          <w:sz w:val="24"/>
-          <w:szCs w:val="24"/>
-          <w:lang w:val="en-US"/>
-        </w:rPr>
-        <w:t>柳琴</w:t>
-      </w:r>
-      <w:r>
-        <w:rPr>
-          <w:rFonts w:ascii="Noto Serif SC" w:eastAsia="Noto Serif SC" w:hAnsi="Noto Serif SC" w:cs="Noto Serif"/>
-          <w:sz w:val="24"/>
-          <w:szCs w:val="24"/>
-          <w:lang w:val="en-US"/>
-        </w:rPr>
-        <w:t xml:space="preserve"> I, II (</w:t>
-      </w:r>
-      <w:proofErr w:type="spellStart"/>
-      <w:r>
-        <w:rPr>
-          <w:rFonts w:ascii="Noto Serif SC" w:eastAsia="Noto Serif SC" w:hAnsi="Noto Serif SC" w:cs="Noto Serif"/>
-          <w:sz w:val="24"/>
-          <w:szCs w:val="24"/>
-          <w:lang w:val="en-US"/>
-        </w:rPr>
-        <w:t>Liuqin</w:t>
-      </w:r>
-      <w:proofErr w:type="spellEnd"/>
-      <w:r>
-        <w:rPr>
-          <w:rFonts w:ascii="Noto Serif SC" w:eastAsia="Noto Serif SC" w:hAnsi="Noto Serif SC" w:cs="Noto Serif"/>
-          <w:sz w:val="24"/>
-          <w:szCs w:val="24"/>
-          <w:lang w:val="en-US"/>
-        </w:rPr>
-        <w:t xml:space="preserve"> I, II)</w:t>
-      </w:r>
-    </w:p>
-    <w:p>
-      <w:pPr>
-        <w:jc w:val="right"/>
-        <w:rPr>
-          <w:rFonts w:ascii="Noto Serif SC" w:eastAsia="Noto Serif SC" w:hAnsi="Noto Serif SC" w:cs="Noto Serif"/>
-          <w:sz w:val="24"/>
-          <w:szCs w:val="24"/>
-          <w:lang w:val="en-US"/>
-        </w:rPr>
-      </w:pPr>
-      <w:r>
-        <w:rPr>
-          <w:rFonts w:ascii="Noto Serif SC" w:eastAsia="Noto Serif SC" w:hAnsi="Noto Serif SC" w:cs="Noto Serif" w:hint="eastAsia"/>
-          <w:sz w:val="24"/>
-          <w:szCs w:val="24"/>
-          <w:lang w:val="en-US"/>
-        </w:rPr>
-        <w:t>琵琶</w:t>
-      </w:r>
-      <w:r>
-        <w:rPr>
-          <w:rFonts w:ascii="Noto Serif SC" w:eastAsia="Noto Serif SC" w:hAnsi="Noto Serif SC" w:cs="Noto Serif"/>
-          <w:sz w:val="24"/>
-          <w:szCs w:val="24"/>
-          <w:lang w:val="en-US"/>
-        </w:rPr>
-        <w:t xml:space="preserve"> I-IV (Pipa I-IV)</w:t>
-      </w:r>
-    </w:p>
-    <w:p>
-      <w:pPr>
-        <w:jc w:val="right"/>
-        <w:rPr>
-          <w:rFonts w:ascii="Noto Serif SC" w:eastAsia="Noto Serif SC" w:hAnsi="Noto Serif SC" w:cs="Noto Serif"/>
-          <w:sz w:val="24"/>
-          <w:szCs w:val="24"/>
-          <w:lang w:val="en-US"/>
-        </w:rPr>
-      </w:pPr>
-      <w:r>
-        <w:rPr>
-          <w:rFonts w:ascii="Noto Serif SC" w:eastAsia="Noto Serif SC" w:hAnsi="Noto Serif SC" w:cs="Noto Serif" w:hint="eastAsia"/>
-          <w:sz w:val="24"/>
-          <w:szCs w:val="24"/>
-          <w:lang w:val="en-US"/>
-        </w:rPr>
-        <w:t>中阮</w:t>
-      </w:r>
-      <w:r>
-        <w:rPr>
-          <w:rFonts w:ascii="Noto Serif SC" w:eastAsia="Noto Serif SC" w:hAnsi="Noto Serif SC" w:cs="Noto Serif"/>
-          <w:sz w:val="24"/>
-          <w:szCs w:val="24"/>
-          <w:lang w:val="en-US"/>
-        </w:rPr>
-        <w:t xml:space="preserve"> I-IV (Zhongruan I-IV)</w:t>
-      </w:r>
-    </w:p>
-    <w:p>
-      <w:pPr>
-        <w:jc w:val="right"/>
-        <w:rPr>
-          <w:rFonts w:ascii="Noto Serif SC" w:eastAsia="Noto Serif SC" w:hAnsi="Noto Serif SC" w:cs="Noto Serif"/>
-          <w:sz w:val="24"/>
-          <w:szCs w:val="24"/>
-          <w:lang w:val="en-US"/>
-        </w:rPr>
-      </w:pPr>
-      <w:r>
-        <w:rPr>
-          <w:rFonts w:ascii="Noto Serif SC" w:eastAsia="Noto Serif SC" w:hAnsi="Noto Serif SC" w:cs="Noto Serif" w:hint="eastAsia"/>
-          <w:sz w:val="24"/>
-          <w:szCs w:val="24"/>
-        </w:rPr>
-        <w:t>三弦</w:t>
-      </w:r>
-      <w:r>
-        <w:rPr>
-          <w:rFonts w:ascii="Noto Serif SC" w:eastAsia="Noto Serif SC" w:hAnsi="Noto Serif SC" w:cs="Noto Serif"/>
-          <w:sz w:val="24"/>
-          <w:szCs w:val="24"/>
-          <w:lang w:val="en-US"/>
-        </w:rPr>
-        <w:t xml:space="preserve"> Sanxian</w:t>
-      </w:r>
-    </w:p>
-    <w:p>
-      <w:pPr>
-        <w:jc w:val="right"/>
-        <w:rPr>
-          <w:rFonts w:ascii="Noto Serif SC" w:eastAsia="Noto Serif SC" w:hAnsi="Noto Serif SC" w:cs="Noto Serif"/>
-          <w:sz w:val="24"/>
-          <w:szCs w:val="24"/>
-          <w:lang w:val="en-US"/>
-        </w:rPr>
-      </w:pPr>
-      <w:r>
-        <w:rPr>
-          <w:rFonts w:ascii="Noto Serif SC" w:eastAsia="Noto Serif SC" w:hAnsi="Noto Serif SC" w:cs="Noto Serif" w:hint="eastAsia"/>
-          <w:sz w:val="24"/>
-          <w:szCs w:val="24"/>
-          <w:lang w:val="en-US"/>
-        </w:rPr>
-        <w:t>大阮</w:t>
-      </w:r>
-      <w:r>
-        <w:rPr>
-          <w:rFonts w:ascii="Noto Serif SC" w:eastAsia="Noto Serif SC" w:hAnsi="Noto Serif SC" w:cs="Noto Serif"/>
-          <w:sz w:val="24"/>
-          <w:szCs w:val="24"/>
-          <w:lang w:val="en-US"/>
-        </w:rPr>
-        <w:t xml:space="preserve"> I, II (Daruan I, II)</w:t>
-      </w:r>
-    </w:p>
-    <w:p>
-      <w:pPr>
-        <w:jc w:val="right"/>
-        <w:rPr>
-          <w:rFonts w:ascii="Noto Serif SC" w:eastAsia="Noto Serif SC" w:hAnsi="Noto Serif SC" w:cs="Noto Serif"/>
-          <w:sz w:val="24"/>
-          <w:szCs w:val="24"/>
-          <w:lang w:val="en-US"/>
-        </w:rPr>
-      </w:pPr>
-      <w:r>
-        <w:rPr>
-          <w:rFonts w:ascii="Noto Serif SC" w:eastAsia="Noto Serif SC" w:hAnsi="Noto Serif SC" w:cs="Noto Serif" w:hint="eastAsia"/>
-          <w:sz w:val="24"/>
-          <w:szCs w:val="24"/>
-        </w:rPr>
-        <w:t>古筝</w:t>
-      </w:r>
-      <w:r>
-        <w:rPr>
-          <w:rFonts w:ascii="Noto Serif SC" w:eastAsia="Noto Serif SC" w:hAnsi="Noto Serif SC" w:cs="Noto Serif"/>
-          <w:sz w:val="24"/>
-          <w:szCs w:val="24"/>
-          <w:lang w:val="en-US"/>
-        </w:rPr>
-        <w:t xml:space="preserve"> (Guzheng)</w:t>
-      </w:r>
-    </w:p>
-    <w:p>
-      <w:pPr>
-        <w:jc w:val="right"/>
-        <w:rPr>
-          <w:rFonts w:ascii="Noto Serif SC" w:eastAsia="Noto Serif SC" w:hAnsi="Noto Serif SC" w:cs="Noto Serif"/>
-          <w:sz w:val="24"/>
-          <w:szCs w:val="24"/>
-          <w:lang w:val="en-US"/>
-        </w:rPr>
-      </w:pPr>
-      <w:r>
-        <w:rPr>
-          <w:rFonts w:ascii="Noto Serif SC" w:eastAsia="Noto Serif SC" w:hAnsi="Noto Serif SC" w:cs="Noto Serif" w:hint="eastAsia"/>
-          <w:sz w:val="24"/>
-          <w:szCs w:val="24"/>
-          <w:lang w:val="en-US"/>
-        </w:rPr>
-        <w:t>竖琴</w:t>
-      </w:r>
-      <w:r>
-        <w:rPr>
-          <w:rFonts w:ascii="Noto Serif SC" w:eastAsia="Noto Serif SC" w:hAnsi="Noto Serif SC" w:cs="Noto Serif"/>
-          <w:sz w:val="24"/>
-          <w:szCs w:val="24"/>
-          <w:lang w:val="en-US"/>
-        </w:rPr>
-        <w:t xml:space="preserve"> (Harp)</w:t>
-      </w:r>
-    </w:p>
-    <w:p>
-      <w:pPr>
-        <w:jc w:val="right"/>
-        <w:rPr>
-          <w:rFonts w:ascii="Noto Serif SC" w:eastAsia="Noto Serif SC" w:hAnsi="Noto Serif SC" w:cs="Noto Serif"/>
-          <w:sz w:val="24"/>
-          <w:szCs w:val="24"/>
-          <w:lang w:val="en-US"/>
-        </w:rPr>
-      </w:pPr>
-    </w:p>
-    <w:p>
-      <w:pPr>
-        <w:jc w:val="right"/>
-        <w:rPr>
-          <w:rFonts w:ascii="Noto Serif SC" w:eastAsia="Noto Serif SC" w:hAnsi="Noto Serif SC" w:cs="Noto Serif"/>
-          <w:sz w:val="24"/>
-          <w:szCs w:val="24"/>
-          <w:lang w:val="en-US"/>
-        </w:rPr>
-      </w:pPr>
-      <w:r>
-        <w:rPr>
-          <w:rFonts w:ascii="Noto Serif SC" w:eastAsia="Noto Serif SC" w:hAnsi="Noto Serif SC" w:cs="Noto Serif" w:hint="eastAsia"/>
-          <w:sz w:val="24"/>
-          <w:szCs w:val="24"/>
-          <w:lang w:val="en-US"/>
-        </w:rPr>
-        <w:t>打击乐</w:t>
-      </w:r>
-      <w:r>
-        <w:rPr>
-          <w:rFonts w:ascii="Noto Serif SC" w:eastAsia="Noto Serif SC" w:hAnsi="Noto Serif SC" w:cs="Noto Serif"/>
-          <w:sz w:val="24"/>
-          <w:szCs w:val="24"/>
-          <w:lang w:val="en-US"/>
-        </w:rPr>
-        <w:t xml:space="preserve"> I (Percussion I)</w:t>
-      </w:r>
-    </w:p>
-    <w:p>
-      <w:pPr>
-        <w:jc w:val="right"/>
-        <w:rPr>
-          <w:rFonts w:ascii="Noto Serif SC" w:eastAsia="Noto Serif SC" w:hAnsi="Noto Serif SC" w:cs="Noto Serif"/>
-          <w:sz w:val="20"/>
-          <w:szCs w:val="20"/>
-          <w:lang w:val="en-GB"/>
-        </w:rPr>
-      </w:pPr>
-      <w:r>
-        <w:rPr>
-          <w:rFonts w:ascii="Noto Serif SC" w:eastAsia="Noto Serif SC" w:hAnsi="Noto Serif SC" w:cs="Noto Serif"/>
-          <w:sz w:val="20"/>
-          <w:szCs w:val="20"/>
-        </w:rPr>
-        <w:t>(</w:t>
-      </w:r>
-      <w:r>
-        <w:rPr>
-          <w:rFonts w:ascii="Noto Serif SC" w:eastAsia="Noto Serif SC" w:hAnsi="Noto Serif SC" w:cs="Noto Serif" w:hint="eastAsia"/>
-          <w:sz w:val="20"/>
-          <w:szCs w:val="20"/>
-        </w:rPr>
-        <w:t>西方</w:t>
-      </w:r>
-      <w:r>
-        <w:rPr>
-          <w:rFonts w:ascii="Noto Serif SC" w:eastAsia="Noto Serif SC" w:hAnsi="Noto Serif SC" w:cs="Noto Serif"/>
-          <w:sz w:val="20"/>
-          <w:szCs w:val="20"/>
-        </w:rPr>
-        <w:t xml:space="preserve">) </w:t>
-      </w:r>
-      <w:r>
-        <w:rPr>
-          <w:rFonts w:ascii="Noto Serif SC" w:eastAsia="Noto Serif SC" w:hAnsi="Noto Serif SC" w:cs="Noto Serif" w:hint="eastAsia"/>
-          <w:sz w:val="20"/>
-          <w:szCs w:val="20"/>
-        </w:rPr>
-        <w:t>木鱼</w:t>
-      </w:r>
-      <w:r>
-        <w:rPr>
-          <w:rFonts w:ascii="Noto Serif SC" w:eastAsia="Noto Serif SC" w:hAnsi="Noto Serif SC" w:cs="Noto Serif"/>
-          <w:sz w:val="20"/>
-          <w:szCs w:val="20"/>
-        </w:rPr>
-        <w:t xml:space="preserve"> </w:t>
-      </w:r>
-      <w:r>
-        <w:rPr>
-          <w:rFonts w:ascii="Noto Serif SC" w:eastAsia="Noto Serif SC" w:hAnsi="Noto Serif SC" w:cs="Noto Serif" w:hint="eastAsia"/>
-          <w:sz w:val="20"/>
-          <w:szCs w:val="20"/>
-        </w:rPr>
-        <w:t>(</w:t>
-      </w:r>
-      <w:r>
-        <w:rPr>
-          <w:rFonts w:ascii="Noto Serif SC" w:eastAsia="Noto Serif SC" w:hAnsi="Noto Serif SC" w:cs="Noto Serif"/>
-          <w:sz w:val="20"/>
-          <w:szCs w:val="20"/>
-        </w:rPr>
-        <w:t>Woodblocks</w:t>
-      </w:r>
-      <w:r>
-        <w:rPr>
-          <w:rFonts w:ascii="Noto Serif SC" w:eastAsia="Noto Serif SC" w:hAnsi="Noto Serif SC" w:cs="Noto Serif" w:hint="eastAsia"/>
-          <w:sz w:val="20"/>
-          <w:szCs w:val="20"/>
-        </w:rPr>
-        <w:t>)</w:t>
-      </w:r>
-      <w:r>
-        <w:rPr>
-          <w:rFonts w:ascii="Noto Serif SC" w:eastAsia="Noto Serif SC" w:hAnsi="Noto Serif SC" w:cs="Noto Serif"/>
-          <w:sz w:val="20"/>
-          <w:szCs w:val="20"/>
-        </w:rPr>
-        <w:t xml:space="preserve">, </w:t>
-      </w:r>
-      <w:r>
-        <w:rPr>
-          <w:rFonts w:ascii="Noto Serif SC" w:eastAsia="Noto Serif SC" w:hAnsi="Noto Serif SC" w:cs="Noto Serif" w:hint="eastAsia"/>
-          <w:sz w:val="20"/>
-          <w:szCs w:val="20"/>
-        </w:rPr>
-        <w:t>钟琴</w:t>
-      </w:r>
-      <w:r>
-        <w:rPr>
-          <w:rFonts w:ascii="Noto Serif SC" w:eastAsia="Noto Serif SC" w:hAnsi="Noto Serif SC" w:cs="Noto Serif"/>
-          <w:sz w:val="20"/>
-          <w:szCs w:val="20"/>
-        </w:rPr>
-        <w:t xml:space="preserve"> </w:t>
-      </w:r>
-      <w:r>
-        <w:rPr>
-          <w:rFonts w:ascii="Noto Serif SC" w:eastAsia="Noto Serif SC" w:hAnsi="Noto Serif SC" w:cs="Noto Serif" w:hint="eastAsia"/>
-          <w:sz w:val="20"/>
-          <w:szCs w:val="20"/>
-        </w:rPr>
-        <w:t>(</w:t>
-      </w:r>
-      <w:r>
-        <w:rPr>
-          <w:rFonts w:ascii="Noto Serif SC" w:eastAsia="Noto Serif SC" w:hAnsi="Noto Serif SC" w:cs="Noto Serif"/>
-          <w:sz w:val="20"/>
-          <w:szCs w:val="20"/>
-        </w:rPr>
-        <w:t>Glockenspiel</w:t>
-      </w:r>
-      <w:r>
-        <w:rPr>
-          <w:rFonts w:ascii="Noto Serif SC" w:eastAsia="Noto Serif SC" w:hAnsi="Noto Serif SC" w:cs="Noto Serif" w:hint="eastAsia"/>
-          <w:sz w:val="20"/>
-          <w:szCs w:val="20"/>
-        </w:rPr>
-        <w:t>)</w:t>
-      </w:r>
-      <w:r>
-        <w:rPr>
-          <w:rFonts w:ascii="Noto Serif SC" w:eastAsia="Noto Serif SC" w:hAnsi="Noto Serif SC" w:cs="Noto Serif"/>
-          <w:sz w:val="20"/>
-          <w:szCs w:val="20"/>
-        </w:rPr>
-        <w:t xml:space="preserve">, </w:t>
-      </w:r>
-      <w:r>
-        <w:rPr>
-          <w:rFonts w:ascii="Noto Serif SC" w:eastAsia="Noto Serif SC" w:hAnsi="Noto Serif SC" w:cs="Noto Serif" w:hint="eastAsia"/>
-          <w:sz w:val="20"/>
-          <w:szCs w:val="20"/>
-        </w:rPr>
-        <w:t>云锣</w:t>
-      </w:r>
-      <w:r>
-        <w:rPr>
-          <w:rFonts w:ascii="Noto Serif SC" w:eastAsia="Noto Serif SC" w:hAnsi="Noto Serif SC" w:cs="Noto Serif"/>
-          <w:sz w:val="20"/>
-          <w:szCs w:val="20"/>
-        </w:rPr>
-        <w:t xml:space="preserve"> </w:t>
-      </w:r>
-      <w:r>
-        <w:rPr>
-          <w:rFonts w:ascii="Noto Serif SC" w:eastAsia="Noto Serif SC" w:hAnsi="Noto Serif SC" w:cs="Noto Serif" w:hint="eastAsia"/>
-          <w:sz w:val="20"/>
-          <w:szCs w:val="20"/>
-        </w:rPr>
-        <w:t>(</w:t>
-      </w:r>
-      <w:r>
-        <w:rPr>
-          <w:rFonts w:ascii="Noto Serif SC" w:eastAsia="Noto Serif SC" w:hAnsi="Noto Serif SC" w:cs="Noto Serif"/>
-          <w:sz w:val="20"/>
-          <w:szCs w:val="20"/>
-        </w:rPr>
-        <w:t>Yunluo</w:t>
-      </w:r>
-      <w:r>
-        <w:rPr>
-          <w:rFonts w:ascii="Noto Serif SC" w:eastAsia="Noto Serif SC" w:hAnsi="Noto Serif SC" w:cs="Noto Serif" w:hint="eastAsia"/>
-          <w:sz w:val="20"/>
-          <w:szCs w:val="20"/>
-        </w:rPr>
-        <w:t>)</w:t>
-      </w:r>
-      <w:r>
-        <w:rPr>
-          <w:rFonts w:ascii="Noto Serif SC" w:eastAsia="Noto Serif SC" w:hAnsi="Noto Serif SC" w:cs="Noto Serif"/>
-          <w:sz w:val="20"/>
-          <w:szCs w:val="20"/>
-        </w:rPr>
-        <w:t xml:space="preserve">, </w:t>
-      </w:r>
-      <w:r>
-        <w:rPr>
-          <w:rFonts w:ascii="Noto Serif SC" w:eastAsia="Noto Serif SC" w:hAnsi="Noto Serif SC" w:cs="Noto Serif" w:hint="eastAsia"/>
-          <w:sz w:val="20"/>
-          <w:szCs w:val="20"/>
-        </w:rPr>
-        <w:t>小堂鼓</w:t>
-      </w:r>
-      <w:r>
-        <w:rPr>
-          <w:rFonts w:ascii="Noto Serif SC" w:eastAsia="Noto Serif SC" w:hAnsi="Noto Serif SC" w:cs="Noto Serif"/>
-          <w:sz w:val="20"/>
-          <w:szCs w:val="20"/>
-        </w:rPr>
-        <w:t xml:space="preserve"> </w:t>
-      </w:r>
-      <w:r>
-        <w:rPr>
-          <w:rFonts w:ascii="Noto Serif SC" w:eastAsia="Noto Serif SC" w:hAnsi="Noto Serif SC" w:cs="Noto Serif" w:hint="eastAsia"/>
-          <w:sz w:val="20"/>
-          <w:szCs w:val="20"/>
-        </w:rPr>
-        <w:t>(</w:t>
-      </w:r>
-      <w:proofErr w:type="spellStart"/>
-      <w:r>
-        <w:rPr>
-          <w:rFonts w:ascii="Noto Serif SC" w:eastAsia="Noto Serif SC" w:hAnsi="Noto Serif SC" w:cs="Noto Serif"/>
-          <w:sz w:val="20"/>
-          <w:szCs w:val="20"/>
-        </w:rPr>
-        <w:t>Xiaotanggu</w:t>
-      </w:r>
-      <w:proofErr w:type="spellEnd"/>
-      <w:r>
-        <w:rPr>
-          <w:rFonts w:ascii="Noto Serif SC" w:eastAsia="Noto Serif SC" w:hAnsi="Noto Serif SC" w:cs="Noto Serif" w:hint="eastAsia"/>
-          <w:sz w:val="20"/>
-          <w:szCs w:val="20"/>
-        </w:rPr>
-        <w:t>)</w:t>
-      </w:r>
-      <w:r>
-        <w:rPr>
-          <w:rFonts w:ascii="Noto Serif SC" w:eastAsia="Noto Serif SC" w:hAnsi="Noto Serif SC" w:cs="Noto Serif"/>
-          <w:sz w:val="20"/>
-          <w:szCs w:val="20"/>
-        </w:rPr>
-        <w:t xml:space="preserve">, </w:t>
-      </w:r>
-      <w:r>
-        <w:rPr>
-          <w:rFonts w:ascii="Noto Serif SC" w:eastAsia="Noto Serif SC" w:hAnsi="Noto Serif SC" w:cs="Noto Serif" w:hint="eastAsia"/>
-          <w:sz w:val="20"/>
-          <w:szCs w:val="20"/>
-        </w:rPr>
-        <w:t>排鼓</w:t>
-      </w:r>
-      <w:r>
-        <w:rPr>
-          <w:rFonts w:ascii="Noto Serif SC" w:eastAsia="Noto Serif SC" w:hAnsi="Noto Serif SC" w:cs="Noto Serif"/>
-          <w:sz w:val="20"/>
-          <w:szCs w:val="20"/>
-        </w:rPr>
-        <w:t xml:space="preserve"> </w:t>
-      </w:r>
-      <w:r>
-        <w:rPr>
-          <w:rFonts w:ascii="Noto Serif SC" w:eastAsia="Noto Serif SC" w:hAnsi="Noto Serif SC" w:cs="Noto Serif"/>
-          <w:sz w:val="20"/>
-          <w:szCs w:val="20"/>
-          <w:lang w:val="en-GB"/>
-        </w:rPr>
-        <w:t>(</w:t>
-      </w:r>
-      <w:proofErr w:type="spellStart"/>
-      <w:r>
-        <w:rPr>
-          <w:rFonts w:ascii="Noto Serif SC" w:eastAsia="Noto Serif SC" w:hAnsi="Noto Serif SC" w:cs="Noto Serif"/>
-          <w:sz w:val="20"/>
-          <w:szCs w:val="20"/>
-        </w:rPr>
-        <w:t>Paigu</w:t>
-      </w:r>
-      <w:proofErr w:type="spellEnd"/>
-      <w:r>
-        <w:rPr>
-          <w:rFonts w:ascii="Noto Serif SC" w:eastAsia="Noto Serif SC" w:hAnsi="Noto Serif SC" w:cs="Noto Serif"/>
-          <w:sz w:val="20"/>
-          <w:szCs w:val="20"/>
-        </w:rPr>
-        <w:t>)</w:t>
-      </w:r>
-      <w:r>
-        <w:rPr>
-          <w:rFonts w:ascii="Noto Serif SC" w:eastAsia="Noto Serif SC" w:hAnsi="Noto Serif SC" w:cs="Noto Serif"/>
-          <w:sz w:val="20"/>
-          <w:szCs w:val="20"/>
-        </w:rPr>
-        <w:t xml:space="preserve">, </w:t>
-      </w:r>
-      <w:r>
-        <w:rPr>
-          <w:rFonts w:ascii="Noto Serif SC" w:eastAsia="Noto Serif SC" w:hAnsi="Noto Serif SC" w:cs="Noto Serif" w:hint="eastAsia"/>
-          <w:sz w:val="20"/>
-          <w:szCs w:val="20"/>
-        </w:rPr>
-        <w:t>木鱼</w:t>
-      </w:r>
-      <w:r>
-        <w:rPr>
-          <w:rFonts w:ascii="Noto Serif SC" w:eastAsia="Noto Serif SC" w:hAnsi="Noto Serif SC" w:cs="Noto Serif"/>
-          <w:sz w:val="20"/>
-          <w:szCs w:val="20"/>
-        </w:rPr>
-        <w:t xml:space="preserve"> </w:t>
-      </w:r>
-      <w:r>
-        <w:rPr>
-          <w:rFonts w:ascii="Noto Serif SC" w:eastAsia="Noto Serif SC" w:hAnsi="Noto Serif SC" w:cs="Noto Serif"/>
-          <w:sz w:val="20"/>
-          <w:szCs w:val="20"/>
-        </w:rPr>
-        <w:t>(</w:t>
-      </w:r>
-      <w:r>
-        <w:rPr>
-          <w:rFonts w:ascii="Noto Serif SC" w:eastAsia="Noto Serif SC" w:hAnsi="Noto Serif SC" w:cs="Noto Serif"/>
-          <w:sz w:val="20"/>
-          <w:szCs w:val="20"/>
-        </w:rPr>
-        <w:t>Chinese Woodblock</w:t>
-      </w:r>
-      <w:r>
-        <w:rPr>
-          <w:rFonts w:ascii="Noto Serif SC" w:eastAsia="Noto Serif SC" w:hAnsi="Noto Serif SC" w:cs="Noto Serif"/>
-          <w:sz w:val="20"/>
-          <w:szCs w:val="20"/>
-        </w:rPr>
-        <w:t>)</w:t>
-      </w:r>
-    </w:p>
-    <w:p>
-      <w:pPr>
-        <w:jc w:val="right"/>
-        <w:rPr>
-          <w:rFonts w:ascii="Noto Serif SC" w:eastAsia="Noto Serif SC" w:hAnsi="Noto Serif SC" w:cs="Noto Serif"/>
-          <w:sz w:val="24"/>
-          <w:szCs w:val="24"/>
-          <w:lang w:val="en-US"/>
-        </w:rPr>
-      </w:pPr>
-      <w:r>
-        <w:rPr>
-          <w:rFonts w:ascii="Noto Serif SC" w:eastAsia="Noto Serif SC" w:hAnsi="Noto Serif SC" w:cs="Noto Serif" w:hint="eastAsia"/>
-          <w:sz w:val="24"/>
-          <w:szCs w:val="24"/>
-          <w:lang w:val="en-US"/>
-        </w:rPr>
-        <w:t>打击乐</w:t>
-      </w:r>
-      <w:r>
-        <w:rPr>
-          <w:rFonts w:ascii="Noto Serif SC" w:eastAsia="Noto Serif SC" w:hAnsi="Noto Serif SC" w:cs="Noto Serif"/>
-          <w:sz w:val="24"/>
-          <w:szCs w:val="24"/>
-          <w:lang w:val="en-US"/>
-        </w:rPr>
-        <w:t xml:space="preserve"> II (Percussion II)</w:t>
-      </w:r>
-    </w:p>
-    <w:p>
-      <w:pPr>
-        <w:jc w:val="right"/>
-        <w:rPr>
-          <w:rFonts w:ascii="Noto Serif SC" w:eastAsia="Noto Serif SC" w:hAnsi="Noto Serif SC" w:cs="Noto Serif"/>
-          <w:sz w:val="20"/>
-          <w:szCs w:val="20"/>
-          <w:lang w:val="en-US"/>
-        </w:rPr>
-      </w:pPr>
-      <w:r>
-        <w:rPr>
-          <w:rFonts w:ascii="Noto Serif SC" w:eastAsia="Noto Serif SC" w:hAnsi="Noto Serif SC" w:cs="Noto Serif" w:hint="eastAsia"/>
-          <w:sz w:val="20"/>
-          <w:szCs w:val="20"/>
-        </w:rPr>
-        <w:t>中国木鱼</w:t>
-      </w:r>
-      <w:r>
-        <w:rPr>
-          <w:rFonts w:ascii="Noto Serif SC" w:eastAsia="Noto Serif SC" w:hAnsi="Noto Serif SC" w:cs="Noto Serif"/>
-          <w:sz w:val="20"/>
-          <w:szCs w:val="20"/>
-        </w:rPr>
-        <w:t xml:space="preserve"> </w:t>
-      </w:r>
-      <w:r>
-        <w:rPr>
-          <w:rFonts w:ascii="Noto Serif SC" w:eastAsia="Noto Serif SC" w:hAnsi="Noto Serif SC" w:cs="Noto Serif"/>
-          <w:sz w:val="20"/>
-          <w:szCs w:val="20"/>
-        </w:rPr>
-        <w:t>(</w:t>
-      </w:r>
-      <w:r>
-        <w:rPr>
-          <w:rFonts w:ascii="Noto Serif SC" w:eastAsia="Noto Serif SC" w:hAnsi="Noto Serif SC" w:cs="Noto Serif"/>
-          <w:sz w:val="20"/>
-          <w:szCs w:val="20"/>
-        </w:rPr>
-        <w:t>Chinese Woodblock</w:t>
-      </w:r>
-      <w:r>
-        <w:rPr>
-          <w:rFonts w:ascii="Noto Serif SC" w:eastAsia="Noto Serif SC" w:hAnsi="Noto Serif SC" w:cs="Noto Serif"/>
-          <w:sz w:val="20"/>
-          <w:szCs w:val="20"/>
-        </w:rPr>
-        <w:t>)</w:t>
-      </w:r>
-      <w:r>
-        <w:rPr>
-          <w:rFonts w:ascii="Noto Serif SC" w:eastAsia="Noto Serif SC" w:hAnsi="Noto Serif SC" w:cs="Noto Serif"/>
-          <w:sz w:val="20"/>
-          <w:szCs w:val="20"/>
-        </w:rPr>
-        <w:t xml:space="preserve">, </w:t>
-      </w:r>
-      <w:r>
-        <w:rPr>
-          <w:rFonts w:ascii="Noto Serif SC" w:eastAsia="Noto Serif SC" w:hAnsi="Noto Serif SC" w:cs="Noto Serif" w:hint="eastAsia"/>
-          <w:sz w:val="20"/>
-          <w:szCs w:val="20"/>
-        </w:rPr>
-        <w:t>颤音琴</w:t>
-      </w:r>
-      <w:r>
-        <w:rPr>
-          <w:rFonts w:ascii="Noto Serif SC" w:eastAsia="Noto Serif SC" w:hAnsi="Noto Serif SC" w:cs="Noto Serif"/>
-          <w:sz w:val="20"/>
-          <w:szCs w:val="20"/>
-        </w:rPr>
-        <w:t xml:space="preserve"> </w:t>
-      </w:r>
-      <w:r>
-        <w:rPr>
-          <w:rFonts w:ascii="Noto Serif SC" w:eastAsia="Noto Serif SC" w:hAnsi="Noto Serif SC" w:cs="Noto Serif"/>
-          <w:sz w:val="20"/>
-          <w:szCs w:val="20"/>
-        </w:rPr>
-        <w:t>(</w:t>
-      </w:r>
-      <w:r>
-        <w:rPr>
-          <w:rFonts w:ascii="Noto Serif SC" w:eastAsia="Noto Serif SC" w:hAnsi="Noto Serif SC" w:cs="Noto Serif"/>
-          <w:sz w:val="20"/>
-          <w:szCs w:val="20"/>
-        </w:rPr>
-        <w:t>Vibraphone</w:t>
-      </w:r>
-      <w:r>
-        <w:rPr>
-          <w:rFonts w:ascii="Noto Serif SC" w:eastAsia="Noto Serif SC" w:hAnsi="Noto Serif SC" w:cs="Noto Serif"/>
-          <w:sz w:val="20"/>
-          <w:szCs w:val="20"/>
-        </w:rPr>
-        <w:t>)</w:t>
-      </w:r>
-      <w:r>
-        <w:rPr>
-          <w:rFonts w:ascii="Noto Serif SC" w:eastAsia="Noto Serif SC" w:hAnsi="Noto Serif SC" w:cs="Noto Serif"/>
-          <w:sz w:val="20"/>
-          <w:szCs w:val="20"/>
-        </w:rPr>
-        <w:t xml:space="preserve">, </w:t>
-      </w:r>
-      <w:r>
-        <w:rPr>
-          <w:rFonts w:ascii="Noto Serif SC" w:eastAsia="Noto Serif SC" w:hAnsi="Noto Serif SC" w:cs="Noto Serif" w:hint="eastAsia"/>
-          <w:sz w:val="20"/>
-          <w:szCs w:val="20"/>
-        </w:rPr>
-        <w:t>大钹</w:t>
-      </w:r>
-      <w:r>
-        <w:rPr>
-          <w:rFonts w:ascii="Noto Serif SC" w:eastAsia="Noto Serif SC" w:hAnsi="Noto Serif SC" w:cs="Noto Serif"/>
-          <w:sz w:val="20"/>
-          <w:szCs w:val="20"/>
-        </w:rPr>
-        <w:t xml:space="preserve"> </w:t>
-      </w:r>
-      <w:r>
-        <w:rPr>
-          <w:rFonts w:ascii="Noto Serif SC" w:eastAsia="Noto Serif SC" w:hAnsi="Noto Serif SC" w:cs="Noto Serif"/>
-          <w:sz w:val="20"/>
-          <w:szCs w:val="20"/>
-        </w:rPr>
-        <w:t>(</w:t>
-      </w:r>
-      <w:r>
-        <w:rPr>
-          <w:rFonts w:ascii="Noto Serif SC" w:eastAsia="Noto Serif SC" w:hAnsi="Noto Serif SC" w:cs="Noto Serif"/>
-          <w:sz w:val="20"/>
-          <w:szCs w:val="20"/>
-        </w:rPr>
-        <w:t>Dabo</w:t>
-      </w:r>
-      <w:r>
-        <w:rPr>
-          <w:rFonts w:ascii="Noto Serif SC" w:eastAsia="Noto Serif SC" w:hAnsi="Noto Serif SC" w:cs="Noto Serif"/>
-          <w:sz w:val="20"/>
-          <w:szCs w:val="20"/>
-        </w:rPr>
-        <w:t>)</w:t>
-      </w:r>
-      <w:r>
-        <w:rPr>
-          <w:rFonts w:ascii="Noto Serif SC" w:eastAsia="Noto Serif SC" w:hAnsi="Noto Serif SC" w:cs="Noto Serif"/>
-          <w:sz w:val="20"/>
-          <w:szCs w:val="20"/>
-        </w:rPr>
-        <w:t xml:space="preserve">, </w:t>
-      </w:r>
-      <w:r>
-        <w:rPr>
-          <w:rFonts w:ascii="Noto Serif SC" w:eastAsia="Noto Serif SC" w:hAnsi="Noto Serif SC" w:cs="Noto Serif" w:hint="eastAsia"/>
-          <w:sz w:val="20"/>
-          <w:szCs w:val="20"/>
-        </w:rPr>
-        <w:t>排鼓</w:t>
-      </w:r>
-      <w:r>
-        <w:rPr>
-          <w:rFonts w:ascii="Noto Serif SC" w:eastAsia="Noto Serif SC" w:hAnsi="Noto Serif SC" w:cs="Noto Serif"/>
-          <w:sz w:val="20"/>
-          <w:szCs w:val="20"/>
-        </w:rPr>
-        <w:t xml:space="preserve"> </w:t>
-      </w:r>
-      <w:r>
-        <w:rPr>
-          <w:rFonts w:ascii="Noto Serif SC" w:eastAsia="Noto Serif SC" w:hAnsi="Noto Serif SC" w:cs="Noto Serif"/>
-          <w:sz w:val="20"/>
-          <w:szCs w:val="20"/>
-        </w:rPr>
-        <w:t>(</w:t>
-      </w:r>
-      <w:proofErr w:type="spellStart"/>
-      <w:r>
-        <w:rPr>
-          <w:rFonts w:ascii="Noto Serif SC" w:eastAsia="Noto Serif SC" w:hAnsi="Noto Serif SC" w:cs="Noto Serif"/>
-          <w:sz w:val="20"/>
-          <w:szCs w:val="20"/>
-        </w:rPr>
-        <w:t>Paigu</w:t>
-      </w:r>
-      <w:proofErr w:type="spellEnd"/>
-      <w:r>
-        <w:rPr>
-          <w:rFonts w:ascii="Noto Serif SC" w:eastAsia="Noto Serif SC" w:hAnsi="Noto Serif SC" w:cs="Noto Serif"/>
-          <w:sz w:val="20"/>
-          <w:szCs w:val="20"/>
-        </w:rPr>
-        <w:t>)</w:t>
-      </w:r>
-      <w:r>
-        <w:rPr>
-          <w:rFonts w:ascii="Noto Serif SC" w:eastAsia="Noto Serif SC" w:hAnsi="Noto Serif SC" w:cs="Noto Serif"/>
-          <w:sz w:val="20"/>
-          <w:szCs w:val="20"/>
-        </w:rPr>
-        <w:t xml:space="preserve">, </w:t>
-      </w:r>
-      <w:r>
-        <w:rPr>
-          <w:rFonts w:ascii="Noto Serif SC" w:eastAsia="Noto Serif SC" w:hAnsi="Noto Serif SC" w:cs="Noto Serif" w:hint="eastAsia"/>
-          <w:sz w:val="20"/>
-          <w:szCs w:val="20"/>
-        </w:rPr>
-        <w:t>军镲</w:t>
-      </w:r>
-      <w:r>
-        <w:rPr>
-          <w:rFonts w:ascii="Noto Serif SC" w:eastAsia="Noto Serif SC" w:hAnsi="Noto Serif SC" w:cs="Noto Serif"/>
-          <w:sz w:val="20"/>
-          <w:szCs w:val="20"/>
-        </w:rPr>
-        <w:t xml:space="preserve"> </w:t>
-      </w:r>
-      <w:r>
-        <w:rPr>
-          <w:rFonts w:ascii="Noto Serif SC" w:eastAsia="Noto Serif SC" w:hAnsi="Noto Serif SC" w:cs="Noto Serif"/>
-          <w:sz w:val="20"/>
-          <w:szCs w:val="20"/>
-        </w:rPr>
-        <w:t>(</w:t>
-      </w:r>
-      <w:r>
-        <w:rPr>
-          <w:rFonts w:ascii="Noto Serif SC" w:eastAsia="Noto Serif SC" w:hAnsi="Noto Serif SC" w:cs="Noto Serif"/>
-          <w:sz w:val="20"/>
-          <w:szCs w:val="20"/>
-        </w:rPr>
-        <w:t>Cymbals</w:t>
-      </w:r>
-      <w:r>
-        <w:rPr>
-          <w:rFonts w:ascii="Noto Serif SC" w:eastAsia="Noto Serif SC" w:hAnsi="Noto Serif SC" w:cs="Noto Serif"/>
-          <w:sz w:val="20"/>
-          <w:szCs w:val="20"/>
-        </w:rPr>
-        <w:t>)</w:t>
-      </w:r>
-      <w:r>
-        <w:rPr>
-          <w:rFonts w:ascii="Noto Serif SC" w:eastAsia="Noto Serif SC" w:hAnsi="Noto Serif SC" w:cs="Noto Serif"/>
-          <w:sz w:val="20"/>
-          <w:szCs w:val="20"/>
-        </w:rPr>
-        <w:t xml:space="preserve">, </w:t>
-      </w:r>
-      <w:r>
-        <w:rPr>
-          <w:rFonts w:ascii="Noto Serif SC" w:eastAsia="Noto Serif SC" w:hAnsi="Noto Serif SC" w:cs="Noto Serif" w:hint="eastAsia"/>
-          <w:sz w:val="20"/>
-          <w:szCs w:val="20"/>
-        </w:rPr>
-        <w:t>通通鼓</w:t>
-      </w:r>
-      <w:r>
-        <w:rPr>
-          <w:rFonts w:ascii="Noto Serif SC" w:eastAsia="Noto Serif SC" w:hAnsi="Noto Serif SC" w:cs="Noto Serif"/>
-          <w:sz w:val="20"/>
-          <w:szCs w:val="20"/>
-        </w:rPr>
-        <w:t xml:space="preserve"> </w:t>
-      </w:r>
-      <w:r>
-        <w:rPr>
-          <w:rFonts w:ascii="Noto Serif SC" w:eastAsia="Noto Serif SC" w:hAnsi="Noto Serif SC" w:cs="Noto Serif"/>
-          <w:sz w:val="20"/>
-          <w:szCs w:val="20"/>
-        </w:rPr>
-        <w:t>(</w:t>
-      </w:r>
-      <w:r>
-        <w:rPr>
-          <w:rFonts w:ascii="Noto Serif SC" w:eastAsia="Noto Serif SC" w:hAnsi="Noto Serif SC" w:cs="Noto Serif"/>
-          <w:sz w:val="20"/>
-          <w:szCs w:val="20"/>
-        </w:rPr>
-        <w:t>Tom-toms</w:t>
-      </w:r>
-      <w:r>
-        <w:rPr>
-          <w:rFonts w:ascii="Noto Serif SC" w:eastAsia="Noto Serif SC" w:hAnsi="Noto Serif SC" w:cs="Noto Serif"/>
-          <w:sz w:val="20"/>
-          <w:szCs w:val="20"/>
-        </w:rPr>
-        <w:t>)</w:t>
-      </w:r>
-    </w:p>
-    <w:p>
-      <w:pPr>
-        <w:jc w:val="right"/>
-        <w:rPr>
-          <w:rFonts w:ascii="Noto Serif SC" w:eastAsia="Noto Serif SC" w:hAnsi="Noto Serif SC" w:cs="Noto Serif"/>
-          <w:sz w:val="24"/>
-          <w:szCs w:val="24"/>
-          <w:lang w:val="en-US"/>
-        </w:rPr>
-      </w:pPr>
-      <w:r>
-        <w:rPr>
-          <w:rFonts w:ascii="Noto Serif SC" w:eastAsia="Noto Serif SC" w:hAnsi="Noto Serif SC" w:cs="Noto Serif" w:hint="eastAsia"/>
-          <w:sz w:val="24"/>
-          <w:szCs w:val="24"/>
-          <w:lang w:val="en-US"/>
-        </w:rPr>
-        <w:t>打击乐</w:t>
-      </w:r>
-      <w:r>
-        <w:rPr>
-          <w:rFonts w:ascii="Noto Serif SC" w:eastAsia="Noto Serif SC" w:hAnsi="Noto Serif SC" w:cs="Noto Serif"/>
-          <w:sz w:val="24"/>
-          <w:szCs w:val="24"/>
-          <w:lang w:val="en-US"/>
-        </w:rPr>
-        <w:t xml:space="preserve"> III (Percussion III)</w:t>
-      </w:r>
-    </w:p>
-    <w:p>
-      <w:pPr>
-        <w:jc w:val="right"/>
-        <w:rPr>
-          <w:rFonts w:ascii="Noto Serif SC" w:eastAsia="Noto Serif SC" w:hAnsi="Noto Serif SC" w:cs="Noto Serif"/>
-          <w:sz w:val="20"/>
-          <w:szCs w:val="20"/>
-        </w:rPr>
-      </w:pPr>
-      <w:r>
-        <w:rPr>
-          <w:rFonts w:ascii="Noto Serif SC" w:eastAsia="Noto Serif SC" w:hAnsi="Noto Serif SC" w:cs="Noto Serif" w:hint="eastAsia"/>
-          <w:sz w:val="20"/>
-          <w:szCs w:val="20"/>
-        </w:rPr>
-        <w:t>木琴</w:t>
-      </w:r>
-      <w:r>
-        <w:rPr>
-          <w:rFonts w:ascii="Noto Serif SC" w:eastAsia="Noto Serif SC" w:hAnsi="Noto Serif SC" w:cs="Noto Serif"/>
-          <w:sz w:val="20"/>
-          <w:szCs w:val="20"/>
-        </w:rPr>
-        <w:t xml:space="preserve"> </w:t>
-      </w:r>
-      <w:r>
-        <w:rPr>
-          <w:rFonts w:ascii="Noto Serif SC" w:eastAsia="Noto Serif SC" w:hAnsi="Noto Serif SC" w:cs="Noto Serif"/>
-          <w:sz w:val="20"/>
-          <w:szCs w:val="20"/>
-        </w:rPr>
-        <w:t>(</w:t>
-      </w:r>
-      <w:r>
-        <w:rPr>
-          <w:rFonts w:ascii="Noto Serif SC" w:eastAsia="Noto Serif SC" w:hAnsi="Noto Serif SC" w:cs="Noto Serif"/>
-          <w:sz w:val="20"/>
-          <w:szCs w:val="20"/>
-        </w:rPr>
-        <w:t>Xylophone</w:t>
-      </w:r>
-      <w:r>
-        <w:rPr>
-          <w:rFonts w:ascii="Noto Serif SC" w:eastAsia="Noto Serif SC" w:hAnsi="Noto Serif SC" w:cs="Noto Serif"/>
-          <w:sz w:val="20"/>
-          <w:szCs w:val="20"/>
-        </w:rPr>
-        <w:t>)</w:t>
-      </w:r>
-      <w:r>
-        <w:rPr>
-          <w:rFonts w:ascii="Noto Serif SC" w:eastAsia="Noto Serif SC" w:hAnsi="Noto Serif SC" w:cs="Noto Serif"/>
-          <w:sz w:val="20"/>
-          <w:szCs w:val="20"/>
-        </w:rPr>
-        <w:t xml:space="preserve">, </w:t>
-      </w:r>
-      <w:r>
-        <w:rPr>
-          <w:rFonts w:ascii="Noto Serif SC" w:eastAsia="Noto Serif SC" w:hAnsi="Noto Serif SC" w:cs="Noto Serif" w:hint="eastAsia"/>
-          <w:sz w:val="20"/>
-          <w:szCs w:val="20"/>
-        </w:rPr>
-        <w:t>通通鼓</w:t>
-      </w:r>
-      <w:r>
-        <w:rPr>
-          <w:rFonts w:ascii="Noto Serif SC" w:eastAsia="Noto Serif SC" w:hAnsi="Noto Serif SC" w:cs="Noto Serif"/>
-          <w:sz w:val="20"/>
-          <w:szCs w:val="20"/>
-        </w:rPr>
-        <w:t xml:space="preserve"> </w:t>
-      </w:r>
-      <w:r>
-        <w:rPr>
-          <w:rFonts w:ascii="Noto Serif SC" w:eastAsia="Noto Serif SC" w:hAnsi="Noto Serif SC" w:cs="Noto Serif"/>
-          <w:sz w:val="20"/>
-          <w:szCs w:val="20"/>
-        </w:rPr>
-        <w:t>(</w:t>
-      </w:r>
-      <w:r>
-        <w:rPr>
-          <w:rFonts w:ascii="Noto Serif SC" w:eastAsia="Noto Serif SC" w:hAnsi="Noto Serif SC" w:cs="Noto Serif"/>
-          <w:sz w:val="20"/>
-          <w:szCs w:val="20"/>
-        </w:rPr>
-        <w:t>Tom-toms</w:t>
-      </w:r>
-      <w:r>
-        <w:rPr>
-          <w:rFonts w:ascii="Noto Serif SC" w:eastAsia="Noto Serif SC" w:hAnsi="Noto Serif SC" w:cs="Noto Serif"/>
-          <w:sz w:val="20"/>
-          <w:szCs w:val="20"/>
-        </w:rPr>
-        <w:t>)</w:t>
-      </w:r>
-      <w:r>
-        <w:rPr>
-          <w:rFonts w:ascii="Noto Serif SC" w:eastAsia="Noto Serif SC" w:hAnsi="Noto Serif SC" w:cs="Noto Serif"/>
-          <w:sz w:val="20"/>
-          <w:szCs w:val="20"/>
-        </w:rPr>
-        <w:t xml:space="preserve">, </w:t>
-      </w:r>
-      <w:r>
-        <w:rPr>
-          <w:rFonts w:ascii="Noto Serif SC" w:eastAsia="Noto Serif SC" w:hAnsi="Noto Serif SC" w:cs="Noto Serif" w:hint="eastAsia"/>
-          <w:sz w:val="20"/>
-          <w:szCs w:val="20"/>
-        </w:rPr>
-        <w:t>乐鞭</w:t>
-      </w:r>
-      <w:r>
-        <w:rPr>
-          <w:rFonts w:ascii="Noto Serif SC" w:eastAsia="Noto Serif SC" w:hAnsi="Noto Serif SC" w:cs="Noto Serif"/>
-          <w:sz w:val="20"/>
-          <w:szCs w:val="20"/>
-        </w:rPr>
-        <w:t xml:space="preserve"> </w:t>
-      </w:r>
-      <w:r>
-        <w:rPr>
-          <w:rFonts w:ascii="Noto Serif SC" w:eastAsia="Noto Serif SC" w:hAnsi="Noto Serif SC" w:cs="Noto Serif"/>
-          <w:sz w:val="20"/>
-          <w:szCs w:val="20"/>
-        </w:rPr>
-        <w:t>(</w:t>
-      </w:r>
-      <w:r>
-        <w:rPr>
-          <w:rFonts w:ascii="Noto Serif SC" w:eastAsia="Noto Serif SC" w:hAnsi="Noto Serif SC" w:cs="Noto Serif"/>
-          <w:sz w:val="20"/>
-          <w:szCs w:val="20"/>
-        </w:rPr>
-        <w:t>Whip</w:t>
-      </w:r>
-      <w:r>
-        <w:rPr>
-          <w:rFonts w:ascii="Noto Serif SC" w:eastAsia="Noto Serif SC" w:hAnsi="Noto Serif SC" w:cs="Noto Serif"/>
-          <w:sz w:val="20"/>
-          <w:szCs w:val="20"/>
-        </w:rPr>
-        <w:t>)</w:t>
-      </w:r>
-      <w:r>
-        <w:rPr>
-          <w:rFonts w:ascii="Noto Serif SC" w:eastAsia="Noto Serif SC" w:hAnsi="Noto Serif SC" w:cs="Noto Serif"/>
-          <w:sz w:val="20"/>
-          <w:szCs w:val="20"/>
-        </w:rPr>
-        <w:t xml:space="preserve">, </w:t>
-      </w:r>
-      <w:r>
-        <w:rPr>
-          <w:rFonts w:ascii="Noto Serif SC" w:eastAsia="Noto Serif SC" w:hAnsi="Noto Serif SC" w:cs="Noto Serif" w:hint="eastAsia"/>
-          <w:sz w:val="20"/>
-          <w:szCs w:val="20"/>
-        </w:rPr>
-        <w:t>康嘎鼓</w:t>
-      </w:r>
-      <w:r>
-        <w:rPr>
-          <w:rFonts w:ascii="Noto Serif SC" w:eastAsia="Noto Serif SC" w:hAnsi="Noto Serif SC" w:cs="Noto Serif"/>
-          <w:sz w:val="20"/>
-          <w:szCs w:val="20"/>
-        </w:rPr>
-        <w:t xml:space="preserve"> </w:t>
-      </w:r>
-      <w:r>
-        <w:rPr>
-          <w:rFonts w:ascii="Noto Serif SC" w:eastAsia="Noto Serif SC" w:hAnsi="Noto Serif SC" w:cs="Noto Serif"/>
-          <w:sz w:val="20"/>
-          <w:szCs w:val="20"/>
-        </w:rPr>
-        <w:t>(</w:t>
-      </w:r>
-      <w:r>
-        <w:rPr>
-          <w:rFonts w:ascii="Noto Serif SC" w:eastAsia="Noto Serif SC" w:hAnsi="Noto Serif SC" w:cs="Noto Serif"/>
-          <w:sz w:val="20"/>
-          <w:szCs w:val="20"/>
-        </w:rPr>
-        <w:t>Congas</w:t>
-      </w:r>
-      <w:r>
-        <w:rPr>
-          <w:rFonts w:ascii="Noto Serif SC" w:eastAsia="Noto Serif SC" w:hAnsi="Noto Serif SC" w:cs="Noto Serif"/>
-          <w:sz w:val="20"/>
-          <w:szCs w:val="20"/>
-        </w:rPr>
-        <w:t>)</w:t>
-      </w:r>
-    </w:p>
-    <w:p>
-      <w:pPr>
-        <w:jc w:val="right"/>
-        <w:rPr>
-          <w:rFonts w:ascii="Noto Serif SC" w:eastAsia="Noto Serif SC" w:hAnsi="Noto Serif SC" w:cs="Noto Serif"/>
-          <w:sz w:val="24"/>
-          <w:szCs w:val="24"/>
-          <w:lang w:val="en-US"/>
-        </w:rPr>
-      </w:pPr>
-      <w:r>
-        <w:rPr>
-          <w:rFonts w:ascii="Noto Serif SC" w:eastAsia="Noto Serif SC" w:hAnsi="Noto Serif SC" w:cs="Noto Serif" w:hint="eastAsia"/>
-          <w:sz w:val="24"/>
-          <w:szCs w:val="24"/>
-          <w:lang w:val="en-US"/>
-        </w:rPr>
-        <w:t>打击乐</w:t>
-      </w:r>
-      <w:r>
-        <w:rPr>
-          <w:rFonts w:ascii="Noto Serif SC" w:eastAsia="Noto Serif SC" w:hAnsi="Noto Serif SC" w:cs="Noto Serif"/>
-          <w:sz w:val="24"/>
-          <w:szCs w:val="24"/>
-          <w:lang w:val="en-US"/>
-        </w:rPr>
-        <w:t xml:space="preserve"> IV (Percussion IV)</w:t>
-      </w:r>
-    </w:p>
-    <w:p>
-      <w:pPr>
-        <w:jc w:val="right"/>
-        <w:rPr>
-          <w:rFonts w:ascii="Noto Serif SC" w:eastAsia="Noto Serif SC" w:hAnsi="Noto Serif SC" w:cs="Noto Serif"/>
-          <w:sz w:val="20"/>
-          <w:szCs w:val="20"/>
-        </w:rPr>
-      </w:pPr>
-      <w:r>
-        <w:rPr>
-          <w:rFonts w:ascii="Noto Serif SC" w:eastAsia="Noto Serif SC" w:hAnsi="Noto Serif SC" w:cs="Noto Serif" w:hint="eastAsia"/>
-          <w:sz w:val="20"/>
-          <w:szCs w:val="20"/>
-        </w:rPr>
-        <w:t>编钟</w:t>
-      </w:r>
-      <w:r>
-        <w:rPr>
-          <w:rFonts w:ascii="Noto Serif SC" w:eastAsia="Noto Serif SC" w:hAnsi="Noto Serif SC" w:cs="Noto Serif"/>
-          <w:sz w:val="20"/>
-          <w:szCs w:val="20"/>
-        </w:rPr>
-        <w:t xml:space="preserve"> </w:t>
-      </w:r>
-      <w:r>
-        <w:rPr>
-          <w:rFonts w:ascii="Noto Serif SC" w:eastAsia="Noto Serif SC" w:hAnsi="Noto Serif SC" w:cs="Noto Serif"/>
-          <w:sz w:val="20"/>
-          <w:szCs w:val="20"/>
-        </w:rPr>
-        <w:t>(</w:t>
-      </w:r>
-      <w:proofErr w:type="spellStart"/>
-      <w:r>
-        <w:rPr>
-          <w:rFonts w:ascii="Noto Serif SC" w:eastAsia="Noto Serif SC" w:hAnsi="Noto Serif SC" w:cs="Noto Serif"/>
-          <w:sz w:val="20"/>
-          <w:szCs w:val="20"/>
-        </w:rPr>
-        <w:t>Bianzhong</w:t>
-      </w:r>
-      <w:proofErr w:type="spellEnd"/>
-      <w:r>
-        <w:rPr>
-          <w:rFonts w:ascii="Noto Serif SC" w:eastAsia="Noto Serif SC" w:hAnsi="Noto Serif SC" w:cs="Noto Serif"/>
-          <w:sz w:val="20"/>
-          <w:szCs w:val="20"/>
-        </w:rPr>
-        <w:t>)</w:t>
-      </w:r>
-      <w:r>
-        <w:rPr>
-          <w:rFonts w:ascii="Noto Serif SC" w:eastAsia="Noto Serif SC" w:hAnsi="Noto Serif SC" w:cs="Noto Serif"/>
-          <w:sz w:val="20"/>
-          <w:szCs w:val="20"/>
-        </w:rPr>
-        <w:t xml:space="preserve">, </w:t>
-      </w:r>
-      <w:r>
-        <w:rPr>
-          <w:rFonts w:ascii="Noto Serif SC" w:eastAsia="Noto Serif SC" w:hAnsi="Noto Serif SC" w:cs="Noto Serif" w:hint="eastAsia"/>
-          <w:sz w:val="20"/>
-          <w:szCs w:val="20"/>
-        </w:rPr>
-        <w:t>通通鼓</w:t>
-      </w:r>
-      <w:r>
-        <w:rPr>
-          <w:rFonts w:ascii="Noto Serif SC" w:eastAsia="Noto Serif SC" w:hAnsi="Noto Serif SC" w:cs="Noto Serif"/>
-          <w:sz w:val="20"/>
-          <w:szCs w:val="20"/>
-        </w:rPr>
-        <w:t xml:space="preserve"> </w:t>
-      </w:r>
-      <w:r>
-        <w:rPr>
-          <w:rFonts w:ascii="Noto Serif SC" w:eastAsia="Noto Serif SC" w:hAnsi="Noto Serif SC" w:cs="Noto Serif"/>
-          <w:sz w:val="20"/>
-          <w:szCs w:val="20"/>
-        </w:rPr>
-        <w:t>(</w:t>
-      </w:r>
-      <w:r>
-        <w:rPr>
-          <w:rFonts w:ascii="Noto Serif SC" w:eastAsia="Noto Serif SC" w:hAnsi="Noto Serif SC" w:cs="Noto Serif"/>
-          <w:sz w:val="20"/>
-          <w:szCs w:val="20"/>
-        </w:rPr>
-        <w:t>Tom-toms</w:t>
-      </w:r>
-      <w:r>
-        <w:rPr>
-          <w:rFonts w:ascii="Noto Serif SC" w:eastAsia="Noto Serif SC" w:hAnsi="Noto Serif SC" w:cs="Noto Serif"/>
-          <w:sz w:val="20"/>
-          <w:szCs w:val="20"/>
-        </w:rPr>
-        <w:t>)</w:t>
-      </w:r>
-      <w:r>
-        <w:rPr>
-          <w:rFonts w:ascii="Noto Serif SC" w:eastAsia="Noto Serif SC" w:hAnsi="Noto Serif SC" w:cs="Noto Serif"/>
-          <w:sz w:val="20"/>
-          <w:szCs w:val="20"/>
-        </w:rPr>
-        <w:t xml:space="preserve">, </w:t>
-      </w:r>
-      <w:r>
-        <w:rPr>
-          <w:rFonts w:ascii="Noto Serif SC" w:eastAsia="Noto Serif SC" w:hAnsi="Noto Serif SC" w:cs="Noto Serif" w:hint="eastAsia"/>
-          <w:sz w:val="20"/>
-          <w:szCs w:val="20"/>
-        </w:rPr>
-        <w:t>马林巴</w:t>
-      </w:r>
-      <w:r>
-        <w:rPr>
-          <w:rFonts w:ascii="Noto Serif SC" w:eastAsia="Noto Serif SC" w:hAnsi="Noto Serif SC" w:cs="Noto Serif"/>
-          <w:sz w:val="20"/>
-          <w:szCs w:val="20"/>
-        </w:rPr>
-        <w:t xml:space="preserve"> </w:t>
-      </w:r>
-      <w:r>
-        <w:rPr>
-          <w:rFonts w:ascii="Noto Serif SC" w:eastAsia="Noto Serif SC" w:hAnsi="Noto Serif SC" w:cs="Noto Serif"/>
-          <w:sz w:val="20"/>
-          <w:szCs w:val="20"/>
-        </w:rPr>
-        <w:t>(</w:t>
-      </w:r>
-      <w:r>
-        <w:rPr>
-          <w:rFonts w:ascii="Noto Serif SC" w:eastAsia="Noto Serif SC" w:hAnsi="Noto Serif SC" w:cs="Noto Serif"/>
-          <w:sz w:val="20"/>
-          <w:szCs w:val="20"/>
-        </w:rPr>
-        <w:t>Marimba</w:t>
-      </w:r>
-      <w:r>
-        <w:rPr>
-          <w:rFonts w:ascii="Noto Serif SC" w:eastAsia="Noto Serif SC" w:hAnsi="Noto Serif SC" w:cs="Noto Serif"/>
-          <w:sz w:val="20"/>
-          <w:szCs w:val="20"/>
-        </w:rPr>
-        <w:t>)</w:t>
-      </w:r>
-      <w:r>
-        <w:rPr>
-          <w:rFonts w:ascii="Noto Serif SC" w:eastAsia="Noto Serif SC" w:hAnsi="Noto Serif SC" w:cs="Noto Serif"/>
-          <w:sz w:val="20"/>
-          <w:szCs w:val="20"/>
-        </w:rPr>
-        <w:t xml:space="preserve">, </w:t>
-      </w:r>
-      <w:r>
-        <w:rPr>
-          <w:rFonts w:ascii="Noto Serif SC" w:eastAsia="Noto Serif SC" w:hAnsi="Noto Serif SC" w:cs="Noto Serif" w:hint="eastAsia"/>
-          <w:sz w:val="20"/>
-          <w:szCs w:val="20"/>
-        </w:rPr>
-        <w:t>军镲</w:t>
-      </w:r>
-      <w:r>
-        <w:rPr>
-          <w:rFonts w:ascii="Noto Serif SC" w:eastAsia="Noto Serif SC" w:hAnsi="Noto Serif SC" w:cs="Noto Serif"/>
-          <w:sz w:val="20"/>
-          <w:szCs w:val="20"/>
-        </w:rPr>
-        <w:t xml:space="preserve"> </w:t>
-      </w:r>
-      <w:r>
-        <w:rPr>
-          <w:rFonts w:ascii="Noto Serif SC" w:eastAsia="Noto Serif SC" w:hAnsi="Noto Serif SC" w:cs="Noto Serif"/>
-          <w:sz w:val="20"/>
-          <w:szCs w:val="20"/>
-        </w:rPr>
-        <w:t>(</w:t>
-      </w:r>
-      <w:r>
-        <w:rPr>
-          <w:rFonts w:ascii="Noto Serif SC" w:eastAsia="Noto Serif SC" w:hAnsi="Noto Serif SC" w:cs="Noto Serif"/>
-          <w:sz w:val="20"/>
-          <w:szCs w:val="20"/>
-        </w:rPr>
-        <w:t>Cymbals</w:t>
-      </w:r>
-      <w:r>
-        <w:rPr>
-          <w:rFonts w:ascii="Noto Serif SC" w:eastAsia="Noto Serif SC" w:hAnsi="Noto Serif SC" w:cs="Noto Serif"/>
-          <w:sz w:val="20"/>
-          <w:szCs w:val="20"/>
-        </w:rPr>
-        <w:t>)</w:t>
-      </w:r>
-    </w:p>
-    <w:p>
-      <w:pPr>
-        <w:jc w:val="right"/>
-        <w:rPr>
-          <w:rFonts w:ascii="Noto Serif SC" w:eastAsia="Noto Serif SC" w:hAnsi="Noto Serif SC" w:cs="Noto Serif"/>
-          <w:sz w:val="24"/>
-          <w:szCs w:val="24"/>
-          <w:lang w:val="en-US"/>
-        </w:rPr>
-      </w:pPr>
-      <w:r>
-        <w:rPr>
-          <w:rFonts w:ascii="Noto Serif SC" w:eastAsia="Noto Serif SC" w:hAnsi="Noto Serif SC" w:cs="Noto Serif" w:hint="eastAsia"/>
-          <w:sz w:val="24"/>
-          <w:szCs w:val="24"/>
-          <w:lang w:val="en-US"/>
-        </w:rPr>
-        <w:t>打击乐</w:t>
-      </w:r>
-      <w:r>
-        <w:rPr>
-          <w:rFonts w:ascii="Noto Serif SC" w:eastAsia="Noto Serif SC" w:hAnsi="Noto Serif SC" w:cs="Noto Serif"/>
-          <w:sz w:val="24"/>
-          <w:szCs w:val="24"/>
-          <w:lang w:val="en-US"/>
-        </w:rPr>
-        <w:t xml:space="preserve"> V (Percussion V)</w:t>
-      </w:r>
-    </w:p>
-    <w:p>
-      <w:pPr>
-        <w:jc w:val="right"/>
-        <w:rPr>
-          <w:rFonts w:ascii="Noto Serif SC" w:eastAsia="Noto Serif SC" w:hAnsi="Noto Serif SC" w:cs="Noto Serif"/>
-          <w:sz w:val="20"/>
-          <w:szCs w:val="20"/>
-        </w:rPr>
-      </w:pPr>
-      <w:r>
-        <w:rPr>
-          <w:rFonts w:ascii="Noto Serif SC" w:eastAsia="Noto Serif SC" w:hAnsi="Noto Serif SC" w:cs="Noto Serif" w:hint="eastAsia"/>
-          <w:sz w:val="20"/>
-          <w:szCs w:val="20"/>
-        </w:rPr>
-        <w:t>铓锣</w:t>
-      </w:r>
-      <w:r>
-        <w:rPr>
-          <w:rFonts w:ascii="Noto Serif SC" w:eastAsia="Noto Serif SC" w:hAnsi="Noto Serif SC" w:cs="Noto Serif"/>
-          <w:sz w:val="20"/>
-          <w:szCs w:val="20"/>
-        </w:rPr>
-        <w:t xml:space="preserve"> </w:t>
-      </w:r>
-      <w:r>
-        <w:rPr>
-          <w:rFonts w:ascii="Noto Serif SC" w:eastAsia="Noto Serif SC" w:hAnsi="Noto Serif SC" w:cs="Noto Serif"/>
-          <w:sz w:val="20"/>
-          <w:szCs w:val="20"/>
-        </w:rPr>
-        <w:t>(</w:t>
-      </w:r>
-      <w:proofErr w:type="spellStart"/>
-      <w:r>
-        <w:rPr>
-          <w:rFonts w:ascii="Noto Serif SC" w:eastAsia="Noto Serif SC" w:hAnsi="Noto Serif SC" w:cs="Noto Serif"/>
-          <w:sz w:val="20"/>
-          <w:szCs w:val="20"/>
-        </w:rPr>
-        <w:t>Mangluo</w:t>
-      </w:r>
-      <w:proofErr w:type="spellEnd"/>
-      <w:r>
-        <w:rPr>
-          <w:rFonts w:ascii="Noto Serif SC" w:eastAsia="Noto Serif SC" w:hAnsi="Noto Serif SC" w:cs="Noto Serif"/>
-          <w:sz w:val="20"/>
-          <w:szCs w:val="20"/>
-        </w:rPr>
-        <w:t>)</w:t>
-      </w:r>
-      <w:r>
-        <w:rPr>
-          <w:rFonts w:ascii="Noto Serif SC" w:eastAsia="Noto Serif SC" w:hAnsi="Noto Serif SC" w:cs="Noto Serif"/>
-          <w:sz w:val="20"/>
-          <w:szCs w:val="20"/>
-        </w:rPr>
-        <w:t xml:space="preserve">, </w:t>
-      </w:r>
-      <w:r>
-        <w:rPr>
-          <w:rFonts w:ascii="Noto Serif SC" w:eastAsia="Noto Serif SC" w:hAnsi="Noto Serif SC" w:cs="Noto Serif" w:hint="eastAsia"/>
-          <w:sz w:val="20"/>
-          <w:szCs w:val="20"/>
-        </w:rPr>
-        <w:t>颤音琴</w:t>
-      </w:r>
-      <w:r>
-        <w:rPr>
-          <w:rFonts w:ascii="Noto Serif SC" w:eastAsia="Noto Serif SC" w:hAnsi="Noto Serif SC" w:cs="Noto Serif"/>
-          <w:sz w:val="20"/>
-          <w:szCs w:val="20"/>
-        </w:rPr>
-        <w:t xml:space="preserve"> </w:t>
-      </w:r>
-      <w:r>
-        <w:rPr>
-          <w:rFonts w:ascii="Noto Serif SC" w:eastAsia="Noto Serif SC" w:hAnsi="Noto Serif SC" w:cs="Noto Serif"/>
-          <w:sz w:val="20"/>
-          <w:szCs w:val="20"/>
-        </w:rPr>
-        <w:t>(</w:t>
-      </w:r>
-      <w:r>
-        <w:rPr>
-          <w:rFonts w:ascii="Noto Serif SC" w:eastAsia="Noto Serif SC" w:hAnsi="Noto Serif SC" w:cs="Noto Serif"/>
-          <w:sz w:val="20"/>
-          <w:szCs w:val="20"/>
-        </w:rPr>
-        <w:t>Vibraphone</w:t>
-      </w:r>
-      <w:r>
-        <w:rPr>
-          <w:rFonts w:ascii="Noto Serif SC" w:eastAsia="Noto Serif SC" w:hAnsi="Noto Serif SC" w:cs="Noto Serif"/>
-          <w:sz w:val="20"/>
-          <w:szCs w:val="20"/>
-        </w:rPr>
-        <w:t>)</w:t>
-      </w:r>
-      <w:r>
-        <w:rPr>
-          <w:rFonts w:ascii="Noto Serif SC" w:eastAsia="Noto Serif SC" w:hAnsi="Noto Serif SC" w:cs="Noto Serif"/>
-          <w:sz w:val="20"/>
-          <w:szCs w:val="20"/>
-        </w:rPr>
-        <w:t xml:space="preserve">, </w:t>
-      </w:r>
-      <w:r>
-        <w:rPr>
-          <w:rFonts w:ascii="Noto Serif SC" w:eastAsia="Noto Serif SC" w:hAnsi="Noto Serif SC" w:cs="Noto Serif" w:hint="eastAsia"/>
-          <w:sz w:val="20"/>
-          <w:szCs w:val="20"/>
-        </w:rPr>
-        <w:t>编钟</w:t>
-      </w:r>
-      <w:r>
-        <w:rPr>
-          <w:rFonts w:ascii="Noto Serif SC" w:eastAsia="Noto Serif SC" w:hAnsi="Noto Serif SC" w:cs="Noto Serif"/>
-          <w:sz w:val="20"/>
-          <w:szCs w:val="20"/>
-        </w:rPr>
-        <w:t xml:space="preserve"> </w:t>
-      </w:r>
-      <w:r>
-        <w:rPr>
-          <w:rFonts w:ascii="Noto Serif SC" w:eastAsia="Noto Serif SC" w:hAnsi="Noto Serif SC" w:cs="Noto Serif"/>
-          <w:sz w:val="20"/>
-          <w:szCs w:val="20"/>
-        </w:rPr>
-        <w:t>(</w:t>
-      </w:r>
-      <w:proofErr w:type="spellStart"/>
-      <w:r>
-        <w:rPr>
-          <w:rFonts w:ascii="Noto Serif SC" w:eastAsia="Noto Serif SC" w:hAnsi="Noto Serif SC" w:cs="Noto Serif"/>
-          <w:sz w:val="20"/>
-          <w:szCs w:val="20"/>
-        </w:rPr>
-        <w:t>Bianzhong</w:t>
-      </w:r>
-      <w:proofErr w:type="spellEnd"/>
-      <w:r>
-        <w:rPr>
-          <w:rFonts w:ascii="Noto Serif SC" w:eastAsia="Noto Serif SC" w:hAnsi="Noto Serif SC" w:cs="Noto Serif"/>
-          <w:sz w:val="20"/>
-          <w:szCs w:val="20"/>
-        </w:rPr>
-        <w:t>)</w:t>
-      </w:r>
-      <w:r>
-        <w:rPr>
-          <w:rFonts w:ascii="Noto Serif SC" w:eastAsia="Noto Serif SC" w:hAnsi="Noto Serif SC" w:cs="Noto Serif"/>
-          <w:sz w:val="20"/>
-          <w:szCs w:val="20"/>
-        </w:rPr>
-        <w:t xml:space="preserve">, </w:t>
-      </w:r>
-      <w:r>
-        <w:rPr>
-          <w:rFonts w:ascii="Noto Serif SC" w:eastAsia="Noto Serif SC" w:hAnsi="Noto Serif SC" w:cs="Noto Serif" w:hint="eastAsia"/>
-          <w:sz w:val="20"/>
-          <w:szCs w:val="20"/>
-        </w:rPr>
-        <w:t>大军鼓</w:t>
-      </w:r>
-      <w:r>
-        <w:rPr>
-          <w:rFonts w:ascii="Noto Serif SC" w:eastAsia="Noto Serif SC" w:hAnsi="Noto Serif SC" w:cs="Noto Serif"/>
-          <w:sz w:val="20"/>
-          <w:szCs w:val="20"/>
-        </w:rPr>
-        <w:t xml:space="preserve"> </w:t>
-      </w:r>
-      <w:r>
-        <w:rPr>
-          <w:rFonts w:ascii="Noto Serif SC" w:eastAsia="Noto Serif SC" w:hAnsi="Noto Serif SC" w:cs="Noto Serif"/>
-          <w:sz w:val="20"/>
-          <w:szCs w:val="20"/>
-        </w:rPr>
-        <w:t>(</w:t>
-      </w:r>
-      <w:r>
-        <w:rPr>
-          <w:rFonts w:ascii="Noto Serif SC" w:eastAsia="Noto Serif SC" w:hAnsi="Noto Serif SC" w:cs="Noto Serif"/>
-          <w:sz w:val="20"/>
-          <w:szCs w:val="20"/>
-        </w:rPr>
-        <w:t>Bass drum</w:t>
-      </w:r>
-      <w:r>
-        <w:rPr>
-          <w:rFonts w:ascii="Noto Serif SC" w:eastAsia="Noto Serif SC" w:hAnsi="Noto Serif SC" w:cs="Noto Serif"/>
-          <w:sz w:val="20"/>
-          <w:szCs w:val="20"/>
-        </w:rPr>
-        <w:t>)</w:t>
-      </w:r>
-      <w:r>
-        <w:rPr>
-          <w:rFonts w:ascii="Noto Serif SC" w:eastAsia="Noto Serif SC" w:hAnsi="Noto Serif SC" w:cs="Noto Serif"/>
-          <w:sz w:val="20"/>
-          <w:szCs w:val="20"/>
-        </w:rPr>
-        <w:t xml:space="preserve">, </w:t>
-      </w:r>
-      <w:r>
-        <w:rPr>
-          <w:rFonts w:ascii="Noto Serif SC" w:eastAsia="Noto Serif SC" w:hAnsi="Noto Serif SC" w:cs="Noto Serif" w:hint="eastAsia"/>
-          <w:sz w:val="20"/>
-          <w:szCs w:val="20"/>
-        </w:rPr>
-        <w:t>大锣</w:t>
-      </w:r>
-      <w:r>
-        <w:rPr>
-          <w:rFonts w:ascii="Noto Serif SC" w:eastAsia="Noto Serif SC" w:hAnsi="Noto Serif SC" w:cs="Noto Serif"/>
-          <w:sz w:val="20"/>
-          <w:szCs w:val="20"/>
-        </w:rPr>
-        <w:t xml:space="preserve"> </w:t>
-      </w:r>
-      <w:r>
-        <w:rPr>
-          <w:rFonts w:ascii="Noto Serif SC" w:eastAsia="Noto Serif SC" w:hAnsi="Noto Serif SC" w:cs="Noto Serif"/>
-          <w:sz w:val="20"/>
-          <w:szCs w:val="20"/>
-        </w:rPr>
-        <w:t>(</w:t>
-      </w:r>
-      <w:proofErr w:type="spellStart"/>
-      <w:r>
-        <w:rPr>
-          <w:rFonts w:ascii="Noto Serif SC" w:eastAsia="Noto Serif SC" w:hAnsi="Noto Serif SC" w:cs="Noto Serif"/>
-          <w:sz w:val="20"/>
-          <w:szCs w:val="20"/>
-        </w:rPr>
-        <w:t>Daluo</w:t>
-      </w:r>
-      <w:proofErr w:type="spellEnd"/>
-      <w:r>
-        <w:rPr>
-          <w:rFonts w:ascii="Noto Serif SC" w:eastAsia="Noto Serif SC" w:hAnsi="Noto Serif SC" w:cs="Noto Serif"/>
-          <w:sz w:val="20"/>
-          <w:szCs w:val="20"/>
-        </w:rPr>
-        <w:t>)</w:t>
-      </w:r>
-    </w:p>
-    <w:p>
-      <w:pPr>
-        <w:jc w:val="right"/>
-        <w:rPr>
-          <w:rFonts w:ascii="Noto Serif SC" w:eastAsia="Noto Serif SC" w:hAnsi="Noto Serif SC" w:cs="Noto Serif"/>
-          <w:sz w:val="24"/>
-          <w:szCs w:val="24"/>
-          <w:lang w:val="en-US"/>
-        </w:rPr>
-      </w:pPr>
-      <w:r>
-        <w:rPr>
-          <w:rFonts w:ascii="Noto Serif SC" w:eastAsia="Noto Serif SC" w:hAnsi="Noto Serif SC" w:cs="Noto Serif" w:hint="eastAsia"/>
-          <w:sz w:val="24"/>
-          <w:szCs w:val="24"/>
-          <w:lang w:val="en-US"/>
-        </w:rPr>
-        <w:t>打击乐</w:t>
-      </w:r>
-      <w:r>
-        <w:rPr>
-          <w:rFonts w:ascii="Noto Serif SC" w:eastAsia="Noto Serif SC" w:hAnsi="Noto Serif SC" w:cs="Noto Serif"/>
-          <w:sz w:val="24"/>
-          <w:szCs w:val="24"/>
-          <w:lang w:val="en-US"/>
-        </w:rPr>
-        <w:t xml:space="preserve"> VI (Percussion VI)</w:t>
-      </w:r>
-    </w:p>
-    <w:p>
-      <w:pPr>
-        <w:jc w:val="right"/>
-        <w:rPr>
-          <w:rFonts w:ascii="Noto Serif SC" w:eastAsia="Noto Serif SC" w:hAnsi="Noto Serif SC" w:cs="Noto Serif"/>
-          <w:sz w:val="20"/>
-          <w:szCs w:val="20"/>
-          <w:lang w:val="en-US"/>
-        </w:rPr>
-      </w:pPr>
-      <w:r>
-        <w:rPr>
-          <w:rFonts w:ascii="Noto Serif SC" w:eastAsia="Noto Serif SC" w:hAnsi="Noto Serif SC" w:cs="Noto Serif"/>
-          <w:sz w:val="20"/>
-          <w:szCs w:val="20"/>
-        </w:rPr>
-        <w:t>(</w:t>
-      </w:r>
-      <w:r>
-        <w:rPr>
-          <w:rFonts w:ascii="Noto Serif SC" w:eastAsia="Noto Serif SC" w:hAnsi="Noto Serif SC" w:cs="Noto Serif" w:hint="eastAsia"/>
-          <w:sz w:val="20"/>
-          <w:szCs w:val="20"/>
-        </w:rPr>
-        <w:t>中国</w:t>
-      </w:r>
-      <w:r>
-        <w:rPr>
-          <w:rFonts w:ascii="Noto Serif SC" w:eastAsia="Noto Serif SC" w:hAnsi="Noto Serif SC" w:cs="Noto Serif"/>
-          <w:sz w:val="20"/>
-          <w:szCs w:val="20"/>
-        </w:rPr>
-        <w:t>)</w:t>
-      </w:r>
-      <w:r>
-        <w:rPr>
-          <w:rFonts w:ascii="Noto Serif SC" w:eastAsia="Noto Serif SC" w:hAnsi="Noto Serif SC" w:cs="Noto Serif" w:hint="eastAsia"/>
-          <w:sz w:val="20"/>
-          <w:szCs w:val="20"/>
-        </w:rPr>
-        <w:t>大鼓</w:t>
-      </w:r>
-      <w:r>
-        <w:rPr>
-          <w:rFonts w:ascii="Noto Serif SC" w:eastAsia="Noto Serif SC" w:hAnsi="Noto Serif SC" w:cs="Noto Serif"/>
-          <w:sz w:val="20"/>
-          <w:szCs w:val="20"/>
-        </w:rPr>
-        <w:t xml:space="preserve"> </w:t>
-      </w:r>
-      <w:r>
-        <w:rPr>
-          <w:rFonts w:ascii="Noto Serif SC" w:eastAsia="Noto Serif SC" w:hAnsi="Noto Serif SC" w:cs="Noto Serif"/>
-          <w:sz w:val="20"/>
-          <w:szCs w:val="20"/>
-        </w:rPr>
-        <w:t>(</w:t>
-      </w:r>
-      <w:proofErr w:type="spellStart"/>
-      <w:r>
-        <w:rPr>
           <w:rFonts w:ascii="Noto Serif SC" w:eastAsia="Noto Serif SC" w:hAnsi="Noto Serif SC" w:cs="Noto Serif"/>
           <w:sz w:val="20"/>
           <w:szCs w:val="20"/>
         </w:rPr>
         <w:t>Dagu</w:t>
       </w:r>
-      <w:proofErr w:type="spellEnd"/>
-      <w:r>
-        <w:rPr>
-          <w:rFonts w:ascii="Noto Serif SC" w:eastAsia="Noto Serif SC" w:hAnsi="Noto Serif SC" w:cs="Noto Serif"/>
-          <w:sz w:val="20"/>
-          <w:szCs w:val="20"/>
-        </w:rPr>
-        <w:t>)</w:t>
-      </w:r>
-      <w:r>
-        <w:rPr>
-          <w:rFonts w:ascii="Noto Serif SC" w:eastAsia="Noto Serif SC" w:hAnsi="Noto Serif SC" w:cs="Noto Serif"/>
-          <w:sz w:val="20"/>
-          <w:szCs w:val="20"/>
-        </w:rPr>
-        <w:t xml:space="preserve">, </w:t>
-      </w:r>
-      <w:proofErr w:type="spellStart"/>
-      <w:r>
-        <w:rPr>
-          <w:rFonts w:ascii="Noto Serif SC" w:eastAsia="Noto Serif SC" w:hAnsi="Noto Serif SC" w:cs="Noto Serif"/>
-          <w:sz w:val="20"/>
-          <w:szCs w:val="20"/>
-        </w:rPr>
-        <w:t>Tubaphone</w:t>
-      </w:r>
-      <w:proofErr w:type="spellEnd"/>
-      <w:r>
-        <w:rPr>
-          <w:rFonts w:ascii="Noto Serif SC" w:eastAsia="Noto Serif SC" w:hAnsi="Noto Serif SC" w:cs="Noto Serif"/>
-          <w:sz w:val="20"/>
-          <w:szCs w:val="20"/>
-        </w:rPr>
-        <w:t xml:space="preserve">, </w:t>
-      </w:r>
-      <w:r>
-        <w:rPr>
-          <w:rFonts w:ascii="Noto Serif SC" w:eastAsia="Noto Serif SC" w:hAnsi="Noto Serif SC" w:cs="Noto Serif" w:hint="eastAsia"/>
-          <w:sz w:val="20"/>
-          <w:szCs w:val="20"/>
-        </w:rPr>
-        <w:t>小军鼓</w:t>
-      </w:r>
-      <w:r>
-        <w:rPr>
-          <w:rFonts w:ascii="Noto Serif SC" w:eastAsia="Noto Serif SC" w:hAnsi="Noto Serif SC" w:cs="Noto Serif"/>
-          <w:sz w:val="20"/>
-          <w:szCs w:val="20"/>
-        </w:rPr>
-        <w:t xml:space="preserve"> </w:t>
-      </w:r>
-      <w:r>
-        <w:rPr>
-          <w:rFonts w:ascii="Noto Serif SC" w:eastAsia="Noto Serif SC" w:hAnsi="Noto Serif SC" w:cs="Noto Serif"/>
-          <w:sz w:val="20"/>
-          <w:szCs w:val="20"/>
-        </w:rPr>
-        <w:t>(</w:t>
-      </w:r>
-      <w:r>
-        <w:rPr>
-          <w:rFonts w:ascii="Noto Serif SC" w:eastAsia="Noto Serif SC" w:hAnsi="Noto Serif SC" w:cs="Noto Serif"/>
-          <w:sz w:val="20"/>
-          <w:szCs w:val="20"/>
-        </w:rPr>
-        <w:t>Snare Drum</w:t>
-      </w:r>
-      <w:r>
-        <w:rPr>
-          <w:rFonts w:ascii="Noto Serif SC" w:eastAsia="Noto Serif SC" w:hAnsi="Noto Serif SC" w:cs="Noto Serif"/>
-          <w:sz w:val="20"/>
-          <w:szCs w:val="20"/>
-        </w:rPr>
-        <w:t>)</w:t>
-      </w:r>
-      <w:r>
-        <w:rPr>
-          <w:rFonts w:ascii="Noto Serif SC" w:eastAsia="Noto Serif SC" w:hAnsi="Noto Serif SC" w:cs="Noto Serif"/>
-          <w:sz w:val="20"/>
-          <w:szCs w:val="20"/>
-        </w:rPr>
-        <w:t>, (</w:t>
-      </w:r>
-      <w:r>
-        <w:rPr>
-          <w:rFonts w:ascii="Noto Serif SC" w:eastAsia="Noto Serif SC" w:hAnsi="Noto Serif SC" w:cs="Noto Serif" w:hint="eastAsia"/>
-          <w:sz w:val="20"/>
-          <w:szCs w:val="20"/>
-        </w:rPr>
-        <w:t>中国</w:t>
-      </w:r>
-      <w:r>
-        <w:rPr>
-          <w:rFonts w:ascii="Noto Serif SC" w:eastAsia="Noto Serif SC" w:hAnsi="Noto Serif SC" w:cs="Noto Serif"/>
-          <w:sz w:val="20"/>
-          <w:szCs w:val="20"/>
-        </w:rPr>
-        <w:t>)</w:t>
-      </w:r>
-      <w:r>
-        <w:rPr>
-          <w:rFonts w:ascii="Noto Serif SC" w:eastAsia="Noto Serif SC" w:hAnsi="Noto Serif SC" w:cs="Noto Serif" w:hint="eastAsia"/>
-          <w:sz w:val="20"/>
-          <w:szCs w:val="20"/>
-        </w:rPr>
-        <w:t>大鼓</w:t>
-      </w:r>
-      <w:r>
-        <w:rPr>
-          <w:rFonts w:ascii="Noto Serif SC" w:eastAsia="Noto Serif SC" w:hAnsi="Noto Serif SC" w:cs="Noto Serif"/>
-          <w:sz w:val="20"/>
-          <w:szCs w:val="20"/>
-        </w:rPr>
-        <w:t xml:space="preserve"> </w:t>
-      </w:r>
-      <w:r>
-        <w:rPr>
-          <w:rFonts w:ascii="Noto Serif SC" w:eastAsia="Noto Serif SC" w:hAnsi="Noto Serif SC" w:cs="Noto Serif"/>
-          <w:sz w:val="20"/>
-          <w:szCs w:val="20"/>
-        </w:rPr>
-        <w:t>(</w:t>
-      </w:r>
-      <w:proofErr w:type="spellStart"/>
-      <w:r>
-        <w:rPr>
-          <w:rFonts w:ascii="Noto Serif SC" w:eastAsia="Noto Serif SC" w:hAnsi="Noto Serif SC" w:cs="Noto Serif"/>
-          <w:sz w:val="20"/>
-          <w:szCs w:val="20"/>
-        </w:rPr>
-        <w:t>Dagu</w:t>
-      </w:r>
-      <w:proofErr w:type="spellEnd"/>
       <w:r>
         <w:rPr>
           <w:rFonts w:ascii="Noto Serif SC" w:eastAsia="Noto Serif SC" w:hAnsi="Noto Serif SC" w:cs="Noto Serif"/>

</xml_diff>

<commit_message>
Front matter minor formatting fix
</commit_message>
<xml_diff>
--- a/Front Matter/Template/3_Front-Matter.docx
+++ b/Front Matter/Template/3_Front-Matter.docx
@@ -3559,7 +3559,6 @@
     </w:p>
     <w:p>
       <w:pPr>
-        <w:spacing w:after="640"/>
         <w:rPr>
           <w:rFonts w:ascii="Noto Serif SC" w:eastAsia="Noto Serif SC" w:hAnsi="Noto Serif SC" w:cs="Noto Serif"/>
           <w:b/>
@@ -3702,7 +3701,6 @@
     </w:p>
     <w:p>
       <w:pPr>
-        <w:spacing w:after="120"/>
         <w:rPr>
           <w:rFonts w:ascii="Noto Serif SC" w:eastAsia="Noto Serif SC" w:hAnsi="Noto Serif SC" w:cs="Noto Serif"/>
           <w:sz w:val="24"/>
@@ -3760,6 +3758,7 @@
     </w:p>
     <w:p>
       <w:pPr>
+        <w:spacing w:before="240"/>
         <w:rPr>
           <w:rFonts w:ascii="Noto Serif SC" w:eastAsia="Noto Serif SC" w:hAnsi="Noto Serif SC" w:cs="Noto Serif"/>
           <w:sz w:val="24"/>
@@ -3901,7 +3900,6 @@
     </w:p>
     <w:p>
       <w:pPr>
-        <w:spacing w:after="120"/>
         <w:rPr>
           <w:rFonts w:ascii="Noto Serif SC" w:eastAsia="Noto Serif SC" w:hAnsi="Noto Serif SC" w:cs="Noto Serif"/>
           <w:sz w:val="24"/>
@@ -3945,6 +3943,89 @@
         </w:rPr>
         <w:t xml:space="preserve">1 </w:t>
       </w:r>
+      <w:r>
+        <w:rPr>
+          <w:rFonts w:ascii="Noto Serif SC" w:eastAsia="Noto Serif SC" w:hAnsi="Noto Serif SC" w:cs="Noto Serif"/>
+          <w:sz w:val="24"/>
+          <w:szCs w:val="24"/>
+          <w:lang w:val="en-GB"/>
+        </w:rPr>
+        <w:t>Diyin Shen</w:t>
+      </w:r>
+      <w:r>
+        <w:rPr>
+          <w:rFonts w:ascii="Noto Serif SC" w:eastAsia="Noto Serif SC" w:hAnsi="Noto Serif SC" w:cs="Noto Serif"/>
+          <w:sz w:val="24"/>
+          <w:szCs w:val="24"/>
+          <w:lang w:val="en-GB"/>
+        </w:rPr>
+        <w:t>g</w:t>
+      </w:r>
+    </w:p>
+    <w:p>
+      <w:pPr>
+        <w:spacing w:before="240"/>
+        <w:rPr>
+          <w:rFonts w:ascii="Noto Serif SC" w:eastAsia="Noto Serif SC" w:hAnsi="Noto Serif SC" w:cs="Noto Serif"/>
+          <w:sz w:val="24"/>
+          <w:szCs w:val="24"/>
+          <w:lang w:val="en-GB"/>
+        </w:rPr>
+      </w:pPr>
+      <w:r>
+        <w:rPr>
+          <w:rFonts w:ascii="Noto Serif SC" w:eastAsia="Noto Serif SC" w:hAnsi="Noto Serif SC" w:cs="Noto Serif"/>
+          <w:sz w:val="24"/>
+          <w:szCs w:val="24"/>
+          <w:lang w:val="en-GB"/>
+        </w:rPr>
+        <w:t xml:space="preserve">2 </w:t>
+      </w:r>
+      <w:r>
+        <w:rPr>
+          <w:rFonts w:ascii="Noto Serif SC" w:eastAsia="Noto Serif SC" w:hAnsi="Noto Serif SC" w:cs="Noto Serif" w:hint="eastAsia"/>
+          <w:sz w:val="24"/>
+          <w:szCs w:val="24"/>
+          <w:lang w:val="en-GB"/>
+        </w:rPr>
+        <w:t>高音唢呐</w:t>
+      </w:r>
+      <w:r>
+        <w:rPr>
+          <w:rFonts w:ascii="Noto Serif SC" w:eastAsia="Noto Serif SC" w:hAnsi="Noto Serif SC" w:cs="Noto Serif"/>
+          <w:sz w:val="24"/>
+          <w:szCs w:val="24"/>
+          <w:lang w:val="en-GB"/>
+        </w:rPr>
+        <w:t>*</w:t>
+      </w:r>
+      <w:r>
+        <w:rPr>
+          <w:rFonts w:ascii="Noto Serif SC" w:eastAsia="Noto Serif SC" w:hAnsi="Noto Serif SC" w:cs="Noto Serif"/>
+          <w:sz w:val="24"/>
+          <w:szCs w:val="24"/>
+          <w:lang w:val="en-GB"/>
+        </w:rPr>
+        <w:t xml:space="preserve"> </w:t>
+      </w:r>
+      <w:r>
+        <w:rPr>
+          <w:rFonts w:ascii="Noto Serif SC" w:eastAsia="Noto Serif SC" w:hAnsi="Noto Serif SC" w:cs="Noto Serif"/>
+          <w:sz w:val="24"/>
+          <w:szCs w:val="24"/>
+          <w:lang w:val="en-GB"/>
+        </w:rPr>
+        <w:t>2</w:t>
+      </w:r>
+      <w:r>
+        <w:rPr>
+          <w:rFonts w:ascii="Noto Serif SC" w:eastAsia="Noto Serif SC" w:hAnsi="Noto Serif SC" w:cs="Noto Serif"/>
+          <w:sz w:val="24"/>
+          <w:szCs w:val="24"/>
+          <w:lang w:val="en-GB"/>
+        </w:rPr>
+        <w:t xml:space="preserve"> </w:t>
+      </w:r>
       <w:proofErr w:type="spellStart"/>
       <w:r>
         <w:rPr>
@@ -3953,7 +4034,7 @@
           <w:szCs w:val="24"/>
           <w:lang w:val="en-GB"/>
         </w:rPr>
-        <w:t>Diyin</w:t>
+        <w:t>Gaoyin</w:t>
       </w:r>
       <w:proofErr w:type="spellEnd"/>
       <w:r>
@@ -3963,8 +4044,9 @@
           <w:szCs w:val="24"/>
           <w:lang w:val="en-GB"/>
         </w:rPr>
-        <w:t xml:space="preserve"> Shen</w:t>
-      </w:r>
+        <w:t xml:space="preserve"> </w:t>
+      </w:r>
+      <w:proofErr w:type="spellStart"/>
       <w:r>
         <w:rPr>
           <w:rFonts w:ascii="Noto Serif SC" w:eastAsia="Noto Serif SC" w:hAnsi="Noto Serif SC" w:cs="Noto Serif"/>
@@ -3972,69 +4054,1062 @@
           <w:szCs w:val="24"/>
           <w:lang w:val="en-GB"/>
         </w:rPr>
-        <w:t>g</w:t>
-      </w:r>
-    </w:p>
-    <w:p>
-      <w:pPr>
+        <w:t>Suona</w:t>
+      </w:r>
+      <w:proofErr w:type="spellEnd"/>
+      <w:r>
         <w:rPr>
           <w:rFonts w:ascii="Noto Serif SC" w:eastAsia="Noto Serif SC" w:hAnsi="Noto Serif SC" w:cs="Noto Serif"/>
           <w:sz w:val="24"/>
           <w:szCs w:val="24"/>
           <w:lang w:val="en-GB"/>
         </w:rPr>
-      </w:pPr>
-      <w:r>
-        <w:rPr>
-          <w:rFonts w:ascii="Noto Serif SC" w:eastAsia="Noto Serif SC" w:hAnsi="Noto Serif SC" w:cs="Noto Serif"/>
-          <w:sz w:val="24"/>
-          <w:szCs w:val="24"/>
+        <w:t>*</w:t>
+      </w:r>
+    </w:p>
+    <w:p>
+      <w:pPr>
+        <w:rPr>
+          <w:rFonts w:ascii="Noto Serif SC" w:eastAsia="Noto Serif SC" w:hAnsi="Noto Serif SC" w:cs="Noto Serif"/>
+          <w:sz w:val="24"/>
+          <w:szCs w:val="24"/>
+          <w:lang w:val="en-US"/>
+        </w:rPr>
+      </w:pPr>
+      <w:r>
+        <w:rPr>
+          <w:rFonts w:ascii="Noto Serif SC" w:eastAsia="Noto Serif SC" w:hAnsi="Noto Serif SC" w:cs="Noto Serif"/>
+          <w:sz w:val="20"/>
+          <w:szCs w:val="20"/>
           <w:lang w:val="en-GB"/>
         </w:rPr>
+        <w:t xml:space="preserve"> * </w:t>
+      </w:r>
+      <w:r>
+        <w:rPr>
+          <w:rFonts w:ascii="Noto Serif SC" w:eastAsia="Noto Serif SC" w:hAnsi="Noto Serif SC" w:cs="Noto Serif"/>
+          <w:sz w:val="20"/>
+          <w:szCs w:val="20"/>
+          <w:lang w:val="en-GB"/>
+        </w:rPr>
+        <w:t>I</w:t>
+      </w:r>
+      <w:r>
+        <w:rPr>
+          <w:rFonts w:ascii="Noto Serif SC" w:eastAsia="Noto Serif SC" w:hAnsi="Noto Serif SC" w:cs="Noto Serif" w:hint="eastAsia"/>
+          <w:sz w:val="20"/>
+          <w:szCs w:val="20"/>
+          <w:lang w:val="en-GB"/>
+        </w:rPr>
+        <w:t>兼奏高音管</w:t>
+      </w:r>
+      <w:r>
+        <w:rPr>
+          <w:rFonts w:ascii="Noto Serif SC" w:eastAsia="Noto Serif SC" w:hAnsi="Noto Serif SC" w:cs="Noto Serif"/>
+          <w:sz w:val="20"/>
+          <w:szCs w:val="20"/>
+          <w:lang w:val="en-GB"/>
+        </w:rPr>
+        <w:t xml:space="preserve"> </w:t>
+      </w:r>
+      <w:r>
+        <w:rPr>
+          <w:rFonts w:ascii="Noto Serif SC" w:eastAsia="Noto Serif SC" w:hAnsi="Noto Serif SC" w:cs="Noto Serif"/>
+          <w:sz w:val="20"/>
+          <w:szCs w:val="20"/>
+          <w:lang w:val="en-GB"/>
+        </w:rPr>
+        <w:t xml:space="preserve">* </w:t>
+      </w:r>
+      <w:r>
+        <w:rPr>
+          <w:rFonts w:ascii="Noto Serif SC" w:eastAsia="Noto Serif SC" w:hAnsi="Noto Serif SC" w:cs="Noto Serif"/>
+          <w:sz w:val="20"/>
+          <w:szCs w:val="20"/>
+          <w:lang w:val="en-GB"/>
+        </w:rPr>
+        <w:t>I</w:t>
+      </w:r>
+      <w:r>
+        <w:rPr>
+          <w:rFonts w:ascii="Noto Serif SC" w:eastAsia="Noto Serif SC" w:hAnsi="Noto Serif SC" w:cs="Noto Serif"/>
+          <w:sz w:val="20"/>
+          <w:szCs w:val="20"/>
+          <w:lang w:val="en-GB"/>
+        </w:rPr>
+        <w:t xml:space="preserve"> </w:t>
+      </w:r>
+      <w:proofErr w:type="spellStart"/>
+      <w:r>
+        <w:rPr>
+          <w:rFonts w:ascii="Noto Serif SC" w:eastAsia="Noto Serif SC" w:hAnsi="Noto Serif SC" w:cs="Noto Serif"/>
+          <w:sz w:val="20"/>
+          <w:szCs w:val="20"/>
+          <w:lang w:val="en-GB"/>
+        </w:rPr>
+        <w:t>doub</w:t>
+      </w:r>
+      <w:proofErr w:type="spellEnd"/>
+      <w:r>
+        <w:rPr>
+          <w:rFonts w:ascii="Noto Serif SC" w:eastAsia="Noto Serif SC" w:hAnsi="Noto Serif SC" w:cs="Noto Serif"/>
+          <w:sz w:val="20"/>
+          <w:szCs w:val="20"/>
+          <w:lang w:val="en-GB"/>
+        </w:rPr>
+        <w:t xml:space="preserve">. </w:t>
+      </w:r>
+      <w:proofErr w:type="spellStart"/>
+      <w:r>
+        <w:rPr>
+          <w:rFonts w:ascii="Noto Serif SC" w:eastAsia="Noto Serif SC" w:hAnsi="Noto Serif SC" w:cs="Noto Serif"/>
+          <w:sz w:val="20"/>
+          <w:szCs w:val="20"/>
+          <w:lang w:val="en-GB"/>
+        </w:rPr>
+        <w:t>Gaoyin</w:t>
+      </w:r>
+      <w:proofErr w:type="spellEnd"/>
+      <w:r>
+        <w:rPr>
+          <w:rFonts w:ascii="Noto Serif SC" w:eastAsia="Noto Serif SC" w:hAnsi="Noto Serif SC" w:cs="Noto Serif"/>
+          <w:sz w:val="20"/>
+          <w:szCs w:val="20"/>
+          <w:lang w:val="en-GB"/>
+        </w:rPr>
+        <w:t xml:space="preserve"> Guan</w:t>
+      </w:r>
+    </w:p>
+    <w:p>
+      <w:pPr>
+        <w:rPr>
+          <w:rFonts w:ascii="Noto Serif SC" w:eastAsia="Noto Serif SC" w:hAnsi="Noto Serif SC" w:cs="Noto Serif"/>
+          <w:sz w:val="24"/>
+          <w:szCs w:val="24"/>
+          <w:lang w:val="en-US"/>
+        </w:rPr>
+      </w:pPr>
+      <w:r>
+        <w:rPr>
+          <w:rFonts w:ascii="Noto Serif SC" w:eastAsia="Noto Serif SC" w:hAnsi="Noto Serif SC" w:cs="Noto Serif"/>
+          <w:sz w:val="24"/>
+          <w:szCs w:val="24"/>
+          <w:lang w:val="en-US"/>
+        </w:rPr>
+        <w:t xml:space="preserve">1 </w:t>
+      </w:r>
+      <w:r>
+        <w:rPr>
+          <w:rFonts w:ascii="Noto Serif SC" w:eastAsia="Noto Serif SC" w:hAnsi="Noto Serif SC" w:cs="Noto Serif" w:hint="eastAsia"/>
+          <w:sz w:val="24"/>
+          <w:szCs w:val="24"/>
+          <w:lang w:val="en-US"/>
+        </w:rPr>
+        <w:t>加键中音唢呐</w:t>
+      </w:r>
+      <w:r>
+        <w:rPr>
+          <w:rFonts w:ascii="Noto Serif SC" w:eastAsia="Noto Serif SC" w:hAnsi="Noto Serif SC" w:cs="Noto Serif"/>
+          <w:sz w:val="24"/>
+          <w:szCs w:val="24"/>
+          <w:lang w:val="en-US"/>
+        </w:rPr>
+        <w:t xml:space="preserve">* </w:t>
+      </w:r>
+      <w:r>
+        <w:rPr>
+          <w:rFonts w:ascii="Noto Serif SC" w:eastAsia="Noto Serif SC" w:hAnsi="Noto Serif SC" w:cs="Noto Serif"/>
+          <w:sz w:val="24"/>
+          <w:szCs w:val="24"/>
+          <w:lang w:val="en-US"/>
+        </w:rPr>
+        <w:t xml:space="preserve">1 </w:t>
+      </w:r>
+      <w:r>
+        <w:rPr>
+          <w:rFonts w:ascii="Noto Serif SC" w:eastAsia="Noto Serif SC" w:hAnsi="Noto Serif SC" w:cs="Noto Serif"/>
+          <w:sz w:val="24"/>
+          <w:szCs w:val="24"/>
+          <w:lang w:val="en-US"/>
+        </w:rPr>
+        <w:t>Keyed</w:t>
+      </w:r>
+      <w:r>
+        <w:rPr>
+          <w:rFonts w:ascii="Noto Serif SC" w:eastAsia="Noto Serif SC" w:hAnsi="Noto Serif SC" w:cs="Noto Serif"/>
+          <w:sz w:val="24"/>
+          <w:szCs w:val="24"/>
+          <w:lang w:val="en-US"/>
+        </w:rPr>
+        <w:t xml:space="preserve"> </w:t>
+      </w:r>
+      <w:proofErr w:type="spellStart"/>
+      <w:r>
+        <w:rPr>
+          <w:rFonts w:ascii="Noto Serif SC" w:eastAsia="Noto Serif SC" w:hAnsi="Noto Serif SC" w:cs="Noto Serif"/>
+          <w:sz w:val="24"/>
+          <w:szCs w:val="24"/>
+          <w:lang w:val="en-US"/>
+        </w:rPr>
+        <w:t>Zhongyin</w:t>
+      </w:r>
+      <w:proofErr w:type="spellEnd"/>
+      <w:r>
+        <w:rPr>
+          <w:rFonts w:ascii="Noto Serif SC" w:eastAsia="Noto Serif SC" w:hAnsi="Noto Serif SC" w:cs="Noto Serif"/>
+          <w:sz w:val="24"/>
+          <w:szCs w:val="24"/>
+          <w:lang w:val="en-US"/>
+        </w:rPr>
+        <w:t xml:space="preserve"> </w:t>
+      </w:r>
+      <w:proofErr w:type="spellStart"/>
+      <w:r>
+        <w:rPr>
+          <w:rFonts w:ascii="Noto Serif SC" w:eastAsia="Noto Serif SC" w:hAnsi="Noto Serif SC" w:cs="Noto Serif"/>
+          <w:sz w:val="24"/>
+          <w:szCs w:val="24"/>
+          <w:lang w:val="en-US"/>
+        </w:rPr>
+        <w:t>Suona</w:t>
+      </w:r>
+      <w:proofErr w:type="spellEnd"/>
+      <w:r>
+        <w:rPr>
+          <w:rFonts w:ascii="Noto Serif SC" w:eastAsia="Noto Serif SC" w:hAnsi="Noto Serif SC" w:cs="Noto Serif"/>
+          <w:sz w:val="24"/>
+          <w:szCs w:val="24"/>
+          <w:lang w:val="en-US"/>
+        </w:rPr>
+        <w:t>*</w:t>
+      </w:r>
+    </w:p>
+    <w:p>
+      <w:pPr>
+        <w:rPr>
+          <w:rFonts w:ascii="Noto Serif SC" w:eastAsia="Noto Serif SC" w:hAnsi="Noto Serif SC" w:cs="Noto Serif"/>
+          <w:sz w:val="24"/>
+          <w:szCs w:val="24"/>
+          <w:lang w:val="en-US"/>
+        </w:rPr>
+      </w:pPr>
+      <w:r>
+        <w:rPr>
+          <w:rFonts w:ascii="Noto Serif SC" w:eastAsia="Noto Serif SC" w:hAnsi="Noto Serif SC" w:cs="Noto Serif"/>
+          <w:sz w:val="20"/>
+          <w:szCs w:val="20"/>
+          <w:lang w:val="en-US"/>
+        </w:rPr>
+        <w:t>*</w:t>
+      </w:r>
+      <w:r>
+        <w:rPr>
+          <w:rFonts w:ascii="Noto Serif SC" w:eastAsia="Noto Serif SC" w:hAnsi="Noto Serif SC" w:cs="Noto Serif" w:hint="eastAsia"/>
+          <w:sz w:val="20"/>
+          <w:szCs w:val="20"/>
+        </w:rPr>
+        <w:t>兼奏低音管</w:t>
+      </w:r>
+      <w:r>
+        <w:rPr>
+          <w:rFonts w:ascii="Noto Serif SC" w:eastAsia="Noto Serif SC" w:hAnsi="Noto Serif SC" w:cs="Noto Serif"/>
+          <w:sz w:val="20"/>
+          <w:szCs w:val="20"/>
+          <w:lang w:val="en-GB"/>
+        </w:rPr>
+        <w:t xml:space="preserve"> (</w:t>
+      </w:r>
+      <w:proofErr w:type="spellStart"/>
+      <w:r>
+        <w:rPr>
+          <w:rFonts w:ascii="Noto Serif SC" w:eastAsia="Noto Serif SC" w:hAnsi="Noto Serif SC" w:cs="Noto Serif"/>
+          <w:sz w:val="20"/>
+          <w:szCs w:val="20"/>
+          <w:lang w:val="en-GB"/>
+        </w:rPr>
+        <w:t>doub</w:t>
+      </w:r>
+      <w:proofErr w:type="spellEnd"/>
+      <w:r>
+        <w:rPr>
+          <w:rFonts w:ascii="Noto Serif SC" w:eastAsia="Noto Serif SC" w:hAnsi="Noto Serif SC" w:cs="Noto Serif"/>
+          <w:sz w:val="20"/>
+          <w:szCs w:val="20"/>
+          <w:lang w:val="en-GB"/>
+        </w:rPr>
+        <w:t>. on Diyin Guan)</w:t>
+      </w:r>
+    </w:p>
+    <w:p>
+      <w:pPr>
+        <w:rPr>
+          <w:rFonts w:ascii="Noto Serif SC" w:eastAsia="Noto Serif SC" w:hAnsi="Noto Serif SC" w:cs="Noto Serif"/>
+          <w:sz w:val="24"/>
+          <w:szCs w:val="24"/>
+          <w:lang w:val="en-US"/>
+        </w:rPr>
+      </w:pPr>
+      <w:r>
+        <w:rPr>
+          <w:rFonts w:ascii="Noto Serif SC" w:eastAsia="Noto Serif SC" w:hAnsi="Noto Serif SC" w:cs="Noto Serif"/>
+          <w:sz w:val="24"/>
+          <w:szCs w:val="24"/>
+          <w:lang w:val="en-US"/>
+        </w:rPr>
+        <w:t xml:space="preserve">1 </w:t>
+      </w:r>
+      <w:r>
+        <w:rPr>
+          <w:rFonts w:ascii="Noto Serif SC" w:eastAsia="Noto Serif SC" w:hAnsi="Noto Serif SC" w:cs="Noto Serif" w:hint="eastAsia"/>
+          <w:sz w:val="24"/>
+          <w:szCs w:val="24"/>
+          <w:lang w:val="en-US"/>
+        </w:rPr>
+        <w:t>管</w:t>
+      </w:r>
+      <w:r>
+        <w:rPr>
+          <w:rFonts w:ascii="Noto Serif SC" w:eastAsia="Noto Serif SC" w:hAnsi="Noto Serif SC" w:cs="Noto Serif"/>
+          <w:sz w:val="24"/>
+          <w:szCs w:val="24"/>
+          <w:lang w:val="en-US"/>
+        </w:rPr>
+        <w:t xml:space="preserve"> </w:t>
+      </w:r>
+      <w:r>
+        <w:rPr>
+          <w:rFonts w:ascii="Noto Serif SC" w:eastAsia="Noto Serif SC" w:hAnsi="Noto Serif SC" w:cs="Noto Serif"/>
+          <w:sz w:val="24"/>
+          <w:szCs w:val="24"/>
+        </w:rPr>
+        <w:t>(</w:t>
+      </w:r>
+      <w:r>
+        <w:rPr>
+          <w:rFonts w:ascii="Noto Serif SC" w:eastAsia="Noto Serif SC" w:hAnsi="Noto Serif SC" w:cs="Noto Serif" w:hint="eastAsia"/>
+          <w:sz w:val="24"/>
+          <w:szCs w:val="24"/>
+        </w:rPr>
+        <w:t>兼</w:t>
+      </w:r>
+      <w:r>
+        <w:rPr>
+          <w:rFonts w:ascii="Noto Serif SC" w:eastAsia="Noto Serif SC" w:hAnsi="Noto Serif SC" w:cs="Noto Serif"/>
+          <w:sz w:val="24"/>
+          <w:szCs w:val="24"/>
+        </w:rPr>
+        <w:t xml:space="preserve">: </w:t>
+      </w:r>
+      <w:r>
+        <w:rPr>
+          <w:rFonts w:ascii="Noto Serif SC" w:eastAsia="Noto Serif SC" w:hAnsi="Noto Serif SC" w:cs="Noto Serif" w:hint="eastAsia"/>
+          <w:sz w:val="24"/>
+          <w:szCs w:val="24"/>
+        </w:rPr>
+        <w:t>高音，中音，低音</w:t>
+      </w:r>
+      <w:r>
+        <w:rPr>
+          <w:rFonts w:ascii="Noto Serif SC" w:eastAsia="Noto Serif SC" w:hAnsi="Noto Serif SC" w:cs="Noto Serif"/>
+          <w:sz w:val="24"/>
+          <w:szCs w:val="24"/>
+        </w:rPr>
+        <w:t>)</w:t>
+      </w:r>
+      <w:r>
+        <w:rPr>
+          <w:rFonts w:ascii="Noto Serif SC" w:eastAsia="Noto Serif SC" w:hAnsi="Noto Serif SC" w:cs="Noto Serif"/>
+          <w:sz w:val="24"/>
+          <w:szCs w:val="24"/>
+          <w:lang w:val="en-US"/>
+        </w:rPr>
+        <w:t xml:space="preserve"> </w:t>
+      </w:r>
+      <w:r>
+        <w:rPr>
+          <w:rFonts w:ascii="Noto Serif SC" w:eastAsia="Noto Serif SC" w:hAnsi="Noto Serif SC" w:cs="Noto Serif"/>
+          <w:sz w:val="24"/>
+          <w:szCs w:val="24"/>
+          <w:lang w:val="en-US"/>
+        </w:rPr>
+        <w:t xml:space="preserve">1 </w:t>
+      </w:r>
+      <w:r>
+        <w:rPr>
+          <w:rFonts w:ascii="Noto Serif SC" w:eastAsia="Noto Serif SC" w:hAnsi="Noto Serif SC" w:cs="Noto Serif"/>
+          <w:sz w:val="24"/>
+          <w:szCs w:val="24"/>
+          <w:lang w:val="en-US"/>
+        </w:rPr>
+        <w:t xml:space="preserve">Guan </w:t>
+      </w:r>
+      <w:r>
+        <w:rPr>
+          <w:rFonts w:ascii="Noto Serif SC" w:eastAsia="Noto Serif SC" w:hAnsi="Noto Serif SC" w:cs="Noto Serif"/>
+          <w:sz w:val="24"/>
+          <w:szCs w:val="24"/>
+          <w:lang w:val="en-US"/>
+        </w:rPr>
+        <w:t>(</w:t>
+      </w:r>
+      <w:r>
+        <w:rPr>
+          <w:rFonts w:ascii="Noto Serif SC" w:eastAsia="Noto Serif SC" w:hAnsi="Noto Serif SC" w:cs="Noto Serif"/>
+          <w:sz w:val="24"/>
+          <w:szCs w:val="24"/>
+        </w:rPr>
+        <w:t>High, Middle, Low</w:t>
+      </w:r>
+      <w:r>
+        <w:rPr>
+          <w:rFonts w:ascii="Noto Serif SC" w:eastAsia="Noto Serif SC" w:hAnsi="Noto Serif SC" w:cs="Noto Serif"/>
+          <w:sz w:val="24"/>
+          <w:szCs w:val="24"/>
+          <w:lang w:val="en-US"/>
+        </w:rPr>
+        <w:t>)</w:t>
+      </w:r>
+    </w:p>
+    <w:p>
+      <w:pPr>
+        <w:rPr>
+          <w:rFonts w:ascii="Noto Serif SC" w:eastAsia="Noto Serif SC" w:hAnsi="Noto Serif SC" w:cs="Noto Serif"/>
+          <w:sz w:val="24"/>
+          <w:szCs w:val="24"/>
+          <w:lang w:val="en-US"/>
+        </w:rPr>
+      </w:pPr>
+    </w:p>
+    <w:p>
+      <w:pPr>
+        <w:rPr>
+          <w:rFonts w:ascii="Noto Serif SC" w:eastAsia="Noto Serif SC" w:hAnsi="Noto Serif SC" w:cs="Noto Serif"/>
+          <w:sz w:val="24"/>
+          <w:szCs w:val="24"/>
+          <w:lang w:val="en-US"/>
+        </w:rPr>
+      </w:pPr>
+      <w:r>
+        <w:rPr>
+          <w:rFonts w:ascii="Noto Serif SC" w:eastAsia="Noto Serif SC" w:hAnsi="Noto Serif SC" w:cs="Noto Serif"/>
+          <w:sz w:val="24"/>
+          <w:szCs w:val="24"/>
+          <w:lang w:val="en-US"/>
+        </w:rPr>
+        <w:t xml:space="preserve">1 </w:t>
+      </w:r>
+      <w:r>
+        <w:rPr>
+          <w:rFonts w:ascii="Noto Serif SC" w:eastAsia="Noto Serif SC" w:hAnsi="Noto Serif SC" w:cs="Noto Serif" w:hint="eastAsia"/>
+          <w:sz w:val="24"/>
+          <w:szCs w:val="24"/>
+          <w:lang w:val="en-US"/>
+        </w:rPr>
+        <w:t>扬琴</w:t>
+      </w:r>
+      <w:r>
+        <w:rPr>
+          <w:rFonts w:ascii="Noto Serif SC" w:eastAsia="Noto Serif SC" w:hAnsi="Noto Serif SC" w:cs="Noto Serif"/>
+          <w:sz w:val="24"/>
+          <w:szCs w:val="24"/>
+          <w:lang w:val="en-US"/>
+        </w:rPr>
+        <w:t xml:space="preserve"> </w:t>
+      </w:r>
+      <w:r>
+        <w:rPr>
+          <w:rFonts w:ascii="Noto Serif SC" w:eastAsia="Noto Serif SC" w:hAnsi="Noto Serif SC" w:cs="Noto Serif"/>
+          <w:sz w:val="24"/>
+          <w:szCs w:val="24"/>
+          <w:lang w:val="en-US"/>
+        </w:rPr>
+        <w:t xml:space="preserve">1 </w:t>
+      </w:r>
+      <w:r>
+        <w:rPr>
+          <w:rFonts w:ascii="Noto Serif SC" w:eastAsia="Noto Serif SC" w:hAnsi="Noto Serif SC" w:cs="Noto Serif"/>
+          <w:sz w:val="24"/>
+          <w:szCs w:val="24"/>
+          <w:lang w:val="en-US"/>
+        </w:rPr>
+        <w:t>Yangqin</w:t>
+      </w:r>
+    </w:p>
+    <w:p>
+      <w:pPr>
+        <w:rPr>
+          <w:rFonts w:ascii="Noto Serif SC" w:eastAsia="Noto Serif SC" w:hAnsi="Noto Serif SC" w:cs="Noto Serif"/>
+          <w:sz w:val="24"/>
+          <w:szCs w:val="24"/>
+          <w:lang w:val="en-US"/>
+        </w:rPr>
+      </w:pPr>
+      <w:r>
+        <w:rPr>
+          <w:rFonts w:ascii="Noto Serif SC" w:eastAsia="Noto Serif SC" w:hAnsi="Noto Serif SC" w:cs="Noto Serif"/>
+          <w:sz w:val="24"/>
+          <w:szCs w:val="24"/>
+          <w:lang w:val="en-US"/>
+        </w:rPr>
+        <w:t>2</w:t>
+      </w:r>
+      <w:r>
+        <w:rPr>
+          <w:rFonts w:ascii="Noto Serif SC" w:eastAsia="Noto Serif SC" w:hAnsi="Noto Serif SC" w:cs="Noto Serif" w:hint="eastAsia"/>
+          <w:sz w:val="24"/>
+          <w:szCs w:val="24"/>
+          <w:lang w:val="en-US"/>
+        </w:rPr>
+        <w:t>柳琴</w:t>
+      </w:r>
+      <w:r>
+        <w:rPr>
+          <w:rFonts w:ascii="Noto Serif SC" w:eastAsia="Noto Serif SC" w:hAnsi="Noto Serif SC" w:cs="Noto Serif"/>
+          <w:sz w:val="24"/>
+          <w:szCs w:val="24"/>
+          <w:lang w:val="en-US"/>
+        </w:rPr>
+        <w:t xml:space="preserve"> </w:t>
+      </w:r>
+      <w:r>
+        <w:rPr>
+          <w:rFonts w:ascii="Noto Serif SC" w:eastAsia="Noto Serif SC" w:hAnsi="Noto Serif SC" w:cs="Noto Serif"/>
+          <w:sz w:val="24"/>
+          <w:szCs w:val="24"/>
+          <w:lang w:val="en-US"/>
+        </w:rPr>
         <w:t xml:space="preserve">2 </w:t>
       </w:r>
-      <w:r>
-        <w:rPr>
-          <w:rFonts w:ascii="Noto Serif SC" w:eastAsia="Noto Serif SC" w:hAnsi="Noto Serif SC" w:cs="Noto Serif" w:hint="eastAsia"/>
-          <w:sz w:val="24"/>
-          <w:szCs w:val="24"/>
+      <w:proofErr w:type="spellStart"/>
+      <w:r>
+        <w:rPr>
+          <w:rFonts w:ascii="Noto Serif SC" w:eastAsia="Noto Serif SC" w:hAnsi="Noto Serif SC" w:cs="Noto Serif"/>
+          <w:sz w:val="24"/>
+          <w:szCs w:val="24"/>
+          <w:lang w:val="en-US"/>
+        </w:rPr>
+        <w:t>Liuqin</w:t>
+      </w:r>
+      <w:proofErr w:type="spellEnd"/>
+    </w:p>
+    <w:p>
+      <w:pPr>
+        <w:rPr>
+          <w:rFonts w:ascii="Noto Serif SC" w:eastAsia="Noto Serif SC" w:hAnsi="Noto Serif SC" w:cs="Noto Serif"/>
+          <w:sz w:val="24"/>
+          <w:szCs w:val="24"/>
+          <w:lang w:val="en-US"/>
+        </w:rPr>
+      </w:pPr>
+      <w:r>
+        <w:rPr>
+          <w:rFonts w:ascii="Noto Serif SC" w:eastAsia="Noto Serif SC" w:hAnsi="Noto Serif SC" w:cs="Noto Serif"/>
+          <w:sz w:val="24"/>
+          <w:szCs w:val="24"/>
+          <w:lang w:val="en-US"/>
+        </w:rPr>
+        <w:t>4</w:t>
+      </w:r>
+      <w:r>
+        <w:rPr>
+          <w:rFonts w:ascii="Noto Serif SC" w:eastAsia="Noto Serif SC" w:hAnsi="Noto Serif SC" w:cs="Noto Serif" w:hint="eastAsia"/>
+          <w:sz w:val="24"/>
+          <w:szCs w:val="24"/>
+          <w:lang w:val="en-US"/>
+        </w:rPr>
+        <w:t>琵琶</w:t>
+      </w:r>
+      <w:r>
+        <w:rPr>
+          <w:rFonts w:ascii="Noto Serif SC" w:eastAsia="Noto Serif SC" w:hAnsi="Noto Serif SC" w:cs="Noto Serif"/>
+          <w:sz w:val="24"/>
+          <w:szCs w:val="24"/>
+          <w:lang w:val="en-US"/>
+        </w:rPr>
+        <w:t xml:space="preserve"> </w:t>
+      </w:r>
+      <w:r>
+        <w:rPr>
+          <w:rFonts w:ascii="Noto Serif SC" w:eastAsia="Noto Serif SC" w:hAnsi="Noto Serif SC" w:cs="Noto Serif"/>
+          <w:sz w:val="24"/>
+          <w:szCs w:val="24"/>
+          <w:lang w:val="en-US"/>
+        </w:rPr>
+        <w:t xml:space="preserve">4 </w:t>
+      </w:r>
+      <w:r>
+        <w:rPr>
+          <w:rFonts w:ascii="Noto Serif SC" w:eastAsia="Noto Serif SC" w:hAnsi="Noto Serif SC" w:cs="Noto Serif"/>
+          <w:sz w:val="24"/>
+          <w:szCs w:val="24"/>
+          <w:lang w:val="en-US"/>
+        </w:rPr>
+        <w:t>Pipa</w:t>
+      </w:r>
+    </w:p>
+    <w:p>
+      <w:pPr>
+        <w:rPr>
+          <w:rFonts w:ascii="Noto Serif SC" w:eastAsia="Noto Serif SC" w:hAnsi="Noto Serif SC" w:cs="Noto Serif"/>
+          <w:sz w:val="24"/>
+          <w:szCs w:val="24"/>
+          <w:lang w:val="en-US"/>
+        </w:rPr>
+      </w:pPr>
+      <w:r>
+        <w:rPr>
+          <w:rFonts w:ascii="Noto Serif SC" w:eastAsia="Noto Serif SC" w:hAnsi="Noto Serif SC" w:cs="Noto Serif"/>
+          <w:sz w:val="24"/>
+          <w:szCs w:val="24"/>
+          <w:lang w:val="en-US"/>
+        </w:rPr>
+        <w:t>4</w:t>
+      </w:r>
+      <w:r>
+        <w:rPr>
+          <w:rFonts w:ascii="Noto Serif SC" w:eastAsia="Noto Serif SC" w:hAnsi="Noto Serif SC" w:cs="Noto Serif" w:hint="eastAsia"/>
+          <w:sz w:val="24"/>
+          <w:szCs w:val="24"/>
+          <w:lang w:val="en-US"/>
+        </w:rPr>
+        <w:t>中阮</w:t>
+      </w:r>
+      <w:r>
+        <w:rPr>
+          <w:rFonts w:ascii="Noto Serif SC" w:eastAsia="Noto Serif SC" w:hAnsi="Noto Serif SC" w:cs="Noto Serif"/>
+          <w:sz w:val="24"/>
+          <w:szCs w:val="24"/>
+          <w:lang w:val="en-US"/>
+        </w:rPr>
+        <w:t xml:space="preserve"> </w:t>
+      </w:r>
+      <w:r>
+        <w:rPr>
+          <w:rFonts w:ascii="Noto Serif SC" w:eastAsia="Noto Serif SC" w:hAnsi="Noto Serif SC" w:cs="Noto Serif"/>
+          <w:sz w:val="24"/>
+          <w:szCs w:val="24"/>
+          <w:lang w:val="en-US"/>
+        </w:rPr>
+        <w:t xml:space="preserve">4 </w:t>
+      </w:r>
+      <w:r>
+        <w:rPr>
+          <w:rFonts w:ascii="Noto Serif SC" w:eastAsia="Noto Serif SC" w:hAnsi="Noto Serif SC" w:cs="Noto Serif"/>
+          <w:sz w:val="24"/>
+          <w:szCs w:val="24"/>
+          <w:lang w:val="en-US"/>
+        </w:rPr>
+        <w:t>Zhongruan</w:t>
+      </w:r>
+    </w:p>
+    <w:p>
+      <w:pPr>
+        <w:rPr>
+          <w:rFonts w:ascii="Noto Serif SC" w:eastAsia="Noto Serif SC" w:hAnsi="Noto Serif SC" w:cs="Noto Serif"/>
+          <w:sz w:val="24"/>
+          <w:szCs w:val="24"/>
+          <w:lang w:val="en-US"/>
+        </w:rPr>
+      </w:pPr>
+      <w:r>
+        <w:rPr>
+          <w:rFonts w:ascii="Noto Serif SC" w:eastAsia="Noto Serif SC" w:hAnsi="Noto Serif SC" w:cs="Noto Serif"/>
+          <w:sz w:val="24"/>
+          <w:szCs w:val="24"/>
+          <w:lang w:val="en-US"/>
+        </w:rPr>
+        <w:t>1</w:t>
+      </w:r>
+      <w:r>
+        <w:rPr>
+          <w:rFonts w:ascii="Noto Serif SC" w:eastAsia="Noto Serif SC" w:hAnsi="Noto Serif SC" w:cs="Noto Serif" w:hint="eastAsia"/>
+          <w:sz w:val="24"/>
+          <w:szCs w:val="24"/>
+        </w:rPr>
+        <w:t>三弦</w:t>
+      </w:r>
+      <w:r>
+        <w:rPr>
+          <w:rFonts w:ascii="Noto Serif SC" w:eastAsia="Noto Serif SC" w:hAnsi="Noto Serif SC" w:cs="Noto Serif"/>
+          <w:sz w:val="24"/>
+          <w:szCs w:val="24"/>
+          <w:lang w:val="en-US"/>
+        </w:rPr>
+        <w:t xml:space="preserve"> </w:t>
+      </w:r>
+      <w:r>
+        <w:rPr>
+          <w:rFonts w:ascii="Noto Serif SC" w:eastAsia="Noto Serif SC" w:hAnsi="Noto Serif SC" w:cs="Noto Serif"/>
+          <w:sz w:val="24"/>
+          <w:szCs w:val="24"/>
+          <w:lang w:val="en-US"/>
+        </w:rPr>
+        <w:t xml:space="preserve">1 </w:t>
+      </w:r>
+      <w:r>
+        <w:rPr>
+          <w:rFonts w:ascii="Noto Serif SC" w:eastAsia="Noto Serif SC" w:hAnsi="Noto Serif SC" w:cs="Noto Serif"/>
+          <w:sz w:val="24"/>
+          <w:szCs w:val="24"/>
+          <w:lang w:val="en-US"/>
+        </w:rPr>
+        <w:t>Sanxian</w:t>
+      </w:r>
+    </w:p>
+    <w:p>
+      <w:pPr>
+        <w:rPr>
+          <w:rFonts w:ascii="Noto Serif SC" w:eastAsia="Noto Serif SC" w:hAnsi="Noto Serif SC" w:cs="Noto Serif"/>
+          <w:sz w:val="24"/>
+          <w:szCs w:val="24"/>
+          <w:lang w:val="en-US"/>
+        </w:rPr>
+      </w:pPr>
+      <w:r>
+        <w:rPr>
+          <w:rFonts w:ascii="Noto Serif SC" w:eastAsia="Noto Serif SC" w:hAnsi="Noto Serif SC" w:cs="Noto Serif"/>
+          <w:sz w:val="24"/>
+          <w:szCs w:val="24"/>
+          <w:lang w:val="en-US"/>
+        </w:rPr>
+        <w:t>2</w:t>
+      </w:r>
+      <w:r>
+        <w:rPr>
+          <w:rFonts w:ascii="Noto Serif SC" w:eastAsia="Noto Serif SC" w:hAnsi="Noto Serif SC" w:cs="Noto Serif" w:hint="eastAsia"/>
+          <w:sz w:val="24"/>
+          <w:szCs w:val="24"/>
+          <w:lang w:val="en-US"/>
+        </w:rPr>
+        <w:t>大阮</w:t>
+      </w:r>
+      <w:r>
+        <w:rPr>
+          <w:rFonts w:ascii="Noto Serif SC" w:eastAsia="Noto Serif SC" w:hAnsi="Noto Serif SC" w:cs="Noto Serif"/>
+          <w:sz w:val="24"/>
+          <w:szCs w:val="24"/>
+          <w:lang w:val="en-US"/>
+        </w:rPr>
+        <w:t xml:space="preserve"> </w:t>
+      </w:r>
+      <w:r>
+        <w:rPr>
+          <w:rFonts w:ascii="Noto Serif SC" w:eastAsia="Noto Serif SC" w:hAnsi="Noto Serif SC" w:cs="Noto Serif"/>
+          <w:sz w:val="24"/>
+          <w:szCs w:val="24"/>
+          <w:lang w:val="en-US"/>
+        </w:rPr>
+        <w:t xml:space="preserve">2 </w:t>
+      </w:r>
+      <w:r>
+        <w:rPr>
+          <w:rFonts w:ascii="Noto Serif SC" w:eastAsia="Noto Serif SC" w:hAnsi="Noto Serif SC" w:cs="Noto Serif"/>
+          <w:sz w:val="24"/>
+          <w:szCs w:val="24"/>
+          <w:lang w:val="en-US"/>
+        </w:rPr>
+        <w:t>Daruan</w:t>
+      </w:r>
+    </w:p>
+    <w:p>
+      <w:pPr>
+        <w:spacing w:after="240"/>
+        <w:rPr>
+          <w:rFonts w:ascii="Noto Serif SC" w:eastAsia="Noto Serif SC" w:hAnsi="Noto Serif SC" w:cs="Noto Serif"/>
+          <w:sz w:val="24"/>
+          <w:szCs w:val="24"/>
+          <w:lang w:val="en-US"/>
+        </w:rPr>
+      </w:pPr>
+      <w:r>
+        <w:rPr>
+          <w:rFonts w:ascii="Noto Serif SC" w:eastAsia="Noto Serif SC" w:hAnsi="Noto Serif SC" w:cs="Noto Serif"/>
+          <w:sz w:val="24"/>
+          <w:szCs w:val="24"/>
+          <w:lang w:val="en-US"/>
+        </w:rPr>
+        <w:t>1</w:t>
+      </w:r>
+      <w:r>
+        <w:rPr>
+          <w:rFonts w:ascii="Noto Serif SC" w:eastAsia="Noto Serif SC" w:hAnsi="Noto Serif SC" w:cs="Noto Serif" w:hint="eastAsia"/>
+          <w:sz w:val="24"/>
+          <w:szCs w:val="24"/>
+        </w:rPr>
+        <w:t>古筝</w:t>
+      </w:r>
+      <w:r>
+        <w:rPr>
+          <w:rFonts w:ascii="Noto Serif SC" w:eastAsia="Noto Serif SC" w:hAnsi="Noto Serif SC" w:cs="Noto Serif"/>
+          <w:sz w:val="24"/>
+          <w:szCs w:val="24"/>
+          <w:lang w:val="en-US"/>
+        </w:rPr>
+        <w:t xml:space="preserve"> </w:t>
+      </w:r>
+      <w:r>
+        <w:rPr>
+          <w:rFonts w:ascii="Noto Serif SC" w:eastAsia="Noto Serif SC" w:hAnsi="Noto Serif SC" w:cs="Noto Serif"/>
+          <w:sz w:val="24"/>
+          <w:szCs w:val="24"/>
+          <w:lang w:val="en-US"/>
+        </w:rPr>
+        <w:t xml:space="preserve">1 </w:t>
+      </w:r>
+      <w:r>
+        <w:rPr>
+          <w:rFonts w:ascii="Noto Serif SC" w:eastAsia="Noto Serif SC" w:hAnsi="Noto Serif SC" w:cs="Noto Serif"/>
+          <w:sz w:val="24"/>
+          <w:szCs w:val="24"/>
+          <w:lang w:val="en-US"/>
+        </w:rPr>
+        <w:t>Guzheng</w:t>
+      </w:r>
+    </w:p>
+    <w:p>
+      <w:pPr>
+        <w:rPr>
+          <w:rFonts w:ascii="Noto Serif SC" w:eastAsia="Noto Serif SC" w:hAnsi="Noto Serif SC" w:cs="Noto Serif"/>
+          <w:sz w:val="24"/>
+          <w:szCs w:val="24"/>
+          <w:lang w:val="en-US"/>
+        </w:rPr>
+      </w:pPr>
+      <w:r>
+        <w:rPr>
+          <w:rFonts w:ascii="Noto Serif SC" w:eastAsia="Noto Serif SC" w:hAnsi="Noto Serif SC" w:cs="Noto Serif"/>
+          <w:sz w:val="24"/>
+          <w:szCs w:val="24"/>
+          <w:lang w:val="en-US"/>
+        </w:rPr>
+        <w:t>1</w:t>
+      </w:r>
+      <w:r>
+        <w:rPr>
+          <w:rFonts w:ascii="Noto Serif SC" w:eastAsia="Noto Serif SC" w:hAnsi="Noto Serif SC" w:cs="Noto Serif" w:hint="eastAsia"/>
+          <w:sz w:val="24"/>
+          <w:szCs w:val="24"/>
+          <w:lang w:val="en-US"/>
+        </w:rPr>
+        <w:t>竖琴</w:t>
+      </w:r>
+      <w:r>
+        <w:rPr>
+          <w:rFonts w:ascii="Noto Serif SC" w:eastAsia="Noto Serif SC" w:hAnsi="Noto Serif SC" w:cs="Noto Serif"/>
+          <w:sz w:val="24"/>
+          <w:szCs w:val="24"/>
+          <w:lang w:val="en-US"/>
+        </w:rPr>
+        <w:t xml:space="preserve"> </w:t>
+      </w:r>
+      <w:r>
+        <w:rPr>
+          <w:rFonts w:ascii="Noto Serif SC" w:eastAsia="Noto Serif SC" w:hAnsi="Noto Serif SC" w:cs="Noto Serif"/>
+          <w:sz w:val="24"/>
+          <w:szCs w:val="24"/>
+          <w:lang w:val="en-US"/>
+        </w:rPr>
+        <w:t xml:space="preserve">1 </w:t>
+      </w:r>
+      <w:r>
+        <w:rPr>
+          <w:rFonts w:ascii="Noto Serif SC" w:eastAsia="Noto Serif SC" w:hAnsi="Noto Serif SC" w:cs="Noto Serif"/>
+          <w:sz w:val="24"/>
+          <w:szCs w:val="24"/>
+          <w:lang w:val="en-US"/>
+        </w:rPr>
+        <w:t>Harp</w:t>
+      </w:r>
+    </w:p>
+    <w:p>
+      <w:pPr>
+        <w:rPr>
+          <w:rFonts w:ascii="Noto Serif SC" w:eastAsia="Noto Serif SC" w:hAnsi="Noto Serif SC" w:cs="Noto Serif"/>
+          <w:sz w:val="24"/>
+          <w:szCs w:val="24"/>
+          <w:lang w:val="en-US"/>
+        </w:rPr>
+      </w:pPr>
+    </w:p>
+    <w:p>
+      <w:pPr>
+        <w:rPr>
+          <w:rFonts w:ascii="Noto Serif SC" w:eastAsia="Noto Serif SC" w:hAnsi="Noto Serif SC" w:cs="Noto Serif"/>
+          <w:sz w:val="24"/>
+          <w:szCs w:val="24"/>
+          <w:lang w:val="en-US"/>
+        </w:rPr>
+      </w:pPr>
+      <w:r>
+        <w:rPr>
+          <w:rFonts w:ascii="Noto Serif SC" w:eastAsia="Noto Serif SC" w:hAnsi="Noto Serif SC" w:cs="Noto Serif"/>
+          <w:sz w:val="24"/>
+          <w:szCs w:val="24"/>
+        </w:rPr>
+        <w:t>6</w:t>
+      </w:r>
+      <w:r>
+        <w:rPr>
+          <w:rFonts w:ascii="Noto Serif SC" w:eastAsia="Noto Serif SC" w:hAnsi="Noto Serif SC" w:cs="Noto Serif" w:hint="eastAsia"/>
+          <w:sz w:val="24"/>
+          <w:szCs w:val="24"/>
+        </w:rPr>
+        <w:t xml:space="preserve"> 打击乐 </w:t>
+      </w:r>
+      <w:r>
+        <w:rPr>
+          <w:rFonts w:ascii="Noto Serif SC" w:eastAsia="Noto Serif SC" w:hAnsi="Noto Serif SC" w:cs="Noto Serif"/>
+          <w:sz w:val="24"/>
+          <w:szCs w:val="24"/>
+        </w:rPr>
+        <w:t>6</w:t>
+      </w:r>
+      <w:r>
+        <w:rPr>
+          <w:rFonts w:ascii="Noto Serif SC" w:eastAsia="Noto Serif SC" w:hAnsi="Noto Serif SC" w:cs="Noto Serif"/>
+          <w:sz w:val="24"/>
+          <w:szCs w:val="24"/>
+        </w:rPr>
+        <w:t xml:space="preserve"> Percussion</w:t>
+      </w:r>
+    </w:p>
+    <w:p>
+      <w:pPr>
+        <w:ind w:left="288"/>
+        <w:rPr>
+          <w:rFonts w:ascii="Noto Serif SC" w:eastAsia="Noto Serif SC" w:hAnsi="Noto Serif SC" w:cs="Noto Serif"/>
+          <w:sz w:val="20"/>
+          <w:szCs w:val="20"/>
           <w:lang w:val="en-GB"/>
         </w:rPr>
-        <w:t>高音唢呐</w:t>
-      </w:r>
-      <w:r>
-        <w:rPr>
-          <w:rFonts w:ascii="Noto Serif SC" w:eastAsia="Noto Serif SC" w:hAnsi="Noto Serif SC" w:cs="Noto Serif"/>
-          <w:sz w:val="24"/>
-          <w:szCs w:val="24"/>
-          <w:lang w:val="en-GB"/>
-        </w:rPr>
-        <w:t>*</w:t>
-      </w:r>
-      <w:r>
-        <w:rPr>
-          <w:rFonts w:ascii="Noto Serif SC" w:eastAsia="Noto Serif SC" w:hAnsi="Noto Serif SC" w:cs="Noto Serif"/>
-          <w:sz w:val="24"/>
-          <w:szCs w:val="24"/>
-          <w:lang w:val="en-GB"/>
+      </w:pPr>
+      <w:r>
+        <w:rPr>
+          <w:rFonts w:ascii="Noto Serif SC" w:eastAsia="Noto Serif SC" w:hAnsi="Noto Serif SC" w:cs="Noto Serif"/>
+          <w:sz w:val="20"/>
+          <w:szCs w:val="20"/>
+        </w:rPr>
+        <w:t xml:space="preserve">I: </w:t>
+      </w:r>
+      <w:r>
+        <w:rPr>
+          <w:rFonts w:ascii="Noto Serif SC" w:eastAsia="Noto Serif SC" w:hAnsi="Noto Serif SC" w:cs="Noto Serif"/>
+          <w:sz w:val="20"/>
+          <w:szCs w:val="20"/>
+        </w:rPr>
+        <w:t>(</w:t>
+      </w:r>
+      <w:r>
+        <w:rPr>
+          <w:rFonts w:ascii="Noto Serif SC" w:eastAsia="Noto Serif SC" w:hAnsi="Noto Serif SC" w:cs="Noto Serif" w:hint="eastAsia"/>
+          <w:sz w:val="20"/>
+          <w:szCs w:val="20"/>
+        </w:rPr>
+        <w:t>西方</w:t>
+      </w:r>
+      <w:r>
+        <w:rPr>
+          <w:rFonts w:ascii="Noto Serif SC" w:eastAsia="Noto Serif SC" w:hAnsi="Noto Serif SC" w:cs="Noto Serif"/>
+          <w:sz w:val="20"/>
+          <w:szCs w:val="20"/>
+        </w:rPr>
+        <w:t xml:space="preserve">) </w:t>
+      </w:r>
+      <w:r>
+        <w:rPr>
+          <w:rFonts w:ascii="Noto Serif SC" w:eastAsia="Noto Serif SC" w:hAnsi="Noto Serif SC" w:cs="Noto Serif" w:hint="eastAsia"/>
+          <w:sz w:val="20"/>
+          <w:szCs w:val="20"/>
+        </w:rPr>
+        <w:t>木鱼</w:t>
+      </w:r>
+      <w:r>
+        <w:rPr>
+          <w:rFonts w:ascii="Noto Serif SC" w:eastAsia="Noto Serif SC" w:hAnsi="Noto Serif SC" w:cs="Noto Serif"/>
+          <w:sz w:val="20"/>
+          <w:szCs w:val="20"/>
+        </w:rPr>
+        <w:t xml:space="preserve"> Woodblocks, </w:t>
+      </w:r>
+      <w:r>
+        <w:rPr>
+          <w:rFonts w:ascii="Noto Serif SC" w:eastAsia="Noto Serif SC" w:hAnsi="Noto Serif SC" w:cs="Noto Serif" w:hint="eastAsia"/>
+          <w:sz w:val="20"/>
+          <w:szCs w:val="20"/>
+        </w:rPr>
+        <w:t>钟琴</w:t>
+      </w:r>
+      <w:r>
+        <w:rPr>
+          <w:rFonts w:ascii="Noto Serif SC" w:eastAsia="Noto Serif SC" w:hAnsi="Noto Serif SC" w:cs="Noto Serif"/>
+          <w:sz w:val="20"/>
+          <w:szCs w:val="20"/>
+        </w:rPr>
+        <w:t xml:space="preserve"> Glockenspiel, </w:t>
+      </w:r>
+      <w:r>
+        <w:rPr>
+          <w:rFonts w:ascii="Noto Serif SC" w:eastAsia="Noto Serif SC" w:hAnsi="Noto Serif SC" w:cs="Noto Serif" w:hint="eastAsia"/>
+          <w:sz w:val="20"/>
+          <w:szCs w:val="20"/>
+        </w:rPr>
+        <w:t>云锣</w:t>
+      </w:r>
+      <w:r>
+        <w:rPr>
+          <w:rFonts w:ascii="Noto Serif SC" w:eastAsia="Noto Serif SC" w:hAnsi="Noto Serif SC" w:cs="Noto Serif"/>
+          <w:sz w:val="20"/>
+          <w:szCs w:val="20"/>
+        </w:rPr>
+        <w:t xml:space="preserve"> Yunluo, </w:t>
+      </w:r>
+      <w:r>
+        <w:rPr>
+          <w:rFonts w:ascii="Noto Serif SC" w:eastAsia="Noto Serif SC" w:hAnsi="Noto Serif SC" w:cs="Noto Serif" w:hint="eastAsia"/>
+          <w:sz w:val="20"/>
+          <w:szCs w:val="20"/>
+        </w:rPr>
+        <w:t>小堂鼓</w:t>
+      </w:r>
+      <w:r>
+        <w:rPr>
+          <w:rFonts w:ascii="Noto Serif SC" w:eastAsia="Noto Serif SC" w:hAnsi="Noto Serif SC" w:cs="Noto Serif"/>
+          <w:sz w:val="20"/>
+          <w:szCs w:val="20"/>
         </w:rPr>
         <w:t xml:space="preserve"> </w:t>
       </w:r>
-      <w:r>
-        <w:rPr>
-          <w:rFonts w:ascii="Noto Serif SC" w:eastAsia="Noto Serif SC" w:hAnsi="Noto Serif SC" w:cs="Noto Serif"/>
-          <w:sz w:val="24"/>
-          <w:szCs w:val="24"/>
-          <w:lang w:val="en-GB"/>
-        </w:rPr>
-        <w:t>2</w:t>
-      </w:r>
-      <w:r>
-        <w:rPr>
-          <w:rFonts w:ascii="Noto Serif SC" w:eastAsia="Noto Serif SC" w:hAnsi="Noto Serif SC" w:cs="Noto Serif"/>
-          <w:sz w:val="24"/>
-          <w:szCs w:val="24"/>
-          <w:lang w:val="en-GB"/>
+      <w:proofErr w:type="spellStart"/>
+      <w:r>
+        <w:rPr>
+          <w:rFonts w:ascii="Noto Serif SC" w:eastAsia="Noto Serif SC" w:hAnsi="Noto Serif SC" w:cs="Noto Serif"/>
+          <w:sz w:val="20"/>
+          <w:szCs w:val="20"/>
+        </w:rPr>
+        <w:t>Xiaotanggu</w:t>
+      </w:r>
+      <w:proofErr w:type="spellEnd"/>
+      <w:r>
+        <w:rPr>
+          <w:rFonts w:ascii="Noto Serif SC" w:eastAsia="Noto Serif SC" w:hAnsi="Noto Serif SC" w:cs="Noto Serif"/>
+          <w:sz w:val="20"/>
+          <w:szCs w:val="20"/>
+        </w:rPr>
+        <w:t xml:space="preserve">, </w:t>
+      </w:r>
+      <w:r>
+        <w:rPr>
+          <w:rFonts w:ascii="Noto Serif SC" w:eastAsia="Noto Serif SC" w:hAnsi="Noto Serif SC" w:cs="Noto Serif" w:hint="eastAsia"/>
+          <w:sz w:val="20"/>
+          <w:szCs w:val="20"/>
+        </w:rPr>
+        <w:t>排鼓</w:t>
+      </w:r>
+      <w:r>
+        <w:rPr>
+          <w:rFonts w:ascii="Noto Serif SC" w:eastAsia="Noto Serif SC" w:hAnsi="Noto Serif SC" w:cs="Noto Serif"/>
+          <w:sz w:val="20"/>
+          <w:szCs w:val="20"/>
         </w:rPr>
         <w:t xml:space="preserve"> </w:t>
       </w:r>
@@ -4042,112 +5117,317 @@
       <w:r>
         <w:rPr>
           <w:rFonts w:ascii="Noto Serif SC" w:eastAsia="Noto Serif SC" w:hAnsi="Noto Serif SC" w:cs="Noto Serif"/>
-          <w:sz w:val="24"/>
-          <w:szCs w:val="24"/>
-          <w:lang w:val="en-GB"/>
-        </w:rPr>
-        <w:t>Gaoyin</w:t>
+          <w:sz w:val="20"/>
+          <w:szCs w:val="20"/>
+        </w:rPr>
+        <w:t>Paigu</w:t>
       </w:r>
       <w:proofErr w:type="spellEnd"/>
       <w:r>
         <w:rPr>
           <w:rFonts w:ascii="Noto Serif SC" w:eastAsia="Noto Serif SC" w:hAnsi="Noto Serif SC" w:cs="Noto Serif"/>
-          <w:sz w:val="24"/>
-          <w:szCs w:val="24"/>
-          <w:lang w:val="en-GB"/>
+          <w:sz w:val="20"/>
+          <w:szCs w:val="20"/>
+        </w:rPr>
+        <w:t xml:space="preserve">, </w:t>
+      </w:r>
+      <w:r>
+        <w:rPr>
+          <w:rFonts w:ascii="Noto Serif SC" w:eastAsia="Noto Serif SC" w:hAnsi="Noto Serif SC" w:cs="Noto Serif" w:hint="eastAsia"/>
+          <w:sz w:val="20"/>
+          <w:szCs w:val="20"/>
+        </w:rPr>
+        <w:t>木鱼</w:t>
+      </w:r>
+      <w:r>
+        <w:rPr>
+          <w:rFonts w:ascii="Noto Serif SC" w:eastAsia="Noto Serif SC" w:hAnsi="Noto Serif SC" w:cs="Noto Serif"/>
+          <w:sz w:val="20"/>
+          <w:szCs w:val="20"/>
+        </w:rPr>
+        <w:t xml:space="preserve"> Chinese Woodblock</w:t>
+      </w:r>
+    </w:p>
+    <w:p>
+      <w:pPr>
+        <w:ind w:left="288"/>
+        <w:rPr>
+          <w:rFonts w:ascii="Noto Serif SC" w:eastAsia="Noto Serif SC" w:hAnsi="Noto Serif SC" w:cs="Noto Serif"/>
+          <w:sz w:val="20"/>
+          <w:szCs w:val="20"/>
+          <w:lang w:val="en-US"/>
+        </w:rPr>
+      </w:pPr>
+      <w:r>
+        <w:rPr>
+          <w:rFonts w:ascii="Noto Serif SC" w:eastAsia="Noto Serif SC" w:hAnsi="Noto Serif SC" w:cs="Noto Serif"/>
+          <w:sz w:val="20"/>
+          <w:szCs w:val="20"/>
+          <w:lang w:val="en-US"/>
+        </w:rPr>
+        <w:t xml:space="preserve">II: </w:t>
+      </w:r>
+      <w:r>
+        <w:rPr>
+          <w:rFonts w:ascii="Noto Serif SC" w:eastAsia="Noto Serif SC" w:hAnsi="Noto Serif SC" w:cs="Noto Serif" w:hint="eastAsia"/>
+          <w:sz w:val="20"/>
+          <w:szCs w:val="20"/>
+        </w:rPr>
+        <w:t>中国木鱼</w:t>
+      </w:r>
+      <w:r>
+        <w:rPr>
+          <w:rFonts w:ascii="Noto Serif SC" w:eastAsia="Noto Serif SC" w:hAnsi="Noto Serif SC" w:cs="Noto Serif"/>
+          <w:sz w:val="20"/>
+          <w:szCs w:val="20"/>
+        </w:rPr>
+        <w:t xml:space="preserve"> Chinese Woodblock, </w:t>
+      </w:r>
+      <w:r>
+        <w:rPr>
+          <w:rFonts w:ascii="Noto Serif SC" w:eastAsia="Noto Serif SC" w:hAnsi="Noto Serif SC" w:cs="Noto Serif" w:hint="eastAsia"/>
+          <w:sz w:val="20"/>
+          <w:szCs w:val="20"/>
+        </w:rPr>
+        <w:t>颤音琴</w:t>
+      </w:r>
+      <w:r>
+        <w:rPr>
+          <w:rFonts w:ascii="Noto Serif SC" w:eastAsia="Noto Serif SC" w:hAnsi="Noto Serif SC" w:cs="Noto Serif"/>
+          <w:sz w:val="20"/>
+          <w:szCs w:val="20"/>
+        </w:rPr>
+        <w:t xml:space="preserve"> Vibraphone, </w:t>
+      </w:r>
+      <w:r>
+        <w:rPr>
+          <w:rFonts w:ascii="Noto Serif SC" w:eastAsia="Noto Serif SC" w:hAnsi="Noto Serif SC" w:cs="Noto Serif" w:hint="eastAsia"/>
+          <w:sz w:val="20"/>
+          <w:szCs w:val="20"/>
+        </w:rPr>
+        <w:t>大钹</w:t>
+      </w:r>
+      <w:r>
+        <w:rPr>
+          <w:rFonts w:ascii="Noto Serif SC" w:eastAsia="Noto Serif SC" w:hAnsi="Noto Serif SC" w:cs="Noto Serif"/>
+          <w:sz w:val="20"/>
+          <w:szCs w:val="20"/>
+        </w:rPr>
+        <w:t xml:space="preserve"> Dabo</w:t>
+      </w:r>
+      <w:r>
+        <w:rPr>
+          <w:rFonts w:ascii="Noto Serif SC" w:eastAsia="Noto Serif SC" w:hAnsi="Noto Serif SC" w:cs="Noto Serif"/>
+          <w:sz w:val="20"/>
+          <w:szCs w:val="20"/>
+        </w:rPr>
+        <w:t>,</w:t>
+      </w:r>
+      <w:r>
+        <w:rPr>
+          <w:rFonts w:ascii="Noto Serif SC" w:eastAsia="Noto Serif SC" w:hAnsi="Noto Serif SC" w:cs="Noto Serif"/>
+          <w:sz w:val="20"/>
+          <w:szCs w:val="20"/>
         </w:rPr>
         <w:t xml:space="preserve"> </w:t>
       </w:r>
+      <w:r>
+        <w:rPr>
+          <w:rFonts w:ascii="Noto Serif SC" w:eastAsia="Noto Serif SC" w:hAnsi="Noto Serif SC" w:cs="Noto Serif" w:hint="eastAsia"/>
+          <w:sz w:val="20"/>
+          <w:szCs w:val="20"/>
+        </w:rPr>
+        <w:t>排鼓</w:t>
+      </w:r>
+      <w:r>
+        <w:rPr>
+          <w:rFonts w:ascii="Noto Serif SC" w:eastAsia="Noto Serif SC" w:hAnsi="Noto Serif SC" w:cs="Noto Serif"/>
+          <w:sz w:val="20"/>
+          <w:szCs w:val="20"/>
+        </w:rPr>
+        <w:t xml:space="preserve"> </w:t>
+      </w:r>
       <w:proofErr w:type="spellStart"/>
       <w:r>
         <w:rPr>
           <w:rFonts w:ascii="Noto Serif SC" w:eastAsia="Noto Serif SC" w:hAnsi="Noto Serif SC" w:cs="Noto Serif"/>
-          <w:sz w:val="24"/>
-          <w:szCs w:val="24"/>
-          <w:lang w:val="en-GB"/>
-        </w:rPr>
-        <w:t>Suona</w:t>
+          <w:sz w:val="20"/>
+          <w:szCs w:val="20"/>
+        </w:rPr>
+        <w:t>Paigu</w:t>
       </w:r>
       <w:proofErr w:type="spellEnd"/>
       <w:r>
         <w:rPr>
           <w:rFonts w:ascii="Noto Serif SC" w:eastAsia="Noto Serif SC" w:hAnsi="Noto Serif SC" w:cs="Noto Serif"/>
-          <w:sz w:val="24"/>
-          <w:szCs w:val="24"/>
-          <w:lang w:val="en-GB"/>
-        </w:rPr>
-        <w:t>*</w:t>
-      </w:r>
-    </w:p>
-    <w:p>
-      <w:pPr>
-        <w:rPr>
-          <w:rFonts w:ascii="Noto Serif SC" w:eastAsia="Noto Serif SC" w:hAnsi="Noto Serif SC" w:cs="Noto Serif"/>
-          <w:sz w:val="24"/>
-          <w:szCs w:val="24"/>
-          <w:lang w:val="en-US"/>
-        </w:rPr>
-      </w:pPr>
-      <w:r>
-        <w:rPr>
-          <w:rFonts w:ascii="Noto Serif SC" w:eastAsia="Noto Serif SC" w:hAnsi="Noto Serif SC" w:cs="Noto Serif"/>
-          <w:sz w:val="20"/>
-          <w:szCs w:val="20"/>
-          <w:lang w:val="en-GB"/>
-        </w:rPr>
-        <w:t xml:space="preserve"> * </w:t>
-      </w:r>
-      <w:r>
-        <w:rPr>
-          <w:rFonts w:ascii="Noto Serif SC" w:eastAsia="Noto Serif SC" w:hAnsi="Noto Serif SC" w:cs="Noto Serif"/>
-          <w:sz w:val="20"/>
-          <w:szCs w:val="20"/>
-          <w:lang w:val="en-GB"/>
-        </w:rPr>
-        <w:t>I</w:t>
-      </w:r>
-      <w:r>
-        <w:rPr>
-          <w:rFonts w:ascii="Noto Serif SC" w:eastAsia="Noto Serif SC" w:hAnsi="Noto Serif SC" w:cs="Noto Serif" w:hint="eastAsia"/>
-          <w:sz w:val="20"/>
-          <w:szCs w:val="20"/>
-          <w:lang w:val="en-GB"/>
-        </w:rPr>
-        <w:t>兼奏高音管</w:t>
-      </w:r>
-      <w:r>
-        <w:rPr>
-          <w:rFonts w:ascii="Noto Serif SC" w:eastAsia="Noto Serif SC" w:hAnsi="Noto Serif SC" w:cs="Noto Serif"/>
-          <w:sz w:val="20"/>
-          <w:szCs w:val="20"/>
-          <w:lang w:val="en-GB"/>
+          <w:sz w:val="20"/>
+          <w:szCs w:val="20"/>
+        </w:rPr>
+        <w:t xml:space="preserve">, </w:t>
+      </w:r>
+      <w:r>
+        <w:rPr>
+          <w:rFonts w:ascii="Noto Serif SC" w:eastAsia="Noto Serif SC" w:hAnsi="Noto Serif SC" w:cs="Noto Serif" w:hint="eastAsia"/>
+          <w:sz w:val="20"/>
+          <w:szCs w:val="20"/>
+        </w:rPr>
+        <w:t>军镲</w:t>
+      </w:r>
+      <w:r>
+        <w:rPr>
+          <w:rFonts w:ascii="Noto Serif SC" w:eastAsia="Noto Serif SC" w:hAnsi="Noto Serif SC" w:cs="Noto Serif"/>
+          <w:sz w:val="20"/>
+          <w:szCs w:val="20"/>
+        </w:rPr>
+        <w:t xml:space="preserve"> Cymbals</w:t>
+      </w:r>
+      <w:r>
+        <w:rPr>
+          <w:rFonts w:ascii="Noto Serif SC" w:eastAsia="Noto Serif SC" w:hAnsi="Noto Serif SC" w:cs="Noto Serif"/>
+          <w:sz w:val="20"/>
+          <w:szCs w:val="20"/>
+        </w:rPr>
+        <w:t>,</w:t>
+      </w:r>
+      <w:r>
+        <w:rPr>
+          <w:rFonts w:ascii="Noto Serif SC" w:eastAsia="Noto Serif SC" w:hAnsi="Noto Serif SC" w:cs="Noto Serif"/>
+          <w:sz w:val="20"/>
+          <w:szCs w:val="20"/>
         </w:rPr>
         <w:t xml:space="preserve"> </w:t>
       </w:r>
       <w:r>
         <w:rPr>
-          <w:rFonts w:ascii="Noto Serif SC" w:eastAsia="Noto Serif SC" w:hAnsi="Noto Serif SC" w:cs="Noto Serif"/>
-          <w:sz w:val="20"/>
-          <w:szCs w:val="20"/>
-          <w:lang w:val="en-GB"/>
-        </w:rPr>
-        <w:t xml:space="preserve">* </w:t>
-      </w:r>
-      <w:r>
-        <w:rPr>
-          <w:rFonts w:ascii="Noto Serif SC" w:eastAsia="Noto Serif SC" w:hAnsi="Noto Serif SC" w:cs="Noto Serif"/>
-          <w:sz w:val="20"/>
-          <w:szCs w:val="20"/>
-          <w:lang w:val="en-GB"/>
-        </w:rPr>
-        <w:t>I</w:t>
-      </w:r>
-      <w:r>
-        <w:rPr>
-          <w:rFonts w:ascii="Noto Serif SC" w:eastAsia="Noto Serif SC" w:hAnsi="Noto Serif SC" w:cs="Noto Serif"/>
-          <w:sz w:val="20"/>
-          <w:szCs w:val="20"/>
-          <w:lang w:val="en-GB"/>
+          <w:rFonts w:ascii="Noto Serif SC" w:eastAsia="Noto Serif SC" w:hAnsi="Noto Serif SC" w:cs="Noto Serif" w:hint="eastAsia"/>
+          <w:sz w:val="20"/>
+          <w:szCs w:val="20"/>
+        </w:rPr>
+        <w:t>通通鼓</w:t>
+      </w:r>
+      <w:r>
+        <w:rPr>
+          <w:rFonts w:ascii="Noto Serif SC" w:eastAsia="Noto Serif SC" w:hAnsi="Noto Serif SC" w:cs="Noto Serif"/>
+          <w:sz w:val="20"/>
+          <w:szCs w:val="20"/>
+        </w:rPr>
+        <w:t xml:space="preserve"> Tom-toms</w:t>
+      </w:r>
+    </w:p>
+    <w:p>
+      <w:pPr>
+        <w:ind w:left="288"/>
+        <w:rPr>
+          <w:rFonts w:ascii="Noto Serif SC" w:eastAsia="Noto Serif SC" w:hAnsi="Noto Serif SC" w:cs="Noto Serif"/>
+          <w:sz w:val="20"/>
+          <w:szCs w:val="20"/>
+        </w:rPr>
+      </w:pPr>
+      <w:r>
+        <w:rPr>
+          <w:rFonts w:ascii="Noto Serif SC" w:eastAsia="Noto Serif SC" w:hAnsi="Noto Serif SC" w:cs="Noto Serif"/>
+          <w:sz w:val="20"/>
+          <w:szCs w:val="20"/>
+          <w:lang w:val="en-US"/>
+        </w:rPr>
+        <w:t xml:space="preserve">III: </w:t>
+      </w:r>
+      <w:r>
+        <w:rPr>
+          <w:rFonts w:ascii="Noto Serif SC" w:eastAsia="Noto Serif SC" w:hAnsi="Noto Serif SC" w:cs="Noto Serif" w:hint="eastAsia"/>
+          <w:sz w:val="20"/>
+          <w:szCs w:val="20"/>
+        </w:rPr>
+        <w:t>木琴</w:t>
+      </w:r>
+      <w:r>
+        <w:rPr>
+          <w:rFonts w:ascii="Noto Serif SC" w:eastAsia="Noto Serif SC" w:hAnsi="Noto Serif SC" w:cs="Noto Serif"/>
+          <w:sz w:val="20"/>
+          <w:szCs w:val="20"/>
+        </w:rPr>
+        <w:t xml:space="preserve"> Xylophone, </w:t>
+      </w:r>
+      <w:r>
+        <w:rPr>
+          <w:rFonts w:ascii="Noto Serif SC" w:eastAsia="Noto Serif SC" w:hAnsi="Noto Serif SC" w:cs="Noto Serif" w:hint="eastAsia"/>
+          <w:sz w:val="20"/>
+          <w:szCs w:val="20"/>
+        </w:rPr>
+        <w:t>通通鼓</w:t>
+      </w:r>
+      <w:r>
+        <w:rPr>
+          <w:rFonts w:ascii="Noto Serif SC" w:eastAsia="Noto Serif SC" w:hAnsi="Noto Serif SC" w:cs="Noto Serif"/>
+          <w:sz w:val="20"/>
+          <w:szCs w:val="20"/>
+        </w:rPr>
+        <w:t xml:space="preserve"> Tom-toms, </w:t>
+      </w:r>
+      <w:r>
+        <w:rPr>
+          <w:rFonts w:ascii="Noto Serif SC" w:eastAsia="Noto Serif SC" w:hAnsi="Noto Serif SC" w:cs="Noto Serif" w:hint="eastAsia"/>
+          <w:sz w:val="20"/>
+          <w:szCs w:val="20"/>
+        </w:rPr>
+        <w:t>乐鞭</w:t>
+      </w:r>
+      <w:r>
+        <w:rPr>
+          <w:rFonts w:ascii="Noto Serif SC" w:eastAsia="Noto Serif SC" w:hAnsi="Noto Serif SC" w:cs="Noto Serif"/>
+          <w:sz w:val="20"/>
+          <w:szCs w:val="20"/>
+        </w:rPr>
+        <w:t xml:space="preserve"> Whip, </w:t>
+      </w:r>
+      <w:r>
+        <w:rPr>
+          <w:rFonts w:ascii="Noto Serif SC" w:eastAsia="Noto Serif SC" w:hAnsi="Noto Serif SC" w:cs="Noto Serif" w:hint="eastAsia"/>
+          <w:sz w:val="20"/>
+          <w:szCs w:val="20"/>
+        </w:rPr>
+        <w:t>康嘎鼓</w:t>
+      </w:r>
+      <w:r>
+        <w:rPr>
+          <w:rFonts w:ascii="Noto Serif SC" w:eastAsia="Noto Serif SC" w:hAnsi="Noto Serif SC" w:cs="Noto Serif"/>
+          <w:sz w:val="20"/>
+          <w:szCs w:val="20"/>
+        </w:rPr>
+        <w:t xml:space="preserve"> Congas</w:t>
+      </w:r>
+    </w:p>
+    <w:p>
+      <w:pPr>
+        <w:ind w:left="288"/>
+        <w:rPr>
+          <w:rFonts w:ascii="Noto Serif SC" w:eastAsia="Noto Serif SC" w:hAnsi="Noto Serif SC" w:cs="Noto Serif"/>
+          <w:sz w:val="20"/>
+          <w:szCs w:val="20"/>
+        </w:rPr>
+      </w:pPr>
+      <w:r>
+        <w:rPr>
+          <w:rFonts w:ascii="Noto Serif SC" w:eastAsia="Noto Serif SC" w:hAnsi="Noto Serif SC" w:cs="Noto Serif"/>
+          <w:sz w:val="20"/>
+          <w:szCs w:val="20"/>
+          <w:lang w:val="en-US"/>
+        </w:rPr>
+        <w:t xml:space="preserve">IV: </w:t>
+      </w:r>
+      <w:r>
+        <w:rPr>
+          <w:rFonts w:ascii="Noto Serif SC" w:eastAsia="Noto Serif SC" w:hAnsi="Noto Serif SC" w:cs="Noto Serif" w:hint="eastAsia"/>
+          <w:sz w:val="20"/>
+          <w:szCs w:val="20"/>
+        </w:rPr>
+        <w:t>编钟</w:t>
+      </w:r>
+      <w:r>
+        <w:rPr>
+          <w:rFonts w:ascii="Noto Serif SC" w:eastAsia="Noto Serif SC" w:hAnsi="Noto Serif SC" w:cs="Noto Serif"/>
+          <w:sz w:val="20"/>
+          <w:szCs w:val="20"/>
         </w:rPr>
         <w:t xml:space="preserve"> </w:t>
       </w:r>
@@ -4157,9 +5437,8 @@
           <w:rFonts w:ascii="Noto Serif SC" w:eastAsia="Noto Serif SC" w:hAnsi="Noto Serif SC" w:cs="Noto Serif"/>
           <w:sz w:val="20"/>
           <w:szCs w:val="20"/>
-          <w:lang w:val="en-GB"/>
-        </w:rPr>
-        <w:t>doub</w:t>
+        </w:rPr>
+        <w:t>Bianzhong</w:t>
       </w:r>
       <w:proofErr w:type="spellEnd"/>
       <w:r>
@@ -4167,9 +5446,107 @@
           <w:rFonts w:ascii="Noto Serif SC" w:eastAsia="Noto Serif SC" w:hAnsi="Noto Serif SC" w:cs="Noto Serif"/>
           <w:sz w:val="20"/>
           <w:szCs w:val="20"/>
-          <w:lang w:val="en-GB"/>
-        </w:rPr>
-        <w:t xml:space="preserve">. </w:t>
+        </w:rPr>
+        <w:t xml:space="preserve">, </w:t>
+      </w:r>
+      <w:r>
+        <w:rPr>
+          <w:rFonts w:ascii="Noto Serif SC" w:eastAsia="Noto Serif SC" w:hAnsi="Noto Serif SC" w:cs="Noto Serif" w:hint="eastAsia"/>
+          <w:sz w:val="20"/>
+          <w:szCs w:val="20"/>
+        </w:rPr>
+        <w:t>通通鼓</w:t>
+      </w:r>
+      <w:r>
+        <w:rPr>
+          <w:rFonts w:ascii="Noto Serif SC" w:eastAsia="Noto Serif SC" w:hAnsi="Noto Serif SC" w:cs="Noto Serif"/>
+          <w:sz w:val="20"/>
+          <w:szCs w:val="20"/>
+        </w:rPr>
+        <w:t xml:space="preserve"> Tom-toms, </w:t>
+      </w:r>
+      <w:r>
+        <w:rPr>
+          <w:rFonts w:ascii="Noto Serif SC" w:eastAsia="Noto Serif SC" w:hAnsi="Noto Serif SC" w:cs="Noto Serif" w:hint="eastAsia"/>
+          <w:sz w:val="20"/>
+          <w:szCs w:val="20"/>
+        </w:rPr>
+        <w:t>马林巴</w:t>
+      </w:r>
+      <w:r>
+        <w:rPr>
+          <w:rFonts w:ascii="Noto Serif SC" w:eastAsia="Noto Serif SC" w:hAnsi="Noto Serif SC" w:cs="Noto Serif"/>
+          <w:sz w:val="20"/>
+          <w:szCs w:val="20"/>
+        </w:rPr>
+        <w:t xml:space="preserve"> Marimba, </w:t>
+      </w:r>
+      <w:r>
+        <w:rPr>
+          <w:rFonts w:ascii="Noto Serif SC" w:eastAsia="Noto Serif SC" w:hAnsi="Noto Serif SC" w:cs="Noto Serif" w:hint="eastAsia"/>
+          <w:sz w:val="20"/>
+          <w:szCs w:val="20"/>
+        </w:rPr>
+        <w:t>军镲</w:t>
+      </w:r>
+      <w:r>
+        <w:rPr>
+          <w:rFonts w:ascii="Noto Serif SC" w:eastAsia="Noto Serif SC" w:hAnsi="Noto Serif SC" w:cs="Noto Serif"/>
+          <w:sz w:val="20"/>
+          <w:szCs w:val="20"/>
+        </w:rPr>
+        <w:t xml:space="preserve"> </w:t>
+      </w:r>
+      <w:r>
+        <w:rPr>
+          <w:rFonts w:ascii="Noto Serif SC" w:eastAsia="Noto Serif SC" w:hAnsi="Noto Serif SC" w:cs="Noto Serif"/>
+          <w:sz w:val="20"/>
+          <w:szCs w:val="20"/>
+        </w:rPr>
+        <w:t>C</w:t>
+      </w:r>
+      <w:r>
+        <w:rPr>
+          <w:rFonts w:ascii="Noto Serif SC" w:eastAsia="Noto Serif SC" w:hAnsi="Noto Serif SC" w:cs="Noto Serif"/>
+          <w:sz w:val="20"/>
+          <w:szCs w:val="20"/>
+        </w:rPr>
+        <w:t>ymbals</w:t>
+      </w:r>
+    </w:p>
+    <w:p>
+      <w:pPr>
+        <w:ind w:left="288"/>
+        <w:rPr>
+          <w:rFonts w:ascii="Noto Serif SC" w:eastAsia="Noto Serif SC" w:hAnsi="Noto Serif SC" w:cs="Noto Serif"/>
+          <w:sz w:val="20"/>
+          <w:szCs w:val="20"/>
+        </w:rPr>
+      </w:pPr>
+      <w:r>
+        <w:rPr>
+          <w:rFonts w:ascii="Noto Serif SC" w:eastAsia="Noto Serif SC" w:hAnsi="Noto Serif SC" w:cs="Noto Serif"/>
+          <w:sz w:val="20"/>
+          <w:szCs w:val="20"/>
+          <w:lang w:val="en-US"/>
+        </w:rPr>
+        <w:t xml:space="preserve">V: </w:t>
+      </w:r>
+      <w:r>
+        <w:rPr>
+          <w:rFonts w:ascii="Noto Serif SC" w:eastAsia="Noto Serif SC" w:hAnsi="Noto Serif SC" w:cs="Noto Serif" w:hint="eastAsia"/>
+          <w:sz w:val="20"/>
+          <w:szCs w:val="20"/>
+        </w:rPr>
+        <w:t>铓锣</w:t>
+      </w:r>
+      <w:r>
+        <w:rPr>
+          <w:rFonts w:ascii="Noto Serif SC" w:eastAsia="Noto Serif SC" w:hAnsi="Noto Serif SC" w:cs="Noto Serif"/>
+          <w:sz w:val="20"/>
+          <w:szCs w:val="20"/>
+        </w:rPr>
+        <w:t xml:space="preserve"> </w:t>
       </w:r>
       <w:proofErr w:type="spellStart"/>
       <w:r>
@@ -4177,9 +5554,8 @@
           <w:rFonts w:ascii="Noto Serif SC" w:eastAsia="Noto Serif SC" w:hAnsi="Noto Serif SC" w:cs="Noto Serif"/>
           <w:sz w:val="20"/>
           <w:szCs w:val="20"/>
-          <w:lang w:val="en-GB"/>
-        </w:rPr>
-        <w:t>Gaoyin</w:t>
+        </w:rPr>
+        <w:t>Mangluo</w:t>
       </w:r>
       <w:proofErr w:type="spellEnd"/>
       <w:r>
@@ -4187,73 +5563,120 @@
           <w:rFonts w:ascii="Noto Serif SC" w:eastAsia="Noto Serif SC" w:hAnsi="Noto Serif SC" w:cs="Noto Serif"/>
           <w:sz w:val="20"/>
           <w:szCs w:val="20"/>
-          <w:lang w:val="en-GB"/>
-        </w:rPr>
-        <w:t xml:space="preserve"> Guan</w:t>
-      </w:r>
-    </w:p>
-    <w:p>
-      <w:pPr>
-        <w:rPr>
-          <w:rFonts w:ascii="Noto Serif SC" w:eastAsia="Noto Serif SC" w:hAnsi="Noto Serif SC" w:cs="Noto Serif"/>
-          <w:sz w:val="24"/>
-          <w:szCs w:val="24"/>
-          <w:lang w:val="en-US"/>
-        </w:rPr>
-      </w:pPr>
-      <w:r>
-        <w:rPr>
-          <w:rFonts w:ascii="Noto Serif SC" w:eastAsia="Noto Serif SC" w:hAnsi="Noto Serif SC" w:cs="Noto Serif" w:hint="eastAsia"/>
-          <w:sz w:val="24"/>
-          <w:szCs w:val="24"/>
-          <w:lang w:val="en-US"/>
-        </w:rPr>
-        <w:t>加键中音唢呐</w:t>
-      </w:r>
-      <w:r>
-        <w:rPr>
-          <w:rFonts w:ascii="Noto Serif SC" w:eastAsia="Noto Serif SC" w:hAnsi="Noto Serif SC" w:cs="Noto Serif"/>
-          <w:sz w:val="24"/>
-          <w:szCs w:val="24"/>
-          <w:lang w:val="en-US"/>
-        </w:rPr>
-        <w:t xml:space="preserve">* </w:t>
-      </w:r>
-      <w:r>
-        <w:rPr>
-          <w:rFonts w:ascii="Noto Serif SC" w:eastAsia="Noto Serif SC" w:hAnsi="Noto Serif SC" w:cs="Noto Serif"/>
-          <w:sz w:val="24"/>
-          <w:szCs w:val="24"/>
-          <w:lang w:val="en-US"/>
-        </w:rPr>
-        <w:t>Keyed</w:t>
-      </w:r>
-      <w:r>
-        <w:rPr>
-          <w:rFonts w:ascii="Noto Serif SC" w:eastAsia="Noto Serif SC" w:hAnsi="Noto Serif SC" w:cs="Noto Serif"/>
-          <w:sz w:val="24"/>
-          <w:szCs w:val="24"/>
-          <w:lang w:val="en-US"/>
+        </w:rPr>
+        <w:t xml:space="preserve">, </w:t>
+      </w:r>
+      <w:r>
+        <w:rPr>
+          <w:rFonts w:ascii="Noto Serif SC" w:eastAsia="Noto Serif SC" w:hAnsi="Noto Serif SC" w:cs="Noto Serif" w:hint="eastAsia"/>
+          <w:sz w:val="20"/>
+          <w:szCs w:val="20"/>
+        </w:rPr>
+        <w:t>颤音琴</w:t>
+      </w:r>
+      <w:r>
+        <w:rPr>
+          <w:rFonts w:ascii="Noto Serif SC" w:eastAsia="Noto Serif SC" w:hAnsi="Noto Serif SC" w:cs="Noto Serif"/>
+          <w:sz w:val="20"/>
+          <w:szCs w:val="20"/>
+        </w:rPr>
+        <w:t xml:space="preserve"> Vibraphone</w:t>
+      </w:r>
+      <w:r>
+        <w:rPr>
+          <w:rFonts w:ascii="Noto Serif SC" w:eastAsia="Noto Serif SC" w:hAnsi="Noto Serif SC" w:cs="Noto Serif"/>
+          <w:sz w:val="20"/>
+          <w:szCs w:val="20"/>
+        </w:rPr>
+        <w:t>,</w:t>
+      </w:r>
+      <w:r>
+        <w:rPr>
+          <w:rFonts w:ascii="Noto Serif SC" w:eastAsia="Noto Serif SC" w:hAnsi="Noto Serif SC" w:cs="Noto Serif"/>
+          <w:sz w:val="20"/>
+          <w:szCs w:val="20"/>
         </w:rPr>
         <w:t xml:space="preserve"> </w:t>
       </w:r>
+      <w:r>
+        <w:rPr>
+          <w:rFonts w:ascii="Noto Serif SC" w:eastAsia="Noto Serif SC" w:hAnsi="Noto Serif SC" w:cs="Noto Serif" w:hint="eastAsia"/>
+          <w:sz w:val="20"/>
+          <w:szCs w:val="20"/>
+        </w:rPr>
+        <w:t>编钟</w:t>
+      </w:r>
+      <w:r>
+        <w:rPr>
+          <w:rFonts w:ascii="Noto Serif SC" w:eastAsia="Noto Serif SC" w:hAnsi="Noto Serif SC" w:cs="Noto Serif"/>
+          <w:sz w:val="20"/>
+          <w:szCs w:val="20"/>
+        </w:rPr>
+        <w:t xml:space="preserve"> </w:t>
+      </w:r>
       <w:proofErr w:type="spellStart"/>
       <w:r>
         <w:rPr>
           <w:rFonts w:ascii="Noto Serif SC" w:eastAsia="Noto Serif SC" w:hAnsi="Noto Serif SC" w:cs="Noto Serif"/>
-          <w:sz w:val="24"/>
-          <w:szCs w:val="24"/>
-          <w:lang w:val="en-US"/>
-        </w:rPr>
-        <w:t>Zhongyin</w:t>
+          <w:sz w:val="20"/>
+          <w:szCs w:val="20"/>
+        </w:rPr>
+        <w:t>Bianzhong</w:t>
       </w:r>
       <w:proofErr w:type="spellEnd"/>
       <w:r>
         <w:rPr>
           <w:rFonts w:ascii="Noto Serif SC" w:eastAsia="Noto Serif SC" w:hAnsi="Noto Serif SC" w:cs="Noto Serif"/>
-          <w:sz w:val="24"/>
-          <w:szCs w:val="24"/>
-          <w:lang w:val="en-US"/>
+          <w:sz w:val="20"/>
+          <w:szCs w:val="20"/>
+        </w:rPr>
+        <w:t xml:space="preserve">, </w:t>
+      </w:r>
+      <w:r>
+        <w:rPr>
+          <w:rFonts w:ascii="Noto Serif SC" w:eastAsia="Noto Serif SC" w:hAnsi="Noto Serif SC" w:cs="Noto Serif" w:hint="eastAsia"/>
+          <w:sz w:val="20"/>
+          <w:szCs w:val="20"/>
+        </w:rPr>
+        <w:t>大军鼓</w:t>
+      </w:r>
+      <w:r>
+        <w:rPr>
+          <w:rFonts w:ascii="Noto Serif SC" w:eastAsia="Noto Serif SC" w:hAnsi="Noto Serif SC" w:cs="Noto Serif"/>
+          <w:sz w:val="20"/>
+          <w:szCs w:val="20"/>
+        </w:rPr>
+        <w:t xml:space="preserve"> Bass </w:t>
+      </w:r>
+      <w:r>
+        <w:rPr>
+          <w:rFonts w:ascii="Noto Serif SC" w:eastAsia="Noto Serif SC" w:hAnsi="Noto Serif SC" w:cs="Noto Serif"/>
+          <w:sz w:val="20"/>
+          <w:szCs w:val="20"/>
+        </w:rPr>
+        <w:t>D</w:t>
+      </w:r>
+      <w:r>
+        <w:rPr>
+          <w:rFonts w:ascii="Noto Serif SC" w:eastAsia="Noto Serif SC" w:hAnsi="Noto Serif SC" w:cs="Noto Serif"/>
+          <w:sz w:val="20"/>
+          <w:szCs w:val="20"/>
+        </w:rPr>
+        <w:t xml:space="preserve">rum, </w:t>
+      </w:r>
+      <w:r>
+        <w:rPr>
+          <w:rFonts w:ascii="Noto Serif SC" w:eastAsia="Noto Serif SC" w:hAnsi="Noto Serif SC" w:cs="Noto Serif" w:hint="eastAsia"/>
+          <w:sz w:val="20"/>
+          <w:szCs w:val="20"/>
+        </w:rPr>
+        <w:t>大锣</w:t>
+      </w:r>
+      <w:r>
+        <w:rPr>
+          <w:rFonts w:ascii="Noto Serif SC" w:eastAsia="Noto Serif SC" w:hAnsi="Noto Serif SC" w:cs="Noto Serif"/>
+          <w:sz w:val="20"/>
+          <w:szCs w:val="20"/>
         </w:rPr>
         <w:t xml:space="preserve"> </w:t>
       </w:r>
@@ -4261,1447 +5684,57 @@
       <w:r>
         <w:rPr>
           <w:rFonts w:ascii="Noto Serif SC" w:eastAsia="Noto Serif SC" w:hAnsi="Noto Serif SC" w:cs="Noto Serif"/>
-          <w:sz w:val="24"/>
-          <w:szCs w:val="24"/>
-          <w:lang w:val="en-US"/>
-        </w:rPr>
-        <w:t>Suona</w:t>
+          <w:sz w:val="20"/>
+          <w:szCs w:val="20"/>
+        </w:rPr>
+        <w:t>Daluo</w:t>
       </w:r>
       <w:proofErr w:type="spellEnd"/>
-      <w:r>
-        <w:rPr>
-          <w:rFonts w:ascii="Noto Serif SC" w:eastAsia="Noto Serif SC" w:hAnsi="Noto Serif SC" w:cs="Noto Serif"/>
-          <w:sz w:val="24"/>
-          <w:szCs w:val="24"/>
-          <w:lang w:val="en-US"/>
-        </w:rPr>
-        <w:t>*</w:t>
-      </w:r>
-    </w:p>
-    <w:p>
-      <w:pPr>
-        <w:rPr>
-          <w:rFonts w:ascii="Noto Serif SC" w:eastAsia="Noto Serif SC" w:hAnsi="Noto Serif SC" w:cs="Noto Serif"/>
-          <w:sz w:val="24"/>
-          <w:szCs w:val="24"/>
-          <w:lang w:val="en-US"/>
-        </w:rPr>
-      </w:pPr>
-      <w:r>
-        <w:rPr>
-          <w:rFonts w:ascii="Noto Serif SC" w:eastAsia="Noto Serif SC" w:hAnsi="Noto Serif SC" w:cs="Noto Serif"/>
-          <w:sz w:val="20"/>
-          <w:szCs w:val="20"/>
-          <w:lang w:val="en-US"/>
-        </w:rPr>
-        <w:t>*</w:t>
-      </w:r>
-      <w:r>
-        <w:rPr>
-          <w:rFonts w:ascii="Noto Serif SC" w:eastAsia="Noto Serif SC" w:hAnsi="Noto Serif SC" w:cs="Noto Serif" w:hint="eastAsia"/>
-          <w:sz w:val="20"/>
-          <w:szCs w:val="20"/>
-        </w:rPr>
-        <w:t>兼奏低音管</w:t>
-      </w:r>
-      <w:r>
-        <w:rPr>
-          <w:rFonts w:ascii="Noto Serif SC" w:eastAsia="Noto Serif SC" w:hAnsi="Noto Serif SC" w:cs="Noto Serif"/>
-          <w:sz w:val="20"/>
-          <w:szCs w:val="20"/>
-          <w:lang w:val="en-GB"/>
-        </w:rPr>
-        <w:t xml:space="preserve"> (</w:t>
-      </w:r>
-      <w:proofErr w:type="spellStart"/>
-      <w:r>
-        <w:rPr>
-          <w:rFonts w:ascii="Noto Serif SC" w:eastAsia="Noto Serif SC" w:hAnsi="Noto Serif SC" w:cs="Noto Serif"/>
-          <w:sz w:val="20"/>
-          <w:szCs w:val="20"/>
-          <w:lang w:val="en-GB"/>
-        </w:rPr>
-        <w:t>doub</w:t>
-      </w:r>
-      <w:proofErr w:type="spellEnd"/>
-      <w:r>
-        <w:rPr>
-          <w:rFonts w:ascii="Noto Serif SC" w:eastAsia="Noto Serif SC" w:hAnsi="Noto Serif SC" w:cs="Noto Serif"/>
-          <w:sz w:val="20"/>
-          <w:szCs w:val="20"/>
-          <w:lang w:val="en-GB"/>
-        </w:rPr>
-        <w:t>. on Diyin Guan)</w:t>
-      </w:r>
-    </w:p>
-    <w:p>
-      <w:pPr>
-        <w:rPr>
-          <w:rFonts w:ascii="Noto Serif SC" w:eastAsia="Noto Serif SC" w:hAnsi="Noto Serif SC" w:cs="Noto Serif"/>
-          <w:sz w:val="24"/>
-          <w:szCs w:val="24"/>
-          <w:lang w:val="en-US"/>
-        </w:rPr>
-      </w:pPr>
-      <w:r>
-        <w:rPr>
-          <w:rFonts w:ascii="Noto Serif SC" w:eastAsia="Noto Serif SC" w:hAnsi="Noto Serif SC" w:cs="Noto Serif" w:hint="eastAsia"/>
-          <w:sz w:val="24"/>
-          <w:szCs w:val="24"/>
-          <w:lang w:val="en-US"/>
-        </w:rPr>
-        <w:t>管</w:t>
-      </w:r>
-      <w:r>
-        <w:rPr>
-          <w:rFonts w:ascii="Noto Serif SC" w:eastAsia="Noto Serif SC" w:hAnsi="Noto Serif SC" w:cs="Noto Serif"/>
-          <w:sz w:val="24"/>
-          <w:szCs w:val="24"/>
-          <w:lang w:val="en-US"/>
-        </w:rPr>
-        <w:t xml:space="preserve"> </w:t>
-      </w:r>
-      <w:r>
-        <w:rPr>
-          <w:rFonts w:ascii="Noto Serif SC" w:eastAsia="Noto Serif SC" w:hAnsi="Noto Serif SC" w:cs="Noto Serif"/>
-          <w:sz w:val="24"/>
-          <w:szCs w:val="24"/>
+    </w:p>
+    <w:p>
+      <w:pPr>
+        <w:ind w:left="288"/>
+        <w:rPr>
+          <w:rFonts w:ascii="Noto Serif SC" w:eastAsia="Noto Serif SC" w:hAnsi="Noto Serif SC" w:cs="Noto Serif"/>
+          <w:sz w:val="20"/>
+          <w:szCs w:val="20"/>
+          <w:lang w:val="en-US"/>
+        </w:rPr>
+      </w:pPr>
+      <w:r>
+        <w:rPr>
+          <w:rFonts w:ascii="Noto Serif SC" w:eastAsia="Noto Serif SC" w:hAnsi="Noto Serif SC" w:cs="Noto Serif"/>
+          <w:sz w:val="20"/>
+          <w:szCs w:val="20"/>
+        </w:rPr>
+        <w:t xml:space="preserve">VI: </w:t>
+      </w:r>
+      <w:r>
+        <w:rPr>
+          <w:rFonts w:ascii="Noto Serif SC" w:eastAsia="Noto Serif SC" w:hAnsi="Noto Serif SC" w:cs="Noto Serif"/>
+          <w:sz w:val="20"/>
+          <w:szCs w:val="20"/>
         </w:rPr>
         <w:t>(</w:t>
       </w:r>
       <w:r>
         <w:rPr>
           <w:rFonts w:ascii="Noto Serif SC" w:eastAsia="Noto Serif SC" w:hAnsi="Noto Serif SC" w:cs="Noto Serif" w:hint="eastAsia"/>
-          <w:sz w:val="24"/>
-          <w:szCs w:val="24"/>
-        </w:rPr>
-        <w:t>兼</w:t>
-      </w:r>
-      <w:r>
-        <w:rPr>
-          <w:rFonts w:ascii="Noto Serif SC" w:eastAsia="Noto Serif SC" w:hAnsi="Noto Serif SC" w:cs="Noto Serif"/>
-          <w:sz w:val="24"/>
-          <w:szCs w:val="24"/>
-        </w:rPr>
-        <w:t xml:space="preserve">: </w:t>
-      </w:r>
-      <w:r>
-        <w:rPr>
-          <w:rFonts w:ascii="Noto Serif SC" w:eastAsia="Noto Serif SC" w:hAnsi="Noto Serif SC" w:cs="Noto Serif" w:hint="eastAsia"/>
-          <w:sz w:val="24"/>
-          <w:szCs w:val="24"/>
-        </w:rPr>
-        <w:t>高音，中音，低音</w:t>
-      </w:r>
-      <w:r>
-        <w:rPr>
-          <w:rFonts w:ascii="Noto Serif SC" w:eastAsia="Noto Serif SC" w:hAnsi="Noto Serif SC" w:cs="Noto Serif"/>
-          <w:sz w:val="24"/>
-          <w:szCs w:val="24"/>
+          <w:sz w:val="20"/>
+          <w:szCs w:val="20"/>
+        </w:rPr>
+        <w:t>中国</w:t>
+      </w:r>
+      <w:r>
+        <w:rPr>
+          <w:rFonts w:ascii="Noto Serif SC" w:eastAsia="Noto Serif SC" w:hAnsi="Noto Serif SC" w:cs="Noto Serif"/>
+          <w:sz w:val="20"/>
+          <w:szCs w:val="20"/>
         </w:rPr>
         <w:t>)</w:t>
       </w:r>
       <w:r>
         <w:rPr>
-          <w:rFonts w:ascii="Noto Serif SC" w:eastAsia="Noto Serif SC" w:hAnsi="Noto Serif SC" w:cs="Noto Serif"/>
-          <w:sz w:val="24"/>
-          <w:szCs w:val="24"/>
-          <w:lang w:val="en-US"/>
-        </w:rPr>
-        <w:t xml:space="preserve"> Guan </w:t>
-      </w:r>
-      <w:r>
-        <w:rPr>
-          <w:rFonts w:ascii="Noto Serif SC" w:eastAsia="Noto Serif SC" w:hAnsi="Noto Serif SC" w:cs="Noto Serif"/>
-          <w:sz w:val="24"/>
-          <w:szCs w:val="24"/>
-          <w:lang w:val="en-US"/>
-        </w:rPr>
-        <w:t>(</w:t>
-      </w:r>
-      <w:r>
-        <w:rPr>
-          <w:rFonts w:ascii="Noto Serif SC" w:eastAsia="Noto Serif SC" w:hAnsi="Noto Serif SC" w:cs="Noto Serif"/>
-          <w:sz w:val="24"/>
-          <w:szCs w:val="24"/>
-        </w:rPr>
-        <w:t>High, Middle, Low</w:t>
-      </w:r>
-      <w:r>
-        <w:rPr>
-          <w:rFonts w:ascii="Noto Serif SC" w:eastAsia="Noto Serif SC" w:hAnsi="Noto Serif SC" w:cs="Noto Serif"/>
-          <w:sz w:val="24"/>
-          <w:szCs w:val="24"/>
-          <w:lang w:val="en-US"/>
-        </w:rPr>
-        <w:t>)</w:t>
-      </w:r>
-    </w:p>
-    <w:p>
-      <w:pPr>
-        <w:rPr>
-          <w:rFonts w:ascii="Noto Serif SC" w:eastAsia="Noto Serif SC" w:hAnsi="Noto Serif SC" w:cs="Noto Serif"/>
-          <w:sz w:val="24"/>
-          <w:szCs w:val="24"/>
-          <w:lang w:val="en-US"/>
-        </w:rPr>
-      </w:pPr>
-    </w:p>
-    <w:p>
-      <w:pPr>
-        <w:rPr>
-          <w:rFonts w:ascii="Noto Serif SC" w:eastAsia="Noto Serif SC" w:hAnsi="Noto Serif SC" w:cs="Noto Serif"/>
-          <w:sz w:val="24"/>
-          <w:szCs w:val="24"/>
-          <w:lang w:val="en-US"/>
-        </w:rPr>
-      </w:pPr>
-      <w:r>
-        <w:rPr>
-          <w:rFonts w:ascii="Noto Serif SC" w:eastAsia="Noto Serif SC" w:hAnsi="Noto Serif SC" w:cs="Noto Serif"/>
-          <w:sz w:val="24"/>
-          <w:szCs w:val="24"/>
-          <w:lang w:val="en-US"/>
-        </w:rPr>
-        <w:t xml:space="preserve">1 </w:t>
-      </w:r>
-      <w:r>
-        <w:rPr>
-          <w:rFonts w:ascii="Noto Serif SC" w:eastAsia="Noto Serif SC" w:hAnsi="Noto Serif SC" w:cs="Noto Serif" w:hint="eastAsia"/>
-          <w:sz w:val="24"/>
-          <w:szCs w:val="24"/>
-          <w:lang w:val="en-US"/>
-        </w:rPr>
-        <w:t>扬琴</w:t>
-      </w:r>
-      <w:r>
-        <w:rPr>
-          <w:rFonts w:ascii="Noto Serif SC" w:eastAsia="Noto Serif SC" w:hAnsi="Noto Serif SC" w:cs="Noto Serif"/>
-          <w:sz w:val="24"/>
-          <w:szCs w:val="24"/>
-          <w:lang w:val="en-US"/>
-        </w:rPr>
-        <w:t xml:space="preserve"> </w:t>
-      </w:r>
-      <w:r>
-        <w:rPr>
-          <w:rFonts w:ascii="Noto Serif SC" w:eastAsia="Noto Serif SC" w:hAnsi="Noto Serif SC" w:cs="Noto Serif"/>
-          <w:sz w:val="24"/>
-          <w:szCs w:val="24"/>
-          <w:lang w:val="en-US"/>
-        </w:rPr>
-        <w:t xml:space="preserve">1 </w:t>
-      </w:r>
-      <w:r>
-        <w:rPr>
-          <w:rFonts w:ascii="Noto Serif SC" w:eastAsia="Noto Serif SC" w:hAnsi="Noto Serif SC" w:cs="Noto Serif"/>
-          <w:sz w:val="24"/>
-          <w:szCs w:val="24"/>
-          <w:lang w:val="en-US"/>
-        </w:rPr>
-        <w:t>Yangqin</w:t>
-      </w:r>
-    </w:p>
-    <w:p>
-      <w:pPr>
-        <w:rPr>
-          <w:rFonts w:ascii="Noto Serif SC" w:eastAsia="Noto Serif SC" w:hAnsi="Noto Serif SC" w:cs="Noto Serif"/>
-          <w:sz w:val="24"/>
-          <w:szCs w:val="24"/>
-          <w:lang w:val="en-US"/>
-        </w:rPr>
-      </w:pPr>
-      <w:r>
-        <w:rPr>
-          <w:rFonts w:ascii="Noto Serif SC" w:eastAsia="Noto Serif SC" w:hAnsi="Noto Serif SC" w:cs="Noto Serif"/>
-          <w:sz w:val="24"/>
-          <w:szCs w:val="24"/>
-          <w:lang w:val="en-US"/>
-        </w:rPr>
-        <w:t>2</w:t>
-      </w:r>
-      <w:r>
-        <w:rPr>
-          <w:rFonts w:ascii="Noto Serif SC" w:eastAsia="Noto Serif SC" w:hAnsi="Noto Serif SC" w:cs="Noto Serif" w:hint="eastAsia"/>
-          <w:sz w:val="24"/>
-          <w:szCs w:val="24"/>
-          <w:lang w:val="en-US"/>
-        </w:rPr>
-        <w:t>柳琴</w:t>
-      </w:r>
-      <w:r>
-        <w:rPr>
-          <w:rFonts w:ascii="Noto Serif SC" w:eastAsia="Noto Serif SC" w:hAnsi="Noto Serif SC" w:cs="Noto Serif"/>
-          <w:sz w:val="24"/>
-          <w:szCs w:val="24"/>
-          <w:lang w:val="en-US"/>
-        </w:rPr>
-        <w:t xml:space="preserve"> </w:t>
-      </w:r>
-      <w:r>
-        <w:rPr>
-          <w:rFonts w:ascii="Noto Serif SC" w:eastAsia="Noto Serif SC" w:hAnsi="Noto Serif SC" w:cs="Noto Serif"/>
-          <w:sz w:val="24"/>
-          <w:szCs w:val="24"/>
-          <w:lang w:val="en-US"/>
-        </w:rPr>
-        <w:t xml:space="preserve">2 </w:t>
-      </w:r>
-      <w:proofErr w:type="spellStart"/>
-      <w:r>
-        <w:rPr>
-          <w:rFonts w:ascii="Noto Serif SC" w:eastAsia="Noto Serif SC" w:hAnsi="Noto Serif SC" w:cs="Noto Serif"/>
-          <w:sz w:val="24"/>
-          <w:szCs w:val="24"/>
-          <w:lang w:val="en-US"/>
-        </w:rPr>
-        <w:t>Liuqin</w:t>
-      </w:r>
-      <w:proofErr w:type="spellEnd"/>
-    </w:p>
-    <w:p>
-      <w:pPr>
-        <w:rPr>
-          <w:rFonts w:ascii="Noto Serif SC" w:eastAsia="Noto Serif SC" w:hAnsi="Noto Serif SC" w:cs="Noto Serif"/>
-          <w:sz w:val="24"/>
-          <w:szCs w:val="24"/>
-          <w:lang w:val="en-US"/>
-        </w:rPr>
-      </w:pPr>
-      <w:r>
-        <w:rPr>
-          <w:rFonts w:ascii="Noto Serif SC" w:eastAsia="Noto Serif SC" w:hAnsi="Noto Serif SC" w:cs="Noto Serif"/>
-          <w:sz w:val="24"/>
-          <w:szCs w:val="24"/>
-          <w:lang w:val="en-US"/>
-        </w:rPr>
-        <w:t>4</w:t>
-      </w:r>
-      <w:r>
-        <w:rPr>
-          <w:rFonts w:ascii="Noto Serif SC" w:eastAsia="Noto Serif SC" w:hAnsi="Noto Serif SC" w:cs="Noto Serif" w:hint="eastAsia"/>
-          <w:sz w:val="24"/>
-          <w:szCs w:val="24"/>
-          <w:lang w:val="en-US"/>
-        </w:rPr>
-        <w:t>琵琶</w:t>
-      </w:r>
-      <w:r>
-        <w:rPr>
-          <w:rFonts w:ascii="Noto Serif SC" w:eastAsia="Noto Serif SC" w:hAnsi="Noto Serif SC" w:cs="Noto Serif"/>
-          <w:sz w:val="24"/>
-          <w:szCs w:val="24"/>
-          <w:lang w:val="en-US"/>
-        </w:rPr>
-        <w:t xml:space="preserve"> </w:t>
-      </w:r>
-      <w:r>
-        <w:rPr>
-          <w:rFonts w:ascii="Noto Serif SC" w:eastAsia="Noto Serif SC" w:hAnsi="Noto Serif SC" w:cs="Noto Serif"/>
-          <w:sz w:val="24"/>
-          <w:szCs w:val="24"/>
-          <w:lang w:val="en-US"/>
-        </w:rPr>
-        <w:t xml:space="preserve">4 </w:t>
-      </w:r>
-      <w:r>
-        <w:rPr>
-          <w:rFonts w:ascii="Noto Serif SC" w:eastAsia="Noto Serif SC" w:hAnsi="Noto Serif SC" w:cs="Noto Serif"/>
-          <w:sz w:val="24"/>
-          <w:szCs w:val="24"/>
-          <w:lang w:val="en-US"/>
-        </w:rPr>
-        <w:t>Pipa</w:t>
-      </w:r>
-    </w:p>
-    <w:p>
-      <w:pPr>
-        <w:rPr>
-          <w:rFonts w:ascii="Noto Serif SC" w:eastAsia="Noto Serif SC" w:hAnsi="Noto Serif SC" w:cs="Noto Serif"/>
-          <w:sz w:val="24"/>
-          <w:szCs w:val="24"/>
-          <w:lang w:val="en-US"/>
-        </w:rPr>
-      </w:pPr>
-      <w:r>
-        <w:rPr>
-          <w:rFonts w:ascii="Noto Serif SC" w:eastAsia="Noto Serif SC" w:hAnsi="Noto Serif SC" w:cs="Noto Serif"/>
-          <w:sz w:val="24"/>
-          <w:szCs w:val="24"/>
-          <w:lang w:val="en-US"/>
-        </w:rPr>
-        <w:t>4</w:t>
-      </w:r>
-      <w:r>
-        <w:rPr>
-          <w:rFonts w:ascii="Noto Serif SC" w:eastAsia="Noto Serif SC" w:hAnsi="Noto Serif SC" w:cs="Noto Serif" w:hint="eastAsia"/>
-          <w:sz w:val="24"/>
-          <w:szCs w:val="24"/>
-          <w:lang w:val="en-US"/>
-        </w:rPr>
-        <w:t>中阮</w:t>
-      </w:r>
-      <w:r>
-        <w:rPr>
-          <w:rFonts w:ascii="Noto Serif SC" w:eastAsia="Noto Serif SC" w:hAnsi="Noto Serif SC" w:cs="Noto Serif"/>
-          <w:sz w:val="24"/>
-          <w:szCs w:val="24"/>
-          <w:lang w:val="en-US"/>
-        </w:rPr>
-        <w:t xml:space="preserve"> </w:t>
-      </w:r>
-      <w:r>
-        <w:rPr>
-          <w:rFonts w:ascii="Noto Serif SC" w:eastAsia="Noto Serif SC" w:hAnsi="Noto Serif SC" w:cs="Noto Serif"/>
-          <w:sz w:val="24"/>
-          <w:szCs w:val="24"/>
-          <w:lang w:val="en-US"/>
-        </w:rPr>
-        <w:t xml:space="preserve">4 </w:t>
-      </w:r>
-      <w:r>
-        <w:rPr>
-          <w:rFonts w:ascii="Noto Serif SC" w:eastAsia="Noto Serif SC" w:hAnsi="Noto Serif SC" w:cs="Noto Serif"/>
-          <w:sz w:val="24"/>
-          <w:szCs w:val="24"/>
-          <w:lang w:val="en-US"/>
-        </w:rPr>
-        <w:t>Zhongruan</w:t>
-      </w:r>
-    </w:p>
-    <w:p>
-      <w:pPr>
-        <w:rPr>
-          <w:rFonts w:ascii="Noto Serif SC" w:eastAsia="Noto Serif SC" w:hAnsi="Noto Serif SC" w:cs="Noto Serif"/>
-          <w:sz w:val="24"/>
-          <w:szCs w:val="24"/>
-          <w:lang w:val="en-US"/>
-        </w:rPr>
-      </w:pPr>
-      <w:r>
-        <w:rPr>
-          <w:rFonts w:ascii="Noto Serif SC" w:eastAsia="Noto Serif SC" w:hAnsi="Noto Serif SC" w:cs="Noto Serif"/>
-          <w:sz w:val="24"/>
-          <w:szCs w:val="24"/>
-          <w:lang w:val="en-US"/>
-        </w:rPr>
-        <w:t>1</w:t>
-      </w:r>
-      <w:r>
-        <w:rPr>
-          <w:rFonts w:ascii="Noto Serif SC" w:eastAsia="Noto Serif SC" w:hAnsi="Noto Serif SC" w:cs="Noto Serif" w:hint="eastAsia"/>
-          <w:sz w:val="24"/>
-          <w:szCs w:val="24"/>
-        </w:rPr>
-        <w:t>三弦</w:t>
-      </w:r>
-      <w:r>
-        <w:rPr>
-          <w:rFonts w:ascii="Noto Serif SC" w:eastAsia="Noto Serif SC" w:hAnsi="Noto Serif SC" w:cs="Noto Serif"/>
-          <w:sz w:val="24"/>
-          <w:szCs w:val="24"/>
-          <w:lang w:val="en-US"/>
-        </w:rPr>
-        <w:t xml:space="preserve"> </w:t>
-      </w:r>
-      <w:r>
-        <w:rPr>
-          <w:rFonts w:ascii="Noto Serif SC" w:eastAsia="Noto Serif SC" w:hAnsi="Noto Serif SC" w:cs="Noto Serif"/>
-          <w:sz w:val="24"/>
-          <w:szCs w:val="24"/>
-          <w:lang w:val="en-US"/>
-        </w:rPr>
-        <w:t xml:space="preserve">1 </w:t>
-      </w:r>
-      <w:r>
-        <w:rPr>
-          <w:rFonts w:ascii="Noto Serif SC" w:eastAsia="Noto Serif SC" w:hAnsi="Noto Serif SC" w:cs="Noto Serif"/>
-          <w:sz w:val="24"/>
-          <w:szCs w:val="24"/>
-          <w:lang w:val="en-US"/>
-        </w:rPr>
-        <w:t>Sanxian</w:t>
-      </w:r>
-    </w:p>
-    <w:p>
-      <w:pPr>
-        <w:rPr>
-          <w:rFonts w:ascii="Noto Serif SC" w:eastAsia="Noto Serif SC" w:hAnsi="Noto Serif SC" w:cs="Noto Serif"/>
-          <w:sz w:val="24"/>
-          <w:szCs w:val="24"/>
-          <w:lang w:val="en-US"/>
-        </w:rPr>
-      </w:pPr>
-      <w:r>
-        <w:rPr>
-          <w:rFonts w:ascii="Noto Serif SC" w:eastAsia="Noto Serif SC" w:hAnsi="Noto Serif SC" w:cs="Noto Serif"/>
-          <w:sz w:val="24"/>
-          <w:szCs w:val="24"/>
-          <w:lang w:val="en-US"/>
-        </w:rPr>
-        <w:t>2</w:t>
-      </w:r>
-      <w:r>
-        <w:rPr>
-          <w:rFonts w:ascii="Noto Serif SC" w:eastAsia="Noto Serif SC" w:hAnsi="Noto Serif SC" w:cs="Noto Serif" w:hint="eastAsia"/>
-          <w:sz w:val="24"/>
-          <w:szCs w:val="24"/>
-          <w:lang w:val="en-US"/>
-        </w:rPr>
-        <w:t>大阮</w:t>
-      </w:r>
-      <w:r>
-        <w:rPr>
-          <w:rFonts w:ascii="Noto Serif SC" w:eastAsia="Noto Serif SC" w:hAnsi="Noto Serif SC" w:cs="Noto Serif"/>
-          <w:sz w:val="24"/>
-          <w:szCs w:val="24"/>
-          <w:lang w:val="en-US"/>
-        </w:rPr>
-        <w:t xml:space="preserve"> </w:t>
-      </w:r>
-      <w:r>
-        <w:rPr>
-          <w:rFonts w:ascii="Noto Serif SC" w:eastAsia="Noto Serif SC" w:hAnsi="Noto Serif SC" w:cs="Noto Serif"/>
-          <w:sz w:val="24"/>
-          <w:szCs w:val="24"/>
-          <w:lang w:val="en-US"/>
-        </w:rPr>
-        <w:t xml:space="preserve">2 </w:t>
-      </w:r>
-      <w:r>
-        <w:rPr>
-          <w:rFonts w:ascii="Noto Serif SC" w:eastAsia="Noto Serif SC" w:hAnsi="Noto Serif SC" w:cs="Noto Serif"/>
-          <w:sz w:val="24"/>
-          <w:szCs w:val="24"/>
-          <w:lang w:val="en-US"/>
-        </w:rPr>
-        <w:t>Daruan</w:t>
-      </w:r>
-    </w:p>
-    <w:p>
-      <w:pPr>
-        <w:spacing w:after="120"/>
-        <w:rPr>
-          <w:rFonts w:ascii="Noto Serif SC" w:eastAsia="Noto Serif SC" w:hAnsi="Noto Serif SC" w:cs="Noto Serif"/>
-          <w:sz w:val="24"/>
-          <w:szCs w:val="24"/>
-          <w:lang w:val="en-US"/>
-        </w:rPr>
-      </w:pPr>
-      <w:r>
-        <w:rPr>
-          <w:rFonts w:ascii="Noto Serif SC" w:eastAsia="Noto Serif SC" w:hAnsi="Noto Serif SC" w:cs="Noto Serif"/>
-          <w:sz w:val="24"/>
-          <w:szCs w:val="24"/>
-          <w:lang w:val="en-US"/>
-        </w:rPr>
-        <w:t>1</w:t>
-      </w:r>
-      <w:r>
-        <w:rPr>
-          <w:rFonts w:ascii="Noto Serif SC" w:eastAsia="Noto Serif SC" w:hAnsi="Noto Serif SC" w:cs="Noto Serif" w:hint="eastAsia"/>
-          <w:sz w:val="24"/>
-          <w:szCs w:val="24"/>
-        </w:rPr>
-        <w:t>古筝</w:t>
-      </w:r>
-      <w:r>
-        <w:rPr>
-          <w:rFonts w:ascii="Noto Serif SC" w:eastAsia="Noto Serif SC" w:hAnsi="Noto Serif SC" w:cs="Noto Serif"/>
-          <w:sz w:val="24"/>
-          <w:szCs w:val="24"/>
-          <w:lang w:val="en-US"/>
-        </w:rPr>
-        <w:t xml:space="preserve"> </w:t>
-      </w:r>
-      <w:r>
-        <w:rPr>
-          <w:rFonts w:ascii="Noto Serif SC" w:eastAsia="Noto Serif SC" w:hAnsi="Noto Serif SC" w:cs="Noto Serif"/>
-          <w:sz w:val="24"/>
-          <w:szCs w:val="24"/>
-          <w:lang w:val="en-US"/>
-        </w:rPr>
-        <w:t xml:space="preserve">1 </w:t>
-      </w:r>
-      <w:r>
-        <w:rPr>
-          <w:rFonts w:ascii="Noto Serif SC" w:eastAsia="Noto Serif SC" w:hAnsi="Noto Serif SC" w:cs="Noto Serif"/>
-          <w:sz w:val="24"/>
-          <w:szCs w:val="24"/>
-          <w:lang w:val="en-US"/>
-        </w:rPr>
-        <w:t>Guzheng</w:t>
-      </w:r>
-    </w:p>
-    <w:p>
-      <w:pPr>
-        <w:rPr>
-          <w:rFonts w:ascii="Noto Serif SC" w:eastAsia="Noto Serif SC" w:hAnsi="Noto Serif SC" w:cs="Noto Serif"/>
-          <w:sz w:val="24"/>
-          <w:szCs w:val="24"/>
-          <w:lang w:val="en-US"/>
-        </w:rPr>
-      </w:pPr>
-      <w:r>
-        <w:rPr>
-          <w:rFonts w:ascii="Noto Serif SC" w:eastAsia="Noto Serif SC" w:hAnsi="Noto Serif SC" w:cs="Noto Serif"/>
-          <w:sz w:val="24"/>
-          <w:szCs w:val="24"/>
-          <w:lang w:val="en-US"/>
-        </w:rPr>
-        <w:t>1</w:t>
-      </w:r>
-      <w:r>
-        <w:rPr>
-          <w:rFonts w:ascii="Noto Serif SC" w:eastAsia="Noto Serif SC" w:hAnsi="Noto Serif SC" w:cs="Noto Serif" w:hint="eastAsia"/>
-          <w:sz w:val="24"/>
-          <w:szCs w:val="24"/>
-          <w:lang w:val="en-US"/>
-        </w:rPr>
-        <w:t>竖琴</w:t>
-      </w:r>
-      <w:r>
-        <w:rPr>
-          <w:rFonts w:ascii="Noto Serif SC" w:eastAsia="Noto Serif SC" w:hAnsi="Noto Serif SC" w:cs="Noto Serif"/>
-          <w:sz w:val="24"/>
-          <w:szCs w:val="24"/>
-          <w:lang w:val="en-US"/>
-        </w:rPr>
-        <w:t xml:space="preserve"> </w:t>
-      </w:r>
-      <w:r>
-        <w:rPr>
-          <w:rFonts w:ascii="Noto Serif SC" w:eastAsia="Noto Serif SC" w:hAnsi="Noto Serif SC" w:cs="Noto Serif"/>
-          <w:sz w:val="24"/>
-          <w:szCs w:val="24"/>
-          <w:lang w:val="en-US"/>
-        </w:rPr>
-        <w:t xml:space="preserve">1 </w:t>
-      </w:r>
-      <w:r>
-        <w:rPr>
-          <w:rFonts w:ascii="Noto Serif SC" w:eastAsia="Noto Serif SC" w:hAnsi="Noto Serif SC" w:cs="Noto Serif"/>
-          <w:sz w:val="24"/>
-          <w:szCs w:val="24"/>
-          <w:lang w:val="en-US"/>
-        </w:rPr>
-        <w:t>Harp</w:t>
-      </w:r>
-    </w:p>
-    <w:p>
-      <w:pPr>
-        <w:rPr>
-          <w:rFonts w:ascii="Noto Serif SC" w:eastAsia="Noto Serif SC" w:hAnsi="Noto Serif SC" w:cs="Noto Serif"/>
-          <w:sz w:val="24"/>
-          <w:szCs w:val="24"/>
-          <w:lang w:val="en-US"/>
-        </w:rPr>
-      </w:pPr>
-    </w:p>
-    <w:p>
-      <w:pPr>
-        <w:rPr>
-          <w:rFonts w:ascii="Noto Serif SC" w:eastAsia="Noto Serif SC" w:hAnsi="Noto Serif SC" w:cs="Noto Serif"/>
-          <w:sz w:val="24"/>
-          <w:szCs w:val="24"/>
-          <w:lang w:val="en-US"/>
-        </w:rPr>
-      </w:pPr>
-      <w:r>
-        <w:rPr>
-          <w:rFonts w:ascii="Noto Serif SC" w:eastAsia="Noto Serif SC" w:hAnsi="Noto Serif SC" w:cs="Noto Serif"/>
-          <w:sz w:val="24"/>
-          <w:szCs w:val="24"/>
-        </w:rPr>
-        <w:t>6</w:t>
-      </w:r>
-      <w:r>
-        <w:rPr>
-          <w:rFonts w:ascii="Noto Serif SC" w:eastAsia="Noto Serif SC" w:hAnsi="Noto Serif SC" w:cs="Noto Serif" w:hint="eastAsia"/>
-          <w:sz w:val="24"/>
-          <w:szCs w:val="24"/>
-        </w:rPr>
-        <w:t xml:space="preserve"> 打击乐 </w:t>
-      </w:r>
-      <w:r>
-        <w:rPr>
-          <w:rFonts w:ascii="Noto Serif SC" w:eastAsia="Noto Serif SC" w:hAnsi="Noto Serif SC" w:cs="Noto Serif"/>
-          <w:sz w:val="24"/>
-          <w:szCs w:val="24"/>
-        </w:rPr>
-        <w:t>6</w:t>
-      </w:r>
-      <w:r>
-        <w:rPr>
-          <w:rFonts w:ascii="Noto Serif SC" w:eastAsia="Noto Serif SC" w:hAnsi="Noto Serif SC" w:cs="Noto Serif"/>
-          <w:sz w:val="24"/>
-          <w:szCs w:val="24"/>
-        </w:rPr>
-        <w:t xml:space="preserve"> Percussion</w:t>
-      </w:r>
-    </w:p>
-    <w:p>
-      <w:pPr>
-        <w:ind w:left="288"/>
-        <w:rPr>
-          <w:rFonts w:ascii="Noto Serif SC" w:eastAsia="Noto Serif SC" w:hAnsi="Noto Serif SC" w:cs="Noto Serif"/>
-          <w:sz w:val="20"/>
-          <w:szCs w:val="20"/>
-          <w:lang w:val="en-GB"/>
-        </w:rPr>
-      </w:pPr>
-      <w:r>
-        <w:rPr>
-          <w:rFonts w:ascii="Noto Serif SC" w:eastAsia="Noto Serif SC" w:hAnsi="Noto Serif SC" w:cs="Noto Serif"/>
-          <w:sz w:val="20"/>
-          <w:szCs w:val="20"/>
-        </w:rPr>
-        <w:t xml:space="preserve">I: </w:t>
-      </w:r>
-      <w:r>
-        <w:rPr>
-          <w:rFonts w:ascii="Noto Serif SC" w:eastAsia="Noto Serif SC" w:hAnsi="Noto Serif SC" w:cs="Noto Serif"/>
-          <w:sz w:val="20"/>
-          <w:szCs w:val="20"/>
-        </w:rPr>
-        <w:t>(</w:t>
-      </w:r>
-      <w:r>
-        <w:rPr>
-          <w:rFonts w:ascii="Noto Serif SC" w:eastAsia="Noto Serif SC" w:hAnsi="Noto Serif SC" w:cs="Noto Serif" w:hint="eastAsia"/>
-          <w:sz w:val="20"/>
-          <w:szCs w:val="20"/>
-        </w:rPr>
-        <w:t>西方</w:t>
-      </w:r>
-      <w:r>
-        <w:rPr>
-          <w:rFonts w:ascii="Noto Serif SC" w:eastAsia="Noto Serif SC" w:hAnsi="Noto Serif SC" w:cs="Noto Serif"/>
-          <w:sz w:val="20"/>
-          <w:szCs w:val="20"/>
-        </w:rPr>
-        <w:t xml:space="preserve">) </w:t>
-      </w:r>
-      <w:r>
-        <w:rPr>
-          <w:rFonts w:ascii="Noto Serif SC" w:eastAsia="Noto Serif SC" w:hAnsi="Noto Serif SC" w:cs="Noto Serif" w:hint="eastAsia"/>
-          <w:sz w:val="20"/>
-          <w:szCs w:val="20"/>
-        </w:rPr>
-        <w:t>木鱼</w:t>
-      </w:r>
-      <w:r>
-        <w:rPr>
-          <w:rFonts w:ascii="Noto Serif SC" w:eastAsia="Noto Serif SC" w:hAnsi="Noto Serif SC" w:cs="Noto Serif"/>
-          <w:sz w:val="20"/>
-          <w:szCs w:val="20"/>
-        </w:rPr>
-        <w:t xml:space="preserve"> Woodblocks, </w:t>
-      </w:r>
-      <w:r>
-        <w:rPr>
-          <w:rFonts w:ascii="Noto Serif SC" w:eastAsia="Noto Serif SC" w:hAnsi="Noto Serif SC" w:cs="Noto Serif" w:hint="eastAsia"/>
-          <w:sz w:val="20"/>
-          <w:szCs w:val="20"/>
-        </w:rPr>
-        <w:t>钟琴</w:t>
-      </w:r>
-      <w:r>
-        <w:rPr>
-          <w:rFonts w:ascii="Noto Serif SC" w:eastAsia="Noto Serif SC" w:hAnsi="Noto Serif SC" w:cs="Noto Serif"/>
-          <w:sz w:val="20"/>
-          <w:szCs w:val="20"/>
-        </w:rPr>
-        <w:t xml:space="preserve"> Glockenspiel, </w:t>
-      </w:r>
-      <w:r>
-        <w:rPr>
-          <w:rFonts w:ascii="Noto Serif SC" w:eastAsia="Noto Serif SC" w:hAnsi="Noto Serif SC" w:cs="Noto Serif" w:hint="eastAsia"/>
-          <w:sz w:val="20"/>
-          <w:szCs w:val="20"/>
-        </w:rPr>
-        <w:t>云锣</w:t>
-      </w:r>
-      <w:r>
-        <w:rPr>
-          <w:rFonts w:ascii="Noto Serif SC" w:eastAsia="Noto Serif SC" w:hAnsi="Noto Serif SC" w:cs="Noto Serif"/>
-          <w:sz w:val="20"/>
-          <w:szCs w:val="20"/>
-        </w:rPr>
-        <w:t xml:space="preserve"> Yunluo, </w:t>
-      </w:r>
-      <w:r>
-        <w:rPr>
-          <w:rFonts w:ascii="Noto Serif SC" w:eastAsia="Noto Serif SC" w:hAnsi="Noto Serif SC" w:cs="Noto Serif" w:hint="eastAsia"/>
-          <w:sz w:val="20"/>
-          <w:szCs w:val="20"/>
-        </w:rPr>
-        <w:t>小堂鼓</w:t>
-      </w:r>
-      <w:r>
-        <w:rPr>
-          <w:rFonts w:ascii="Noto Serif SC" w:eastAsia="Noto Serif SC" w:hAnsi="Noto Serif SC" w:cs="Noto Serif"/>
-          <w:sz w:val="20"/>
-          <w:szCs w:val="20"/>
-        </w:rPr>
-        <w:t xml:space="preserve"> </w:t>
-      </w:r>
-      <w:proofErr w:type="spellStart"/>
-      <w:r>
-        <w:rPr>
-          <w:rFonts w:ascii="Noto Serif SC" w:eastAsia="Noto Serif SC" w:hAnsi="Noto Serif SC" w:cs="Noto Serif"/>
-          <w:sz w:val="20"/>
-          <w:szCs w:val="20"/>
-        </w:rPr>
-        <w:t>Xiaotanggu</w:t>
-      </w:r>
-      <w:proofErr w:type="spellEnd"/>
-      <w:r>
-        <w:rPr>
-          <w:rFonts w:ascii="Noto Serif SC" w:eastAsia="Noto Serif SC" w:hAnsi="Noto Serif SC" w:cs="Noto Serif"/>
-          <w:sz w:val="20"/>
-          <w:szCs w:val="20"/>
-        </w:rPr>
-        <w:t xml:space="preserve">, </w:t>
-      </w:r>
-      <w:r>
-        <w:rPr>
-          <w:rFonts w:ascii="Noto Serif SC" w:eastAsia="Noto Serif SC" w:hAnsi="Noto Serif SC" w:cs="Noto Serif" w:hint="eastAsia"/>
-          <w:sz w:val="20"/>
-          <w:szCs w:val="20"/>
-        </w:rPr>
-        <w:t>排鼓</w:t>
-      </w:r>
-      <w:r>
-        <w:rPr>
-          <w:rFonts w:ascii="Noto Serif SC" w:eastAsia="Noto Serif SC" w:hAnsi="Noto Serif SC" w:cs="Noto Serif"/>
-          <w:sz w:val="20"/>
-          <w:szCs w:val="20"/>
-        </w:rPr>
-        <w:t xml:space="preserve"> </w:t>
-      </w:r>
-      <w:proofErr w:type="spellStart"/>
-      <w:r>
-        <w:rPr>
-          <w:rFonts w:ascii="Noto Serif SC" w:eastAsia="Noto Serif SC" w:hAnsi="Noto Serif SC" w:cs="Noto Serif"/>
-          <w:sz w:val="20"/>
-          <w:szCs w:val="20"/>
-        </w:rPr>
-        <w:t>Paigu</w:t>
-      </w:r>
-      <w:proofErr w:type="spellEnd"/>
-      <w:r>
-        <w:rPr>
-          <w:rFonts w:ascii="Noto Serif SC" w:eastAsia="Noto Serif SC" w:hAnsi="Noto Serif SC" w:cs="Noto Serif"/>
-          <w:sz w:val="20"/>
-          <w:szCs w:val="20"/>
-        </w:rPr>
-        <w:t xml:space="preserve">, </w:t>
-      </w:r>
-      <w:r>
-        <w:rPr>
-          <w:rFonts w:ascii="Noto Serif SC" w:eastAsia="Noto Serif SC" w:hAnsi="Noto Serif SC" w:cs="Noto Serif" w:hint="eastAsia"/>
-          <w:sz w:val="20"/>
-          <w:szCs w:val="20"/>
-        </w:rPr>
-        <w:t>木鱼</w:t>
-      </w:r>
-      <w:r>
-        <w:rPr>
-          <w:rFonts w:ascii="Noto Serif SC" w:eastAsia="Noto Serif SC" w:hAnsi="Noto Serif SC" w:cs="Noto Serif"/>
-          <w:sz w:val="20"/>
-          <w:szCs w:val="20"/>
-        </w:rPr>
-        <w:t xml:space="preserve"> Chinese Woodblock</w:t>
-      </w:r>
-    </w:p>
-    <w:p>
-      <w:pPr>
-        <w:ind w:left="288"/>
-        <w:rPr>
-          <w:rFonts w:ascii="Noto Serif SC" w:eastAsia="Noto Serif SC" w:hAnsi="Noto Serif SC" w:cs="Noto Serif"/>
-          <w:sz w:val="20"/>
-          <w:szCs w:val="20"/>
-          <w:lang w:val="en-US"/>
-        </w:rPr>
-      </w:pPr>
-      <w:r>
-        <w:rPr>
-          <w:rFonts w:ascii="Noto Serif SC" w:eastAsia="Noto Serif SC" w:hAnsi="Noto Serif SC" w:cs="Noto Serif"/>
-          <w:sz w:val="20"/>
-          <w:szCs w:val="20"/>
-          <w:lang w:val="en-US"/>
-        </w:rPr>
-        <w:t xml:space="preserve">II: </w:t>
-      </w:r>
-      <w:r>
-        <w:rPr>
-          <w:rFonts w:ascii="Noto Serif SC" w:eastAsia="Noto Serif SC" w:hAnsi="Noto Serif SC" w:cs="Noto Serif" w:hint="eastAsia"/>
-          <w:sz w:val="20"/>
-          <w:szCs w:val="20"/>
-        </w:rPr>
-        <w:t>中国木鱼</w:t>
-      </w:r>
-      <w:r>
-        <w:rPr>
-          <w:rFonts w:ascii="Noto Serif SC" w:eastAsia="Noto Serif SC" w:hAnsi="Noto Serif SC" w:cs="Noto Serif"/>
-          <w:sz w:val="20"/>
-          <w:szCs w:val="20"/>
-        </w:rPr>
-        <w:t xml:space="preserve"> Chinese Woodblock, </w:t>
-      </w:r>
-      <w:r>
-        <w:rPr>
-          <w:rFonts w:ascii="Noto Serif SC" w:eastAsia="Noto Serif SC" w:hAnsi="Noto Serif SC" w:cs="Noto Serif" w:hint="eastAsia"/>
-          <w:sz w:val="20"/>
-          <w:szCs w:val="20"/>
-        </w:rPr>
-        <w:t>颤音琴</w:t>
-      </w:r>
-      <w:r>
-        <w:rPr>
-          <w:rFonts w:ascii="Noto Serif SC" w:eastAsia="Noto Serif SC" w:hAnsi="Noto Serif SC" w:cs="Noto Serif"/>
-          <w:sz w:val="20"/>
-          <w:szCs w:val="20"/>
-        </w:rPr>
-        <w:t xml:space="preserve"> Vibraphone, </w:t>
-      </w:r>
-      <w:r>
-        <w:rPr>
-          <w:rFonts w:ascii="Noto Serif SC" w:eastAsia="Noto Serif SC" w:hAnsi="Noto Serif SC" w:cs="Noto Serif" w:hint="eastAsia"/>
-          <w:sz w:val="20"/>
-          <w:szCs w:val="20"/>
-        </w:rPr>
-        <w:t>大钹</w:t>
-      </w:r>
-      <w:r>
-        <w:rPr>
-          <w:rFonts w:ascii="Noto Serif SC" w:eastAsia="Noto Serif SC" w:hAnsi="Noto Serif SC" w:cs="Noto Serif"/>
-          <w:sz w:val="20"/>
-          <w:szCs w:val="20"/>
-        </w:rPr>
-        <w:t xml:space="preserve"> Dabo</w:t>
-      </w:r>
-      <w:r>
-        <w:rPr>
-          <w:rFonts w:ascii="Noto Serif SC" w:eastAsia="Noto Serif SC" w:hAnsi="Noto Serif SC" w:cs="Noto Serif"/>
-          <w:sz w:val="20"/>
-          <w:szCs w:val="20"/>
-        </w:rPr>
-        <w:t>,</w:t>
-      </w:r>
-      <w:r>
-        <w:rPr>
-          <w:rFonts w:ascii="Noto Serif SC" w:eastAsia="Noto Serif SC" w:hAnsi="Noto Serif SC" w:cs="Noto Serif"/>
-          <w:sz w:val="20"/>
-          <w:szCs w:val="20"/>
-        </w:rPr>
-        <w:t xml:space="preserve"> </w:t>
-      </w:r>
-      <w:r>
-        <w:rPr>
-          <w:rFonts w:ascii="Noto Serif SC" w:eastAsia="Noto Serif SC" w:hAnsi="Noto Serif SC" w:cs="Noto Serif" w:hint="eastAsia"/>
-          <w:sz w:val="20"/>
-          <w:szCs w:val="20"/>
-        </w:rPr>
-        <w:t>排鼓</w:t>
-      </w:r>
-      <w:r>
-        <w:rPr>
-          <w:rFonts w:ascii="Noto Serif SC" w:eastAsia="Noto Serif SC" w:hAnsi="Noto Serif SC" w:cs="Noto Serif"/>
-          <w:sz w:val="20"/>
-          <w:szCs w:val="20"/>
-        </w:rPr>
-        <w:t xml:space="preserve"> </w:t>
-      </w:r>
-      <w:proofErr w:type="spellStart"/>
-      <w:r>
-        <w:rPr>
-          <w:rFonts w:ascii="Noto Serif SC" w:eastAsia="Noto Serif SC" w:hAnsi="Noto Serif SC" w:cs="Noto Serif"/>
-          <w:sz w:val="20"/>
-          <w:szCs w:val="20"/>
-        </w:rPr>
-        <w:t>Paigu</w:t>
-      </w:r>
-      <w:proofErr w:type="spellEnd"/>
-      <w:r>
-        <w:rPr>
-          <w:rFonts w:ascii="Noto Serif SC" w:eastAsia="Noto Serif SC" w:hAnsi="Noto Serif SC" w:cs="Noto Serif"/>
-          <w:sz w:val="20"/>
-          <w:szCs w:val="20"/>
-        </w:rPr>
-        <w:t xml:space="preserve">, </w:t>
-      </w:r>
-      <w:r>
-        <w:rPr>
-          <w:rFonts w:ascii="Noto Serif SC" w:eastAsia="Noto Serif SC" w:hAnsi="Noto Serif SC" w:cs="Noto Serif" w:hint="eastAsia"/>
-          <w:sz w:val="20"/>
-          <w:szCs w:val="20"/>
-        </w:rPr>
-        <w:t>军镲</w:t>
-      </w:r>
-      <w:r>
-        <w:rPr>
-          <w:rFonts w:ascii="Noto Serif SC" w:eastAsia="Noto Serif SC" w:hAnsi="Noto Serif SC" w:cs="Noto Serif"/>
-          <w:sz w:val="20"/>
-          <w:szCs w:val="20"/>
-        </w:rPr>
-        <w:t xml:space="preserve"> Cymbals</w:t>
-      </w:r>
-      <w:r>
-        <w:rPr>
-          <w:rFonts w:ascii="Noto Serif SC" w:eastAsia="Noto Serif SC" w:hAnsi="Noto Serif SC" w:cs="Noto Serif"/>
-          <w:sz w:val="20"/>
-          <w:szCs w:val="20"/>
-        </w:rPr>
-        <w:t>,</w:t>
-      </w:r>
-      <w:r>
-        <w:rPr>
-          <w:rFonts w:ascii="Noto Serif SC" w:eastAsia="Noto Serif SC" w:hAnsi="Noto Serif SC" w:cs="Noto Serif"/>
-          <w:sz w:val="20"/>
-          <w:szCs w:val="20"/>
-        </w:rPr>
-        <w:t xml:space="preserve"> </w:t>
-      </w:r>
-      <w:r>
-        <w:rPr>
-          <w:rFonts w:ascii="Noto Serif SC" w:eastAsia="Noto Serif SC" w:hAnsi="Noto Serif SC" w:cs="Noto Serif" w:hint="eastAsia"/>
-          <w:sz w:val="20"/>
-          <w:szCs w:val="20"/>
-        </w:rPr>
-        <w:t>通通鼓</w:t>
-      </w:r>
-      <w:r>
-        <w:rPr>
-          <w:rFonts w:ascii="Noto Serif SC" w:eastAsia="Noto Serif SC" w:hAnsi="Noto Serif SC" w:cs="Noto Serif"/>
-          <w:sz w:val="20"/>
-          <w:szCs w:val="20"/>
-        </w:rPr>
-        <w:t xml:space="preserve"> Tom-toms</w:t>
-      </w:r>
-    </w:p>
-    <w:p>
-      <w:pPr>
-        <w:ind w:left="288"/>
-        <w:rPr>
-          <w:rFonts w:ascii="Noto Serif SC" w:eastAsia="Noto Serif SC" w:hAnsi="Noto Serif SC" w:cs="Noto Serif"/>
-          <w:sz w:val="20"/>
-          <w:szCs w:val="20"/>
-        </w:rPr>
-      </w:pPr>
-      <w:r>
-        <w:rPr>
-          <w:rFonts w:ascii="Noto Serif SC" w:eastAsia="Noto Serif SC" w:hAnsi="Noto Serif SC" w:cs="Noto Serif"/>
-          <w:sz w:val="20"/>
-          <w:szCs w:val="20"/>
-          <w:lang w:val="en-US"/>
-        </w:rPr>
-        <w:t xml:space="preserve">III: </w:t>
-      </w:r>
-      <w:r>
-        <w:rPr>
-          <w:rFonts w:ascii="Noto Serif SC" w:eastAsia="Noto Serif SC" w:hAnsi="Noto Serif SC" w:cs="Noto Serif" w:hint="eastAsia"/>
-          <w:sz w:val="20"/>
-          <w:szCs w:val="20"/>
-        </w:rPr>
-        <w:t>木琴</w:t>
-      </w:r>
-      <w:r>
-        <w:rPr>
-          <w:rFonts w:ascii="Noto Serif SC" w:eastAsia="Noto Serif SC" w:hAnsi="Noto Serif SC" w:cs="Noto Serif"/>
-          <w:sz w:val="20"/>
-          <w:szCs w:val="20"/>
-        </w:rPr>
-        <w:t xml:space="preserve"> Xylophone, </w:t>
-      </w:r>
-      <w:r>
-        <w:rPr>
-          <w:rFonts w:ascii="Noto Serif SC" w:eastAsia="Noto Serif SC" w:hAnsi="Noto Serif SC" w:cs="Noto Serif" w:hint="eastAsia"/>
-          <w:sz w:val="20"/>
-          <w:szCs w:val="20"/>
-        </w:rPr>
-        <w:t>通通鼓</w:t>
-      </w:r>
-      <w:r>
-        <w:rPr>
-          <w:rFonts w:ascii="Noto Serif SC" w:eastAsia="Noto Serif SC" w:hAnsi="Noto Serif SC" w:cs="Noto Serif"/>
-          <w:sz w:val="20"/>
-          <w:szCs w:val="20"/>
-        </w:rPr>
-        <w:t xml:space="preserve"> Tom-toms, </w:t>
-      </w:r>
-      <w:r>
-        <w:rPr>
-          <w:rFonts w:ascii="Noto Serif SC" w:eastAsia="Noto Serif SC" w:hAnsi="Noto Serif SC" w:cs="Noto Serif" w:hint="eastAsia"/>
-          <w:sz w:val="20"/>
-          <w:szCs w:val="20"/>
-        </w:rPr>
-        <w:t>乐鞭</w:t>
-      </w:r>
-      <w:r>
-        <w:rPr>
-          <w:rFonts w:ascii="Noto Serif SC" w:eastAsia="Noto Serif SC" w:hAnsi="Noto Serif SC" w:cs="Noto Serif"/>
-          <w:sz w:val="20"/>
-          <w:szCs w:val="20"/>
-        </w:rPr>
-        <w:t xml:space="preserve"> Whip, </w:t>
-      </w:r>
-      <w:r>
-        <w:rPr>
-          <w:rFonts w:ascii="Noto Serif SC" w:eastAsia="Noto Serif SC" w:hAnsi="Noto Serif SC" w:cs="Noto Serif" w:hint="eastAsia"/>
-          <w:sz w:val="20"/>
-          <w:szCs w:val="20"/>
-        </w:rPr>
-        <w:t>康嘎鼓</w:t>
-      </w:r>
-      <w:r>
-        <w:rPr>
-          <w:rFonts w:ascii="Noto Serif SC" w:eastAsia="Noto Serif SC" w:hAnsi="Noto Serif SC" w:cs="Noto Serif"/>
-          <w:sz w:val="20"/>
-          <w:szCs w:val="20"/>
-        </w:rPr>
-        <w:t xml:space="preserve"> Congas</w:t>
-      </w:r>
-    </w:p>
-    <w:p>
-      <w:pPr>
-        <w:ind w:left="288"/>
-        <w:rPr>
-          <w:rFonts w:ascii="Noto Serif SC" w:eastAsia="Noto Serif SC" w:hAnsi="Noto Serif SC" w:cs="Noto Serif"/>
-          <w:sz w:val="20"/>
-          <w:szCs w:val="20"/>
-        </w:rPr>
-      </w:pPr>
-      <w:r>
-        <w:rPr>
-          <w:rFonts w:ascii="Noto Serif SC" w:eastAsia="Noto Serif SC" w:hAnsi="Noto Serif SC" w:cs="Noto Serif"/>
-          <w:sz w:val="20"/>
-          <w:szCs w:val="20"/>
-          <w:lang w:val="en-US"/>
-        </w:rPr>
-        <w:t xml:space="preserve">IV: </w:t>
-      </w:r>
-      <w:r>
-        <w:rPr>
-          <w:rFonts w:ascii="Noto Serif SC" w:eastAsia="Noto Serif SC" w:hAnsi="Noto Serif SC" w:cs="Noto Serif" w:hint="eastAsia"/>
-          <w:sz w:val="20"/>
-          <w:szCs w:val="20"/>
-        </w:rPr>
-        <w:t>编钟</w:t>
-      </w:r>
-      <w:r>
-        <w:rPr>
-          <w:rFonts w:ascii="Noto Serif SC" w:eastAsia="Noto Serif SC" w:hAnsi="Noto Serif SC" w:cs="Noto Serif"/>
-          <w:sz w:val="20"/>
-          <w:szCs w:val="20"/>
-        </w:rPr>
-        <w:t xml:space="preserve"> </w:t>
-      </w:r>
-      <w:proofErr w:type="spellStart"/>
-      <w:r>
-        <w:rPr>
-          <w:rFonts w:ascii="Noto Serif SC" w:eastAsia="Noto Serif SC" w:hAnsi="Noto Serif SC" w:cs="Noto Serif"/>
-          <w:sz w:val="20"/>
-          <w:szCs w:val="20"/>
-        </w:rPr>
-        <w:t>Bianzhong</w:t>
-      </w:r>
-      <w:proofErr w:type="spellEnd"/>
-      <w:r>
-        <w:rPr>
-          <w:rFonts w:ascii="Noto Serif SC" w:eastAsia="Noto Serif SC" w:hAnsi="Noto Serif SC" w:cs="Noto Serif"/>
-          <w:sz w:val="20"/>
-          <w:szCs w:val="20"/>
-        </w:rPr>
-        <w:t xml:space="preserve">, </w:t>
-      </w:r>
-      <w:r>
-        <w:rPr>
-          <w:rFonts w:ascii="Noto Serif SC" w:eastAsia="Noto Serif SC" w:hAnsi="Noto Serif SC" w:cs="Noto Serif" w:hint="eastAsia"/>
-          <w:sz w:val="20"/>
-          <w:szCs w:val="20"/>
-        </w:rPr>
-        <w:t>通通鼓</w:t>
-      </w:r>
-      <w:r>
-        <w:rPr>
-          <w:rFonts w:ascii="Noto Serif SC" w:eastAsia="Noto Serif SC" w:hAnsi="Noto Serif SC" w:cs="Noto Serif"/>
-          <w:sz w:val="20"/>
-          <w:szCs w:val="20"/>
-        </w:rPr>
-        <w:t xml:space="preserve"> Tom-toms, </w:t>
-      </w:r>
-      <w:r>
-        <w:rPr>
-          <w:rFonts w:ascii="Noto Serif SC" w:eastAsia="Noto Serif SC" w:hAnsi="Noto Serif SC" w:cs="Noto Serif" w:hint="eastAsia"/>
-          <w:sz w:val="20"/>
-          <w:szCs w:val="20"/>
-        </w:rPr>
-        <w:t>马林巴</w:t>
-      </w:r>
-      <w:r>
-        <w:rPr>
-          <w:rFonts w:ascii="Noto Serif SC" w:eastAsia="Noto Serif SC" w:hAnsi="Noto Serif SC" w:cs="Noto Serif"/>
-          <w:sz w:val="20"/>
-          <w:szCs w:val="20"/>
-        </w:rPr>
-        <w:t xml:space="preserve"> Marimba, </w:t>
-      </w:r>
-      <w:r>
-        <w:rPr>
-          <w:rFonts w:ascii="Noto Serif SC" w:eastAsia="Noto Serif SC" w:hAnsi="Noto Serif SC" w:cs="Noto Serif" w:hint="eastAsia"/>
-          <w:sz w:val="20"/>
-          <w:szCs w:val="20"/>
-        </w:rPr>
-        <w:t>军镲</w:t>
-      </w:r>
-      <w:r>
-        <w:rPr>
-          <w:rFonts w:ascii="Noto Serif SC" w:eastAsia="Noto Serif SC" w:hAnsi="Noto Serif SC" w:cs="Noto Serif"/>
-          <w:sz w:val="20"/>
-          <w:szCs w:val="20"/>
-        </w:rPr>
-        <w:t xml:space="preserve"> </w:t>
-      </w:r>
-      <w:r>
-        <w:rPr>
-          <w:rFonts w:ascii="Noto Serif SC" w:eastAsia="Noto Serif SC" w:hAnsi="Noto Serif SC" w:cs="Noto Serif"/>
-          <w:sz w:val="20"/>
-          <w:szCs w:val="20"/>
-        </w:rPr>
-        <w:t>C</w:t>
-      </w:r>
-      <w:r>
-        <w:rPr>
-          <w:rFonts w:ascii="Noto Serif SC" w:eastAsia="Noto Serif SC" w:hAnsi="Noto Serif SC" w:cs="Noto Serif"/>
-          <w:sz w:val="20"/>
-          <w:szCs w:val="20"/>
-        </w:rPr>
-        <w:t>ymbals</w:t>
-      </w:r>
-    </w:p>
-    <w:p>
-      <w:pPr>
-        <w:ind w:left="288"/>
-        <w:rPr>
-          <w:rFonts w:ascii="Noto Serif SC" w:eastAsia="Noto Serif SC" w:hAnsi="Noto Serif SC" w:cs="Noto Serif"/>
-          <w:sz w:val="20"/>
-          <w:szCs w:val="20"/>
-        </w:rPr>
-      </w:pPr>
-      <w:r>
-        <w:rPr>
-          <w:rFonts w:ascii="Noto Serif SC" w:eastAsia="Noto Serif SC" w:hAnsi="Noto Serif SC" w:cs="Noto Serif"/>
-          <w:sz w:val="20"/>
-          <w:szCs w:val="20"/>
-          <w:lang w:val="en-US"/>
-        </w:rPr>
-        <w:t xml:space="preserve">V: </w:t>
-      </w:r>
-      <w:r>
-        <w:rPr>
-          <w:rFonts w:ascii="Noto Serif SC" w:eastAsia="Noto Serif SC" w:hAnsi="Noto Serif SC" w:cs="Noto Serif" w:hint="eastAsia"/>
-          <w:sz w:val="20"/>
-          <w:szCs w:val="20"/>
-        </w:rPr>
-        <w:t>铓锣</w:t>
-      </w:r>
-      <w:r>
-        <w:rPr>
-          <w:rFonts w:ascii="Noto Serif SC" w:eastAsia="Noto Serif SC" w:hAnsi="Noto Serif SC" w:cs="Noto Serif"/>
-          <w:sz w:val="20"/>
-          <w:szCs w:val="20"/>
-        </w:rPr>
-        <w:t xml:space="preserve"> </w:t>
-      </w:r>
-      <w:proofErr w:type="spellStart"/>
-      <w:r>
-        <w:rPr>
-          <w:rFonts w:ascii="Noto Serif SC" w:eastAsia="Noto Serif SC" w:hAnsi="Noto Serif SC" w:cs="Noto Serif"/>
-          <w:sz w:val="20"/>
-          <w:szCs w:val="20"/>
-        </w:rPr>
-        <w:t>Mangluo</w:t>
-      </w:r>
-      <w:proofErr w:type="spellEnd"/>
-      <w:r>
-        <w:rPr>
-          <w:rFonts w:ascii="Noto Serif SC" w:eastAsia="Noto Serif SC" w:hAnsi="Noto Serif SC" w:cs="Noto Serif"/>
-          <w:sz w:val="20"/>
-          <w:szCs w:val="20"/>
-        </w:rPr>
-        <w:t xml:space="preserve">, </w:t>
-      </w:r>
-      <w:r>
-        <w:rPr>
-          <w:rFonts w:ascii="Noto Serif SC" w:eastAsia="Noto Serif SC" w:hAnsi="Noto Serif SC" w:cs="Noto Serif" w:hint="eastAsia"/>
-          <w:sz w:val="20"/>
-          <w:szCs w:val="20"/>
-        </w:rPr>
-        <w:t>颤音琴</w:t>
-      </w:r>
-      <w:r>
-        <w:rPr>
-          <w:rFonts w:ascii="Noto Serif SC" w:eastAsia="Noto Serif SC" w:hAnsi="Noto Serif SC" w:cs="Noto Serif"/>
-          <w:sz w:val="20"/>
-          <w:szCs w:val="20"/>
-        </w:rPr>
-        <w:t xml:space="preserve"> Vibraphone</w:t>
-      </w:r>
-      <w:r>
-        <w:rPr>
-          <w:rFonts w:ascii="Noto Serif SC" w:eastAsia="Noto Serif SC" w:hAnsi="Noto Serif SC" w:cs="Noto Serif"/>
-          <w:sz w:val="20"/>
-          <w:szCs w:val="20"/>
-        </w:rPr>
-        <w:t>,</w:t>
-      </w:r>
-      <w:r>
-        <w:rPr>
-          <w:rFonts w:ascii="Noto Serif SC" w:eastAsia="Noto Serif SC" w:hAnsi="Noto Serif SC" w:cs="Noto Serif"/>
-          <w:sz w:val="20"/>
-          <w:szCs w:val="20"/>
-        </w:rPr>
-        <w:t xml:space="preserve"> </w:t>
-      </w:r>
-      <w:r>
-        <w:rPr>
-          <w:rFonts w:ascii="Noto Serif SC" w:eastAsia="Noto Serif SC" w:hAnsi="Noto Serif SC" w:cs="Noto Serif" w:hint="eastAsia"/>
-          <w:sz w:val="20"/>
-          <w:szCs w:val="20"/>
-        </w:rPr>
-        <w:t>编钟</w:t>
-      </w:r>
-      <w:r>
-        <w:rPr>
-          <w:rFonts w:ascii="Noto Serif SC" w:eastAsia="Noto Serif SC" w:hAnsi="Noto Serif SC" w:cs="Noto Serif"/>
-          <w:sz w:val="20"/>
-          <w:szCs w:val="20"/>
-        </w:rPr>
-        <w:t xml:space="preserve"> </w:t>
-      </w:r>
-      <w:proofErr w:type="spellStart"/>
-      <w:r>
-        <w:rPr>
-          <w:rFonts w:ascii="Noto Serif SC" w:eastAsia="Noto Serif SC" w:hAnsi="Noto Serif SC" w:cs="Noto Serif"/>
-          <w:sz w:val="20"/>
-          <w:szCs w:val="20"/>
-        </w:rPr>
-        <w:t>Bianzhong</w:t>
-      </w:r>
-      <w:proofErr w:type="spellEnd"/>
-      <w:r>
-        <w:rPr>
-          <w:rFonts w:ascii="Noto Serif SC" w:eastAsia="Noto Serif SC" w:hAnsi="Noto Serif SC" w:cs="Noto Serif"/>
-          <w:sz w:val="20"/>
-          <w:szCs w:val="20"/>
-        </w:rPr>
-        <w:t xml:space="preserve">, </w:t>
-      </w:r>
-      <w:r>
-        <w:rPr>
-          <w:rFonts w:ascii="Noto Serif SC" w:eastAsia="Noto Serif SC" w:hAnsi="Noto Serif SC" w:cs="Noto Serif" w:hint="eastAsia"/>
-          <w:sz w:val="20"/>
-          <w:szCs w:val="20"/>
-        </w:rPr>
-        <w:t>大军鼓</w:t>
-      </w:r>
-      <w:r>
-        <w:rPr>
-          <w:rFonts w:ascii="Noto Serif SC" w:eastAsia="Noto Serif SC" w:hAnsi="Noto Serif SC" w:cs="Noto Serif"/>
-          <w:sz w:val="20"/>
-          <w:szCs w:val="20"/>
-        </w:rPr>
-        <w:t xml:space="preserve"> Bass </w:t>
-      </w:r>
-      <w:r>
-        <w:rPr>
-          <w:rFonts w:ascii="Noto Serif SC" w:eastAsia="Noto Serif SC" w:hAnsi="Noto Serif SC" w:cs="Noto Serif"/>
-          <w:sz w:val="20"/>
-          <w:szCs w:val="20"/>
-        </w:rPr>
-        <w:t>D</w:t>
-      </w:r>
-      <w:r>
-        <w:rPr>
-          <w:rFonts w:ascii="Noto Serif SC" w:eastAsia="Noto Serif SC" w:hAnsi="Noto Serif SC" w:cs="Noto Serif"/>
-          <w:sz w:val="20"/>
-          <w:szCs w:val="20"/>
-        </w:rPr>
-        <w:t xml:space="preserve">rum, </w:t>
-      </w:r>
-      <w:r>
-        <w:rPr>
-          <w:rFonts w:ascii="Noto Serif SC" w:eastAsia="Noto Serif SC" w:hAnsi="Noto Serif SC" w:cs="Noto Serif" w:hint="eastAsia"/>
-          <w:sz w:val="20"/>
-          <w:szCs w:val="20"/>
-        </w:rPr>
-        <w:t>大锣</w:t>
-      </w:r>
-      <w:r>
-        <w:rPr>
-          <w:rFonts w:ascii="Noto Serif SC" w:eastAsia="Noto Serif SC" w:hAnsi="Noto Serif SC" w:cs="Noto Serif"/>
-          <w:sz w:val="20"/>
-          <w:szCs w:val="20"/>
-        </w:rPr>
-        <w:t xml:space="preserve"> </w:t>
-      </w:r>
-      <w:proofErr w:type="spellStart"/>
-      <w:r>
-        <w:rPr>
-          <w:rFonts w:ascii="Noto Serif SC" w:eastAsia="Noto Serif SC" w:hAnsi="Noto Serif SC" w:cs="Noto Serif"/>
-          <w:sz w:val="20"/>
-          <w:szCs w:val="20"/>
-        </w:rPr>
-        <w:t>Daluo</w:t>
-      </w:r>
-      <w:proofErr w:type="spellEnd"/>
-    </w:p>
-    <w:p>
-      <w:pPr>
-        <w:ind w:left="288"/>
-        <w:rPr>
-          <w:rFonts w:ascii="Noto Serif SC" w:eastAsia="Noto Serif SC" w:hAnsi="Noto Serif SC" w:cs="Noto Serif"/>
-          <w:sz w:val="20"/>
-          <w:szCs w:val="20"/>
-          <w:lang w:val="en-US"/>
-        </w:rPr>
-      </w:pPr>
-      <w:r>
-        <w:rPr>
-          <w:rFonts w:ascii="Noto Serif SC" w:eastAsia="Noto Serif SC" w:hAnsi="Noto Serif SC" w:cs="Noto Serif"/>
-          <w:sz w:val="20"/>
-          <w:szCs w:val="20"/>
-        </w:rPr>
-        <w:t xml:space="preserve">VI: </w:t>
-      </w:r>
-      <w:r>
-        <w:rPr>
-          <w:rFonts w:ascii="Noto Serif SC" w:eastAsia="Noto Serif SC" w:hAnsi="Noto Serif SC" w:cs="Noto Serif"/>
-          <w:sz w:val="20"/>
-          <w:szCs w:val="20"/>
-        </w:rPr>
-        <w:t>(</w:t>
-      </w:r>
-      <w:r>
-        <w:rPr>
-          <w:rFonts w:ascii="Noto Serif SC" w:eastAsia="Noto Serif SC" w:hAnsi="Noto Serif SC" w:cs="Noto Serif" w:hint="eastAsia"/>
-          <w:sz w:val="20"/>
-          <w:szCs w:val="20"/>
-        </w:rPr>
-        <w:t>中国</w:t>
-      </w:r>
-      <w:r>
-        <w:rPr>
-          <w:rFonts w:ascii="Noto Serif SC" w:eastAsia="Noto Serif SC" w:hAnsi="Noto Serif SC" w:cs="Noto Serif"/>
-          <w:sz w:val="20"/>
-          <w:szCs w:val="20"/>
-        </w:rPr>
-        <w:t>)</w:t>
-      </w:r>
-      <w:r>
-        <w:rPr>
           <w:rFonts w:ascii="Noto Serif SC" w:eastAsia="Noto Serif SC" w:hAnsi="Noto Serif SC" w:cs="Noto Serif" w:hint="eastAsia"/>
           <w:sz w:val="20"/>
           <w:szCs w:val="20"/>
@@ -5714,25 +5747,7 @@
           <w:sz w:val="20"/>
           <w:szCs w:val="20"/>
         </w:rPr>
-        <w:t xml:space="preserve"> </w:t>
-      </w:r>
-      <w:proofErr w:type="spellStart"/>
-      <w:r>
-        <w:rPr>
-          <w:rFonts w:ascii="Noto Serif SC" w:eastAsia="Noto Serif SC" w:hAnsi="Noto Serif SC" w:cs="Noto Serif"/>
-          <w:sz w:val="20"/>
-          <w:szCs w:val="20"/>
-        </w:rPr>
-        <w:t>Dagu</w:t>
-      </w:r>
-      <w:proofErr w:type="spellEnd"/>
-      <w:r>
-        <w:rPr>
-          <w:rFonts w:ascii="Noto Serif SC" w:eastAsia="Noto Serif SC" w:hAnsi="Noto Serif SC" w:cs="Noto Serif"/>
-          <w:sz w:val="20"/>
-          <w:szCs w:val="20"/>
-        </w:rPr>
-        <w:t xml:space="preserve">, </w:t>
+        <w:t xml:space="preserve"> Dagu, </w:t>
       </w:r>
       <w:proofErr w:type="spellStart"/>
       <w:r>

</xml_diff>

<commit_message>
Piece 3 - apostrophes
</commit_message>
<xml_diff>
--- a/Front Matter/Template/3_Front-Matter.docx
+++ b/Front Matter/Template/3_Front-Matter.docx
@@ -3016,7 +3016,23 @@
           <w:sz w:val="24"/>
           <w:szCs w:val="24"/>
         </w:rPr>
-        <w:t xml:space="preserve">, Zhu’s works are widely played throughout Europe and Asia. His piece </w:t>
+        <w:t>, Zhu</w:t>
+      </w:r>
+      <w:r>
+        <w:rPr>
+          <w:rFonts w:ascii="Noto Serif SC" w:eastAsia="Noto Serif SC" w:hAnsi="Noto Serif SC" w:cs="Noto Serif"/>
+          <w:sz w:val="24"/>
+          <w:szCs w:val="24"/>
+        </w:rPr>
+        <w:t>'</w:t>
+      </w:r>
+      <w:r>
+        <w:rPr>
+          <w:rFonts w:ascii="Noto Serif SC" w:eastAsia="Noto Serif SC" w:hAnsi="Noto Serif SC" w:cs="Noto Serif"/>
+          <w:sz w:val="24"/>
+          <w:szCs w:val="24"/>
+        </w:rPr>
+        <w:t xml:space="preserve">s works are widely played throughout Europe and Asia. His piece </w:t>
       </w:r>
       <w:r>
         <w:rPr>

</xml_diff>

<commit_message>
Piece 3 front matter (still work in progress)
</commit_message>
<xml_diff>
--- a/Front Matter/Template/3_Front-Matter.docx
+++ b/Front Matter/Template/3_Front-Matter.docx
@@ -12,6 +12,8 @@
           <w:lang w:val="en-US"/>
         </w:rPr>
       </w:pPr>
+      <w:bookmarkStart w:id="0" w:name="_Hlk182175382"/>
+      <w:bookmarkEnd w:id="0"/>
     </w:p>
     <w:p>
       <w:pPr>
@@ -423,7 +425,7 @@
           <w:szCs w:val="72"/>
         </w:rPr>
         <w:drawing>
-          <wp:anchor distT="0" distB="0" distL="114300" distR="114300" simplePos="0" relativeHeight="251659264" behindDoc="0" locked="0" layoutInCell="1" allowOverlap="1" wp14:anchorId="01B9B58D" wp14:editId="4E61CDDE">
+          <wp:anchor distT="0" distB="0" distL="114300" distR="114300" simplePos="0" relativeHeight="251657216" behindDoc="0" locked="0" layoutInCell="1" allowOverlap="1" wp14:anchorId="01B9B58D" wp14:editId="6A7A68FF">
             <wp:simplePos x="0" y="0"/>
             <wp:positionH relativeFrom="margin">
               <wp:align>center</wp:align>
@@ -1980,7 +1982,7 @@
           <w:lang w:val="zh-CN"/>
         </w:rPr>
         <w:drawing>
-          <wp:anchor distT="0" distB="0" distL="114300" distR="114300" simplePos="0" relativeHeight="251658240" behindDoc="0" locked="0" layoutInCell="1" allowOverlap="1" wp14:anchorId="1BC6A986" wp14:editId="7486E3FB">
+          <wp:anchor distT="0" distB="0" distL="114300" distR="114300" simplePos="0" relativeHeight="251656192" behindDoc="0" locked="0" layoutInCell="1" allowOverlap="1" wp14:anchorId="1BC6A986" wp14:editId="17D53C63">
             <wp:simplePos x="0" y="0"/>
             <wp:positionH relativeFrom="margin">
               <wp:align>right</wp:align>
@@ -5775,438 +5777,2056 @@
           <w:sz w:val="20"/>
           <w:szCs w:val="20"/>
         </w:rPr>
+        <w:t xml:space="preserve"> Dagu, </w:t>
+      </w:r>
+      <w:proofErr w:type="spellStart"/>
+      <w:r>
+        <w:rPr>
+          <w:rFonts w:ascii="Noto Serif SC" w:eastAsia="Noto Serif SC" w:hAnsi="Noto Serif SC" w:cs="Noto Serif"/>
+          <w:sz w:val="20"/>
+          <w:szCs w:val="20"/>
+        </w:rPr>
+        <w:t>Tubaphone</w:t>
+      </w:r>
+      <w:proofErr w:type="spellEnd"/>
+      <w:r>
+        <w:rPr>
+          <w:rFonts w:ascii="Noto Serif SC" w:eastAsia="Noto Serif SC" w:hAnsi="Noto Serif SC" w:cs="Noto Serif"/>
+          <w:sz w:val="20"/>
+          <w:szCs w:val="20"/>
+        </w:rPr>
+        <w:t xml:space="preserve">, </w:t>
+      </w:r>
+      <w:r>
+        <w:rPr>
+          <w:rFonts w:ascii="Noto Serif SC" w:eastAsia="Noto Serif SC" w:hAnsi="Noto Serif SC" w:cs="Noto Serif" w:hint="eastAsia"/>
+          <w:sz w:val="20"/>
+          <w:szCs w:val="20"/>
+        </w:rPr>
+        <w:t>小军鼓</w:t>
+      </w:r>
+      <w:r>
+        <w:rPr>
+          <w:rFonts w:ascii="Noto Serif SC" w:eastAsia="Noto Serif SC" w:hAnsi="Noto Serif SC" w:cs="Noto Serif"/>
+          <w:sz w:val="20"/>
+          <w:szCs w:val="20"/>
+        </w:rPr>
+        <w:t xml:space="preserve"> Snare Drum, </w:t>
+      </w:r>
+      <w:r>
+        <w:rPr>
+          <w:rFonts w:ascii="Noto Serif SC" w:eastAsia="Noto Serif SC" w:hAnsi="Noto Serif SC" w:cs="Noto Serif" w:hint="eastAsia"/>
+          <w:sz w:val="20"/>
+          <w:szCs w:val="20"/>
+        </w:rPr>
+        <w:t>编磬</w:t>
+      </w:r>
+      <w:r>
+        <w:rPr>
+          <w:rFonts w:ascii="Noto Serif SC" w:eastAsia="Noto Serif SC" w:hAnsi="Noto Serif SC" w:cs="Noto Serif"/>
+          <w:sz w:val="20"/>
+          <w:szCs w:val="20"/>
+        </w:rPr>
+        <w:t xml:space="preserve"> Bianqing</w:t>
+      </w:r>
+    </w:p>
+    <w:p>
+      <w:pPr>
+        <w:rPr>
+          <w:rFonts w:ascii="Noto Serif SC" w:eastAsia="Noto Serif SC" w:hAnsi="Noto Serif SC" w:cs="Noto Serif"/>
+          <w:sz w:val="24"/>
+          <w:szCs w:val="24"/>
+          <w:lang w:val="en-US"/>
+        </w:rPr>
+      </w:pPr>
+    </w:p>
+    <w:p>
+      <w:pPr>
+        <w:rPr>
+          <w:rFonts w:ascii="Noto Serif SC" w:eastAsia="Noto Serif SC" w:hAnsi="Noto Serif SC" w:cs="Noto Serif"/>
+          <w:sz w:val="24"/>
+          <w:szCs w:val="24"/>
+          <w:lang w:val="en-US"/>
+        </w:rPr>
+      </w:pPr>
+      <w:r>
+        <w:rPr>
+          <w:rFonts w:ascii="Noto Serif SC" w:eastAsia="Noto Serif SC" w:hAnsi="Noto Serif SC" w:cs="Noto Serif" w:hint="eastAsia"/>
+          <w:sz w:val="24"/>
+          <w:szCs w:val="24"/>
+        </w:rPr>
+        <w:t>竹笛独奏</w:t>
+      </w:r>
+      <w:r>
+        <w:rPr>
+          <w:rFonts w:ascii="Noto Serif SC" w:eastAsia="Noto Serif SC" w:hAnsi="Noto Serif SC" w:cs="Noto Serif"/>
+          <w:sz w:val="24"/>
+          <w:szCs w:val="24"/>
+          <w:lang w:val="en-US"/>
+        </w:rPr>
         <w:t xml:space="preserve"> </w:t>
       </w:r>
       <w:proofErr w:type="spellStart"/>
       <w:r>
         <w:rPr>
           <w:rFonts w:ascii="Noto Serif SC" w:eastAsia="Noto Serif SC" w:hAnsi="Noto Serif SC" w:cs="Noto Serif"/>
-          <w:sz w:val="20"/>
-          <w:szCs w:val="20"/>
-        </w:rPr>
-        <w:t>Dagu</w:t>
+          <w:sz w:val="24"/>
+          <w:szCs w:val="24"/>
+          <w:lang w:val="en-US"/>
+        </w:rPr>
+        <w:t>Zhudi</w:t>
       </w:r>
       <w:proofErr w:type="spellEnd"/>
       <w:r>
         <w:rPr>
           <w:rFonts w:ascii="Noto Serif SC" w:eastAsia="Noto Serif SC" w:hAnsi="Noto Serif SC" w:cs="Noto Serif"/>
-          <w:sz w:val="20"/>
-          <w:szCs w:val="20"/>
-        </w:rPr>
-        <w:t xml:space="preserve">, </w:t>
+          <w:sz w:val="24"/>
+          <w:szCs w:val="24"/>
+          <w:lang w:val="en-US"/>
+        </w:rPr>
+        <w:t xml:space="preserve"> solo</w:t>
+      </w:r>
+    </w:p>
+    <w:p>
+      <w:pPr>
+        <w:rPr>
+          <w:rFonts w:ascii="Noto Serif SC" w:eastAsia="Noto Serif SC" w:hAnsi="Noto Serif SC" w:cs="Noto Serif"/>
+          <w:sz w:val="24"/>
+          <w:szCs w:val="24"/>
+          <w:lang w:val="en-US"/>
+        </w:rPr>
+      </w:pPr>
+      <w:r>
+        <w:rPr>
+          <w:rFonts w:ascii="Noto Serif SC" w:eastAsia="Noto Serif SC" w:hAnsi="Noto Serif SC" w:cs="Noto Serif" w:hint="eastAsia"/>
+          <w:sz w:val="24"/>
+          <w:szCs w:val="24"/>
+        </w:rPr>
+        <w:t>琵琶独奏</w:t>
+      </w:r>
+      <w:r>
+        <w:rPr>
+          <w:rFonts w:ascii="Noto Serif SC" w:eastAsia="Noto Serif SC" w:hAnsi="Noto Serif SC" w:cs="Noto Serif"/>
+          <w:sz w:val="24"/>
+          <w:szCs w:val="24"/>
+          <w:lang w:val="en-US"/>
+        </w:rPr>
+        <w:t xml:space="preserve"> </w:t>
+      </w:r>
+      <w:r>
+        <w:rPr>
+          <w:rFonts w:ascii="Noto Serif SC" w:eastAsia="Noto Serif SC" w:hAnsi="Noto Serif SC" w:cs="Noto Serif"/>
+          <w:sz w:val="24"/>
+          <w:szCs w:val="24"/>
+          <w:lang w:val="en-US"/>
+        </w:rPr>
+        <w:t>Pipa solo</w:t>
+      </w:r>
+    </w:p>
+    <w:p>
+      <w:pPr>
+        <w:rPr>
+          <w:rFonts w:ascii="Noto Serif SC" w:eastAsia="Noto Serif SC" w:hAnsi="Noto Serif SC" w:cs="Noto Serif"/>
+          <w:sz w:val="24"/>
+          <w:szCs w:val="24"/>
+          <w:lang w:val="en-US"/>
+        </w:rPr>
+      </w:pPr>
+    </w:p>
+    <w:p>
+      <w:pPr>
+        <w:rPr>
+          <w:rFonts w:ascii="Noto Serif SC" w:eastAsia="Noto Serif SC" w:hAnsi="Noto Serif SC" w:cs="Noto Serif"/>
+          <w:sz w:val="24"/>
+          <w:szCs w:val="24"/>
+          <w:lang w:val="en-US"/>
+        </w:rPr>
+      </w:pPr>
+      <w:r>
+        <w:rPr>
+          <w:rFonts w:ascii="Noto Serif SC" w:eastAsia="Noto Serif SC" w:hAnsi="Noto Serif SC" w:cs="Noto Serif" w:hint="eastAsia"/>
+          <w:sz w:val="24"/>
+          <w:szCs w:val="24"/>
+          <w:lang w:val="en-US"/>
+        </w:rPr>
+        <w:t>高胡</w:t>
+      </w:r>
+      <w:r>
+        <w:rPr>
+          <w:rFonts w:ascii="Noto Serif SC" w:eastAsia="Noto Serif SC" w:hAnsi="Noto Serif SC" w:cs="Noto Serif"/>
+          <w:sz w:val="24"/>
+          <w:szCs w:val="24"/>
+          <w:lang w:val="en-US"/>
+        </w:rPr>
+        <w:t xml:space="preserve"> Gaohu</w:t>
+      </w:r>
+    </w:p>
+    <w:p>
+      <w:pPr>
+        <w:rPr>
+          <w:rFonts w:ascii="Noto Serif SC" w:eastAsia="Noto Serif SC" w:hAnsi="Noto Serif SC" w:cs="Noto Serif"/>
+          <w:sz w:val="24"/>
+          <w:szCs w:val="24"/>
+          <w:lang w:val="en-US"/>
+        </w:rPr>
+      </w:pPr>
+      <w:r>
+        <w:rPr>
+          <w:rFonts w:ascii="Noto Serif SC" w:eastAsia="Noto Serif SC" w:hAnsi="Noto Serif SC" w:cs="Noto Serif" w:hint="eastAsia"/>
+          <w:sz w:val="24"/>
+          <w:szCs w:val="24"/>
+          <w:lang w:val="en-US"/>
+        </w:rPr>
+        <w:t>二胡</w:t>
+      </w:r>
+      <w:r>
+        <w:rPr>
+          <w:rFonts w:ascii="Noto Serif SC" w:eastAsia="Noto Serif SC" w:hAnsi="Noto Serif SC" w:cs="Noto Serif"/>
+          <w:sz w:val="24"/>
+          <w:szCs w:val="24"/>
+          <w:lang w:val="en-US"/>
+        </w:rPr>
+        <w:t xml:space="preserve"> Erhu</w:t>
+      </w:r>
+      <w:r>
+        <w:rPr>
+          <w:rFonts w:ascii="Noto Serif SC" w:eastAsia="Noto Serif SC" w:hAnsi="Noto Serif SC" w:cs="Noto Serif"/>
+          <w:sz w:val="24"/>
+          <w:szCs w:val="24"/>
+          <w:lang w:val="en-US"/>
+        </w:rPr>
+        <w:t xml:space="preserve"> I</w:t>
+      </w:r>
+    </w:p>
+    <w:p>
+      <w:pPr>
+        <w:rPr>
+          <w:rFonts w:ascii="Noto Serif SC" w:eastAsia="Noto Serif SC" w:hAnsi="Noto Serif SC" w:cs="Noto Serif"/>
+          <w:sz w:val="24"/>
+          <w:szCs w:val="24"/>
+          <w:lang w:val="en-US"/>
+        </w:rPr>
+      </w:pPr>
+      <w:r>
+        <w:rPr>
+          <w:rFonts w:ascii="Noto Serif SC" w:eastAsia="Noto Serif SC" w:hAnsi="Noto Serif SC" w:cs="Noto Serif" w:hint="eastAsia"/>
+          <w:sz w:val="24"/>
+          <w:szCs w:val="24"/>
+          <w:lang w:val="en-US"/>
+        </w:rPr>
+        <w:t>二胡</w:t>
+      </w:r>
+      <w:r>
+        <w:rPr>
+          <w:rFonts w:ascii="Noto Serif SC" w:eastAsia="Noto Serif SC" w:hAnsi="Noto Serif SC" w:cs="Noto Serif"/>
+          <w:sz w:val="24"/>
+          <w:szCs w:val="24"/>
+          <w:lang w:val="en-US"/>
+        </w:rPr>
+        <w:t xml:space="preserve"> Erhu</w:t>
+      </w:r>
+      <w:r>
+        <w:rPr>
+          <w:rFonts w:ascii="Noto Serif SC" w:eastAsia="Noto Serif SC" w:hAnsi="Noto Serif SC" w:cs="Noto Serif"/>
+          <w:sz w:val="24"/>
+          <w:szCs w:val="24"/>
+          <w:lang w:val="en-US"/>
+        </w:rPr>
+        <w:t xml:space="preserve"> II</w:t>
+      </w:r>
+    </w:p>
+    <w:p>
+      <w:pPr>
+        <w:rPr>
+          <w:rFonts w:ascii="Noto Serif SC" w:eastAsia="Noto Serif SC" w:hAnsi="Noto Serif SC" w:cs="Noto Serif"/>
+          <w:sz w:val="24"/>
+          <w:szCs w:val="24"/>
+          <w:lang w:val="en-US"/>
+        </w:rPr>
+      </w:pPr>
+      <w:r>
+        <w:rPr>
+          <w:rFonts w:ascii="Noto Serif SC" w:eastAsia="Noto Serif SC" w:hAnsi="Noto Serif SC" w:cs="Noto Serif" w:hint="eastAsia"/>
+          <w:sz w:val="24"/>
+          <w:szCs w:val="24"/>
+          <w:lang w:val="en-US"/>
+        </w:rPr>
+        <w:t>中胡</w:t>
+      </w:r>
+      <w:r>
+        <w:rPr>
+          <w:rFonts w:ascii="Noto Serif SC" w:eastAsia="Noto Serif SC" w:hAnsi="Noto Serif SC" w:cs="Noto Serif"/>
+          <w:sz w:val="24"/>
+          <w:szCs w:val="24"/>
+          <w:lang w:val="en-US"/>
+        </w:rPr>
+        <w:t xml:space="preserve"> Zhonghu</w:t>
+      </w:r>
+    </w:p>
+    <w:p>
+      <w:pPr>
+        <w:rPr>
+          <w:rFonts w:ascii="Noto Serif SC" w:eastAsia="Noto Serif SC" w:hAnsi="Noto Serif SC" w:cs="Noto Serif"/>
+          <w:sz w:val="24"/>
+          <w:szCs w:val="24"/>
+          <w:lang w:val="en-US"/>
+        </w:rPr>
+      </w:pPr>
+      <w:r>
+        <w:rPr>
+          <w:rFonts w:ascii="Noto Serif SC" w:eastAsia="Noto Serif SC" w:hAnsi="Noto Serif SC" w:cs="Noto Serif" w:hint="eastAsia"/>
+          <w:sz w:val="24"/>
+          <w:szCs w:val="24"/>
+          <w:lang w:val="en-US"/>
+        </w:rPr>
+        <w:t>大提琴</w:t>
+      </w:r>
+      <w:r>
+        <w:rPr>
+          <w:rFonts w:ascii="Noto Serif SC" w:eastAsia="Noto Serif SC" w:hAnsi="Noto Serif SC" w:cs="Noto Serif"/>
+          <w:sz w:val="24"/>
+          <w:szCs w:val="24"/>
+          <w:lang w:val="en-US"/>
+        </w:rPr>
+        <w:t xml:space="preserve"> Violoncello</w:t>
+      </w:r>
+    </w:p>
+    <w:p>
+      <w:pPr>
+        <w:rPr>
+          <w:rFonts w:ascii="Noto Serif SC" w:eastAsia="Noto Serif SC" w:hAnsi="Noto Serif SC" w:cs="Noto Serif"/>
+          <w:sz w:val="24"/>
+          <w:szCs w:val="24"/>
+          <w:lang w:val="en-US"/>
+        </w:rPr>
+      </w:pPr>
+      <w:r>
+        <w:rPr>
+          <w:rFonts w:ascii="Noto Serif SC" w:eastAsia="Noto Serif SC" w:hAnsi="Noto Serif SC" w:cs="Noto Serif" w:hint="eastAsia"/>
+          <w:sz w:val="24"/>
+          <w:szCs w:val="24"/>
+          <w:lang w:val="en-US"/>
+        </w:rPr>
+        <w:t>低音提琴</w:t>
+      </w:r>
+      <w:r>
+        <w:rPr>
+          <w:rFonts w:ascii="Noto Serif SC" w:eastAsia="Noto Serif SC" w:hAnsi="Noto Serif SC" w:cs="Noto Serif"/>
+          <w:sz w:val="24"/>
+          <w:szCs w:val="24"/>
+          <w:lang w:val="en-US"/>
+        </w:rPr>
+        <w:t xml:space="preserve"> Contrabass</w:t>
+      </w:r>
+    </w:p>
+    <w:p>
+      <w:pPr>
+        <w:rPr>
+          <w:rFonts w:ascii="Noto Serif SC" w:eastAsia="Noto Serif SC" w:hAnsi="Noto Serif SC" w:cs="Noto Serif"/>
+          <w:lang w:val="en-US"/>
+        </w:rPr>
+      </w:pPr>
+    </w:p>
+    <w:p>
+      <w:pPr>
+        <w:rPr>
+          <w:rFonts w:ascii="Noto Serif SC" w:eastAsia="Noto Serif SC" w:hAnsi="Noto Serif SC" w:cs="Noto Serif"/>
+          <w:lang w:val="en-US"/>
+        </w:rPr>
+      </w:pPr>
+    </w:p>
+    <w:p>
+      <w:pPr>
+        <w:rPr>
+          <w:rFonts w:ascii="Noto Serif SC" w:eastAsia="Noto Serif SC" w:hAnsi="Noto Serif SC" w:cs="Noto Serif"/>
+          <w:lang w:val="en-US"/>
+        </w:rPr>
+      </w:pPr>
+    </w:p>
+    <w:p>
+      <w:pPr>
+        <w:rPr>
+          <w:rFonts w:ascii="Noto Serif SC" w:eastAsia="Noto Serif SC" w:hAnsi="Noto Serif SC" w:cs="Noto Serif"/>
+          <w:lang w:val="en-US"/>
+        </w:rPr>
+      </w:pPr>
+    </w:p>
+    <w:p>
+      <w:pPr>
+        <w:rPr>
+          <w:rFonts w:ascii="Noto Serif SC" w:eastAsia="Noto Serif SC" w:hAnsi="Noto Serif SC" w:cs="Noto Serif"/>
+          <w:lang w:val="en-US"/>
+        </w:rPr>
+      </w:pPr>
+    </w:p>
+    <w:p>
+      <w:pPr>
+        <w:rPr>
+          <w:rFonts w:ascii="Noto Serif SC" w:eastAsia="Noto Serif SC" w:hAnsi="Noto Serif SC" w:cs="Noto Serif"/>
+          <w:lang w:val="en-US"/>
+        </w:rPr>
+      </w:pPr>
+    </w:p>
+    <w:p>
+      <w:pPr>
+        <w:rPr>
+          <w:rFonts w:ascii="Noto Serif SC" w:eastAsia="Noto Serif SC" w:hAnsi="Noto Serif SC" w:cs="Noto Serif"/>
+          <w:lang w:val="en-US"/>
+        </w:rPr>
+      </w:pPr>
+    </w:p>
+    <w:p>
+      <w:pPr>
+        <w:rPr>
+          <w:rFonts w:ascii="Noto Serif SC" w:eastAsia="Noto Serif SC" w:hAnsi="Noto Serif SC" w:cs="Noto Serif"/>
+          <w:b/>
+          <w:sz w:val="44"/>
+          <w:szCs w:val="44"/>
+        </w:rPr>
+      </w:pPr>
+      <w:r>
+        <w:rPr>
+          <w:rFonts w:ascii="Noto Serif SC" w:eastAsia="Noto Serif SC" w:hAnsi="Noto Serif SC" w:cs="Noto Serif" w:hint="eastAsia"/>
+          <w:b/>
+          <w:sz w:val="44"/>
+          <w:szCs w:val="44"/>
+        </w:rPr>
+        <w:lastRenderedPageBreak/>
+        <w:t>演奏说明</w:t>
+      </w:r>
+      <w:r>
+        <w:rPr>
+          <w:rFonts w:ascii="Noto Serif SC" w:eastAsia="Noto Serif SC" w:hAnsi="Noto Serif SC" w:cs="Noto Serif"/>
+          <w:b/>
+          <w:sz w:val="44"/>
+          <w:szCs w:val="44"/>
+        </w:rPr>
+        <w:t>Programme Notes</w:t>
+      </w:r>
+    </w:p>
+    <w:p>
+      <w:pPr>
+        <w:rPr>
+          <w:rFonts w:ascii="Noto Serif SC" w:eastAsia="Noto Serif SC" w:hAnsi="Noto Serif SC" w:cs="Noto Serif"/>
+          <w:bCs/>
+          <w:sz w:val="24"/>
+          <w:szCs w:val="24"/>
+        </w:rPr>
+      </w:pPr>
+    </w:p>
+    <w:p>
+      <w:pPr>
+        <w:rPr>
+          <w:rFonts w:ascii="Noto Serif SC" w:eastAsia="Noto Serif SC" w:hAnsi="Noto Serif SC" w:cs="Noto Serif" w:hint="eastAsia"/>
+          <w:bCs/>
+          <w:sz w:val="36"/>
+          <w:szCs w:val="36"/>
+        </w:rPr>
+      </w:pPr>
+      <w:r>
+        <w:rPr>
+          <w:rFonts w:ascii="Noto Serif SC" w:eastAsia="Noto Serif SC" w:hAnsi="Noto Serif SC" w:cs="Noto Serif" w:hint="eastAsia"/>
+          <w:bCs/>
+          <w:sz w:val="36"/>
+          <w:szCs w:val="36"/>
+        </w:rPr>
+        <w:t>独奏竹笛</w:t>
+      </w:r>
+      <w:r>
+        <w:rPr>
+          <w:rFonts w:ascii="Noto Serif SC" w:eastAsia="Noto Serif SC" w:hAnsi="Noto Serif SC" w:cs="Noto Serif" w:hint="eastAsia"/>
+          <w:bCs/>
+          <w:sz w:val="36"/>
+          <w:szCs w:val="36"/>
+        </w:rPr>
+        <w:t xml:space="preserve"> Solo </w:t>
       </w:r>
       <w:proofErr w:type="spellStart"/>
       <w:r>
         <w:rPr>
-          <w:rFonts w:ascii="Noto Serif SC" w:eastAsia="Noto Serif SC" w:hAnsi="Noto Serif SC" w:cs="Noto Serif"/>
-          <w:sz w:val="20"/>
-          <w:szCs w:val="20"/>
-        </w:rPr>
-        <w:t>Tubaphone</w:t>
+          <w:rFonts w:ascii="Noto Serif SC" w:eastAsia="Noto Serif SC" w:hAnsi="Noto Serif SC" w:cs="Noto Serif" w:hint="eastAsia"/>
+          <w:bCs/>
+          <w:sz w:val="36"/>
+          <w:szCs w:val="36"/>
+        </w:rPr>
+        <w:t>Zhudi</w:t>
       </w:r>
       <w:proofErr w:type="spellEnd"/>
       <w:r>
         <w:rPr>
-          <w:rFonts w:ascii="Noto Serif SC" w:eastAsia="Noto Serif SC" w:hAnsi="Noto Serif SC" w:cs="Noto Serif"/>
-          <w:sz w:val="20"/>
-          <w:szCs w:val="20"/>
-        </w:rPr>
-        <w:t xml:space="preserve">, </w:t>
-      </w:r>
-      <w:r>
-        <w:rPr>
-          <w:rFonts w:ascii="Noto Serif SC" w:eastAsia="Noto Serif SC" w:hAnsi="Noto Serif SC" w:cs="Noto Serif" w:hint="eastAsia"/>
-          <w:sz w:val="20"/>
-          <w:szCs w:val="20"/>
-        </w:rPr>
-        <w:t>小军鼓</w:t>
-      </w:r>
-      <w:r>
-        <w:rPr>
-          <w:rFonts w:ascii="Noto Serif SC" w:eastAsia="Noto Serif SC" w:hAnsi="Noto Serif SC" w:cs="Noto Serif"/>
-          <w:sz w:val="20"/>
-          <w:szCs w:val="20"/>
-        </w:rPr>
-        <w:t xml:space="preserve"> Snare Drum, </w:t>
-      </w:r>
-      <w:r>
-        <w:rPr>
-          <w:rFonts w:ascii="Noto Serif SC" w:eastAsia="Noto Serif SC" w:hAnsi="Noto Serif SC" w:cs="Noto Serif" w:hint="eastAsia"/>
-          <w:sz w:val="20"/>
-          <w:szCs w:val="20"/>
-        </w:rPr>
-        <w:t>编磬</w:t>
-      </w:r>
-      <w:r>
-        <w:rPr>
-          <w:rFonts w:ascii="Noto Serif SC" w:eastAsia="Noto Serif SC" w:hAnsi="Noto Serif SC" w:cs="Noto Serif"/>
-          <w:sz w:val="20"/>
-          <w:szCs w:val="20"/>
-        </w:rPr>
-        <w:t xml:space="preserve"> Bianqing</w:t>
-      </w:r>
-    </w:p>
-    <w:p>
-      <w:pPr>
-        <w:rPr>
-          <w:rFonts w:ascii="Noto Serif SC" w:eastAsia="Noto Serif SC" w:hAnsi="Noto Serif SC" w:cs="Noto Serif"/>
-          <w:sz w:val="24"/>
-          <w:szCs w:val="24"/>
-          <w:lang w:val="en-US"/>
-        </w:rPr>
-      </w:pPr>
-    </w:p>
-    <w:p>
-      <w:pPr>
-        <w:rPr>
-          <w:rFonts w:ascii="Noto Serif SC" w:eastAsia="Noto Serif SC" w:hAnsi="Noto Serif SC" w:cs="Noto Serif"/>
-          <w:sz w:val="24"/>
-          <w:szCs w:val="24"/>
-          <w:lang w:val="en-US"/>
-        </w:rPr>
-      </w:pPr>
-      <w:r>
-        <w:rPr>
-          <w:rFonts w:ascii="Noto Serif SC" w:eastAsia="Noto Serif SC" w:hAnsi="Noto Serif SC" w:cs="Noto Serif" w:hint="eastAsia"/>
-          <w:sz w:val="24"/>
-          <w:szCs w:val="24"/>
-        </w:rPr>
-        <w:t>竹笛独奏</w:t>
-      </w:r>
-      <w:r>
-        <w:rPr>
-          <w:rFonts w:ascii="Noto Serif SC" w:eastAsia="Noto Serif SC" w:hAnsi="Noto Serif SC" w:cs="Noto Serif"/>
-          <w:sz w:val="24"/>
-          <w:szCs w:val="24"/>
-          <w:lang w:val="en-US"/>
+          <w:rFonts w:ascii="Noto Serif SC" w:eastAsia="Noto Serif SC" w:hAnsi="Noto Serif SC" w:cs="Noto Serif" w:hint="eastAsia"/>
+          <w:bCs/>
+          <w:sz w:val="36"/>
+          <w:szCs w:val="36"/>
+        </w:rPr>
+        <w:t>:</w:t>
+      </w:r>
+    </w:p>
+    <w:p>
+      <w:pPr>
+        <w:rPr>
+          <w:rFonts w:ascii="Noto Serif SC" w:eastAsia="Noto Serif SC" w:hAnsi="Noto Serif SC" w:cs="Noto Serif"/>
+          <w:bCs/>
+          <w:sz w:val="24"/>
+          <w:szCs w:val="24"/>
+        </w:rPr>
+      </w:pPr>
+    </w:p>
+    <w:p>
+      <w:pPr>
+        <w:rPr>
+          <w:rFonts w:ascii="Noto Serif SC" w:eastAsia="Noto Serif SC" w:hAnsi="Noto Serif SC" w:cs="Noto Serif"/>
+          <w:bCs/>
+          <w:sz w:val="24"/>
+          <w:szCs w:val="24"/>
+        </w:rPr>
+      </w:pPr>
+      <w:r>
+        <w:rPr>
+          <w:rFonts w:ascii="Noto Serif SC" w:eastAsia="Noto Serif SC" w:hAnsi="Noto Serif SC" w:cs="Noto Serif"/>
+          <w:bCs/>
+          <w:noProof/>
+          <w:sz w:val="24"/>
+          <w:szCs w:val="24"/>
+        </w:rPr>
+        <mc:AlternateContent>
+          <mc:Choice Requires="wps">
+            <w:drawing>
+              <wp:anchor distT="0" distB="0" distL="114300" distR="114300" simplePos="0" relativeHeight="251658240" behindDoc="1" locked="0" layoutInCell="1" allowOverlap="1" wp14:anchorId="20B46CE9" wp14:editId="751ADFF7">
+                <wp:simplePos x="0" y="0"/>
+                <wp:positionH relativeFrom="margin">
+                  <wp:align>left</wp:align>
+                </wp:positionH>
+                <wp:positionV relativeFrom="paragraph">
+                  <wp:posOffset>73660</wp:posOffset>
+                </wp:positionV>
+                <wp:extent cx="254000" cy="173990"/>
+                <wp:effectExtent l="19050" t="19050" r="12700" b="35560"/>
+                <wp:wrapTight wrapText="bothSides">
+                  <wp:wrapPolygon edited="0">
+                    <wp:start x="6480" y="-2365"/>
+                    <wp:lineTo x="-1620" y="0"/>
+                    <wp:lineTo x="-1620" y="11825"/>
+                    <wp:lineTo x="4860" y="23650"/>
+                    <wp:lineTo x="16200" y="23650"/>
+                    <wp:lineTo x="21060" y="11825"/>
+                    <wp:lineTo x="21060" y="7095"/>
+                    <wp:lineTo x="16200" y="-2365"/>
+                    <wp:lineTo x="6480" y="-2365"/>
+                  </wp:wrapPolygon>
+                </wp:wrapTight>
+                <wp:docPr id="1552150408" name="Diamond 1"/>
+                <wp:cNvGraphicFramePr/>
+                <a:graphic xmlns:a="http://schemas.openxmlformats.org/drawingml/2006/main">
+                  <a:graphicData uri="http://schemas.microsoft.com/office/word/2010/wordprocessingShape">
+                    <wps:wsp>
+                      <wps:cNvSpPr/>
+                      <wps:spPr>
+                        <a:xfrm>
+                          <a:off x="0" y="0"/>
+                          <a:ext cx="254000" cy="174215"/>
+                        </a:xfrm>
+                        <a:prstGeom prst="diamond">
+                          <a:avLst/>
+                        </a:prstGeom>
+                        <a:noFill/>
+                        <a:ln>
+                          <a:solidFill>
+                            <a:schemeClr val="tx1"/>
+                          </a:solidFill>
+                        </a:ln>
+                      </wps:spPr>
+                      <wps:style>
+                        <a:lnRef idx="2">
+                          <a:schemeClr val="accent1">
+                            <a:shade val="15000"/>
+                          </a:schemeClr>
+                        </a:lnRef>
+                        <a:fillRef idx="1">
+                          <a:schemeClr val="accent1"/>
+                        </a:fillRef>
+                        <a:effectRef idx="0">
+                          <a:schemeClr val="accent1"/>
+                        </a:effectRef>
+                        <a:fontRef idx="minor">
+                          <a:schemeClr val="lt1"/>
+                        </a:fontRef>
+                      </wps:style>
+                      <wps:bodyPr rot="0" spcFirstLastPara="0" vertOverflow="overflow" horzOverflow="overflow" vert="horz" wrap="square" lIns="91440" tIns="45720" rIns="91440" bIns="45720" numCol="1" spcCol="0" rtlCol="0" fromWordArt="0" anchor="ctr" anchorCtr="0" forceAA="0" compatLnSpc="1">
+                        <a:prstTxWarp prst="textNoShape">
+                          <a:avLst/>
+                        </a:prstTxWarp>
+                        <a:noAutofit/>
+                      </wps:bodyPr>
+                    </wps:wsp>
+                  </a:graphicData>
+                </a:graphic>
+                <wp14:sizeRelV relativeFrom="margin">
+                  <wp14:pctHeight>0</wp14:pctHeight>
+                </wp14:sizeRelV>
+              </wp:anchor>
+            </w:drawing>
+          </mc:Choice>
+          <mc:Fallback>
+            <w:pict>
+              <v:shapetype w14:anchorId="2BA55D1C" id="_x0000_t4" coordsize="21600,21600" o:spt="4" path="m10800,l,10800,10800,21600,21600,10800xe">
+                <v:stroke joinstyle="miter"/>
+                <v:path gradientshapeok="t" o:connecttype="rect" textboxrect="5400,5400,16200,16200"/>
+              </v:shapetype>
+              <v:shape id="Diamond 1" o:spid="_x0000_s1026" type="#_x0000_t4" style="position:absolute;margin-left:0;margin-top:5.8pt;width:20pt;height:13.7pt;z-index:-251658240;visibility:visible;mso-wrap-style:square;mso-height-percent:0;mso-wrap-distance-left:9pt;mso-wrap-distance-top:0;mso-wrap-distance-right:9pt;mso-wrap-distance-bottom:0;mso-position-horizontal:left;mso-position-horizontal-relative:margin;mso-position-vertical:absolute;mso-position-vertical-relative:text;mso-height-percent:0;mso-height-relative:margin;v-text-anchor:middle" o:gfxdata="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" filled="f" strokecolor="black [3213]" strokeweight="1pt">
+                <w10:wrap type="tight" anchorx="margin"/>
+              </v:shape>
+            </w:pict>
+          </mc:Fallback>
+        </mc:AlternateContent>
+      </w:r>
+      <w:r>
+        <w:rPr>
+          <w:rFonts w:ascii="Noto Serif SC" w:eastAsia="Noto Serif SC" w:hAnsi="Noto Serif SC" w:cs="Noto Serif" w:hint="eastAsia"/>
+          <w:bCs/>
+          <w:sz w:val="24"/>
+          <w:szCs w:val="24"/>
+        </w:rPr>
+        <w:t xml:space="preserve">  ：</w:t>
+      </w:r>
+      <w:r>
+        <w:rPr>
+          <w:rFonts w:ascii="Noto Serif SC" w:eastAsia="Noto Serif SC" w:hAnsi="Noto Serif SC" w:cs="Noto Serif" w:hint="eastAsia"/>
+          <w:bCs/>
+          <w:sz w:val="24"/>
+          <w:szCs w:val="24"/>
+        </w:rPr>
+        <w:t>稍稍含有气声</w:t>
+      </w:r>
+      <w:r>
+        <w:rPr>
+          <w:rFonts w:ascii="Noto Serif SC" w:eastAsia="Noto Serif SC" w:hAnsi="Noto Serif SC" w:cs="Noto Serif"/>
+          <w:bCs/>
+          <w:sz w:val="24"/>
+          <w:szCs w:val="24"/>
+          <w:lang w:val="en-GB"/>
         </w:rPr>
         <w:t xml:space="preserve"> </w:t>
       </w:r>
+      <w:r>
+        <w:rPr>
+          <w:rFonts w:ascii="Noto Serif SC" w:eastAsia="Noto Serif SC" w:hAnsi="Noto Serif SC" w:cs="Noto Serif" w:hint="eastAsia"/>
+          <w:bCs/>
+          <w:sz w:val="24"/>
+          <w:szCs w:val="24"/>
+        </w:rPr>
+        <w:t>(嘴唇稍微离开吹孔</w:t>
+      </w:r>
+      <w:r>
+        <w:rPr>
+          <w:rFonts w:ascii="Noto Serif SC" w:eastAsia="Noto Serif SC" w:hAnsi="Noto Serif SC" w:cs="Noto Serif" w:hint="eastAsia"/>
+          <w:bCs/>
+          <w:sz w:val="24"/>
+          <w:szCs w:val="24"/>
+        </w:rPr>
+        <w:t>，</w:t>
+      </w:r>
+      <w:r>
+        <w:rPr>
+          <w:rFonts w:ascii="Noto Serif SC" w:eastAsia="Noto Serif SC" w:hAnsi="Noto Serif SC" w:cs="Noto Serif" w:hint="eastAsia"/>
+          <w:bCs/>
+          <w:sz w:val="24"/>
+          <w:szCs w:val="24"/>
+        </w:rPr>
+        <w:t>并能够同时听到音高和吹气的噪音)</w:t>
+      </w:r>
+      <w:r>
+        <w:rPr>
+          <w:rFonts w:ascii="Noto Serif SC" w:eastAsia="Noto Serif SC" w:hAnsi="Noto Serif SC" w:cs="Noto Serif" w:hint="eastAsia"/>
+          <w:bCs/>
+          <w:sz w:val="24"/>
+          <w:szCs w:val="24"/>
+        </w:rPr>
+        <w:t>。</w:t>
+      </w:r>
+    </w:p>
+    <w:p>
+      <w:pPr>
+        <w:rPr>
+          <w:rFonts w:ascii="Noto Serif SC" w:eastAsia="Noto Serif SC" w:hAnsi="Noto Serif SC" w:cs="Noto Serif"/>
+          <w:bCs/>
+          <w:sz w:val="24"/>
+          <w:szCs w:val="24"/>
+        </w:rPr>
+      </w:pPr>
+      <w:r>
+        <w:rPr>
+          <w:rFonts w:ascii="Noto Serif SC" w:eastAsia="Noto Serif SC" w:hAnsi="Noto Serif SC" w:cs="Noto Serif"/>
+          <w:bCs/>
+          <w:sz w:val="24"/>
+          <w:szCs w:val="24"/>
+        </w:rPr>
+        <w:t>〰〰</w:t>
+      </w:r>
+      <w:r>
+        <w:rPr>
+          <w:rFonts w:ascii="Noto Serif SC" w:eastAsia="Noto Serif SC" w:hAnsi="Noto Serif SC" w:cs="Noto Serif" w:hint="eastAsia"/>
+          <w:bCs/>
+          <w:sz w:val="24"/>
+          <w:szCs w:val="24"/>
+        </w:rPr>
+        <w:t xml:space="preserve">  </w:t>
+      </w:r>
+      <w:r>
+        <w:rPr>
+          <w:rFonts w:ascii="Noto Serif SC" w:eastAsia="Noto Serif SC" w:hAnsi="Noto Serif SC" w:cs="Noto Serif"/>
+          <w:bCs/>
+          <w:sz w:val="24"/>
+          <w:szCs w:val="24"/>
+        </w:rPr>
+        <w:tab/>
+      </w:r>
+      <w:r>
+        <w:rPr>
+          <w:rFonts w:ascii="Noto Serif SC" w:eastAsia="Noto Serif SC" w:hAnsi="Noto Serif SC" w:cs="Noto Serif" w:hint="eastAsia"/>
+          <w:bCs/>
+          <w:sz w:val="24"/>
+          <w:szCs w:val="24"/>
+        </w:rPr>
+        <w:t>：</w:t>
+      </w:r>
+      <w:r>
+        <w:rPr>
+          <w:rFonts w:ascii="Noto Serif SC" w:eastAsia="Noto Serif SC" w:hAnsi="Noto Serif SC" w:cs="Noto Serif" w:hint="eastAsia"/>
+          <w:bCs/>
+          <w:sz w:val="24"/>
+          <w:szCs w:val="24"/>
+        </w:rPr>
+        <w:t>意为气息颤动。</w:t>
+      </w:r>
+    </w:p>
+    <w:p>
+      <w:pPr>
+        <w:rPr>
+          <w:rFonts w:ascii="Noto Serif SC" w:eastAsia="Noto Serif SC" w:hAnsi="Noto Serif SC" w:cs="Noto Serif"/>
+          <w:bCs/>
+          <w:sz w:val="24"/>
+          <w:szCs w:val="24"/>
+        </w:rPr>
+      </w:pPr>
+      <w:r>
+        <w:rPr>
+          <w:rFonts w:ascii="Noto Serif SC" w:eastAsia="Noto Serif SC" w:hAnsi="Noto Serif SC" w:cs="Noto Serif" w:hint="eastAsia"/>
+          <w:bCs/>
+          <w:sz w:val="24"/>
+          <w:szCs w:val="24"/>
+        </w:rPr>
+        <w:t>ord.</w:t>
+      </w:r>
+      <w:r>
+        <w:rPr>
+          <w:rFonts w:ascii="Noto Serif SC" w:eastAsia="Noto Serif SC" w:hAnsi="Noto Serif SC" w:cs="Noto Serif"/>
+          <w:bCs/>
+          <w:sz w:val="24"/>
+          <w:szCs w:val="24"/>
+        </w:rPr>
+        <w:tab/>
+      </w:r>
+      <w:r>
+        <w:rPr>
+          <w:rFonts w:ascii="Noto Serif SC" w:eastAsia="Noto Serif SC" w:hAnsi="Noto Serif SC" w:cs="Noto Serif" w:hint="eastAsia"/>
+          <w:bCs/>
+          <w:sz w:val="24"/>
+          <w:szCs w:val="24"/>
+        </w:rPr>
+        <w:t>：</w:t>
+      </w:r>
+      <w:r>
+        <w:rPr>
+          <w:rFonts w:ascii="Noto Serif SC" w:eastAsia="Noto Serif SC" w:hAnsi="Noto Serif SC" w:cs="Noto Serif" w:hint="eastAsia"/>
+          <w:bCs/>
+          <w:sz w:val="24"/>
+          <w:szCs w:val="24"/>
+        </w:rPr>
+        <w:t>正常演奏(ordinary,包括正常的颤动、正常的口唇与吹孔的距离关系等)</w:t>
+      </w:r>
+      <w:r>
+        <w:rPr>
+          <w:rFonts w:ascii="Noto Serif SC" w:eastAsia="Noto Serif SC" w:hAnsi="Noto Serif SC" w:cs="Noto Serif" w:hint="eastAsia"/>
+          <w:bCs/>
+          <w:sz w:val="24"/>
+          <w:szCs w:val="24"/>
+        </w:rPr>
+        <w:t>。</w:t>
+      </w:r>
+    </w:p>
+    <w:p>
+      <w:pPr>
+        <w:rPr>
+          <w:rFonts w:ascii="Noto Serif SC" w:eastAsia="Noto Serif SC" w:hAnsi="Noto Serif SC" w:cs="Noto Serif"/>
+          <w:bCs/>
+          <w:sz w:val="24"/>
+          <w:szCs w:val="24"/>
+        </w:rPr>
+      </w:pPr>
       <w:proofErr w:type="spellStart"/>
       <w:r>
         <w:rPr>
-          <w:rFonts w:ascii="Noto Serif SC" w:eastAsia="Noto Serif SC" w:hAnsi="Noto Serif SC" w:cs="Noto Serif"/>
-          <w:sz w:val="24"/>
-          <w:szCs w:val="24"/>
-          <w:lang w:val="en-US"/>
-        </w:rPr>
-        <w:t>Zhudi</w:t>
+          <w:rFonts w:ascii="Noto Serif SC" w:eastAsia="Noto Serif SC" w:hAnsi="Noto Serif SC" w:cs="Noto Serif" w:hint="eastAsia"/>
+          <w:bCs/>
+          <w:sz w:val="24"/>
+          <w:szCs w:val="24"/>
+        </w:rPr>
+        <w:t>gliss</w:t>
       </w:r>
       <w:proofErr w:type="spellEnd"/>
       <w:r>
         <w:rPr>
-          <w:rFonts w:ascii="Noto Serif SC" w:eastAsia="Noto Serif SC" w:hAnsi="Noto Serif SC" w:cs="Noto Serif"/>
-          <w:sz w:val="24"/>
-          <w:szCs w:val="24"/>
-          <w:lang w:val="en-US"/>
-        </w:rPr>
-        <w:t xml:space="preserve"> solo</w:t>
-      </w:r>
-    </w:p>
-    <w:p>
-      <w:pPr>
-        <w:rPr>
-          <w:rFonts w:ascii="Noto Serif SC" w:eastAsia="Noto Serif SC" w:hAnsi="Noto Serif SC" w:cs="Noto Serif"/>
-          <w:sz w:val="24"/>
-          <w:szCs w:val="24"/>
-          <w:lang w:val="en-US"/>
-        </w:rPr>
-      </w:pPr>
-      <w:r>
-        <w:rPr>
-          <w:rFonts w:ascii="Noto Serif SC" w:eastAsia="Noto Serif SC" w:hAnsi="Noto Serif SC" w:cs="Noto Serif" w:hint="eastAsia"/>
-          <w:sz w:val="24"/>
-          <w:szCs w:val="24"/>
-        </w:rPr>
-        <w:t>琵琶独奏</w:t>
-      </w:r>
-      <w:r>
-        <w:rPr>
-          <w:rFonts w:ascii="Noto Serif SC" w:eastAsia="Noto Serif SC" w:hAnsi="Noto Serif SC" w:cs="Noto Serif"/>
-          <w:sz w:val="24"/>
-          <w:szCs w:val="24"/>
-          <w:lang w:val="en-US"/>
+          <w:rFonts w:ascii="Noto Serif SC" w:eastAsia="Noto Serif SC" w:hAnsi="Noto Serif SC" w:cs="Noto Serif" w:hint="eastAsia"/>
+          <w:bCs/>
+          <w:sz w:val="24"/>
+          <w:szCs w:val="24"/>
+        </w:rPr>
+        <w:t>.</w:t>
+      </w:r>
+      <w:r>
+        <w:rPr>
+          <w:rFonts w:ascii="Noto Serif SC" w:eastAsia="Noto Serif SC" w:hAnsi="Noto Serif SC" w:cs="Noto Serif"/>
+          <w:bCs/>
+          <w:sz w:val="24"/>
+          <w:szCs w:val="24"/>
+        </w:rPr>
+        <w:tab/>
+      </w:r>
+      <w:r>
+        <w:rPr>
+          <w:rFonts w:ascii="Noto Serif SC" w:eastAsia="Noto Serif SC" w:hAnsi="Noto Serif SC" w:cs="Noto Serif" w:hint="eastAsia"/>
+          <w:bCs/>
+          <w:sz w:val="24"/>
+          <w:szCs w:val="24"/>
+        </w:rPr>
+        <w:t>：</w:t>
+      </w:r>
+      <w:r>
+        <w:rPr>
+          <w:rFonts w:ascii="Noto Serif SC" w:eastAsia="Noto Serif SC" w:hAnsi="Noto Serif SC" w:cs="Noto Serif" w:hint="eastAsia"/>
+          <w:bCs/>
+          <w:sz w:val="24"/>
+          <w:szCs w:val="24"/>
+        </w:rPr>
+        <w:t>指滑音或气滑音。</w:t>
+      </w:r>
+    </w:p>
+    <w:p>
+      <w:pPr>
+        <w:rPr>
+          <w:rFonts w:ascii="Noto Serif SC" w:eastAsia="Noto Serif SC" w:hAnsi="Noto Serif SC" w:cs="Noto Serif"/>
+          <w:bCs/>
+          <w:sz w:val="24"/>
+          <w:szCs w:val="24"/>
+        </w:rPr>
+      </w:pPr>
+      <w:proofErr w:type="spellStart"/>
+      <w:r>
+        <w:rPr>
+          <w:rFonts w:ascii="Noto Serif SC" w:eastAsia="Noto Serif SC" w:hAnsi="Noto Serif SC" w:cs="Noto Serif" w:hint="eastAsia"/>
+          <w:bCs/>
+          <w:sz w:val="24"/>
+          <w:szCs w:val="24"/>
+        </w:rPr>
+        <w:t>vib</w:t>
+      </w:r>
+      <w:proofErr w:type="spellEnd"/>
+      <w:r>
+        <w:rPr>
+          <w:rFonts w:ascii="Noto Serif SC" w:eastAsia="Noto Serif SC" w:hAnsi="Noto Serif SC" w:cs="Noto Serif" w:hint="eastAsia"/>
+          <w:bCs/>
+          <w:sz w:val="24"/>
+          <w:szCs w:val="24"/>
+        </w:rPr>
+        <w:t>.</w:t>
+      </w:r>
+      <w:r>
+        <w:rPr>
+          <w:rFonts w:ascii="Noto Serif SC" w:eastAsia="Noto Serif SC" w:hAnsi="Noto Serif SC" w:cs="Noto Serif"/>
+          <w:bCs/>
+          <w:sz w:val="24"/>
+          <w:szCs w:val="24"/>
+        </w:rPr>
+        <w:tab/>
+      </w:r>
+      <w:r>
+        <w:rPr>
+          <w:rFonts w:ascii="Noto Serif SC" w:eastAsia="Noto Serif SC" w:hAnsi="Noto Serif SC" w:cs="Noto Serif" w:hint="eastAsia"/>
+          <w:bCs/>
+          <w:sz w:val="24"/>
+          <w:szCs w:val="24"/>
+        </w:rPr>
+        <w:t>：</w:t>
+      </w:r>
+      <w:r>
+        <w:rPr>
+          <w:rFonts w:ascii="Noto Serif SC" w:eastAsia="Noto Serif SC" w:hAnsi="Noto Serif SC" w:cs="Noto Serif" w:hint="eastAsia"/>
+          <w:bCs/>
+          <w:sz w:val="24"/>
+          <w:szCs w:val="24"/>
+        </w:rPr>
+        <w:t>颤动,颤吟(专指通过气流大小的改变造成,不含指法的变化</w:t>
+      </w:r>
+      <w:r>
+        <w:rPr>
+          <w:rFonts w:ascii="Noto Serif SC" w:eastAsia="Noto Serif SC" w:hAnsi="Noto Serif SC" w:cs="Noto Serif" w:hint="eastAsia"/>
+          <w:bCs/>
+          <w:sz w:val="24"/>
+          <w:szCs w:val="24"/>
+        </w:rPr>
+        <w:t>)</w:t>
+      </w:r>
+    </w:p>
+    <w:p>
+      <w:pPr>
+        <w:rPr>
+          <w:rFonts w:ascii="Noto Serif SC" w:eastAsia="Noto Serif SC" w:hAnsi="Noto Serif SC" w:cs="Noto Serif"/>
+          <w:bCs/>
+          <w:sz w:val="24"/>
+          <w:szCs w:val="24"/>
+        </w:rPr>
+      </w:pPr>
+      <w:r>
+        <w:rPr>
+          <w:rFonts w:ascii="Noto Serif SC" w:eastAsia="Noto Serif SC" w:hAnsi="Noto Serif SC" w:cs="Noto Serif" w:hint="eastAsia"/>
+          <w:bCs/>
+          <w:sz w:val="24"/>
+          <w:szCs w:val="24"/>
+        </w:rPr>
+        <w:t xml:space="preserve">quasi </w:t>
+      </w:r>
+      <w:proofErr w:type="spellStart"/>
+      <w:r>
+        <w:rPr>
+          <w:rFonts w:ascii="Noto Serif SC" w:eastAsia="Noto Serif SC" w:hAnsi="Noto Serif SC" w:cs="Noto Serif" w:hint="eastAsia"/>
+          <w:bCs/>
+          <w:sz w:val="24"/>
+          <w:szCs w:val="24"/>
+        </w:rPr>
+        <w:t>vib</w:t>
+      </w:r>
+      <w:proofErr w:type="spellEnd"/>
+      <w:r>
+        <w:rPr>
+          <w:rFonts w:ascii="Noto Serif SC" w:eastAsia="Noto Serif SC" w:hAnsi="Noto Serif SC" w:cs="Noto Serif" w:hint="eastAsia"/>
+          <w:bCs/>
+          <w:sz w:val="24"/>
+          <w:szCs w:val="24"/>
+        </w:rPr>
+        <w:t xml:space="preserve">. </w:t>
+      </w:r>
+      <w:r>
+        <w:rPr>
+          <w:rFonts w:ascii="Noto Serif SC" w:eastAsia="Noto Serif SC" w:hAnsi="Noto Serif SC" w:cs="Noto Serif"/>
+          <w:bCs/>
+          <w:sz w:val="24"/>
+          <w:szCs w:val="24"/>
+        </w:rPr>
+        <w:tab/>
+      </w:r>
+      <w:r>
+        <w:rPr>
+          <w:rFonts w:ascii="Noto Serif SC" w:eastAsia="Noto Serif SC" w:hAnsi="Noto Serif SC" w:cs="Noto Serif" w:hint="eastAsia"/>
+          <w:bCs/>
+          <w:sz w:val="24"/>
+          <w:szCs w:val="24"/>
+        </w:rPr>
+        <w:t>：</w:t>
+      </w:r>
+      <w:r>
+        <w:rPr>
+          <w:rFonts w:ascii="Noto Serif SC" w:eastAsia="Noto Serif SC" w:hAnsi="Noto Serif SC" w:cs="Noto Serif" w:hint="eastAsia"/>
+          <w:bCs/>
+          <w:sz w:val="24"/>
+          <w:szCs w:val="24"/>
+        </w:rPr>
+        <w:t>十分强烈,甚至有些夸张和乖戾的颤动和颤吟(通过气流大小的改变造成,不含指法的变化</w:t>
+      </w:r>
+      <w:r>
+        <w:rPr>
+          <w:rFonts w:ascii="Noto Serif SC" w:eastAsia="Noto Serif SC" w:hAnsi="Noto Serif SC" w:cs="Noto Serif" w:hint="eastAsia"/>
+          <w:bCs/>
+          <w:sz w:val="24"/>
+          <w:szCs w:val="24"/>
+        </w:rPr>
+        <w:t>)。</w:t>
+      </w:r>
+    </w:p>
+    <w:p>
+      <w:pPr>
+        <w:rPr>
+          <w:rFonts w:ascii="Noto Serif SC" w:eastAsia="Noto Serif SC" w:hAnsi="Noto Serif SC" w:cs="Noto Serif"/>
+          <w:bCs/>
+          <w:sz w:val="24"/>
+          <w:szCs w:val="24"/>
+        </w:rPr>
+      </w:pPr>
+      <w:r>
+        <w:rPr>
+          <w:rFonts w:ascii="Noto Serif SC" w:eastAsia="Noto Serif SC" w:hAnsi="Noto Serif SC" w:cs="Noto Serif" w:hint="eastAsia"/>
+          <w:bCs/>
+          <w:sz w:val="24"/>
+          <w:szCs w:val="24"/>
+        </w:rPr>
+        <w:t xml:space="preserve">non </w:t>
+      </w:r>
+      <w:proofErr w:type="spellStart"/>
+      <w:r>
+        <w:rPr>
+          <w:rFonts w:ascii="Noto Serif SC" w:eastAsia="Noto Serif SC" w:hAnsi="Noto Serif SC" w:cs="Noto Serif" w:hint="eastAsia"/>
+          <w:bCs/>
+          <w:sz w:val="24"/>
+          <w:szCs w:val="24"/>
+        </w:rPr>
+        <w:t>vib</w:t>
+      </w:r>
+      <w:proofErr w:type="spellEnd"/>
+      <w:r>
+        <w:rPr>
+          <w:rFonts w:ascii="Noto Serif SC" w:eastAsia="Noto Serif SC" w:hAnsi="Noto Serif SC" w:cs="Noto Serif" w:hint="eastAsia"/>
+          <w:bCs/>
+          <w:sz w:val="24"/>
+          <w:szCs w:val="24"/>
+        </w:rPr>
+        <w:t>.</w:t>
+      </w:r>
+      <w:r>
+        <w:rPr>
+          <w:rFonts w:ascii="Noto Serif SC" w:eastAsia="Noto Serif SC" w:hAnsi="Noto Serif SC" w:cs="Noto Serif"/>
+          <w:bCs/>
+          <w:sz w:val="24"/>
+          <w:szCs w:val="24"/>
+        </w:rPr>
+        <w:tab/>
+      </w:r>
+      <w:r>
+        <w:rPr>
+          <w:rFonts w:ascii="Noto Serif SC" w:eastAsia="Noto Serif SC" w:hAnsi="Noto Serif SC" w:cs="Noto Serif" w:hint="eastAsia"/>
+          <w:bCs/>
+          <w:sz w:val="24"/>
+          <w:szCs w:val="24"/>
+        </w:rPr>
+        <w:t>：</w:t>
+      </w:r>
+      <w:r>
+        <w:rPr>
+          <w:rFonts w:ascii="Noto Serif SC" w:eastAsia="Noto Serif SC" w:hAnsi="Noto Serif SC" w:cs="Noto Serif" w:hint="eastAsia"/>
+          <w:bCs/>
+          <w:sz w:val="24"/>
+          <w:szCs w:val="24"/>
+        </w:rPr>
+        <w:t>没有任何颤动和颤吟。</w:t>
+      </w:r>
+    </w:p>
+    <w:p>
+      <w:pPr>
+        <w:rPr>
+          <w:rFonts w:ascii="Noto Serif SC" w:eastAsia="Noto Serif SC" w:hAnsi="Noto Serif SC" w:cs="Noto Serif"/>
+          <w:bCs/>
+          <w:sz w:val="24"/>
+          <w:szCs w:val="24"/>
+        </w:rPr>
+      </w:pPr>
+      <w:r>
+        <w:rPr>
+          <w:rFonts w:ascii="Noto Serif SC" w:eastAsia="Noto Serif SC" w:hAnsi="Noto Serif SC" w:cs="Noto Serif" w:hint="eastAsia"/>
+          <w:bCs/>
+          <w:sz w:val="24"/>
+          <w:szCs w:val="24"/>
+        </w:rPr>
+        <w:t>tr</w:t>
+      </w:r>
+      <w:r>
+        <w:rPr>
+          <w:rFonts w:ascii="Noto Serif SC" w:eastAsia="Noto Serif SC" w:hAnsi="Noto Serif SC" w:cs="Noto Serif" w:hint="eastAsia"/>
+          <w:bCs/>
+          <w:sz w:val="24"/>
+          <w:szCs w:val="24"/>
+        </w:rPr>
+        <w:t>.</w:t>
+      </w:r>
+      <w:r>
+        <w:rPr>
+          <w:rFonts w:ascii="Noto Serif SC" w:eastAsia="Noto Serif SC" w:hAnsi="Noto Serif SC" w:cs="Noto Serif"/>
+          <w:bCs/>
+          <w:sz w:val="24"/>
+          <w:szCs w:val="24"/>
+        </w:rPr>
+        <w:tab/>
+      </w:r>
+      <w:r>
+        <w:rPr>
+          <w:rFonts w:ascii="Noto Serif SC" w:eastAsia="Noto Serif SC" w:hAnsi="Noto Serif SC" w:cs="Noto Serif" w:hint="eastAsia"/>
+          <w:bCs/>
+          <w:sz w:val="24"/>
+          <w:szCs w:val="24"/>
+        </w:rPr>
+        <w:t>：</w:t>
+      </w:r>
+      <w:r>
+        <w:rPr>
+          <w:rFonts w:ascii="Noto Serif SC" w:eastAsia="Noto Serif SC" w:hAnsi="Noto Serif SC" w:cs="Noto Serif" w:hint="eastAsia"/>
+          <w:bCs/>
+          <w:sz w:val="24"/>
+          <w:szCs w:val="24"/>
+        </w:rPr>
+        <w:t>为基础音与其上方小二度的颤音(无论处在什么调性环境下)。</w:t>
+      </w:r>
+    </w:p>
+    <w:p>
+      <w:pPr>
+        <w:rPr>
+          <w:rFonts w:ascii="Noto Serif SC" w:eastAsia="Noto Serif SC" w:hAnsi="Noto Serif SC" w:cs="Noto Serif"/>
+          <w:bCs/>
+          <w:sz w:val="24"/>
+          <w:szCs w:val="24"/>
+        </w:rPr>
+      </w:pPr>
+    </w:p>
+    <w:p>
+      <w:pPr>
+        <w:rPr>
+          <w:rFonts w:ascii="Noto Serif SC" w:eastAsia="Noto Serif SC" w:hAnsi="Noto Serif SC" w:cs="Noto Serif" w:hint="eastAsia"/>
+          <w:bCs/>
+          <w:sz w:val="36"/>
+          <w:szCs w:val="36"/>
+        </w:rPr>
+      </w:pPr>
+      <w:r>
+        <w:rPr>
+          <w:rFonts w:ascii="Noto Serif SC" w:eastAsia="Noto Serif SC" w:hAnsi="Noto Serif SC" w:cs="Noto Serif" w:hint="eastAsia"/>
+          <w:bCs/>
+          <w:sz w:val="36"/>
+          <w:szCs w:val="36"/>
+        </w:rPr>
+        <w:t>独奏琵琶:</w:t>
+      </w:r>
+      <w:r>
+        <w:rPr>
+          <w:rFonts w:ascii="Noto Serif SC" w:eastAsia="Noto Serif SC" w:hAnsi="Noto Serif SC" w:cs="Noto Serif" w:hint="eastAsia"/>
+          <w:bCs/>
+          <w:sz w:val="36"/>
+          <w:szCs w:val="36"/>
+        </w:rPr>
+        <w:t xml:space="preserve"> Solo </w:t>
+      </w:r>
+      <w:r>
+        <w:rPr>
+          <w:rFonts w:ascii="Noto Serif SC" w:eastAsia="Noto Serif SC" w:hAnsi="Noto Serif SC" w:cs="Noto Serif" w:hint="eastAsia"/>
+          <w:bCs/>
+          <w:sz w:val="36"/>
+          <w:szCs w:val="36"/>
+        </w:rPr>
+        <w:t>Pipa</w:t>
+      </w:r>
+      <w:r>
+        <w:rPr>
+          <w:rFonts w:ascii="Noto Serif SC" w:eastAsia="Noto Serif SC" w:hAnsi="Noto Serif SC" w:cs="Noto Serif" w:hint="eastAsia"/>
+          <w:bCs/>
+          <w:sz w:val="36"/>
+          <w:szCs w:val="36"/>
+        </w:rPr>
+        <w:t>:</w:t>
+      </w:r>
+    </w:p>
+    <w:p>
+      <w:pPr>
+        <w:pStyle w:val="ListParagraph"/>
+        <w:numPr>
+          <w:ilvl w:val="0"/>
+          <w:numId w:val="2"/>
+        </w:numPr>
+        <w:rPr>
+          <w:rFonts w:ascii="Noto Serif SC" w:eastAsia="Noto Serif SC" w:hAnsi="Noto Serif SC" w:cs="Noto Serif"/>
+          <w:bCs/>
+          <w:sz w:val="24"/>
+          <w:szCs w:val="24"/>
+        </w:rPr>
+      </w:pPr>
+      <w:r>
+        <w:rPr>
+          <w:rFonts w:ascii="Noto Serif SC" w:eastAsia="Noto Serif SC" w:hAnsi="Noto Serif SC" w:cs="Noto Serif" w:hint="eastAsia"/>
+          <w:bCs/>
+          <w:sz w:val="24"/>
+          <w:szCs w:val="24"/>
+        </w:rPr>
+        <w:t>泛音:</w:t>
+      </w:r>
+    </w:p>
+    <w:p>
+      <w:pPr>
+        <w:rPr>
+          <w:rFonts w:ascii="Noto Serif SC" w:eastAsia="Noto Serif SC" w:hAnsi="Noto Serif SC" w:cs="Noto Serif"/>
+          <w:bCs/>
+          <w:sz w:val="24"/>
+          <w:szCs w:val="24"/>
+        </w:rPr>
+      </w:pPr>
+      <w:r>
+        <w:rPr>
+          <w:rFonts w:ascii="Noto Serif SC" w:eastAsia="Noto Serif SC" w:hAnsi="Noto Serif SC" w:cs="Noto Serif" w:hint="eastAsia"/>
+          <w:bCs/>
+          <w:sz w:val="24"/>
+          <w:szCs w:val="24"/>
+        </w:rPr>
+        <w:t>记谱:</w:t>
+      </w:r>
+      <w:r>
+        <w:rPr>
+          <w:rFonts w:ascii="Noto Serif SC" w:eastAsia="Noto Serif SC" w:hAnsi="Noto Serif SC" w:cs="Noto Serif" w:hint="eastAsia"/>
+          <w:bCs/>
+          <w:sz w:val="24"/>
+          <w:szCs w:val="24"/>
         </w:rPr>
         <w:t xml:space="preserve"> </w:t>
       </w:r>
       <w:r>
         <w:rPr>
           <w:rFonts w:ascii="Noto Serif SC" w:eastAsia="Noto Serif SC" w:hAnsi="Noto Serif SC" w:cs="Noto Serif"/>
-          <w:sz w:val="24"/>
-          <w:szCs w:val="24"/>
-          <w:lang w:val="en-US"/>
-        </w:rPr>
-        <w:t>Pipa solo</w:t>
-      </w:r>
-    </w:p>
-    <w:p>
-      <w:pPr>
-        <w:rPr>
-          <w:rFonts w:ascii="Noto Serif SC" w:eastAsia="Noto Serif SC" w:hAnsi="Noto Serif SC" w:cs="Noto Serif"/>
-          <w:sz w:val="24"/>
-          <w:szCs w:val="24"/>
-          <w:lang w:val="en-US"/>
-        </w:rPr>
-      </w:pPr>
-    </w:p>
-    <w:p>
-      <w:pPr>
-        <w:rPr>
-          <w:rFonts w:ascii="Noto Serif SC" w:eastAsia="Noto Serif SC" w:hAnsi="Noto Serif SC" w:cs="Noto Serif"/>
-          <w:sz w:val="24"/>
-          <w:szCs w:val="24"/>
-          <w:lang w:val="en-US"/>
-        </w:rPr>
-      </w:pPr>
-      <w:r>
-        <w:rPr>
-          <w:rFonts w:ascii="Noto Serif SC" w:eastAsia="Noto Serif SC" w:hAnsi="Noto Serif SC" w:cs="Noto Serif" w:hint="eastAsia"/>
-          <w:sz w:val="24"/>
-          <w:szCs w:val="24"/>
-          <w:lang w:val="en-US"/>
-        </w:rPr>
-        <w:t>高胡</w:t>
-      </w:r>
-      <w:r>
-        <w:rPr>
-          <w:rFonts w:ascii="Noto Serif SC" w:eastAsia="Noto Serif SC" w:hAnsi="Noto Serif SC" w:cs="Noto Serif"/>
-          <w:sz w:val="24"/>
-          <w:szCs w:val="24"/>
-          <w:lang w:val="en-US"/>
-        </w:rPr>
-        <w:t xml:space="preserve"> Gaohu</w:t>
-      </w:r>
-    </w:p>
-    <w:p>
-      <w:pPr>
-        <w:rPr>
-          <w:rFonts w:ascii="Noto Serif SC" w:eastAsia="Noto Serif SC" w:hAnsi="Noto Serif SC" w:cs="Noto Serif"/>
-          <w:sz w:val="24"/>
-          <w:szCs w:val="24"/>
-          <w:lang w:val="en-US"/>
-        </w:rPr>
-      </w:pPr>
-      <w:r>
-        <w:rPr>
-          <w:rFonts w:ascii="Noto Serif SC" w:eastAsia="Noto Serif SC" w:hAnsi="Noto Serif SC" w:cs="Noto Serif" w:hint="eastAsia"/>
-          <w:sz w:val="24"/>
-          <w:szCs w:val="24"/>
-          <w:lang w:val="en-US"/>
-        </w:rPr>
-        <w:t>二胡</w:t>
-      </w:r>
-      <w:r>
-        <w:rPr>
-          <w:rFonts w:ascii="Noto Serif SC" w:eastAsia="Noto Serif SC" w:hAnsi="Noto Serif SC" w:cs="Noto Serif"/>
-          <w:sz w:val="24"/>
-          <w:szCs w:val="24"/>
-          <w:lang w:val="en-US"/>
-        </w:rPr>
-        <w:t xml:space="preserve"> Erhu</w:t>
-      </w:r>
-      <w:r>
-        <w:rPr>
-          <w:rFonts w:ascii="Noto Serif SC" w:eastAsia="Noto Serif SC" w:hAnsi="Noto Serif SC" w:cs="Noto Serif"/>
-          <w:sz w:val="24"/>
-          <w:szCs w:val="24"/>
-          <w:lang w:val="en-US"/>
-        </w:rPr>
-        <w:t xml:space="preserve"> I</w:t>
-      </w:r>
-    </w:p>
-    <w:p>
-      <w:pPr>
-        <w:rPr>
-          <w:rFonts w:ascii="Noto Serif SC" w:eastAsia="Noto Serif SC" w:hAnsi="Noto Serif SC" w:cs="Noto Serif"/>
-          <w:sz w:val="24"/>
-          <w:szCs w:val="24"/>
-          <w:lang w:val="en-US"/>
-        </w:rPr>
-      </w:pPr>
-      <w:r>
-        <w:rPr>
-          <w:rFonts w:ascii="Noto Serif SC" w:eastAsia="Noto Serif SC" w:hAnsi="Noto Serif SC" w:cs="Noto Serif" w:hint="eastAsia"/>
-          <w:sz w:val="24"/>
-          <w:szCs w:val="24"/>
-          <w:lang w:val="en-US"/>
-        </w:rPr>
-        <w:t>二胡</w:t>
-      </w:r>
-      <w:r>
-        <w:rPr>
-          <w:rFonts w:ascii="Noto Serif SC" w:eastAsia="Noto Serif SC" w:hAnsi="Noto Serif SC" w:cs="Noto Serif"/>
-          <w:sz w:val="24"/>
-          <w:szCs w:val="24"/>
-          <w:lang w:val="en-US"/>
-        </w:rPr>
-        <w:t xml:space="preserve"> Erhu</w:t>
-      </w:r>
-      <w:r>
-        <w:rPr>
-          <w:rFonts w:ascii="Noto Serif SC" w:eastAsia="Noto Serif SC" w:hAnsi="Noto Serif SC" w:cs="Noto Serif"/>
-          <w:sz w:val="24"/>
-          <w:szCs w:val="24"/>
-          <w:lang w:val="en-US"/>
-        </w:rPr>
-        <w:t xml:space="preserve"> II</w:t>
-      </w:r>
-    </w:p>
-    <w:p>
-      <w:pPr>
-        <w:rPr>
-          <w:rFonts w:ascii="Noto Serif SC" w:eastAsia="Noto Serif SC" w:hAnsi="Noto Serif SC" w:cs="Noto Serif"/>
-          <w:sz w:val="24"/>
-          <w:szCs w:val="24"/>
-          <w:lang w:val="en-US"/>
-        </w:rPr>
-      </w:pPr>
-      <w:r>
-        <w:rPr>
-          <w:rFonts w:ascii="Noto Serif SC" w:eastAsia="Noto Serif SC" w:hAnsi="Noto Serif SC" w:cs="Noto Serif" w:hint="eastAsia"/>
-          <w:sz w:val="24"/>
-          <w:szCs w:val="24"/>
-          <w:lang w:val="en-US"/>
-        </w:rPr>
-        <w:t>中胡</w:t>
-      </w:r>
-      <w:r>
-        <w:rPr>
-          <w:rFonts w:ascii="Noto Serif SC" w:eastAsia="Noto Serif SC" w:hAnsi="Noto Serif SC" w:cs="Noto Serif"/>
-          <w:sz w:val="24"/>
-          <w:szCs w:val="24"/>
-          <w:lang w:val="en-US"/>
-        </w:rPr>
-        <w:t xml:space="preserve"> Zhonghu</w:t>
-      </w:r>
-    </w:p>
-    <w:p>
-      <w:pPr>
-        <w:rPr>
-          <w:rFonts w:ascii="Noto Serif SC" w:eastAsia="Noto Serif SC" w:hAnsi="Noto Serif SC" w:cs="Noto Serif"/>
-          <w:sz w:val="24"/>
-          <w:szCs w:val="24"/>
-          <w:lang w:val="en-US"/>
-        </w:rPr>
-      </w:pPr>
-      <w:r>
-        <w:rPr>
-          <w:rFonts w:ascii="Noto Serif SC" w:eastAsia="Noto Serif SC" w:hAnsi="Noto Serif SC" w:cs="Noto Serif" w:hint="eastAsia"/>
-          <w:sz w:val="24"/>
-          <w:szCs w:val="24"/>
-          <w:lang w:val="en-US"/>
-        </w:rPr>
-        <w:t>大提琴</w:t>
-      </w:r>
-      <w:r>
-        <w:rPr>
-          <w:rFonts w:ascii="Noto Serif SC" w:eastAsia="Noto Serif SC" w:hAnsi="Noto Serif SC" w:cs="Noto Serif"/>
-          <w:sz w:val="24"/>
-          <w:szCs w:val="24"/>
-          <w:lang w:val="en-US"/>
-        </w:rPr>
-        <w:t xml:space="preserve"> Violoncello</w:t>
-      </w:r>
-    </w:p>
-    <w:p>
-      <w:pPr>
-        <w:rPr>
-          <w:rFonts w:ascii="Noto Serif SC" w:eastAsia="Noto Serif SC" w:hAnsi="Noto Serif SC" w:cs="Noto Serif"/>
-          <w:sz w:val="24"/>
-          <w:szCs w:val="24"/>
-          <w:lang w:val="en-US"/>
-        </w:rPr>
-      </w:pPr>
-      <w:r>
-        <w:rPr>
-          <w:rFonts w:ascii="Noto Serif SC" w:eastAsia="Noto Serif SC" w:hAnsi="Noto Serif SC" w:cs="Noto Serif" w:hint="eastAsia"/>
-          <w:sz w:val="24"/>
-          <w:szCs w:val="24"/>
-          <w:lang w:val="en-US"/>
-        </w:rPr>
-        <w:t>低音提琴</w:t>
-      </w:r>
-      <w:r>
-        <w:rPr>
-          <w:rFonts w:ascii="Noto Serif SC" w:eastAsia="Noto Serif SC" w:hAnsi="Noto Serif SC" w:cs="Noto Serif"/>
-          <w:sz w:val="24"/>
-          <w:szCs w:val="24"/>
-          <w:lang w:val="en-US"/>
-        </w:rPr>
-        <w:t xml:space="preserve"> Contrabass</w:t>
-      </w:r>
-    </w:p>
-    <w:p>
-      <w:pPr>
-        <w:rPr>
-          <w:rFonts w:ascii="Noto Serif SC" w:eastAsia="Noto Serif SC" w:hAnsi="Noto Serif SC" w:cs="Noto Serif"/>
-          <w:lang w:val="en-US"/>
-        </w:rPr>
-      </w:pPr>
-    </w:p>
-    <w:p>
-      <w:pPr>
-        <w:rPr>
-          <w:rFonts w:ascii="Noto Serif SC" w:eastAsia="Noto Serif SC" w:hAnsi="Noto Serif SC" w:cs="Noto Serif"/>
-          <w:lang w:val="en-US"/>
-        </w:rPr>
-      </w:pPr>
-    </w:p>
-    <w:p>
-      <w:pPr>
-        <w:rPr>
-          <w:rFonts w:ascii="Noto Serif SC" w:eastAsia="Noto Serif SC" w:hAnsi="Noto Serif SC" w:cs="Noto Serif"/>
-          <w:lang w:val="en-US"/>
-        </w:rPr>
-      </w:pPr>
-    </w:p>
-    <w:p>
-      <w:pPr>
-        <w:rPr>
-          <w:rFonts w:ascii="Noto Serif SC" w:eastAsia="Noto Serif SC" w:hAnsi="Noto Serif SC" w:cs="Noto Serif"/>
-          <w:lang w:val="en-US"/>
-        </w:rPr>
-      </w:pPr>
-    </w:p>
-    <w:p>
-      <w:pPr>
-        <w:rPr>
-          <w:rFonts w:ascii="Noto Serif SC" w:eastAsia="Noto Serif SC" w:hAnsi="Noto Serif SC" w:cs="Noto Serif"/>
-          <w:lang w:val="en-US"/>
-        </w:rPr>
-      </w:pPr>
-    </w:p>
-    <w:p>
-      <w:pPr>
-        <w:rPr>
-          <w:rFonts w:ascii="Noto Serif SC" w:eastAsia="Noto Serif SC" w:hAnsi="Noto Serif SC" w:cs="Noto Serif"/>
-          <w:lang w:val="en-US"/>
-        </w:rPr>
-      </w:pPr>
-    </w:p>
-    <w:p>
-      <w:pPr>
-        <w:rPr>
-          <w:rFonts w:ascii="Noto Serif SC" w:eastAsia="Noto Serif SC" w:hAnsi="Noto Serif SC" w:cs="Noto Serif"/>
-          <w:lang w:val="en-US"/>
-        </w:rPr>
-      </w:pPr>
-    </w:p>
-    <w:p>
-      <w:pPr>
-        <w:rPr>
-          <w:rFonts w:ascii="Noto Serif SC" w:eastAsia="Noto Serif SC" w:hAnsi="Noto Serif SC" w:cs="Noto Serif"/>
-          <w:lang w:val="en-US"/>
-        </w:rPr>
-      </w:pPr>
-    </w:p>
-    <w:p>
-      <w:pPr>
-        <w:rPr>
-          <w:rFonts w:ascii="Noto Serif SC" w:eastAsia="Noto Serif SC" w:hAnsi="Noto Serif SC" w:cs="Noto Serif"/>
-          <w:b/>
-          <w:sz w:val="32"/>
-          <w:szCs w:val="40"/>
-          <w:lang w:val="en-US"/>
+          <w:bCs/>
+          <w:sz w:val="24"/>
+          <w:szCs w:val="24"/>
+        </w:rPr>
+        <w:t>◯</w:t>
+      </w:r>
+      <w:r>
+        <w:rPr>
+          <w:rFonts w:ascii="Noto Serif SC" w:eastAsia="Noto Serif SC" w:hAnsi="Noto Serif SC" w:cs="Noto Serif" w:hint="eastAsia"/>
+          <w:bCs/>
+          <w:sz w:val="24"/>
+          <w:szCs w:val="24"/>
+        </w:rPr>
+        <w:t xml:space="preserve"> </w:t>
+      </w:r>
+      <w:r>
+        <w:rPr>
+          <w:rFonts w:ascii="Noto Serif SC" w:eastAsia="Noto Serif SC" w:hAnsi="Noto Serif SC" w:cs="Noto Serif" w:hint="eastAsia"/>
+          <w:bCs/>
+          <w:sz w:val="24"/>
+          <w:szCs w:val="24"/>
+        </w:rPr>
+        <w:t>(泛音音程和泛音和弦同样仅仅使用单个泛音记号表示)</w:t>
+      </w:r>
+    </w:p>
+    <w:p>
+      <w:pPr>
+        <w:pStyle w:val="ListParagraph"/>
+        <w:numPr>
+          <w:ilvl w:val="0"/>
+          <w:numId w:val="2"/>
+        </w:numPr>
+        <w:rPr>
+          <w:rFonts w:ascii="Noto Serif SC" w:eastAsia="Noto Serif SC" w:hAnsi="Noto Serif SC" w:cs="Noto Serif"/>
+          <w:bCs/>
+          <w:sz w:val="24"/>
+          <w:szCs w:val="24"/>
+        </w:rPr>
+      </w:pPr>
+      <w:r>
+        <w:rPr>
+          <w:rFonts w:ascii="Noto Serif SC" w:eastAsia="Noto Serif SC" w:hAnsi="Noto Serif SC" w:cs="Noto Serif" w:hint="eastAsia"/>
+          <w:bCs/>
+          <w:sz w:val="24"/>
+          <w:szCs w:val="24"/>
+        </w:rPr>
+        <w:t>独奏琵琶的定弦:</w:t>
+      </w:r>
+      <w:r>
+        <w:rPr>
+          <w:rFonts w:ascii="Noto Serif SC" w:eastAsia="Noto Serif SC" w:hAnsi="Noto Serif SC" w:cs="Noto Serif" w:hint="eastAsia"/>
+          <w:bCs/>
+          <w:sz w:val="24"/>
+          <w:szCs w:val="24"/>
+        </w:rPr>
+        <w:t xml:space="preserve"> </w:t>
+      </w:r>
+      <w:r>
+        <w:rPr>
+          <w:rFonts w:ascii="Noto Serif SC" w:eastAsia="Noto Serif SC" w:hAnsi="Noto Serif SC" w:cs="Noto Serif" w:hint="eastAsia"/>
+          <w:bCs/>
+          <w:sz w:val="24"/>
+          <w:szCs w:val="24"/>
+        </w:rPr>
+        <w:t>A</w:t>
+      </w:r>
+      <w:r>
+        <w:rPr>
+          <w:rFonts w:ascii="Noto Serif SC" w:eastAsia="Noto Serif SC" w:hAnsi="Noto Serif SC" w:cs="Noto Serif"/>
+          <w:bCs/>
+          <w:sz w:val="24"/>
+          <w:szCs w:val="24"/>
+        </w:rPr>
+        <w:t>♭</w:t>
+      </w:r>
+      <w:r>
+        <w:rPr>
+          <w:rFonts w:ascii="Noto Serif SC" w:eastAsia="Noto Serif SC" w:hAnsi="Noto Serif SC" w:cs="Noto Serif" w:hint="eastAsia"/>
+          <w:bCs/>
+          <w:sz w:val="24"/>
+          <w:szCs w:val="24"/>
+        </w:rPr>
+        <w:t>、d、E</w:t>
+      </w:r>
+      <w:r>
+        <w:rPr>
+          <w:rFonts w:ascii="Noto Serif SC" w:eastAsia="Noto Serif SC" w:hAnsi="Noto Serif SC" w:cs="Noto Serif"/>
+          <w:bCs/>
+          <w:sz w:val="24"/>
+          <w:szCs w:val="24"/>
+        </w:rPr>
+        <w:t>♭</w:t>
+      </w:r>
+      <w:r>
+        <w:rPr>
+          <w:rFonts w:ascii="Noto Serif SC" w:eastAsia="Noto Serif SC" w:hAnsi="Noto Serif SC" w:cs="Noto Serif" w:hint="eastAsia"/>
+          <w:bCs/>
+          <w:sz w:val="24"/>
+          <w:szCs w:val="24"/>
+        </w:rPr>
+        <w:t>、a</w:t>
+      </w:r>
+    </w:p>
+    <w:p>
+      <w:pPr>
+        <w:rPr>
+          <w:rFonts w:ascii="Noto Serif SC" w:eastAsia="Noto Serif SC" w:hAnsi="Noto Serif SC" w:cs="Noto Serif"/>
+          <w:bCs/>
+          <w:sz w:val="24"/>
+          <w:szCs w:val="24"/>
+        </w:rPr>
+      </w:pPr>
+      <w:r>
+        <w:rPr>
+          <w:rFonts w:ascii="Noto Serif SC" w:eastAsia="Noto Serif SC" w:hAnsi="Noto Serif SC" w:cs="Noto Serif" w:hint="eastAsia"/>
+          <w:bCs/>
+          <w:sz w:val="24"/>
+          <w:szCs w:val="24"/>
+        </w:rPr>
+        <w:t>注意:乐谱中所有的音高皆为实际发音音高,不在作缠弦的移位演奏音高记谱处理。</w:t>
+      </w:r>
+    </w:p>
+    <w:p>
+      <w:pPr>
+        <w:pStyle w:val="ListParagraph"/>
+        <w:numPr>
+          <w:ilvl w:val="0"/>
+          <w:numId w:val="2"/>
+        </w:numPr>
+        <w:rPr>
+          <w:rFonts w:ascii="Noto Serif SC" w:eastAsia="Noto Serif SC" w:hAnsi="Noto Serif SC" w:cs="Noto Serif"/>
+          <w:bCs/>
+          <w:sz w:val="24"/>
+          <w:szCs w:val="24"/>
+        </w:rPr>
+      </w:pPr>
+      <w:r>
+        <w:rPr>
+          <w:rFonts w:ascii="Noto Serif SC" w:eastAsia="Noto Serif SC" w:hAnsi="Noto Serif SC" w:cs="Noto Serif"/>
+          <w:bCs/>
+          <w:noProof/>
+          <w:sz w:val="24"/>
+          <w:szCs w:val="24"/>
+          <w:lang w:val="en-GB"/>
+        </w:rPr>
+        <w:drawing>
+          <wp:inline distT="0" distB="0" distL="0" distR="0" wp14:anchorId="19346102" wp14:editId="6418109D">
+            <wp:extent cx="131944" cy="136355"/>
+            <wp:effectExtent l="0" t="0" r="1905" b="0"/>
+            <wp:docPr id="1184050316" name="Picture 4"/>
+            <wp:cNvGraphicFramePr>
+              <a:graphicFrameLocks xmlns:a="http://schemas.openxmlformats.org/drawingml/2006/main" noChangeAspect="1"/>
+            </wp:cNvGraphicFramePr>
+            <a:graphic xmlns:a="http://schemas.openxmlformats.org/drawingml/2006/main">
+              <a:graphicData uri="http://schemas.openxmlformats.org/drawingml/2006/picture">
+                <pic:pic xmlns:pic="http://schemas.openxmlformats.org/drawingml/2006/picture">
+                  <pic:nvPicPr>
+                    <pic:cNvPr id="0" name="Picture 3"/>
+                    <pic:cNvPicPr>
+                      <a:picLocks noChangeAspect="1" noChangeArrowheads="1"/>
+                    </pic:cNvPicPr>
+                  </pic:nvPicPr>
+                  <pic:blipFill>
+                    <a:blip r:embed="rId14" cstate="print">
+                      <a:extLst>
+                        <a:ext uri="{28A0092B-C50C-407E-A947-70E740481C1C}">
+                          <a14:useLocalDpi xmlns:a14="http://schemas.microsoft.com/office/drawing/2010/main" val="0"/>
+                        </a:ext>
+                      </a:extLst>
+                    </a:blip>
+                    <a:srcRect/>
+                    <a:stretch>
+                      <a:fillRect/>
+                    </a:stretch>
+                  </pic:blipFill>
+                  <pic:spPr bwMode="auto">
+                    <a:xfrm>
+                      <a:off x="0" y="0"/>
+                      <a:ext cx="150225" cy="155247"/>
+                    </a:xfrm>
+                    <a:prstGeom prst="rect">
+                      <a:avLst/>
+                    </a:prstGeom>
+                    <a:noFill/>
+                    <a:ln>
+                      <a:noFill/>
+                    </a:ln>
+                  </pic:spPr>
+                </pic:pic>
+              </a:graphicData>
+            </a:graphic>
+          </wp:inline>
+        </w:drawing>
+      </w:r>
+      <w:r>
+        <w:rPr>
+          <w:rFonts w:ascii="Noto Serif SC" w:eastAsia="Noto Serif SC" w:hAnsi="Noto Serif SC" w:cs="Noto Serif" w:hint="eastAsia"/>
+          <w:bCs/>
+          <w:sz w:val="24"/>
+          <w:szCs w:val="24"/>
+        </w:rPr>
+        <w:t xml:space="preserve"> </w:t>
+      </w:r>
+      <w:r>
+        <w:rPr>
+          <w:rFonts w:ascii="Noto Serif SC" w:eastAsia="Noto Serif SC" w:hAnsi="Noto Serif SC" w:cs="Noto Serif" w:hint="eastAsia"/>
+          <w:bCs/>
+          <w:sz w:val="24"/>
+          <w:szCs w:val="24"/>
+        </w:rPr>
+        <w:t>轮指(仅一下)。</w:t>
+      </w:r>
+      <w:r>
+        <w:rPr>
+          <w:rFonts w:ascii="Noto Serif SC" w:eastAsia="Noto Serif SC" w:hAnsi="Noto Serif SC" w:cs="Noto Serif" w:hint="eastAsia"/>
+          <w:bCs/>
+          <w:sz w:val="24"/>
+          <w:szCs w:val="24"/>
+        </w:rPr>
+        <w:t xml:space="preserve"> </w:t>
+      </w:r>
+    </w:p>
+    <w:p>
+      <w:pPr>
+        <w:rPr>
+          <w:rFonts w:ascii="Noto Serif SC" w:eastAsia="Noto Serif SC" w:hAnsi="Noto Serif SC" w:cs="Noto Serif"/>
+          <w:bCs/>
+          <w:sz w:val="24"/>
+          <w:szCs w:val="24"/>
+        </w:rPr>
+      </w:pPr>
+      <w:r>
+        <w:rPr>
+          <w:rFonts w:ascii="Noto Serif SC" w:eastAsia="Noto Serif SC" w:hAnsi="Noto Serif SC" w:cs="Noto Serif"/>
+          <w:bCs/>
+          <w:noProof/>
+          <w:sz w:val="24"/>
+          <w:szCs w:val="24"/>
+        </w:rPr>
+        <mc:AlternateContent>
+          <mc:Choice Requires="wpg">
+            <w:drawing>
+              <wp:inline distT="0" distB="0" distL="0" distR="0" wp14:anchorId="23967F80" wp14:editId="4D42E3CB">
+                <wp:extent cx="422816" cy="135890"/>
+                <wp:effectExtent l="0" t="0" r="0" b="0"/>
+                <wp:docPr id="228028590" name="Group 6"/>
+                <wp:cNvGraphicFramePr/>
+                <a:graphic xmlns:a="http://schemas.openxmlformats.org/drawingml/2006/main">
+                  <a:graphicData uri="http://schemas.microsoft.com/office/word/2010/wordprocessingGroup">
+                    <wpg:wgp>
+                      <wpg:cNvGrpSpPr/>
+                      <wpg:grpSpPr>
+                        <a:xfrm>
+                          <a:off x="0" y="0"/>
+                          <a:ext cx="422816" cy="135890"/>
+                          <a:chOff x="0" y="0"/>
+                          <a:chExt cx="422816" cy="135890"/>
+                        </a:xfrm>
+                      </wpg:grpSpPr>
+                      <pic:pic xmlns:pic="http://schemas.openxmlformats.org/drawingml/2006/picture">
+                        <pic:nvPicPr>
+                          <pic:cNvPr id="238043446" name="Picture 5"/>
+                          <pic:cNvPicPr>
+                            <a:picLocks noChangeAspect="1"/>
+                          </pic:cNvPicPr>
+                        </pic:nvPicPr>
+                        <pic:blipFill>
+                          <a:blip r:embed="rId15" cstate="print">
+                            <a:extLst>
+                              <a:ext uri="{28A0092B-C50C-407E-A947-70E740481C1C}">
+                                <a14:useLocalDpi xmlns:a14="http://schemas.microsoft.com/office/drawing/2010/main" val="0"/>
+                              </a:ext>
+                            </a:extLst>
+                          </a:blip>
+                          <a:srcRect/>
+                          <a:stretch>
+                            <a:fillRect/>
+                          </a:stretch>
+                        </pic:blipFill>
+                        <pic:spPr bwMode="auto">
+                          <a:xfrm>
+                            <a:off x="147861" y="48638"/>
+                            <a:ext cx="274955" cy="45085"/>
+                          </a:xfrm>
+                          <a:prstGeom prst="rect">
+                            <a:avLst/>
+                          </a:prstGeom>
+                          <a:noFill/>
+                          <a:ln>
+                            <a:noFill/>
+                          </a:ln>
+                        </pic:spPr>
+                      </pic:pic>
+                      <pic:pic xmlns:pic="http://schemas.openxmlformats.org/drawingml/2006/picture">
+                        <pic:nvPicPr>
+                          <pic:cNvPr id="1140137047" name="Picture 4"/>
+                          <pic:cNvPicPr>
+                            <a:picLocks noChangeAspect="1"/>
+                          </pic:cNvPicPr>
+                        </pic:nvPicPr>
+                        <pic:blipFill>
+                          <a:blip r:embed="rId16">
+                            <a:extLst>
+                              <a:ext uri="{28A0092B-C50C-407E-A947-70E740481C1C}">
+                                <a14:useLocalDpi xmlns:a14="http://schemas.microsoft.com/office/drawing/2010/main" val="0"/>
+                              </a:ext>
+                            </a:extLst>
+                          </a:blip>
+                          <a:srcRect/>
+                          <a:stretch>
+                            <a:fillRect/>
+                          </a:stretch>
+                        </pic:blipFill>
+                        <pic:spPr bwMode="auto">
+                          <a:xfrm>
+                            <a:off x="0" y="0"/>
+                            <a:ext cx="131445" cy="135890"/>
+                          </a:xfrm>
+                          <a:prstGeom prst="rect">
+                            <a:avLst/>
+                          </a:prstGeom>
+                          <a:noFill/>
+                          <a:ln>
+                            <a:noFill/>
+                          </a:ln>
+                        </pic:spPr>
+                      </pic:pic>
+                    </wpg:wgp>
+                  </a:graphicData>
+                </a:graphic>
+              </wp:inline>
+            </w:drawing>
+          </mc:Choice>
+          <mc:Fallback>
+            <w:pict>
+              <v:group w14:anchorId="793602D9" id="Group 6" o:spid="_x0000_s1026" style="width:33.3pt;height:10.7pt;mso-position-horizontal-relative:char;mso-position-vertical-relative:line" coordsize="422816,135890" o:gfxdata="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">
+                <v:shape id="Picture 5" o:spid="_x0000_s1027" type="#_x0000_t75" style="position:absolute;left:147861;top:48638;width:274955;height:45085;visibility:visible;mso-wrap-style:square" o:gfxdata="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">
+                  <v:imagedata r:id="rId17" o:title=""/>
+                </v:shape>
+                <v:shape id="Picture 4" o:spid="_x0000_s1028" type="#_x0000_t75" style="position:absolute;width:131445;height:135890;visibility:visible;mso-wrap-style:square" o:gfxdata="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">
+                  <v:imagedata r:id="rId18" o:title=""/>
+                </v:shape>
+                <w10:anchorlock/>
+              </v:group>
+            </w:pict>
+          </mc:Fallback>
+        </mc:AlternateContent>
+      </w:r>
+      <w:r>
+        <w:rPr>
+          <w:rFonts w:ascii="Noto Serif SC" w:eastAsia="Noto Serif SC" w:hAnsi="Noto Serif SC" w:cs="Noto Serif"/>
+          <w:bCs/>
+          <w:sz w:val="24"/>
+          <w:szCs w:val="24"/>
+        </w:rPr>
+        <w:t xml:space="preserve"> </w:t>
+      </w:r>
+      <w:r>
+        <w:rPr>
+          <w:rFonts w:ascii="Noto Serif SC" w:eastAsia="Noto Serif SC" w:hAnsi="Noto Serif SC" w:cs="Noto Serif" w:hint="eastAsia"/>
+          <w:bCs/>
+          <w:sz w:val="24"/>
+          <w:szCs w:val="24"/>
+        </w:rPr>
+        <w:t>：</w:t>
+      </w:r>
+      <w:r>
+        <w:rPr>
+          <w:rFonts w:ascii="Noto Serif SC" w:eastAsia="Noto Serif SC" w:hAnsi="Noto Serif SC" w:cs="Noto Serif" w:hint="eastAsia"/>
+          <w:bCs/>
+          <w:sz w:val="24"/>
+          <w:szCs w:val="24"/>
+        </w:rPr>
+        <w:t>持续轮指(包括满轮)。</w:t>
+      </w:r>
+    </w:p>
+    <w:p>
+      <w:pPr>
+        <w:rPr>
+          <w:rFonts w:ascii="Cambria" w:eastAsia="Noto Serif SC" w:hAnsi="Cambria" w:cs="Noto Serif"/>
+          <w:bCs/>
+          <w:sz w:val="24"/>
+          <w:szCs w:val="24"/>
+        </w:rPr>
+      </w:pPr>
+      <w:r>
+        <w:rPr>
+          <w:rFonts w:ascii="Cambria" w:eastAsia="Noto Serif SC" w:hAnsi="Cambria" w:cs="Noto Serif" w:hint="eastAsia"/>
+          <w:bCs/>
+          <w:sz w:val="24"/>
+          <w:szCs w:val="24"/>
+        </w:rPr>
+        <w:t xml:space="preserve"> </w:t>
+      </w:r>
+      <w:r>
+        <w:rPr>
+          <w:sz w:val="24"/>
+          <w:szCs w:val="24"/>
+        </w:rPr>
+        <w:pict w14:anchorId="62D7E167">
+          <v:shape id="Picture 7" o:spid="_x0000_i1038" type="#_x0000_t75" alt="A black background with a black square&#10;&#10;Description automatically generated with medium confidence" style="width:6.65pt;height:15.45pt;visibility:visible;mso-wrap-style:square">
+            <v:imagedata r:id="rId19" o:title="A black background with a black square&#10;&#10;Description automatically generated with medium confidence"/>
+          </v:shape>
+        </w:pict>
+      </w:r>
+      <w:r>
+        <w:rPr>
+          <w:rFonts w:ascii="Cambria" w:eastAsia="Noto Serif SC" w:hAnsi="Cambria" w:cs="Noto Serif" w:hint="eastAsia"/>
+          <w:bCs/>
+          <w:sz w:val="24"/>
+          <w:szCs w:val="24"/>
+        </w:rPr>
+        <w:t xml:space="preserve">  </w:t>
+      </w:r>
+      <w:r>
+        <w:rPr>
+          <w:rFonts w:ascii="Noto Serif SC" w:eastAsia="Noto Serif SC" w:hAnsi="Noto Serif SC" w:cs="Noto Serif" w:hint="eastAsia"/>
+          <w:bCs/>
+          <w:sz w:val="24"/>
+          <w:szCs w:val="24"/>
+        </w:rPr>
+        <w:t>：</w:t>
+      </w:r>
+      <w:r>
+        <w:rPr>
+          <w:rFonts w:ascii="Cambria" w:eastAsia="Noto Serif SC" w:hAnsi="Cambria" w:cs="Noto Serif" w:hint="eastAsia"/>
+          <w:bCs/>
+          <w:sz w:val="24"/>
+          <w:szCs w:val="24"/>
+        </w:rPr>
+        <w:t>连续快速弹挑</w:t>
+      </w:r>
+      <w:r>
+        <w:rPr>
+          <w:rFonts w:ascii="Cambria" w:eastAsia="Noto Serif SC" w:hAnsi="Cambria" w:cs="Noto Serif" w:hint="eastAsia"/>
+          <w:bCs/>
+          <w:sz w:val="24"/>
+          <w:szCs w:val="24"/>
+        </w:rPr>
+        <w:t>,</w:t>
+      </w:r>
+      <w:r>
+        <w:rPr>
+          <w:rFonts w:ascii="Cambria" w:eastAsia="Noto Serif SC" w:hAnsi="Cambria" w:cs="Noto Serif" w:hint="eastAsia"/>
+          <w:bCs/>
+          <w:sz w:val="24"/>
+          <w:szCs w:val="24"/>
+        </w:rPr>
+        <w:t>和震音的意义相同。</w:t>
+      </w:r>
+    </w:p>
+    <w:p>
+      <w:pPr>
+        <w:rPr>
+          <w:rFonts w:ascii="Cambria" w:eastAsia="Noto Serif SC" w:hAnsi="Cambria" w:cs="Noto Serif"/>
+          <w:bCs/>
+          <w:sz w:val="24"/>
+          <w:szCs w:val="24"/>
+        </w:rPr>
+      </w:pPr>
+      <w:r>
+        <w:rPr>
+          <w:noProof/>
+          <w:sz w:val="24"/>
+          <w:szCs w:val="24"/>
+        </w:rPr>
+      </w:r>
+      <w:r>
+        <w:rPr>
+          <w:sz w:val="24"/>
+          <w:szCs w:val="24"/>
+        </w:rPr>
+        <w:pict w14:anchorId="4865C032">
+          <v:shape id="Picture 9" o:spid="_x0000_s2050" type="#_x0000_t75" style="width:8.6pt;height:13.05pt;rotation:-610571fd;visibility:visible;mso-wrap-style:square;mso-left-percent:-10001;mso-top-percent:-10001;mso-position-horizontal:absolute;mso-position-horizontal-relative:char;mso-position-vertical:absolute;mso-position-vertical-relative:line;mso-left-percent:-10001;mso-top-percent:-10001">
+            <v:imagedata r:id="rId20" o:title=""/>
+            <w10:wrap type="none"/>
+            <w10:anchorlock/>
+          </v:shape>
+        </w:pict>
+      </w:r>
+      <w:r>
+        <w:rPr>
+          <w:rFonts w:ascii="Cambria" w:eastAsia="Noto Serif SC" w:hAnsi="Cambria" w:cs="Noto Serif" w:hint="eastAsia"/>
+          <w:bCs/>
+          <w:sz w:val="24"/>
+          <w:szCs w:val="24"/>
+        </w:rPr>
+        <w:t xml:space="preserve">  :  </w:t>
+      </w:r>
+      <w:r>
+        <w:rPr>
+          <w:rFonts w:ascii="Cambria" w:eastAsia="Noto Serif SC" w:hAnsi="Cambria" w:cs="Noto Serif" w:hint="eastAsia"/>
+          <w:bCs/>
+          <w:sz w:val="24"/>
+          <w:szCs w:val="24"/>
+        </w:rPr>
+        <w:t>扫弦</w:t>
+      </w:r>
+      <w:r>
+        <w:rPr>
+          <w:rFonts w:ascii="Cambria" w:eastAsia="Noto Serif SC" w:hAnsi="Cambria" w:cs="Noto Serif" w:hint="eastAsia"/>
+          <w:bCs/>
+          <w:sz w:val="24"/>
+          <w:szCs w:val="24"/>
+        </w:rPr>
+        <w:t>(</w:t>
+      </w:r>
+      <w:r>
+        <w:rPr>
+          <w:rFonts w:ascii="Cambria" w:eastAsia="Noto Serif SC" w:hAnsi="Cambria" w:cs="Noto Serif" w:hint="eastAsia"/>
+          <w:bCs/>
+          <w:sz w:val="24"/>
+          <w:szCs w:val="24"/>
+        </w:rPr>
+        <w:t>仅一下</w:t>
+      </w:r>
+      <w:r>
+        <w:rPr>
+          <w:rFonts w:ascii="Cambria" w:eastAsia="Noto Serif SC" w:hAnsi="Cambria" w:cs="Noto Serif" w:hint="eastAsia"/>
+          <w:bCs/>
+          <w:sz w:val="24"/>
+          <w:szCs w:val="24"/>
+        </w:rPr>
+        <w:t>)</w:t>
+      </w:r>
+      <w:r>
+        <w:rPr>
+          <w:rFonts w:ascii="Cambria" w:eastAsia="Noto Serif SC" w:hAnsi="Cambria" w:cs="Noto Serif" w:hint="eastAsia"/>
+          <w:bCs/>
+          <w:sz w:val="24"/>
+          <w:szCs w:val="24"/>
+        </w:rPr>
+        <w:t>。</w:t>
+      </w:r>
+    </w:p>
+    <w:p>
+      <w:pPr>
+        <w:rPr>
+          <w:rFonts w:ascii="Cambria" w:eastAsia="Noto Serif SC" w:hAnsi="Cambria" w:cs="Noto Serif"/>
+          <w:bCs/>
+          <w:sz w:val="24"/>
+          <w:szCs w:val="24"/>
+        </w:rPr>
+      </w:pPr>
+      <w:r>
+        <w:rPr>
+          <w:rFonts w:ascii="Cambria" w:eastAsia="Noto Serif SC" w:hAnsi="Cambria" w:cs="Noto Serif" w:hint="eastAsia"/>
+          <w:bCs/>
+          <w:noProof/>
+          <w:sz w:val="24"/>
+          <w:szCs w:val="24"/>
+        </w:rPr>
+        <mc:AlternateContent>
+          <mc:Choice Requires="wpg">
+            <w:drawing>
+              <wp:inline distT="0" distB="0" distL="0" distR="0" wp14:anchorId="7B3ABF8E" wp14:editId="377BB1A2">
+                <wp:extent cx="405130" cy="165735"/>
+                <wp:effectExtent l="19050" t="19050" r="0" b="24765"/>
+                <wp:docPr id="1699388499" name="Group 11"/>
+                <wp:cNvGraphicFramePr/>
+                <a:graphic xmlns:a="http://schemas.openxmlformats.org/drawingml/2006/main">
+                  <a:graphicData uri="http://schemas.microsoft.com/office/word/2010/wordprocessingGroup">
+                    <wpg:wgp>
+                      <wpg:cNvGrpSpPr/>
+                      <wpg:grpSpPr>
+                        <a:xfrm>
+                          <a:off x="0" y="0"/>
+                          <a:ext cx="405130" cy="165735"/>
+                          <a:chOff x="0" y="0"/>
+                          <a:chExt cx="405130" cy="165735"/>
+                        </a:xfrm>
+                      </wpg:grpSpPr>
+                      <pic:pic xmlns:pic="http://schemas.openxmlformats.org/drawingml/2006/picture">
+                        <pic:nvPicPr>
+                          <pic:cNvPr id="1615427624" name="Picture 10" descr="A black background with a black square&#10;&#10;Description automatically generated with medium confidence"/>
+                          <pic:cNvPicPr>
+                            <a:picLocks noChangeAspect="1"/>
+                          </pic:cNvPicPr>
+                        </pic:nvPicPr>
+                        <pic:blipFill>
+                          <a:blip r:embed="rId21" cstate="print">
+                            <a:extLst>
+                              <a:ext uri="{28A0092B-C50C-407E-A947-70E740481C1C}">
+                                <a14:useLocalDpi xmlns:a14="http://schemas.microsoft.com/office/drawing/2010/main" val="0"/>
+                              </a:ext>
+                            </a:extLst>
+                          </a:blip>
+                          <a:srcRect/>
+                          <a:stretch>
+                            <a:fillRect/>
+                          </a:stretch>
+                        </pic:blipFill>
+                        <pic:spPr bwMode="auto">
+                          <a:xfrm rot="-558994">
+                            <a:off x="0" y="0"/>
+                            <a:ext cx="109220" cy="165735"/>
+                          </a:xfrm>
+                          <a:prstGeom prst="rect">
+                            <a:avLst/>
+                          </a:prstGeom>
+                          <a:noFill/>
+                          <a:ln>
+                            <a:noFill/>
+                          </a:ln>
+                        </pic:spPr>
+                      </pic:pic>
+                      <pic:pic xmlns:pic="http://schemas.openxmlformats.org/drawingml/2006/picture">
+                        <pic:nvPicPr>
+                          <pic:cNvPr id="177948281" name="Picture 5" descr="A black background with a black square&#10;&#10;Description automatically generated with medium confidence"/>
+                          <pic:cNvPicPr>
+                            <a:picLocks noChangeAspect="1"/>
+                          </pic:cNvPicPr>
+                        </pic:nvPicPr>
+                        <pic:blipFill>
+                          <a:blip r:embed="rId15" cstate="print">
+                            <a:extLst>
+                              <a:ext uri="{28A0092B-C50C-407E-A947-70E740481C1C}">
+                                <a14:useLocalDpi xmlns:a14="http://schemas.microsoft.com/office/drawing/2010/main" val="0"/>
+                              </a:ext>
+                            </a:extLst>
+                          </a:blip>
+                          <a:srcRect/>
+                          <a:stretch>
+                            <a:fillRect/>
+                          </a:stretch>
+                        </pic:blipFill>
+                        <pic:spPr bwMode="auto">
+                          <a:xfrm>
+                            <a:off x="130175" y="50800"/>
+                            <a:ext cx="274955" cy="45085"/>
+                          </a:xfrm>
+                          <a:prstGeom prst="rect">
+                            <a:avLst/>
+                          </a:prstGeom>
+                          <a:noFill/>
+                          <a:ln>
+                            <a:noFill/>
+                          </a:ln>
+                        </pic:spPr>
+                      </pic:pic>
+                    </wpg:wgp>
+                  </a:graphicData>
+                </a:graphic>
+              </wp:inline>
+            </w:drawing>
+          </mc:Choice>
+          <mc:Fallback>
+            <w:pict>
+              <v:group w14:anchorId="1335BF99" id="Group 11" o:spid="_x0000_s1026" style="width:31.9pt;height:13.05pt;mso-position-horizontal-relative:char;mso-position-vertical-relative:line" coordsize="405130,165735" o:gfxdata="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">
+                <v:shape id="Picture 10" o:spid="_x0000_s1027" type="#_x0000_t75" alt="A black background with a black square&#10;&#10;Description automatically generated with medium confidence" style="position:absolute;width:109220;height:165735;rotation:-610571fd;visibility:visible;mso-wrap-style:square" o:gfxdata="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">
+                  <v:imagedata r:id="rId20" o:title="A black background with a black square&#10;&#10;Description automatically generated with medium confidence"/>
+                </v:shape>
+                <v:shape id="Picture 5" o:spid="_x0000_s1028" type="#_x0000_t75" alt="A black background with a black square&#10;&#10;Description automatically generated with medium confidence" style="position:absolute;left:130175;top:50800;width:274955;height:45085;visibility:visible;mso-wrap-style:square" o:gfxdata="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">
+                  <v:imagedata r:id="rId17" o:title="A black background with a black square&#10;&#10;Description automatically generated with medium confidence"/>
+                </v:shape>
+                <w10:anchorlock/>
+              </v:group>
+            </w:pict>
+          </mc:Fallback>
+        </mc:AlternateContent>
+      </w:r>
+      <w:r>
+        <w:rPr>
+          <w:rFonts w:ascii="Cambria" w:eastAsia="Noto Serif SC" w:hAnsi="Cambria" w:cs="Noto Serif" w:hint="eastAsia"/>
+          <w:bCs/>
+          <w:sz w:val="24"/>
+          <w:szCs w:val="24"/>
+        </w:rPr>
+        <w:t xml:space="preserve"> </w:t>
+      </w:r>
+      <w:r>
+        <w:rPr>
+          <w:rFonts w:ascii="Cambria" w:eastAsia="Noto Serif SC" w:hAnsi="Cambria" w:cs="Noto Serif" w:hint="eastAsia"/>
+          <w:bCs/>
+          <w:sz w:val="24"/>
+          <w:szCs w:val="24"/>
+        </w:rPr>
+        <w:t xml:space="preserve">:  </w:t>
+      </w:r>
+      <w:r>
+        <w:rPr>
+          <w:rFonts w:ascii="Cambria" w:eastAsia="Noto Serif SC" w:hAnsi="Cambria" w:cs="Noto Serif" w:hint="eastAsia"/>
+          <w:bCs/>
+          <w:sz w:val="24"/>
+          <w:szCs w:val="24"/>
+        </w:rPr>
+        <w:t>连续扫拂</w:t>
+      </w:r>
+      <w:r>
+        <w:rPr>
+          <w:rFonts w:ascii="Cambria" w:eastAsia="Noto Serif SC" w:hAnsi="Cambria" w:cs="Noto Serif" w:hint="eastAsia"/>
+          <w:bCs/>
+          <w:sz w:val="24"/>
+          <w:szCs w:val="24"/>
+        </w:rPr>
+        <w:t xml:space="preserve"> </w:t>
+      </w:r>
+      <w:r>
+        <w:rPr>
+          <w:rFonts w:ascii="Cambria" w:eastAsia="Noto Serif SC" w:hAnsi="Cambria" w:cs="Noto Serif" w:hint="eastAsia"/>
+          <w:bCs/>
+          <w:sz w:val="24"/>
+          <w:szCs w:val="24"/>
+        </w:rPr>
+        <w:t>(</w:t>
+      </w:r>
+      <w:r>
+        <w:rPr>
+          <w:rFonts w:ascii="Cambria" w:eastAsia="Noto Serif SC" w:hAnsi="Cambria" w:cs="Noto Serif"/>
+          <w:bCs/>
+          <w:sz w:val="24"/>
+          <w:szCs w:val="24"/>
+        </w:rPr>
+        <w:t>“</w:t>
+      </w:r>
+      <w:proofErr w:type="gramStart"/>
+      <w:r>
+        <w:rPr>
+          <w:rFonts w:ascii="Cambria" w:eastAsia="Noto Serif SC" w:hAnsi="Cambria" w:cs="Noto Serif" w:hint="eastAsia"/>
+          <w:bCs/>
+          <w:sz w:val="24"/>
+          <w:szCs w:val="24"/>
+        </w:rPr>
+        <w:t>拂</w:t>
+      </w:r>
+      <w:r>
+        <w:rPr>
+          <w:rFonts w:ascii="Cambria" w:eastAsia="Noto Serif SC" w:hAnsi="Cambria" w:cs="Noto Serif"/>
+          <w:bCs/>
+          <w:sz w:val="24"/>
+          <w:szCs w:val="24"/>
+        </w:rPr>
+        <w:t>”</w:t>
+      </w:r>
+      <w:r>
+        <w:rPr>
+          <w:rFonts w:ascii="Cambria" w:eastAsia="Noto Serif SC" w:hAnsi="Cambria" w:cs="Noto Serif" w:hint="eastAsia"/>
+          <w:bCs/>
+          <w:sz w:val="24"/>
+          <w:szCs w:val="24"/>
+        </w:rPr>
+        <w:t>记号省略</w:t>
+      </w:r>
+      <w:proofErr w:type="gramEnd"/>
+      <w:r>
+        <w:rPr>
+          <w:rFonts w:ascii="Cambria" w:eastAsia="Noto Serif SC" w:hAnsi="Cambria" w:cs="Noto Serif" w:hint="eastAsia"/>
+          <w:bCs/>
+          <w:sz w:val="24"/>
+          <w:szCs w:val="24"/>
+        </w:rPr>
+        <w:t>)</w:t>
+      </w:r>
+      <w:r>
+        <w:rPr>
+          <w:rFonts w:ascii="Cambria" w:eastAsia="Noto Serif SC" w:hAnsi="Cambria" w:cs="Noto Serif" w:hint="eastAsia"/>
+          <w:bCs/>
+          <w:sz w:val="24"/>
+          <w:szCs w:val="24"/>
+        </w:rPr>
+        <w:t>。</w:t>
+      </w:r>
+    </w:p>
+    <w:p>
+      <w:pPr>
+        <w:rPr>
+          <w:rFonts w:ascii="Cambria" w:eastAsia="Noto Serif SC" w:hAnsi="Cambria" w:cs="Noto Serif"/>
+          <w:bCs/>
+          <w:sz w:val="24"/>
+          <w:szCs w:val="24"/>
+        </w:rPr>
+      </w:pPr>
+      <w:r>
+        <w:rPr>
+          <w:rFonts w:ascii="Cambria" w:eastAsia="Noto Serif SC" w:hAnsi="Cambria" w:cs="Noto Serif" w:hint="eastAsia"/>
+          <w:bCs/>
+          <w:sz w:val="24"/>
+          <w:szCs w:val="24"/>
+        </w:rPr>
+        <w:t xml:space="preserve">K: </w:t>
+      </w:r>
+      <w:r>
+        <w:rPr>
+          <w:rFonts w:ascii="Cambria" w:eastAsia="Noto Serif SC" w:hAnsi="Cambria" w:cs="Noto Serif" w:hint="eastAsia"/>
+          <w:bCs/>
+          <w:sz w:val="24"/>
+          <w:szCs w:val="24"/>
+        </w:rPr>
+        <w:t>(</w:t>
+      </w:r>
+      <w:r>
+        <w:rPr>
+          <w:rFonts w:ascii="Cambria" w:eastAsia="Noto Serif SC" w:hAnsi="Cambria" w:cs="Noto Serif" w:hint="eastAsia"/>
+          <w:bCs/>
+          <w:sz w:val="24"/>
+          <w:szCs w:val="24"/>
+        </w:rPr>
+        <w:t>没有符头的音</w:t>
+      </w:r>
+      <w:r>
+        <w:rPr>
+          <w:rFonts w:ascii="Cambria" w:eastAsia="Noto Serif SC" w:hAnsi="Cambria" w:cs="Noto Serif" w:hint="eastAsia"/>
+          <w:bCs/>
+          <w:sz w:val="24"/>
+          <w:szCs w:val="24"/>
+        </w:rPr>
+        <w:t>)</w:t>
+      </w:r>
+      <w:r>
+        <w:rPr>
+          <w:rFonts w:ascii="Cambria" w:eastAsia="Noto Serif SC" w:hAnsi="Cambria" w:cs="Noto Serif" w:hint="eastAsia"/>
+          <w:bCs/>
+          <w:sz w:val="24"/>
+          <w:szCs w:val="24"/>
+        </w:rPr>
+        <w:t xml:space="preserve"> </w:t>
+      </w:r>
+      <w:r>
+        <w:rPr>
+          <w:rFonts w:ascii="Cambria" w:eastAsia="Noto Serif SC" w:hAnsi="Cambria" w:cs="Noto Serif" w:hint="eastAsia"/>
+          <w:bCs/>
+          <w:sz w:val="24"/>
+          <w:szCs w:val="24"/>
+        </w:rPr>
+        <w:t>意为绞弦演奏</w:t>
+      </w:r>
+      <w:r>
+        <w:rPr>
+          <w:rFonts w:ascii="Cambria" w:eastAsia="Noto Serif SC" w:hAnsi="Cambria" w:cs="Noto Serif" w:hint="eastAsia"/>
+          <w:bCs/>
+          <w:sz w:val="24"/>
+          <w:szCs w:val="24"/>
+        </w:rPr>
+        <w:t>。</w:t>
+      </w:r>
+    </w:p>
+    <w:p>
+      <w:pPr>
+        <w:rPr>
+          <w:rFonts w:ascii="Cambria" w:eastAsia="Noto Serif SC" w:hAnsi="Cambria" w:cs="Noto Serif" w:hint="eastAsia"/>
+          <w:bCs/>
+          <w:sz w:val="24"/>
+          <w:szCs w:val="24"/>
         </w:rPr>
       </w:pPr>
     </w:p>
@@ -6283,7 +7903,129 @@
 
 <file path=word/numbering.xml><?xml version="1.0" encoding="utf-8"?>
 <w:numbering xmlns:wpc="http://schemas.microsoft.com/office/word/2010/wordprocessingCanvas" xmlns:cx="http://schemas.microsoft.com/office/drawing/2014/chartex" xmlns:cx1="http://schemas.microsoft.com/office/drawing/2015/9/8/chartex" xmlns:cx2="http://schemas.microsoft.com/office/drawing/2015/10/21/chartex" xmlns:cx3="http://schemas.microsoft.com/office/drawing/2016/5/9/chartex" xmlns:cx4="http://schemas.microsoft.com/office/drawing/2016/5/10/chartex" xmlns:cx5="http://schemas.microsoft.com/office/drawing/2016/5/11/chartex" xmlns:cx6="http://schemas.microsoft.com/office/drawing/2016/5/12/chartex" xmlns:cx7="http://schemas.microsoft.com/office/drawing/2016/5/13/chartex" xmlns:cx8="http://schemas.microsoft.com/office/drawing/2016/5/14/chartex" xmlns:mc="http://schemas.openxmlformats.org/markup-compatibility/2006" xmlns:aink="http://schemas.microsoft.com/office/drawing/2016/ink" xmlns:am3d="http://schemas.microsoft.com/office/drawing/2017/model3d" xmlns:o="urn:schemas-microsoft-com:office:office" xmlns:oel="http://schemas.microsoft.com/office/2019/extlst" xmlns:r="http://schemas.openxmlformats.org/officeDocument/2006/relationships" xmlns:m="http://schemas.openxmlformats.org/officeDocument/2006/math" xmlns:v="urn:schemas-microsoft-com:vml" xmlns:wp14="http://schemas.microsoft.com/office/word/2010/wordprocessingDrawing" xmlns:wp="http://schemas.openxmlformats.org/drawingml/2006/wordprocessingDrawing" xmlns:w10="urn:schemas-microsoft-com:office:word" xmlns:w="http://schemas.openxmlformats.org/wordprocessingml/2006/main" xmlns:w14="http://schemas.microsoft.com/office/word/2010/wordml" xmlns:w15="http://schemas.microsoft.com/office/word/2012/wordml" xmlns:w16cex="http://schemas.microsoft.com/office/word/2018/wordml/cex" xmlns:w16cid="http://schemas.microsoft.com/office/word/2016/wordml/cid" xmlns:w16="http://schemas.microsoft.com/office/word/2018/wordml" xmlns:w16du="http://schemas.microsoft.com/office/word/2023/wordml/word16du" xmlns:w16sdtdh="http://schemas.microsoft.com/office/word/2020/wordml/sdtdatahash" xmlns:w16se="http://schemas.microsoft.com/office/word/2015/wordml/symex" xmlns:wpg="http://schemas.microsoft.com/office/word/2010/wordprocessingGroup" xmlns:wpi="http://schemas.microsoft.com/office/word/2010/wordprocessingInk" xmlns:wne="http://schemas.microsoft.com/office/word/2006/wordml" xmlns:wps="http://schemas.microsoft.com/office/word/2010/wordprocessingShape" mc:Ignorable="w14 w15 w16se w16cid w16 w16cex w16sdtdh w16du wp14">
+  <w:numPicBullet w:numPicBulletId="0">
+    <w:pict>
+      <v:shapetype id="_x0000_t75" coordsize="21600,21600" o:spt="75" o:preferrelative="t" path="m@4@5l@4@11@9@11@9@5xe" filled="f" stroked="f">
+        <v:stroke joinstyle="miter"/>
+        <v:formulas>
+          <v:f eqn="if lineDrawn pixelLineWidth 0"/>
+          <v:f eqn="sum @0 1 0"/>
+          <v:f eqn="sum 0 0 @1"/>
+          <v:f eqn="prod @2 1 2"/>
+          <v:f eqn="prod @3 21600 pixelWidth"/>
+          <v:f eqn="prod @3 21600 pixelHeight"/>
+          <v:f eqn="sum @0 0 1"/>
+          <v:f eqn="prod @6 1 2"/>
+          <v:f eqn="prod @7 21600 pixelWidth"/>
+          <v:f eqn="sum @8 21600 0"/>
+          <v:f eqn="prod @7 21600 pixelHeight"/>
+          <v:f eqn="sum @10 21600 0"/>
+        </v:formulas>
+        <v:path o:extrusionok="f" gradientshapeok="t" o:connecttype="rect"/>
+        <o:lock v:ext="edit" aspectratio="t"/>
+      </v:shapetype>
+      <v:shape id="_x0000_i1050" type="#_x0000_t75" alt="A black background with a black square&#10;&#10;Description automatically generated with medium confidence" style="width:3in;height:522.1pt;visibility:visible;mso-wrap-style:square" o:bullet="t">
+        <v:imagedata r:id="rId1" o:title="A black background with a black square&#10;&#10;Description automatically generated with medium confidence"/>
+      </v:shape>
+    </w:pict>
+  </w:numPicBullet>
+  <w:numPicBullet w:numPicBulletId="1">
+    <w:pict>
+      <v:shape id="_x0000_i1051" type="#_x0000_t75" style="width:278.3pt;height:422.7pt;flip:x;visibility:visible;mso-wrap-style:square" o:bullet="t">
+        <v:imagedata r:id="rId2" o:title=""/>
+      </v:shape>
+    </w:pict>
+  </w:numPicBullet>
   <w:abstractNum w:abstractNumId="0" w15:restartNumberingAfterBreak="0">
+    <w:nsid w:val="28FD3A89"/>
+    <w:multiLevelType w:val="hybridMultilevel"/>
+    <w:tmpl w:val="912CA8D0"/>
+    <w:lvl w:ilvl="0" w:tplc="9B42C0B0">
+      <w:start w:val="1"/>
+      <w:numFmt w:val="decimal"/>
+      <w:lvlText w:val="(%1)"/>
+      <w:lvlJc w:val="left"/>
+      <w:pPr>
+        <w:ind w:left="720" w:hanging="360"/>
+      </w:pPr>
+      <w:rPr>
+        <w:rFonts w:hint="default"/>
+      </w:rPr>
+    </w:lvl>
+    <w:lvl w:ilvl="1" w:tplc="08090019" w:tentative="1">
+      <w:start w:val="1"/>
+      <w:numFmt w:val="lowerLetter"/>
+      <w:lvlText w:val="%2."/>
+      <w:lvlJc w:val="left"/>
+      <w:pPr>
+        <w:ind w:left="1440" w:hanging="360"/>
+      </w:pPr>
+    </w:lvl>
+    <w:lvl w:ilvl="2" w:tplc="0809001B" w:tentative="1">
+      <w:start w:val="1"/>
+      <w:numFmt w:val="lowerRoman"/>
+      <w:lvlText w:val="%3."/>
+      <w:lvlJc w:val="right"/>
+      <w:pPr>
+        <w:ind w:left="2160" w:hanging="180"/>
+      </w:pPr>
+    </w:lvl>
+    <w:lvl w:ilvl="3" w:tplc="0809000F" w:tentative="1">
+      <w:start w:val="1"/>
+      <w:numFmt w:val="decimal"/>
+      <w:lvlText w:val="%4."/>
+      <w:lvlJc w:val="left"/>
+      <w:pPr>
+        <w:ind w:left="2880" w:hanging="360"/>
+      </w:pPr>
+    </w:lvl>
+    <w:lvl w:ilvl="4" w:tplc="08090019" w:tentative="1">
+      <w:start w:val="1"/>
+      <w:numFmt w:val="lowerLetter"/>
+      <w:lvlText w:val="%5."/>
+      <w:lvlJc w:val="left"/>
+      <w:pPr>
+        <w:ind w:left="3600" w:hanging="360"/>
+      </w:pPr>
+    </w:lvl>
+    <w:lvl w:ilvl="5" w:tplc="0809001B" w:tentative="1">
+      <w:start w:val="1"/>
+      <w:numFmt w:val="lowerRoman"/>
+      <w:lvlText w:val="%6."/>
+      <w:lvlJc w:val="right"/>
+      <w:pPr>
+        <w:ind w:left="4320" w:hanging="180"/>
+      </w:pPr>
+    </w:lvl>
+    <w:lvl w:ilvl="6" w:tplc="0809000F" w:tentative="1">
+      <w:start w:val="1"/>
+      <w:numFmt w:val="decimal"/>
+      <w:lvlText w:val="%7."/>
+      <w:lvlJc w:val="left"/>
+      <w:pPr>
+        <w:ind w:left="5040" w:hanging="360"/>
+      </w:pPr>
+    </w:lvl>
+    <w:lvl w:ilvl="7" w:tplc="08090019" w:tentative="1">
+      <w:start w:val="1"/>
+      <w:numFmt w:val="lowerLetter"/>
+      <w:lvlText w:val="%8."/>
+      <w:lvlJc w:val="left"/>
+      <w:pPr>
+        <w:ind w:left="5760" w:hanging="360"/>
+      </w:pPr>
+    </w:lvl>
+    <w:lvl w:ilvl="8" w:tplc="0809001B" w:tentative="1">
+      <w:start w:val="1"/>
+      <w:numFmt w:val="lowerRoman"/>
+      <w:lvlText w:val="%9."/>
+      <w:lvlJc w:val="right"/>
+      <w:pPr>
+        <w:ind w:left="6480" w:hanging="180"/>
+      </w:pPr>
+    </w:lvl>
+  </w:abstractNum>
+  <w:abstractNum w:abstractNumId="1" w15:restartNumberingAfterBreak="0">
     <w:nsid w:val="290678A1"/>
     <w:multiLevelType w:val="hybridMultilevel"/>
     <w:tmpl w:val="A3928B82"/>
@@ -6396,6 +8138,9 @@
     </w:lvl>
   </w:abstractNum>
   <w:num w:numId="1" w16cid:durableId="535773423">
+    <w:abstractNumId w:val="1"/>
+  </w:num>
+  <w:num w:numId="2" w16cid:durableId="318920945">
     <w:abstractNumId w:val="0"/>
   </w:num>
 </w:numbering>
@@ -6820,7 +8565,6 @@
   <w:style w:type="character" w:default="1" w:styleId="DefaultParagraphFont">
     <w:name w:val="Default Paragraph Font"/>
     <w:uiPriority w:val="1"/>
-    <w:semiHidden/>
     <w:unhideWhenUsed/>
   </w:style>
   <w:style w:type="table" w:default="1" w:styleId="TableNormal">
@@ -6919,6 +8663,18 @@
     <w:rPr>
       <w:color w:val="0563C1" w:themeColor="hyperlink"/>
       <w:u w:val="single"/>
+    </w:rPr>
+  </w:style>
+  <w:style w:type="character" w:styleId="UnresolvedMention">
+    <w:name w:val="Unresolved Mention"/>
+    <w:basedOn w:val="DefaultParagraphFont"/>
+    <w:uiPriority w:val="99"/>
+    <w:semiHidden/>
+    <w:unhideWhenUsed/>
+    <w:rsid w:val="00EA66C2"/>
+    <w:rPr>
+      <w:color w:val="605E5C"/>
+      <w:shd w:val="clear" w:color="auto" w:fill="E1DFDD"/>
     </w:rPr>
   </w:style>
 </w:styles>

</xml_diff>

<commit_message>
Included graphical elements from Piece 3 (for front matter (extended) techniques)
</commit_message>
<xml_diff>
--- a/Front Matter/Template/3_Front-Matter.docx
+++ b/Front Matter/Template/3_Front-Matter.docx
@@ -6876,6 +6876,62 @@
           <w:sz w:val="24"/>
           <w:szCs w:val="24"/>
         </w:rPr>
+        <w:t xml:space="preserve"> Harmonics</w:t>
+      </w:r>
+      <w:r>
+        <w:rPr>
+          <w:rFonts w:ascii="Noto Serif SC" w:eastAsia="Noto Serif SC" w:hAnsi="Noto Serif SC" w:cs="Noto Serif" w:hint="eastAsia"/>
+          <w:bCs/>
+          <w:sz w:val="24"/>
+          <w:szCs w:val="24"/>
+        </w:rPr>
+        <w:t>：</w:t>
+      </w:r>
+    </w:p>
+    <w:p>
+      <w:pPr>
+        <w:ind w:firstLine="720"/>
+        <w:rPr>
+          <w:rFonts w:ascii="Noto Serif SC" w:eastAsia="Noto Serif SC" w:hAnsi="Noto Serif SC" w:cs="Noto Serif"/>
+          <w:bCs/>
+          <w:sz w:val="24"/>
+          <w:szCs w:val="24"/>
+        </w:rPr>
+      </w:pPr>
+      <w:r>
+        <w:rPr>
+          <w:rFonts w:ascii="Noto Serif SC" w:eastAsia="Noto Serif SC" w:hAnsi="Noto Serif SC" w:cs="Noto Serif" w:hint="eastAsia"/>
+          <w:bCs/>
+          <w:sz w:val="24"/>
+          <w:szCs w:val="24"/>
+        </w:rPr>
+        <w:t>记谱</w:t>
+      </w:r>
+      <w:r>
+        <w:rPr>
+          <w:rFonts w:ascii="Noto Serif SC" w:eastAsia="Noto Serif SC" w:hAnsi="Noto Serif SC" w:cs="Noto Serif" w:hint="eastAsia"/>
+          <w:bCs/>
+          <w:sz w:val="24"/>
+          <w:szCs w:val="24"/>
+        </w:rPr>
+        <w:t>：</w:t>
+      </w:r>
+      <w:r>
+        <w:rPr>
+          <w:rFonts w:ascii="Noto Serif SC" w:eastAsia="Noto Serif SC" w:hAnsi="Noto Serif SC" w:cs="Noto Serif"/>
+          <w:bCs/>
+          <w:sz w:val="24"/>
+          <w:szCs w:val="24"/>
+        </w:rPr>
+        <w:t>◯</w:t>
+      </w:r>
+      <w:r>
+        <w:rPr>
+          <w:rFonts w:ascii="Noto Serif SC" w:eastAsia="Noto Serif SC" w:hAnsi="Noto Serif SC" w:cs="Noto Serif" w:hint="eastAsia"/>
+          <w:bCs/>
+          <w:sz w:val="24"/>
+          <w:szCs w:val="24"/>
+        </w:rPr>
         <w:t xml:space="preserve"> </w:t>
       </w:r>
       <w:r>
@@ -6885,25 +6941,34 @@
           <w:sz w:val="24"/>
           <w:szCs w:val="24"/>
         </w:rPr>
-        <w:t>Harmonic</w:t>
-      </w:r>
-      <w:r>
-        <w:rPr>
-          <w:rFonts w:ascii="Noto Serif SC" w:eastAsia="Noto Serif SC" w:hAnsi="Noto Serif SC" w:cs="Noto Serif" w:hint="eastAsia"/>
-          <w:bCs/>
-          <w:sz w:val="24"/>
-          <w:szCs w:val="24"/>
-        </w:rPr>
-        <w:t>s</w:t>
-      </w:r>
-      <w:r>
-        <w:rPr>
-          <w:rFonts w:ascii="Noto Serif SC" w:eastAsia="Noto Serif SC" w:hAnsi="Noto Serif SC" w:cs="Noto Serif" w:hint="eastAsia"/>
-          <w:bCs/>
-          <w:sz w:val="24"/>
-          <w:szCs w:val="24"/>
-        </w:rPr>
-        <w:t>：</w:t>
+        <w:t>（</w:t>
+      </w:r>
+      <w:r>
+        <w:rPr>
+          <w:rFonts w:ascii="Noto Serif SC" w:eastAsia="Noto Serif SC" w:hAnsi="Noto Serif SC" w:cs="Noto Serif" w:hint="eastAsia"/>
+          <w:bCs/>
+          <w:sz w:val="24"/>
+          <w:szCs w:val="24"/>
+        </w:rPr>
+        <w:t>泛音音程和泛音和弦同样仅仅使用单个泛音记号表示</w:t>
+      </w:r>
+      <w:r>
+        <w:rPr>
+          <w:rFonts w:ascii="Noto Serif SC" w:eastAsia="Noto Serif SC" w:hAnsi="Noto Serif SC" w:cs="Noto Serif" w:hint="eastAsia"/>
+          <w:bCs/>
+          <w:sz w:val="24"/>
+          <w:szCs w:val="24"/>
+        </w:rPr>
+        <w:t>）</w:t>
+      </w:r>
+      <w:r>
+        <w:rPr>
+          <w:rFonts w:ascii="Noto Serif SC" w:eastAsia="Noto Serif SC" w:hAnsi="Noto Serif SC" w:cs="Noto Serif" w:hint="eastAsia"/>
+          <w:bCs/>
+          <w:sz w:val="24"/>
+          <w:szCs w:val="24"/>
+        </w:rPr>
+        <w:t>。</w:t>
       </w:r>
     </w:p>
     <w:p>
@@ -6911,89 +6976,6 @@
         <w:ind w:firstLine="720"/>
         <w:rPr>
           <w:rFonts w:ascii="Noto Serif SC" w:eastAsia="Noto Serif SC" w:hAnsi="Noto Serif SC" w:cs="Noto Serif"/>
-          <w:bCs/>
-          <w:sz w:val="24"/>
-          <w:szCs w:val="24"/>
-        </w:rPr>
-      </w:pPr>
-      <w:r>
-        <w:rPr>
-          <w:rFonts w:ascii="Noto Serif SC" w:eastAsia="Noto Serif SC" w:hAnsi="Noto Serif SC" w:cs="Noto Serif" w:hint="eastAsia"/>
-          <w:bCs/>
-          <w:sz w:val="24"/>
-          <w:szCs w:val="24"/>
-        </w:rPr>
-        <w:t>记谱</w:t>
-      </w:r>
-      <w:r>
-        <w:rPr>
-          <w:rFonts w:ascii="Noto Serif SC" w:eastAsia="Noto Serif SC" w:hAnsi="Noto Serif SC" w:cs="Noto Serif" w:hint="eastAsia"/>
-          <w:bCs/>
-          <w:sz w:val="24"/>
-          <w:szCs w:val="24"/>
-        </w:rPr>
-        <w:t>：</w:t>
-      </w:r>
-      <w:r>
-        <w:rPr>
-          <w:rFonts w:ascii="Noto Serif SC" w:eastAsia="Noto Serif SC" w:hAnsi="Noto Serif SC" w:cs="Noto Serif"/>
-          <w:bCs/>
-          <w:sz w:val="24"/>
-          <w:szCs w:val="24"/>
-        </w:rPr>
-        <w:t>◯</w:t>
-      </w:r>
-      <w:r>
-        <w:rPr>
-          <w:rFonts w:ascii="Noto Serif SC" w:eastAsia="Noto Serif SC" w:hAnsi="Noto Serif SC" w:cs="Noto Serif" w:hint="eastAsia"/>
-          <w:bCs/>
-          <w:sz w:val="24"/>
-          <w:szCs w:val="24"/>
-        </w:rPr>
-        <w:t xml:space="preserve"> </w:t>
-      </w:r>
-      <w:r>
-        <w:rPr>
-          <w:rFonts w:ascii="Noto Serif SC" w:eastAsia="Noto Serif SC" w:hAnsi="Noto Serif SC" w:cs="Noto Serif" w:hint="eastAsia"/>
-          <w:bCs/>
-          <w:sz w:val="24"/>
-          <w:szCs w:val="24"/>
-        </w:rPr>
-        <w:t>（</w:t>
-      </w:r>
-      <w:r>
-        <w:rPr>
-          <w:rFonts w:ascii="Noto Serif SC" w:eastAsia="Noto Serif SC" w:hAnsi="Noto Serif SC" w:cs="Noto Serif" w:hint="eastAsia"/>
-          <w:bCs/>
-          <w:sz w:val="24"/>
-          <w:szCs w:val="24"/>
-        </w:rPr>
-        <w:t>泛音音程和泛音和弦同样仅仅使用单个泛音记号表示</w:t>
-      </w:r>
-      <w:r>
-        <w:rPr>
-          <w:rFonts w:ascii="Noto Serif SC" w:eastAsia="Noto Serif SC" w:hAnsi="Noto Serif SC" w:cs="Noto Serif" w:hint="eastAsia"/>
-          <w:bCs/>
-          <w:sz w:val="24"/>
-          <w:szCs w:val="24"/>
-        </w:rPr>
-        <w:t>）</w:t>
-      </w:r>
-      <w:r>
-        <w:rPr>
-          <w:rFonts w:ascii="Noto Serif SC" w:eastAsia="Noto Serif SC" w:hAnsi="Noto Serif SC" w:cs="Noto Serif" w:hint="eastAsia"/>
-          <w:bCs/>
-          <w:sz w:val="24"/>
-          <w:szCs w:val="24"/>
-        </w:rPr>
-        <w:t>。</w:t>
-      </w:r>
-    </w:p>
-    <w:p>
-      <w:pPr>
-        <w:ind w:firstLine="720"/>
-        <w:rPr>
-          <w:rFonts w:ascii="Noto Serif SC" w:eastAsia="Noto Serif SC" w:hAnsi="Noto Serif SC" w:cs="Noto Serif" w:hint="eastAsia"/>
           <w:bCs/>
           <w:sz w:val="24"/>
           <w:szCs w:val="24"/>
@@ -7210,7 +7192,7 @@
       <w:pPr>
         <w:pStyle w:val="ListParagraph"/>
         <w:rPr>
-          <w:rFonts w:ascii="Noto Serif SC" w:eastAsia="Noto Serif SC" w:hAnsi="Noto Serif SC" w:cs="Noto Serif" w:hint="eastAsia"/>
+          <w:rFonts w:ascii="Noto Serif SC" w:eastAsia="Noto Serif SC" w:hAnsi="Noto Serif SC" w:cs="Noto Serif"/>
           <w:bCs/>
           <w:sz w:val="24"/>
           <w:szCs w:val="24"/>
@@ -7232,25 +7214,7 @@
           <w:sz w:val="24"/>
           <w:szCs w:val="24"/>
         </w:rPr>
-        <w:t>All s</w:t>
-      </w:r>
-      <w:r>
-        <w:rPr>
-          <w:rFonts w:ascii="Noto Serif SC" w:eastAsia="Noto Serif SC" w:hAnsi="Noto Serif SC" w:cs="Noto Serif" w:hint="eastAsia"/>
-          <w:bCs/>
-          <w:sz w:val="24"/>
-          <w:szCs w:val="24"/>
-        </w:rPr>
-        <w:t>cordatura</w:t>
-      </w:r>
-      <w:r>
-        <w:rPr>
-          <w:rFonts w:ascii="Noto Serif SC" w:eastAsia="Noto Serif SC" w:hAnsi="Noto Serif SC" w:cs="Noto Serif" w:hint="eastAsia"/>
-          <w:bCs/>
-          <w:sz w:val="24"/>
-          <w:szCs w:val="24"/>
-        </w:rPr>
-        <w:t xml:space="preserve"> </w:t>
+        <w:t xml:space="preserve">All scordatura </w:t>
       </w:r>
       <w:r>
         <w:rPr>
@@ -7297,7 +7261,7 @@
           <w:numId w:val="2"/>
         </w:numPr>
         <w:rPr>
-          <w:rFonts w:ascii="Noto Serif SC" w:eastAsia="Noto Serif SC" w:hAnsi="Noto Serif SC" w:cs="Noto Serif" w:hint="eastAsia"/>
+          <w:rFonts w:ascii="Noto Serif SC" w:eastAsia="Noto Serif SC" w:hAnsi="Noto Serif SC" w:cs="Noto Serif"/>
           <w:bCs/>
           <w:sz w:val="24"/>
           <w:szCs w:val="24"/>
@@ -7344,7 +7308,7 @@
       <w:pPr>
         <w:ind w:left="1440"/>
         <w:rPr>
-          <w:rFonts w:ascii="Noto Serif SC" w:eastAsia="Noto Serif SC" w:hAnsi="Noto Serif SC" w:cs="Noto Serif" w:hint="eastAsia"/>
+          <w:rFonts w:ascii="Noto Serif SC" w:eastAsia="Noto Serif SC" w:hAnsi="Noto Serif SC" w:cs="Noto Serif"/>
           <w:bCs/>
           <w:sz w:val="24"/>
           <w:szCs w:val="24"/>
@@ -7563,7 +7527,7 @@
       <w:pPr>
         <w:ind w:left="1440"/>
         <w:rPr>
-          <w:rFonts w:ascii="Noto Serif SC" w:eastAsia="Noto Serif SC" w:hAnsi="Noto Serif SC" w:cs="Noto Serif" w:hint="eastAsia"/>
+          <w:rFonts w:ascii="Noto Serif SC" w:eastAsia="Noto Serif SC" w:hAnsi="Noto Serif SC" w:cs="Noto Serif"/>
           <w:bCs/>
           <w:sz w:val="24"/>
           <w:szCs w:val="24"/>
@@ -7782,7 +7746,7 @@
       <w:pPr>
         <w:ind w:left="1440"/>
         <w:rPr>
-          <w:rFonts w:ascii="Noto Serif SC" w:eastAsia="Noto Serif SC" w:hAnsi="Noto Serif SC" w:cs="Noto Serif" w:hint="eastAsia"/>
+          <w:rFonts w:ascii="Noto Serif SC" w:eastAsia="Noto Serif SC" w:hAnsi="Noto Serif SC" w:cs="Noto Serif"/>
           <w:bCs/>
           <w:sz w:val="24"/>
           <w:szCs w:val="24"/>
@@ -7804,7 +7768,7 @@
           <w:szCs w:val="24"/>
         </w:rPr>
         <w:pict w14:anchorId="62D7E167">
-          <v:shape id="Picture 7" o:spid="_x0000_i1027" type="#_x0000_t75" alt="A black background with a black square&#10;&#10;Description automatically generated with medium confidence" style="width:6.7pt;height:15.9pt;visibility:visible;mso-wrap-style:square">
+          <v:shape id="Picture 7" o:spid="_x0000_i1027" type="#_x0000_t75" alt="A black background with a black square&#10;&#10;Description automatically generated with medium confidence" style="width:6.75pt;height:15.75pt;visibility:visible;mso-wrap-style:square">
             <v:imagedata r:id="rId19" o:title="A black background with a black square&#10;&#10;Description automatically generated with medium confidence"/>
           </v:shape>
         </w:pict>
@@ -7886,7 +7850,7 @@
       <w:pPr>
         <w:ind w:left="1440"/>
         <w:rPr>
-          <w:rFonts w:ascii="Noto Serif SC" w:eastAsia="Noto Serif SC" w:hAnsi="Noto Serif SC" w:cs="Noto Serif" w:hint="eastAsia"/>
+          <w:rFonts w:ascii="Noto Serif SC" w:eastAsia="Noto Serif SC" w:hAnsi="Noto Serif SC" w:cs="Noto Serif"/>
           <w:bCs/>
           <w:sz w:val="24"/>
           <w:szCs w:val="24"/>
@@ -8271,7 +8235,7 @@
       <w:pPr>
         <w:ind w:left="1440"/>
         <w:rPr>
-          <w:rFonts w:ascii="Noto Serif SC" w:eastAsia="Noto Serif SC" w:hAnsi="Noto Serif SC" w:cs="Noto Serif" w:hint="eastAsia"/>
+          <w:rFonts w:ascii="Noto Serif SC" w:eastAsia="Noto Serif SC" w:hAnsi="Noto Serif SC" w:cs="Noto Serif"/>
           <w:bCs/>
           <w:sz w:val="24"/>
           <w:szCs w:val="24"/>
@@ -8356,16 +8320,7 @@
           <w:sz w:val="24"/>
           <w:szCs w:val="24"/>
         </w:rPr>
-        <w:t xml:space="preserve"> (</w:t>
-      </w:r>
-      <w:r>
-        <w:rPr>
-          <w:rFonts w:ascii="Noto Serif SC" w:eastAsia="Noto Serif SC" w:hAnsi="Noto Serif SC" w:cs="Noto Serif" w:hint="eastAsia"/>
-          <w:bCs/>
-          <w:sz w:val="24"/>
-          <w:szCs w:val="24"/>
-        </w:rPr>
-        <w:t>N</w:t>
+        <w:t xml:space="preserve"> (N</w:t>
       </w:r>
       <w:r>
         <w:rPr>
@@ -8774,7 +8729,7 @@
       <w:pPr>
         <w:ind w:left="1440"/>
         <w:rPr>
-          <w:rFonts w:ascii="Noto Serif SC" w:eastAsia="Noto Serif SC" w:hAnsi="Noto Serif SC" w:cs="Noto Serif" w:hint="eastAsia"/>
+          <w:rFonts w:ascii="Noto Serif SC" w:eastAsia="Noto Serif SC" w:hAnsi="Noto Serif SC" w:cs="Noto Serif"/>
           <w:bCs/>
           <w:sz w:val="24"/>
           <w:szCs w:val="24"/>
@@ -9022,7 +8977,7 @@
     <w:p>
       <w:pPr>
         <w:rPr>
-          <w:rFonts w:ascii="Noto Serif SC" w:eastAsia="Noto Serif SC" w:hAnsi="Noto Serif SC" w:cs="Noto Serif" w:hint="eastAsia"/>
+          <w:rFonts w:ascii="Noto Serif SC" w:eastAsia="Noto Serif SC" w:hAnsi="Noto Serif SC" w:cs="Noto Serif"/>
           <w:bCs/>
           <w:sz w:val="24"/>
           <w:szCs w:val="24"/>
@@ -9401,7 +9356,7 @@
         <w:pStyle w:val="ListParagraph"/>
         <w:ind w:left="1440"/>
         <w:rPr>
-          <w:rFonts w:ascii="Noto Serif SC" w:eastAsia="Noto Serif SC" w:hAnsi="Noto Serif SC" w:cs="Noto Serif" w:hint="eastAsia"/>
+          <w:rFonts w:ascii="Noto Serif SC" w:eastAsia="Noto Serif SC" w:hAnsi="Noto Serif SC" w:cs="Noto Serif"/>
           <w:bCs/>
           <w:sz w:val="24"/>
           <w:szCs w:val="24"/>
@@ -9593,7 +9548,7 @@
         <w:pStyle w:val="ListParagraph"/>
         <w:ind w:left="1440"/>
         <w:rPr>
-          <w:rFonts w:ascii="Noto Serif SC" w:eastAsia="Noto Serif SC" w:hAnsi="Noto Serif SC" w:cs="Noto Serif" w:hint="eastAsia"/>
+          <w:rFonts w:ascii="Noto Serif SC" w:eastAsia="Noto Serif SC" w:hAnsi="Noto Serif SC" w:cs="Noto Serif"/>
           <w:bCs/>
           <w:sz w:val="24"/>
           <w:szCs w:val="24"/>
@@ -9773,7 +9728,7 @@
         <w:pStyle w:val="ListParagraph"/>
         <w:ind w:left="1440"/>
         <w:rPr>
-          <w:rFonts w:ascii="Noto Serif SC" w:eastAsia="Noto Serif SC" w:hAnsi="Noto Serif SC" w:cs="Noto Serif" w:hint="eastAsia"/>
+          <w:rFonts w:ascii="Noto Serif SC" w:eastAsia="Noto Serif SC" w:hAnsi="Noto Serif SC" w:cs="Noto Serif"/>
           <w:bCs/>
           <w:sz w:val="24"/>
           <w:szCs w:val="24"/>
@@ -9892,7 +9847,7 @@
         <w:pStyle w:val="ListParagraph"/>
         <w:ind w:left="1440"/>
         <w:rPr>
-          <w:rFonts w:ascii="Noto Serif SC" w:eastAsia="Noto Serif SC" w:hAnsi="Noto Serif SC" w:cs="Noto Serif" w:hint="eastAsia"/>
+          <w:rFonts w:ascii="Noto Serif SC" w:eastAsia="Noto Serif SC" w:hAnsi="Noto Serif SC" w:cs="Noto Serif"/>
           <w:bCs/>
           <w:sz w:val="24"/>
           <w:szCs w:val="24"/>
@@ -10135,7 +10090,7 @@
             <w:pict>
               <v:group w14:anchorId="4EE95896" id="Group 11" o:spid="_x0000_s1026" style="width:31.9pt;height:13.05pt;mso-position-horizontal-relative:char;mso-position-vertical-relative:line" coordsize="405130,165735" o:gfxdata="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">
                 <v:shape id="Picture 10" o:spid="_x0000_s1027" type="#_x0000_t75" alt="A black background with a black square&#10;&#10;Description automatically generated with medium confidence" style="position:absolute;width:109220;height:165735;rotation:-610571fd;visibility:visible;mso-wrap-style:square" o:gfxdata="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">
-                  <v:imagedata r:id="rId20" o:title="A black background with a black square&#10;&#10;Description automatically generated with medium confidence"/>
+                  <v:imagedata r:id="rId27" o:title="A black background with a black square&#10;&#10;Description automatically generated with medium confidence"/>
                 </v:shape>
                 <v:shape id="Picture 5" o:spid="_x0000_s1028" type="#_x0000_t75" alt="A black background with a black square&#10;&#10;Description automatically generated with medium confidence" style="position:absolute;left:130175;top:50800;width:274955;height:45085;visibility:visible;mso-wrap-style:square" o:gfxdata="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">
                   <v:imagedata r:id="rId24" o:title="A black background with a black square&#10;&#10;Description automatically generated with medium confidence"/>
@@ -10719,7 +10674,7 @@
           <w:numId w:val="4"/>
         </w:numPr>
         <w:rPr>
-          <w:rFonts w:ascii="Noto Serif SC" w:eastAsia="Noto Serif SC" w:hAnsi="Noto Serif SC" w:cs="Noto Serif" w:hint="eastAsia"/>
+          <w:rFonts w:ascii="Noto Serif SC" w:eastAsia="Noto Serif SC" w:hAnsi="Noto Serif SC" w:cs="Noto Serif"/>
           <w:bCs/>
           <w:sz w:val="24"/>
           <w:szCs w:val="24"/>
@@ -10775,7 +10730,7 @@
     <w:p>
       <w:pPr>
         <w:rPr>
-          <w:rFonts w:ascii="Noto Serif SC" w:eastAsia="Noto Serif SC" w:hAnsi="Noto Serif SC" w:cs="Noto Serif" w:hint="eastAsia"/>
+          <w:rFonts w:ascii="Noto Serif SC" w:eastAsia="Noto Serif SC" w:hAnsi="Noto Serif SC" w:cs="Noto Serif"/>
           <w:bCs/>
           <w:sz w:val="24"/>
           <w:szCs w:val="24"/>
@@ -11134,7 +11089,7 @@
           <w:numId w:val="3"/>
         </w:numPr>
         <w:rPr>
-          <w:rFonts w:ascii="Noto Serif SC" w:eastAsia="Noto Serif SC" w:hAnsi="Noto Serif SC" w:cs="Noto Serif" w:hint="eastAsia"/>
+          <w:rFonts w:ascii="Noto Serif SC" w:eastAsia="Noto Serif SC" w:hAnsi="Noto Serif SC" w:cs="Noto Serif"/>
           <w:b/>
           <w:sz w:val="24"/>
           <w:szCs w:val="24"/>
@@ -11221,7 +11176,7 @@
                     </pic:cNvPicPr>
                   </pic:nvPicPr>
                   <pic:blipFill>
-                    <a:blip r:embed="rId27" cstate="print">
+                    <a:blip r:embed="rId28" cstate="print">
                       <a:extLst>
                         <a:ext uri="{28A0092B-C50C-407E-A947-70E740481C1C}">
                           <a14:useLocalDpi xmlns:a14="http://schemas.microsoft.com/office/drawing/2010/main" val="0"/>
@@ -11263,7 +11218,7 @@
       <w:pPr>
         <w:ind w:left="1440" w:firstLine="720"/>
         <w:rPr>
-          <w:rFonts w:ascii="Noto Serif SC" w:eastAsia="Noto Serif SC" w:hAnsi="Noto Serif SC" w:cs="Noto Serif" w:hint="eastAsia"/>
+          <w:rFonts w:ascii="Noto Serif SC" w:eastAsia="Noto Serif SC" w:hAnsi="Noto Serif SC" w:cs="Noto Serif"/>
           <w:bCs/>
           <w:sz w:val="24"/>
           <w:szCs w:val="24"/>
@@ -11328,7 +11283,7 @@
       <w:pPr>
         <w:ind w:left="1440"/>
         <w:rPr>
-          <w:rFonts w:ascii="Noto Serif SC" w:eastAsia="Noto Serif SC" w:hAnsi="Noto Serif SC" w:cs="Noto Serif" w:hint="eastAsia"/>
+          <w:rFonts w:ascii="Noto Serif SC" w:eastAsia="Noto Serif SC" w:hAnsi="Noto Serif SC" w:cs="Noto Serif"/>
           <w:bCs/>
           <w:sz w:val="24"/>
           <w:szCs w:val="24"/>
@@ -11497,11 +11452,31 @@
       </w:pPr>
       <w:r>
         <w:rPr>
-          <w:rFonts w:ascii="Noto Serif SC" w:eastAsia="Noto Serif SC" w:hAnsi="Noto Serif SC" w:cs="Noto Serif" w:hint="eastAsia"/>
+          <w:rFonts w:ascii="Noto Serif SC" w:eastAsia="Noto Serif SC" w:hAnsi="Noto Serif SC" w:cs="Noto Serif"/>
           <w:b/>
           <w:sz w:val="24"/>
           <w:szCs w:val="24"/>
         </w:rPr>
+        <w:br w:type="page"/>
+      </w:r>
+    </w:p>
+    <w:p>
+      <w:pPr>
+        <w:rPr>
+          <w:rFonts w:ascii="Noto Serif SC" w:eastAsia="Noto Serif SC" w:hAnsi="Noto Serif SC" w:cs="Noto Serif"/>
+          <w:b/>
+          <w:sz w:val="24"/>
+          <w:szCs w:val="24"/>
+        </w:rPr>
+      </w:pPr>
+      <w:r>
+        <w:rPr>
+          <w:rFonts w:ascii="Noto Serif SC" w:eastAsia="Noto Serif SC" w:hAnsi="Noto Serif SC" w:cs="Noto Serif" w:hint="eastAsia"/>
+          <w:b/>
+          <w:sz w:val="24"/>
+          <w:szCs w:val="24"/>
+        </w:rPr>
+        <w:lastRenderedPageBreak/>
         <w:t>拉弦乐器组的分声部演奏</w:t>
       </w:r>
       <w:r>
@@ -11647,7 +11622,7 @@
       <w:pPr>
         <w:ind w:firstLine="720"/>
         <w:rPr>
-          <w:rFonts w:ascii="Noto Serif SC" w:eastAsia="Noto Serif SC" w:hAnsi="Noto Serif SC" w:cs="Noto Serif" w:hint="eastAsia"/>
+          <w:rFonts w:ascii="Noto Serif SC" w:eastAsia="Noto Serif SC" w:hAnsi="Noto Serif SC" w:cs="Noto Serif"/>
           <w:bCs/>
           <w:color w:val="CC0066"/>
           <w:sz w:val="24"/>
@@ -12175,16 +12150,212 @@
           <w:sz w:val="24"/>
           <w:szCs w:val="24"/>
         </w:rPr>
-        <w:t>violoncello</w:t>
-      </w:r>
-      <w:r>
-        <w:rPr>
-          <w:rFonts w:ascii="Noto Serif SC" w:eastAsia="Noto Serif SC" w:hAnsi="Noto Serif SC" w:cs="Noto Serif" w:hint="eastAsia"/>
+        <w:t xml:space="preserve">violoncello </w:t>
+      </w:r>
+      <w:r>
+        <w:rPr>
+          <w:rFonts w:ascii="Noto Serif SC" w:eastAsia="Noto Serif SC" w:hAnsi="Noto Serif SC" w:cs="Noto Serif"/>
           <w:bCs/>
           <w:color w:val="CC0066"/>
           <w:sz w:val="24"/>
           <w:szCs w:val="24"/>
         </w:rPr>
+        <w:t xml:space="preserve">is divided into six </w:t>
+      </w:r>
+      <w:r>
+        <w:rPr>
+          <w:rFonts w:ascii="Noto Serif SC" w:eastAsia="Noto Serif SC" w:hAnsi="Noto Serif SC" w:cs="Noto Serif" w:hint="eastAsia"/>
+          <w:bCs/>
+          <w:color w:val="CC0066"/>
+          <w:sz w:val="24"/>
+          <w:szCs w:val="24"/>
+        </w:rPr>
+        <w:t>parts</w:t>
+      </w:r>
+      <w:r>
+        <w:rPr>
+          <w:rFonts w:ascii="Noto Serif SC" w:eastAsia="Noto Serif SC" w:hAnsi="Noto Serif SC" w:cs="Noto Serif"/>
+          <w:bCs/>
+          <w:color w:val="CC0066"/>
+          <w:sz w:val="24"/>
+          <w:szCs w:val="24"/>
+        </w:rPr>
+        <w:t xml:space="preserve">, all parts are played </w:t>
+      </w:r>
+      <w:r>
+        <w:rPr>
+          <w:rFonts w:ascii="Noto Serif SC" w:eastAsia="Noto Serif SC" w:hAnsi="Noto Serif SC" w:cs="Noto Serif" w:hint="eastAsia"/>
+          <w:bCs/>
+          <w:color w:val="CC0066"/>
+          <w:sz w:val="24"/>
+          <w:szCs w:val="24"/>
+        </w:rPr>
+        <w:t>independently</w:t>
+      </w:r>
+      <w:r>
+        <w:rPr>
+          <w:rFonts w:ascii="Noto Serif SC" w:eastAsia="Noto Serif SC" w:hAnsi="Noto Serif SC" w:cs="Noto Serif"/>
+          <w:bCs/>
+          <w:color w:val="CC0066"/>
+          <w:sz w:val="24"/>
+          <w:szCs w:val="24"/>
+        </w:rPr>
+        <w:t>.</w:t>
+      </w:r>
+    </w:p>
+    <w:p>
+      <w:pPr>
+        <w:rPr>
+          <w:rFonts w:ascii="Noto Serif SC" w:eastAsia="Noto Serif SC" w:hAnsi="Noto Serif SC" w:cs="Noto Serif"/>
+          <w:bCs/>
+          <w:color w:val="CC0066"/>
+          <w:sz w:val="24"/>
+          <w:szCs w:val="24"/>
+        </w:rPr>
+      </w:pPr>
+    </w:p>
+    <w:p>
+      <w:pPr>
+        <w:ind w:firstLine="720"/>
+        <w:rPr>
+          <w:rFonts w:ascii="Noto Serif SC" w:eastAsia="Noto Serif SC" w:hAnsi="Noto Serif SC" w:cs="Noto Serif"/>
+          <w:bCs/>
+          <w:color w:val="CC0066"/>
+          <w:sz w:val="24"/>
+          <w:szCs w:val="24"/>
+        </w:rPr>
+      </w:pPr>
+      <w:r>
+        <w:rPr>
+          <w:rFonts w:ascii="Noto Serif SC" w:eastAsia="Noto Serif SC" w:hAnsi="Noto Serif SC" w:cs="Noto Serif" w:hint="eastAsia"/>
+          <w:bCs/>
+          <w:color w:val="CC0066"/>
+          <w:sz w:val="24"/>
+          <w:szCs w:val="24"/>
+        </w:rPr>
+        <w:t>当高胡、二胡I、二胡Ⅱ、中胡被分为两行谱表,并且每种乐器的第一行谱表(第1-4人)分为两步演奏时,第1-2人演奏第一声部</w:t>
+      </w:r>
+      <w:r>
+        <w:rPr>
+          <w:rFonts w:ascii="Noto Serif SC" w:eastAsia="Noto Serif SC" w:hAnsi="Noto Serif SC" w:cs="Noto Serif" w:hint="eastAsia"/>
+          <w:bCs/>
+          <w:color w:val="CC0066"/>
+          <w:sz w:val="24"/>
+          <w:szCs w:val="24"/>
+        </w:rPr>
+        <w:t>，</w:t>
+      </w:r>
+      <w:r>
+        <w:rPr>
+          <w:rFonts w:ascii="Noto Serif SC" w:eastAsia="Noto Serif SC" w:hAnsi="Noto Serif SC" w:cs="Noto Serif" w:hint="eastAsia"/>
+          <w:bCs/>
+          <w:color w:val="CC0066"/>
+          <w:sz w:val="24"/>
+          <w:szCs w:val="24"/>
+        </w:rPr>
+        <w:t>第3-4人演奏第二声部。</w:t>
+      </w:r>
+    </w:p>
+    <w:p>
+      <w:pPr>
+        <w:ind w:firstLine="720"/>
+        <w:rPr>
+          <w:rFonts w:ascii="Noto Serif SC" w:eastAsia="Noto Serif SC" w:hAnsi="Noto Serif SC" w:cs="Noto Serif"/>
+          <w:bCs/>
+          <w:color w:val="CC0066"/>
+          <w:sz w:val="24"/>
+          <w:szCs w:val="24"/>
+        </w:rPr>
+      </w:pPr>
+      <w:r>
+        <w:rPr>
+          <w:rFonts w:ascii="Noto Serif SC" w:eastAsia="Noto Serif SC" w:hAnsi="Noto Serif SC" w:cs="Noto Serif" w:hint="eastAsia"/>
+          <w:bCs/>
+          <w:color w:val="CC0066"/>
+          <w:sz w:val="24"/>
+          <w:szCs w:val="24"/>
+        </w:rPr>
+        <w:t>If</w:t>
+      </w:r>
+      <w:r>
+        <w:rPr>
+          <w:rFonts w:ascii="Noto Serif SC" w:eastAsia="Noto Serif SC" w:hAnsi="Noto Serif SC" w:cs="Noto Serif"/>
+          <w:bCs/>
+          <w:color w:val="CC0066"/>
+          <w:sz w:val="24"/>
+          <w:szCs w:val="24"/>
+        </w:rPr>
+        <w:t xml:space="preserve"> Gaohu, Erhu I, Erhu II, and Zhonghu are divided into two staves, and the first </w:t>
+      </w:r>
+      <w:r>
+        <w:rPr>
+          <w:rFonts w:ascii="Noto Serif SC" w:eastAsia="Noto Serif SC" w:hAnsi="Noto Serif SC" w:cs="Noto Serif" w:hint="eastAsia"/>
+          <w:bCs/>
+          <w:color w:val="CC0066"/>
+          <w:sz w:val="24"/>
+          <w:szCs w:val="24"/>
+        </w:rPr>
+        <w:t>upper stave</w:t>
+      </w:r>
+      <w:r>
+        <w:rPr>
+          <w:rFonts w:ascii="Noto Serif SC" w:eastAsia="Noto Serif SC" w:hAnsi="Noto Serif SC" w:cs="Noto Serif" w:hint="eastAsia"/>
+          <w:bCs/>
+          <w:color w:val="CC0066"/>
+          <w:sz w:val="24"/>
+          <w:szCs w:val="24"/>
+        </w:rPr>
+        <w:t xml:space="preserve"> itself is further divided (i.e. div. a 2)</w:t>
+      </w:r>
+      <w:r>
+        <w:rPr>
+          <w:rFonts w:ascii="Noto Serif SC" w:eastAsia="Noto Serif SC" w:hAnsi="Noto Serif SC" w:cs="Noto Serif"/>
+          <w:bCs/>
+          <w:color w:val="CC0066"/>
+          <w:sz w:val="24"/>
+          <w:szCs w:val="24"/>
+        </w:rPr>
+        <w:t xml:space="preserve">, </w:t>
+      </w:r>
+      <w:r>
+        <w:rPr>
+          <w:rFonts w:ascii="Noto Serif SC" w:eastAsia="Noto Serif SC" w:hAnsi="Noto Serif SC" w:cs="Noto Serif" w:hint="eastAsia"/>
+          <w:bCs/>
+          <w:color w:val="CC0066"/>
+          <w:sz w:val="24"/>
+          <w:szCs w:val="24"/>
+        </w:rPr>
+        <w:t xml:space="preserve">the </w:t>
+      </w:r>
+      <w:r>
+        <w:rPr>
+          <w:rFonts w:ascii="Noto Serif SC" w:eastAsia="Noto Serif SC" w:hAnsi="Noto Serif SC" w:cs="Noto Serif"/>
+          <w:bCs/>
+          <w:color w:val="CC0066"/>
+          <w:sz w:val="24"/>
+          <w:szCs w:val="24"/>
+        </w:rPr>
+        <w:t>1</w:t>
+      </w:r>
+      <w:r>
+        <w:rPr>
+          <w:rFonts w:ascii="Noto Serif SC" w:eastAsia="Noto Serif SC" w:hAnsi="Noto Serif SC" w:cs="Noto Serif"/>
+          <w:bCs/>
+          <w:color w:val="CC0066"/>
+          <w:sz w:val="24"/>
+          <w:szCs w:val="24"/>
+          <w:vertAlign w:val="superscript"/>
+        </w:rPr>
+        <w:t>st</w:t>
+      </w:r>
+      <w:r>
+        <w:rPr>
+          <w:rFonts w:ascii="Noto Serif SC" w:eastAsia="Noto Serif SC" w:hAnsi="Noto Serif SC" w:cs="Noto Serif" w:hint="eastAsia"/>
+          <w:bCs/>
+          <w:color w:val="CC0066"/>
+          <w:sz w:val="24"/>
+          <w:szCs w:val="24"/>
+        </w:rPr>
         <w:t xml:space="preserve"> </w:t>
       </w:r>
       <w:r>
@@ -12195,58 +12366,161 @@
           <w:sz w:val="24"/>
           <w:szCs w:val="24"/>
         </w:rPr>
-        <w:t xml:space="preserve">is divided into six </w:t>
-      </w:r>
-      <w:r>
-        <w:rPr>
-          <w:rFonts w:ascii="Noto Serif SC" w:eastAsia="Noto Serif SC" w:hAnsi="Noto Serif SC" w:cs="Noto Serif" w:hint="eastAsia"/>
+        <w:t xml:space="preserve"> to 2</w:t>
+      </w:r>
+      <w:r>
+        <w:rPr>
+          <w:rFonts w:ascii="Noto Serif SC" w:eastAsia="Noto Serif SC" w:hAnsi="Noto Serif SC" w:cs="Noto Serif"/>
           <w:bCs/>
           <w:color w:val="CC0066"/>
           <w:sz w:val="24"/>
           <w:szCs w:val="24"/>
-        </w:rPr>
-        <w:t>parts</w:t>
-      </w:r>
-      <w:r>
-        <w:rPr>
-          <w:rFonts w:ascii="Noto Serif SC" w:eastAsia="Noto Serif SC" w:hAnsi="Noto Serif SC" w:cs="Noto Serif"/>
+          <w:vertAlign w:val="superscript"/>
+        </w:rPr>
+        <w:t>nd</w:t>
+      </w:r>
+      <w:r>
+        <w:rPr>
+          <w:rFonts w:ascii="Noto Serif SC" w:eastAsia="Noto Serif SC" w:hAnsi="Noto Serif SC" w:cs="Noto Serif" w:hint="eastAsia"/>
           <w:bCs/>
           <w:color w:val="CC0066"/>
           <w:sz w:val="24"/>
           <w:szCs w:val="24"/>
         </w:rPr>
-        <w:t xml:space="preserve">, all parts are played </w:t>
-      </w:r>
-      <w:r>
-        <w:rPr>
-          <w:rFonts w:ascii="Noto Serif SC" w:eastAsia="Noto Serif SC" w:hAnsi="Noto Serif SC" w:cs="Noto Serif" w:hint="eastAsia"/>
+        <w:t xml:space="preserve"> </w:t>
+      </w:r>
+      <w:r>
+        <w:rPr>
+          <w:rFonts w:ascii="Noto Serif SC" w:eastAsia="Noto Serif SC" w:hAnsi="Noto Serif SC" w:cs="Noto Serif"/>
           <w:bCs/>
           <w:color w:val="CC0066"/>
           <w:sz w:val="24"/>
           <w:szCs w:val="24"/>
         </w:rPr>
-        <w:t>independently</w:t>
-      </w:r>
-      <w:r>
-        <w:rPr>
-          <w:rFonts w:ascii="Noto Serif SC" w:eastAsia="Noto Serif SC" w:hAnsi="Noto Serif SC" w:cs="Noto Serif"/>
+        <w:t xml:space="preserve"> persons </w:t>
+      </w:r>
+      <w:r>
+        <w:rPr>
+          <w:rFonts w:ascii="Noto Serif SC" w:eastAsia="Noto Serif SC" w:hAnsi="Noto Serif SC" w:cs="Noto Serif" w:hint="eastAsia"/>
           <w:bCs/>
           <w:color w:val="CC0066"/>
           <w:sz w:val="24"/>
           <w:szCs w:val="24"/>
         </w:rPr>
+        <w:t>play the top voice</w:t>
+      </w:r>
+      <w:r>
+        <w:rPr>
+          <w:rFonts w:ascii="Noto Serif SC" w:eastAsia="Noto Serif SC" w:hAnsi="Noto Serif SC" w:cs="Noto Serif"/>
+          <w:bCs/>
+          <w:color w:val="CC0066"/>
+          <w:sz w:val="24"/>
+          <w:szCs w:val="24"/>
+        </w:rPr>
+        <w:t>, and 3</w:t>
+      </w:r>
+      <w:r>
+        <w:rPr>
+          <w:rFonts w:ascii="Noto Serif SC" w:eastAsia="Noto Serif SC" w:hAnsi="Noto Serif SC" w:cs="Noto Serif"/>
+          <w:bCs/>
+          <w:color w:val="CC0066"/>
+          <w:sz w:val="24"/>
+          <w:szCs w:val="24"/>
+          <w:vertAlign w:val="superscript"/>
+        </w:rPr>
+        <w:t>rd</w:t>
+      </w:r>
+      <w:r>
+        <w:rPr>
+          <w:rFonts w:ascii="Noto Serif SC" w:eastAsia="Noto Serif SC" w:hAnsi="Noto Serif SC" w:cs="Noto Serif" w:hint="eastAsia"/>
+          <w:bCs/>
+          <w:color w:val="CC0066"/>
+          <w:sz w:val="24"/>
+          <w:szCs w:val="24"/>
+        </w:rPr>
+        <w:t xml:space="preserve"> </w:t>
+      </w:r>
+      <w:r>
+        <w:rPr>
+          <w:rFonts w:ascii="Noto Serif SC" w:eastAsia="Noto Serif SC" w:hAnsi="Noto Serif SC" w:cs="Noto Serif"/>
+          <w:bCs/>
+          <w:color w:val="CC0066"/>
+          <w:sz w:val="24"/>
+          <w:szCs w:val="24"/>
+        </w:rPr>
+        <w:t>to 4</w:t>
+      </w:r>
+      <w:r>
+        <w:rPr>
+          <w:rFonts w:ascii="Noto Serif SC" w:eastAsia="Noto Serif SC" w:hAnsi="Noto Serif SC" w:cs="Noto Serif"/>
+          <w:bCs/>
+          <w:color w:val="CC0066"/>
+          <w:sz w:val="24"/>
+          <w:szCs w:val="24"/>
+          <w:vertAlign w:val="superscript"/>
+        </w:rPr>
+        <w:t>th</w:t>
+      </w:r>
+      <w:r>
+        <w:rPr>
+          <w:rFonts w:ascii="Noto Serif SC" w:eastAsia="Noto Serif SC" w:hAnsi="Noto Serif SC" w:cs="Noto Serif" w:hint="eastAsia"/>
+          <w:bCs/>
+          <w:color w:val="CC0066"/>
+          <w:sz w:val="24"/>
+          <w:szCs w:val="24"/>
+        </w:rPr>
+        <w:t xml:space="preserve"> </w:t>
+      </w:r>
+      <w:r>
+        <w:rPr>
+          <w:rFonts w:ascii="Noto Serif SC" w:eastAsia="Noto Serif SC" w:hAnsi="Noto Serif SC" w:cs="Noto Serif"/>
+          <w:bCs/>
+          <w:color w:val="CC0066"/>
+          <w:sz w:val="24"/>
+          <w:szCs w:val="24"/>
+        </w:rPr>
+        <w:t xml:space="preserve">persons </w:t>
+      </w:r>
+      <w:r>
+        <w:rPr>
+          <w:rFonts w:ascii="Noto Serif SC" w:eastAsia="Noto Serif SC" w:hAnsi="Noto Serif SC" w:cs="Noto Serif" w:hint="eastAsia"/>
+          <w:bCs/>
+          <w:color w:val="CC0066"/>
+          <w:sz w:val="24"/>
+          <w:szCs w:val="24"/>
+        </w:rPr>
+        <w:t>play the bottom voice</w:t>
+      </w:r>
+      <w:r>
+        <w:rPr>
+          <w:rFonts w:ascii="Noto Serif SC" w:eastAsia="Noto Serif SC" w:hAnsi="Noto Serif SC" w:cs="Noto Serif"/>
+          <w:bCs/>
+          <w:color w:val="CC0066"/>
+          <w:sz w:val="24"/>
+          <w:szCs w:val="24"/>
+        </w:rPr>
         <w:t>.</w:t>
       </w:r>
-    </w:p>
-    <w:p>
-      <w:pPr>
-        <w:rPr>
-          <w:rFonts w:ascii="Noto Serif SC" w:eastAsia="Noto Serif SC" w:hAnsi="Noto Serif SC" w:cs="Noto Serif"/>
+      <w:r>
+        <w:rPr>
+          <w:rFonts w:ascii="Noto Serif SC" w:eastAsia="Noto Serif SC" w:hAnsi="Noto Serif SC" w:cs="Noto Serif" w:hint="eastAsia"/>
           <w:bCs/>
           <w:color w:val="CC0066"/>
           <w:sz w:val="24"/>
           <w:szCs w:val="24"/>
         </w:rPr>
+        <w:t xml:space="preserve"> </w:t>
+      </w:r>
+    </w:p>
+    <w:p>
+      <w:pPr>
+        <w:rPr>
+          <w:rFonts w:ascii="Noto Serif SC" w:eastAsia="Noto Serif SC" w:hAnsi="Noto Serif SC" w:cs="Noto Serif"/>
+          <w:bCs/>
+          <w:color w:val="CC0066"/>
+          <w:sz w:val="24"/>
+          <w:szCs w:val="24"/>
+        </w:rPr>
       </w:pPr>
     </w:p>
     <w:p>
@@ -12268,364 +12542,14 @@
           <w:sz w:val="24"/>
           <w:szCs w:val="24"/>
         </w:rPr>
-        <w:lastRenderedPageBreak/>
-        <w:t>当高胡、二胡I、二胡Ⅱ、中胡被分为两行谱表,并且每种乐器的第一行谱表(第1-4人)分为两步演奏时,第1-2人演奏第一声部</w:t>
-      </w:r>
-      <w:r>
-        <w:rPr>
-          <w:rFonts w:ascii="Noto Serif SC" w:eastAsia="Noto Serif SC" w:hAnsi="Noto Serif SC" w:cs="Noto Serif" w:hint="eastAsia"/>
-          <w:bCs/>
-          <w:color w:val="CC0066"/>
-          <w:sz w:val="24"/>
-          <w:szCs w:val="24"/>
-        </w:rPr>
-        <w:t>，</w:t>
-      </w:r>
-      <w:r>
-        <w:rPr>
-          <w:rFonts w:ascii="Noto Serif SC" w:eastAsia="Noto Serif SC" w:hAnsi="Noto Serif SC" w:cs="Noto Serif" w:hint="eastAsia"/>
-          <w:bCs/>
-          <w:color w:val="CC0066"/>
-          <w:sz w:val="24"/>
-          <w:szCs w:val="24"/>
-        </w:rPr>
-        <w:t>第3-4人演奏第二声部。</w:t>
+        <w:t>当高胡、二胡I、二胡Ⅱ、中胡没有细分两行谱表时,若分为两部演奏,则由第1-4人演奏第一声部,由第5-7人演奏第二声部。当大提琴没有细分两行谱表时，若分两部演奏，则则由第1-3人演奏第一声部,由第4-6人演奏第二声部。</w:t>
       </w:r>
     </w:p>
     <w:p>
       <w:pPr>
         <w:ind w:firstLine="720"/>
         <w:rPr>
-          <w:rFonts w:ascii="Noto Serif SC" w:eastAsia="Noto Serif SC" w:hAnsi="Noto Serif SC" w:cs="Noto Serif" w:hint="eastAsia"/>
-          <w:bCs/>
-          <w:color w:val="CC0066"/>
-          <w:sz w:val="24"/>
-          <w:szCs w:val="24"/>
-        </w:rPr>
-      </w:pPr>
-      <w:r>
-        <w:rPr>
-          <w:rFonts w:ascii="Noto Serif SC" w:eastAsia="Noto Serif SC" w:hAnsi="Noto Serif SC" w:cs="Noto Serif" w:hint="eastAsia"/>
-          <w:bCs/>
-          <w:color w:val="CC0066"/>
-          <w:sz w:val="24"/>
-          <w:szCs w:val="24"/>
-        </w:rPr>
-        <w:t>If</w:t>
-      </w:r>
-      <w:r>
-        <w:rPr>
-          <w:rFonts w:ascii="Noto Serif SC" w:eastAsia="Noto Serif SC" w:hAnsi="Noto Serif SC" w:cs="Noto Serif"/>
-          <w:bCs/>
-          <w:color w:val="CC0066"/>
-          <w:sz w:val="24"/>
-          <w:szCs w:val="24"/>
-        </w:rPr>
-        <w:t xml:space="preserve"> Gaohu, Erhu I, Erhu II, and Zhonghu are divided into two staves, and the first </w:t>
-      </w:r>
-      <w:r>
-        <w:rPr>
-          <w:rFonts w:ascii="Noto Serif SC" w:eastAsia="Noto Serif SC" w:hAnsi="Noto Serif SC" w:cs="Noto Serif" w:hint="eastAsia"/>
-          <w:bCs/>
-          <w:color w:val="CC0066"/>
-          <w:sz w:val="24"/>
-          <w:szCs w:val="24"/>
-        </w:rPr>
-        <w:t>upper stave</w:t>
-      </w:r>
-      <w:r>
-        <w:rPr>
-          <w:rFonts w:ascii="Noto Serif SC" w:eastAsia="Noto Serif SC" w:hAnsi="Noto Serif SC" w:cs="Noto Serif" w:hint="eastAsia"/>
-          <w:bCs/>
-          <w:color w:val="CC0066"/>
-          <w:sz w:val="24"/>
-          <w:szCs w:val="24"/>
-        </w:rPr>
-        <w:t xml:space="preserve"> itself is further divided (i.e. div. a 2)</w:t>
-      </w:r>
-      <w:r>
-        <w:rPr>
-          <w:rFonts w:ascii="Noto Serif SC" w:eastAsia="Noto Serif SC" w:hAnsi="Noto Serif SC" w:cs="Noto Serif"/>
-          <w:bCs/>
-          <w:color w:val="CC0066"/>
-          <w:sz w:val="24"/>
-          <w:szCs w:val="24"/>
-        </w:rPr>
-        <w:t xml:space="preserve">, </w:t>
-      </w:r>
-      <w:r>
-        <w:rPr>
-          <w:rFonts w:ascii="Noto Serif SC" w:eastAsia="Noto Serif SC" w:hAnsi="Noto Serif SC" w:cs="Noto Serif" w:hint="eastAsia"/>
-          <w:bCs/>
-          <w:color w:val="CC0066"/>
-          <w:sz w:val="24"/>
-          <w:szCs w:val="24"/>
-        </w:rPr>
-        <w:t xml:space="preserve">the </w:t>
-      </w:r>
-      <w:r>
-        <w:rPr>
-          <w:rFonts w:ascii="Noto Serif SC" w:eastAsia="Noto Serif SC" w:hAnsi="Noto Serif SC" w:cs="Noto Serif"/>
-          <w:bCs/>
-          <w:color w:val="CC0066"/>
-          <w:sz w:val="24"/>
-          <w:szCs w:val="24"/>
-        </w:rPr>
-        <w:t>1</w:t>
-      </w:r>
-      <w:r>
-        <w:rPr>
-          <w:rFonts w:ascii="Noto Serif SC" w:eastAsia="Noto Serif SC" w:hAnsi="Noto Serif SC" w:cs="Noto Serif"/>
-          <w:bCs/>
-          <w:color w:val="CC0066"/>
-          <w:sz w:val="24"/>
-          <w:szCs w:val="24"/>
-          <w:vertAlign w:val="superscript"/>
-        </w:rPr>
-        <w:t>st</w:t>
-      </w:r>
-      <w:r>
-        <w:rPr>
-          <w:rFonts w:ascii="Noto Serif SC" w:eastAsia="Noto Serif SC" w:hAnsi="Noto Serif SC" w:cs="Noto Serif" w:hint="eastAsia"/>
-          <w:bCs/>
-          <w:color w:val="CC0066"/>
-          <w:sz w:val="24"/>
-          <w:szCs w:val="24"/>
-        </w:rPr>
-        <w:t xml:space="preserve"> </w:t>
-      </w:r>
-      <w:r>
-        <w:rPr>
-          <w:rFonts w:ascii="Noto Serif SC" w:eastAsia="Noto Serif SC" w:hAnsi="Noto Serif SC" w:cs="Noto Serif"/>
-          <w:bCs/>
-          <w:color w:val="CC0066"/>
-          <w:sz w:val="24"/>
-          <w:szCs w:val="24"/>
-        </w:rPr>
-        <w:t xml:space="preserve"> to 2</w:t>
-      </w:r>
-      <w:r>
-        <w:rPr>
-          <w:rFonts w:ascii="Noto Serif SC" w:eastAsia="Noto Serif SC" w:hAnsi="Noto Serif SC" w:cs="Noto Serif"/>
-          <w:bCs/>
-          <w:color w:val="CC0066"/>
-          <w:sz w:val="24"/>
-          <w:szCs w:val="24"/>
-          <w:vertAlign w:val="superscript"/>
-        </w:rPr>
-        <w:t>nd</w:t>
-      </w:r>
-      <w:r>
-        <w:rPr>
-          <w:rFonts w:ascii="Noto Serif SC" w:eastAsia="Noto Serif SC" w:hAnsi="Noto Serif SC" w:cs="Noto Serif" w:hint="eastAsia"/>
-          <w:bCs/>
-          <w:color w:val="CC0066"/>
-          <w:sz w:val="24"/>
-          <w:szCs w:val="24"/>
-        </w:rPr>
-        <w:t xml:space="preserve"> </w:t>
-      </w:r>
-      <w:r>
-        <w:rPr>
-          <w:rFonts w:ascii="Noto Serif SC" w:eastAsia="Noto Serif SC" w:hAnsi="Noto Serif SC" w:cs="Noto Serif"/>
-          <w:bCs/>
-          <w:color w:val="CC0066"/>
-          <w:sz w:val="24"/>
-          <w:szCs w:val="24"/>
-        </w:rPr>
-        <w:t xml:space="preserve"> persons </w:t>
-      </w:r>
-      <w:r>
-        <w:rPr>
-          <w:rFonts w:ascii="Noto Serif SC" w:eastAsia="Noto Serif SC" w:hAnsi="Noto Serif SC" w:cs="Noto Serif" w:hint="eastAsia"/>
-          <w:bCs/>
-          <w:color w:val="CC0066"/>
-          <w:sz w:val="24"/>
-          <w:szCs w:val="24"/>
-        </w:rPr>
-        <w:t>play the top voice</w:t>
-      </w:r>
-      <w:r>
-        <w:rPr>
-          <w:rFonts w:ascii="Noto Serif SC" w:eastAsia="Noto Serif SC" w:hAnsi="Noto Serif SC" w:cs="Noto Serif"/>
-          <w:bCs/>
-          <w:color w:val="CC0066"/>
-          <w:sz w:val="24"/>
-          <w:szCs w:val="24"/>
-        </w:rPr>
-        <w:t>, and 3</w:t>
-      </w:r>
-      <w:r>
-        <w:rPr>
-          <w:rFonts w:ascii="Noto Serif SC" w:eastAsia="Noto Serif SC" w:hAnsi="Noto Serif SC" w:cs="Noto Serif"/>
-          <w:bCs/>
-          <w:color w:val="CC0066"/>
-          <w:sz w:val="24"/>
-          <w:szCs w:val="24"/>
-          <w:vertAlign w:val="superscript"/>
-        </w:rPr>
-        <w:t>rd</w:t>
-      </w:r>
-      <w:r>
-        <w:rPr>
-          <w:rFonts w:ascii="Noto Serif SC" w:eastAsia="Noto Serif SC" w:hAnsi="Noto Serif SC" w:cs="Noto Serif" w:hint="eastAsia"/>
-          <w:bCs/>
-          <w:color w:val="CC0066"/>
-          <w:sz w:val="24"/>
-          <w:szCs w:val="24"/>
-        </w:rPr>
-        <w:t xml:space="preserve"> </w:t>
-      </w:r>
-      <w:r>
-        <w:rPr>
-          <w:rFonts w:ascii="Noto Serif SC" w:eastAsia="Noto Serif SC" w:hAnsi="Noto Serif SC" w:cs="Noto Serif"/>
-          <w:bCs/>
-          <w:color w:val="CC0066"/>
-          <w:sz w:val="24"/>
-          <w:szCs w:val="24"/>
-        </w:rPr>
-        <w:t>to 4</w:t>
-      </w:r>
-      <w:r>
-        <w:rPr>
-          <w:rFonts w:ascii="Noto Serif SC" w:eastAsia="Noto Serif SC" w:hAnsi="Noto Serif SC" w:cs="Noto Serif"/>
-          <w:bCs/>
-          <w:color w:val="CC0066"/>
-          <w:sz w:val="24"/>
-          <w:szCs w:val="24"/>
-          <w:vertAlign w:val="superscript"/>
-        </w:rPr>
-        <w:t>th</w:t>
-      </w:r>
-      <w:r>
-        <w:rPr>
-          <w:rFonts w:ascii="Noto Serif SC" w:eastAsia="Noto Serif SC" w:hAnsi="Noto Serif SC" w:cs="Noto Serif" w:hint="eastAsia"/>
-          <w:bCs/>
-          <w:color w:val="CC0066"/>
-          <w:sz w:val="24"/>
-          <w:szCs w:val="24"/>
-        </w:rPr>
-        <w:t xml:space="preserve"> </w:t>
-      </w:r>
-      <w:r>
-        <w:rPr>
-          <w:rFonts w:ascii="Noto Serif SC" w:eastAsia="Noto Serif SC" w:hAnsi="Noto Serif SC" w:cs="Noto Serif"/>
-          <w:bCs/>
-          <w:color w:val="CC0066"/>
-          <w:sz w:val="24"/>
-          <w:szCs w:val="24"/>
-        </w:rPr>
-        <w:t xml:space="preserve">persons </w:t>
-      </w:r>
-      <w:r>
-        <w:rPr>
-          <w:rFonts w:ascii="Noto Serif SC" w:eastAsia="Noto Serif SC" w:hAnsi="Noto Serif SC" w:cs="Noto Serif" w:hint="eastAsia"/>
-          <w:bCs/>
-          <w:color w:val="CC0066"/>
-          <w:sz w:val="24"/>
-          <w:szCs w:val="24"/>
-        </w:rPr>
-        <w:t>play the bottom voice</w:t>
-      </w:r>
-      <w:r>
-        <w:rPr>
-          <w:rFonts w:ascii="Noto Serif SC" w:eastAsia="Noto Serif SC" w:hAnsi="Noto Serif SC" w:cs="Noto Serif"/>
-          <w:bCs/>
-          <w:color w:val="CC0066"/>
-          <w:sz w:val="24"/>
-          <w:szCs w:val="24"/>
-        </w:rPr>
-        <w:t>.</w:t>
-      </w:r>
-      <w:r>
-        <w:rPr>
-          <w:rFonts w:ascii="Noto Serif SC" w:eastAsia="Noto Serif SC" w:hAnsi="Noto Serif SC" w:cs="Noto Serif" w:hint="eastAsia"/>
-          <w:bCs/>
-          <w:color w:val="CC0066"/>
-          <w:sz w:val="24"/>
-          <w:szCs w:val="24"/>
-        </w:rPr>
-        <w:t xml:space="preserve"> </w:t>
-      </w:r>
-    </w:p>
-    <w:p>
-      <w:pPr>
-        <w:rPr>
-          <w:rFonts w:ascii="Noto Serif SC" w:eastAsia="Noto Serif SC" w:hAnsi="Noto Serif SC" w:cs="Noto Serif"/>
-          <w:bCs/>
-          <w:color w:val="CC0066"/>
-          <w:sz w:val="24"/>
-          <w:szCs w:val="24"/>
-        </w:rPr>
-      </w:pPr>
-    </w:p>
-    <w:p>
-      <w:pPr>
-        <w:ind w:firstLine="720"/>
-        <w:rPr>
-          <w:rFonts w:ascii="Noto Serif SC" w:eastAsia="Noto Serif SC" w:hAnsi="Noto Serif SC" w:cs="Noto Serif"/>
-          <w:bCs/>
-          <w:color w:val="CC0066"/>
-          <w:sz w:val="24"/>
-          <w:szCs w:val="24"/>
-        </w:rPr>
-      </w:pPr>
-      <w:r>
-        <w:rPr>
-          <w:rFonts w:ascii="Noto Serif SC" w:eastAsia="Noto Serif SC" w:hAnsi="Noto Serif SC" w:cs="Noto Serif" w:hint="eastAsia"/>
-          <w:bCs/>
-          <w:color w:val="CC0066"/>
-          <w:sz w:val="24"/>
-          <w:szCs w:val="24"/>
-        </w:rPr>
-        <w:t>当高胡、二胡I、二胡Ⅱ、中胡没有细分两行谱表时,若分为两部演奏,则由第1-4人演奏第一声部,由第5-7人演奏第二声部。当大提琴没有细分两行谱表时</w:t>
-      </w:r>
-      <w:r>
-        <w:rPr>
-          <w:rFonts w:ascii="Noto Serif SC" w:eastAsia="Noto Serif SC" w:hAnsi="Noto Serif SC" w:cs="Noto Serif" w:hint="eastAsia"/>
-          <w:bCs/>
-          <w:color w:val="CC0066"/>
-          <w:sz w:val="24"/>
-          <w:szCs w:val="24"/>
-        </w:rPr>
-        <w:t>，</w:t>
-      </w:r>
-      <w:r>
-        <w:rPr>
-          <w:rFonts w:ascii="Noto Serif SC" w:eastAsia="Noto Serif SC" w:hAnsi="Noto Serif SC" w:cs="Noto Serif" w:hint="eastAsia"/>
-          <w:bCs/>
-          <w:color w:val="CC0066"/>
-          <w:sz w:val="24"/>
-          <w:szCs w:val="24"/>
-        </w:rPr>
-        <w:t>若分两部演奏</w:t>
-      </w:r>
-      <w:r>
-        <w:rPr>
-          <w:rFonts w:ascii="Noto Serif SC" w:eastAsia="Noto Serif SC" w:hAnsi="Noto Serif SC" w:cs="Noto Serif" w:hint="eastAsia"/>
-          <w:bCs/>
-          <w:color w:val="CC0066"/>
-          <w:sz w:val="24"/>
-          <w:szCs w:val="24"/>
-        </w:rPr>
-        <w:t>，</w:t>
-      </w:r>
-      <w:r>
-        <w:rPr>
-          <w:rFonts w:ascii="Noto Serif SC" w:eastAsia="Noto Serif SC" w:hAnsi="Noto Serif SC" w:cs="Noto Serif" w:hint="eastAsia"/>
-          <w:bCs/>
-          <w:color w:val="CC0066"/>
-          <w:sz w:val="24"/>
-          <w:szCs w:val="24"/>
-        </w:rPr>
-        <w:t>则则由第1-3人演奏第一声部,由第4-6人演奏第二声部。</w:t>
-      </w:r>
-    </w:p>
-    <w:p>
-      <w:pPr>
-        <w:ind w:firstLine="720"/>
-        <w:rPr>
-          <w:rFonts w:ascii="Noto Serif SC" w:eastAsia="Noto Serif SC" w:hAnsi="Noto Serif SC" w:cs="Noto Serif" w:hint="eastAsia"/>
+          <w:rFonts w:ascii="Noto Serif SC" w:eastAsia="Noto Serif SC" w:hAnsi="Noto Serif SC" w:cs="Noto Serif"/>
           <w:bCs/>
           <w:color w:val="CC0066"/>
           <w:sz w:val="24"/>
@@ -13910,18 +13834,7 @@
           <w:sz w:val="24"/>
           <w:szCs w:val="24"/>
         </w:rPr>
-        <w:t>f</w:t>
-      </w:r>
-      <w:r>
-        <w:rPr>
-          <w:rFonts w:ascii="Cambria" w:eastAsia="Noto Serif SC" w:hAnsi="Cambria" w:cs="Noto Serif" w:hint="eastAsia"/>
-          <w:b/>
-          <w:i/>
-          <w:iCs/>
-          <w:sz w:val="24"/>
-          <w:szCs w:val="24"/>
-        </w:rPr>
-        <w:t>f</w:t>
+        <w:t>ff</w:t>
       </w:r>
       <w:proofErr w:type="spellEnd"/>
       <w:r>
@@ -13942,7 +13855,7 @@
           <w:numId w:val="5"/>
         </w:numPr>
         <w:rPr>
-          <w:rFonts w:ascii="Cambria" w:eastAsia="Noto Serif SC" w:hAnsi="Cambria" w:cs="Noto Serif" w:hint="eastAsia"/>
+          <w:rFonts w:ascii="Cambria" w:eastAsia="Noto Serif SC" w:hAnsi="Cambria" w:cs="Noto Serif"/>
           <w:bCs/>
           <w:sz w:val="24"/>
           <w:szCs w:val="24"/>
@@ -14167,14 +14080,14 @@
         <v:path o:extrusionok="f" gradientshapeok="t" o:connecttype="rect"/>
         <o:lock v:ext="edit" aspectratio="t"/>
       </v:shapetype>
-      <v:shape id="_x0000_i1354" type="#_x0000_t75" alt="A black background with a black square&#10;&#10;Description automatically generated with medium confidence" style="width:3in;height:522.4pt;visibility:visible;mso-wrap-style:square" o:bullet="t">
+      <v:shape id="_x0000_i1032" type="#_x0000_t75" alt="A black background with a black square&#10;&#10;Description automatically generated with medium confidence" style="width:3in;height:522.75pt;visibility:visible;mso-wrap-style:square" o:bullet="t">
         <v:imagedata r:id="rId1" o:title="A black background with a black square&#10;&#10;Description automatically generated with medium confidence"/>
       </v:shape>
     </w:pict>
   </w:numPicBullet>
   <w:numPicBullet w:numPicBulletId="1">
     <w:pict>
-      <v:shape id="_x0000_i1355" type="#_x0000_t75" style="width:277.95pt;height:422.8pt;flip:x;visibility:visible;mso-wrap-style:square" o:bullet="t">
+      <v:shape id="_x0000_i1033" type="#_x0000_t75" style="width:278.25pt;height:423pt;flip:x;visibility:visible;mso-wrap-style:square" o:bullet="t">
         <v:imagedata r:id="rId2" o:title=""/>
       </v:shape>
     </w:pict>
@@ -15133,6 +15046,7 @@
   <w:style w:type="character" w:default="1" w:styleId="DefaultParagraphFont">
     <w:name w:val="Default Paragraph Font"/>
     <w:uiPriority w:val="1"/>
+    <w:semiHidden/>
     <w:unhideWhenUsed/>
   </w:style>
   <w:style w:type="table" w:default="1" w:styleId="TableNormal">

</xml_diff>